<commit_message>
docs: trace mapping donors and enforce research paragraph structure
Revise the paper to v0.2 with explicit DIM, MPSS, CSAPI and individual donor
concept explanations. Add cited temperature and battery lineage examples with
reuse limits, and require three to five sentences in narrative paragraphs.
Publish the visually reviewed Word edition and maintain both requirements
in the experiment plan, indexes, continuity and authoring checks.
</commit_message>
<xml_diff>
--- a/Docs/Research/Studies/Smart_Citizen/SMART_CITIZEN_EXPERIMENT_PAPER.docx
+++ b/Docs/Research/Studies/Smart_Citizen/SMART_CITIZEN_EXPERIMENT_PAPER.docx
@@ -32,7 +32,7 @@
       <w:pPr/>
       <w:r>
         <w:rPr/>
-        <w:t>Working paper version 0.1 | 24 October 2026 | Study protocol and preliminary source assessment</w:t>
+        <w:t>Working paper version 0.2 | 24 October 2026 | Study protocol and preliminary source assessment</w:t>
       </w:r>
     </w:p>
     <w:p>
@@ -48,7 +48,14 @@
       <w:pPr/>
       <w:r>
         <w:rPr/>
-        <w:t>Integrating a sensing system requires preserving the meaning of its information as well as transporting its measurements. An operator may need to distinguish a product model from an installed unit, a producing sensor from the subject it observes, and a reported condition from an interpretation of that condition. This paper defines a proposed experiment using public Smart Citizen data, an authored adapter, an OGC API Connected Systems service, and the Glaux client to evaluate the MERLIN domain information model and Managed Physical Sensing Systems profile. The study will combine published source definitions with captured responses, document each consequential transformation, and compare competent generic and profile-aware presentations of the same standardized resources. Preliminary access checks establish that selected public measurements and aggregate history were retrievable; they do not establish a running adapter, a loaded CSAPI dataset, or a presentation benefit. The evaluation will report semantic preservation, domain coverage, and operator-facing utility separately. Initial diagrams and code fragments explain the proposed method. Paired source-interface and Glaux screenshots, executed mappings, and measured results will be added as evidence becomes available. The expected contribution is a reproducible account of which meanings survive integration, which require explicit enrichment, and which remain unsupported by the source.</w:t>
+        <w:t>Integrating a sensing system requires preserving the meaning of its information as well as transporting its measurements. An operator may need to distinguish a product model from an installed unit, a producing sensor from the subject it observes, and a reported condition from an interpretation of that condition. This paper defines a proposed experiment using public Smart Citizen data, an authored adapter, an OGC API Connected Systems service, and the Glaux client to evaluate the MERLIN domain information model and Managed Physical Sensing Systems profile. The study will combine published source definitions with captured responses, document each consequential transformation, and compare competent generic and profile-aware presentations of the same standardized resources. Each mapping will explain both its standard representation and its relationship to the underlying domain model and individually identified donor concepts.</w:t>
+      </w:r>
+    </w:p>
+    <w:p>
+      <w:pPr/>
+      <w:r>
+        <w:rPr/>
+        <w:t>Preliminary access checks establish that selected public measurements and aggregate history were retrievable; they do not establish a running adapter, a loaded CSAPI dataset, or a presentation benefit. The evaluation will report semantic preservation, domain coverage, and operator-facing utility separately. Initial diagrams and code fragments explain the proposed method. Paired source-interface and Glaux screenshots, executed mappings, and measured results will be added as evidence becomes available. The expected contribution is a reproducible account of which meanings survive integration, which require explicit enrichment, and which remain unsupported by the source.</w:t>
       </w:r>
     </w:p>
     <w:p>
@@ -183,7 +190,7 @@
       <w:pPr/>
       <w:r>
         <w:rPr/>
-        <w:t>The study proposes a traceable integration case followed by a controlled comparison of information presentation. It addresses three research questions.</w:t>
+        <w:t>The study proposes a traceable integration case. A controlled comparison of information presentation will follow that integration. Together, these stages address three research questions.</w:t>
       </w:r>
     </w:p>
     <w:p>
@@ -360,13 +367,6 @@
       </w:r>
     </w:p>
     <w:p>
-      <w:pPr/>
-      <w:r>
-        <w:rPr/>
-        <w:t>The preliminary study retrieved public registration 19639 on 24 October 2026 at 5:57:35 p.m. EDT, equivalent to 21:57:35 UTC. Selected measurements and their individual source timestamps are preserved in the evidence record. Table 1 summarizes a subset; it is not a new live measurement or an executed adapter result (MERLIN Project 2026b).</w:t>
-      </w:r>
-    </w:p>
-    <w:p>
       <w:pPr>
         <w:pStyle w:val="PaperCaption"/>
         <w:keepNext/>
@@ -379,7 +379,7 @@
       </w:r>
       <w:r>
         <w:rPr/>
-        <w:t xml:space="preserve"> Source timestamps are on 24 October 2026 and are shown in UTC to preserve their original time basis.</w:t>
+        <w:t xml:space="preserve"> The preliminary study retrieved public registration 19639 on 24 October 2026 at 5:57:35 p.m. EDT, equivalent to 21:57:35 UTC. Selected measurements and their individual source timestamps are preserved in the evidence record. The table summarizes a subset; it is not a new live measurement or an executed adapter result (MERLIN Project 2026b). Source timestamps are on 24 October 2026 and are shown in UTC to preserve their original time basis.</w:t>
       </w:r>
     </w:p>
     <w:tbl>
@@ -1176,7 +1176,7 @@
       </w:r>
       <w:r>
         <w:rPr/>
-        <w:t xml:space="preserve"> These members are reproduced from one channel in the captured response. Other members are omitted; the excerpt is not a complete API response or a formal source schema (MERLIN Project 2026b, record “smart-citizen-current-19639”).</w:t>
+        <w:t xml:space="preserve"> These members are reproduced from one channel in the captured response. Other members are omitted. The excerpt is not a complete API response or a formal source schema (MERLIN Project 2026b, record “smart-citizen-current-19639”).</w:t>
       </w:r>
     </w:p>
     <w:p>
@@ -1384,7 +1384,7 @@
       </w:pPr>
       <w:r>
         <w:rPr/>
-        <w:t>Mapping records and illustrative encoding</w:t>
+        <w:t>Mapping records and concept lineage</w:t>
       </w:r>
     </w:p>
     <w:p>
@@ -1392,6 +1392,834 @@
       <w:r>
         <w:rPr/>
         <w:t>For every consequential field, the mapping record will identify its source location, definition, identity scope, subject, quantity, unit, time meaning, aggregation, missing-value treatment, target resource/property, applicable MPSS rule, and presentation decision. Each transformation will have a rationale and an evidence locator. Conflicts between documentation and observed payloads will be recorded and resolved for the affected mapping. Consulting implementation code may help, but its exact revision does not automatically identify the revision deployed by the public service.</w:t>
+      </w:r>
+    </w:p>
+    <w:p>
+      <w:pPr/>
+      <w:r>
+        <w:rPr/>
+        <w:t>Every mapping explanation will connect the native assertion to its underlying DIM concept, the applicable MPSS binding, and the selected CSAPI concepts and representation. It will identify the relevant System, DataStream, Observation, or other resource and explain why that resource has the intended role. Where SensorML or SWE supplies the representation, the explanation will name the actual member, component, semantic definition, and unit mechanism. A JSON destination alone is an incomplete account because it does not explain the meaning being preserved or the model decision behind it.</w:t>
+      </w:r>
+    </w:p>
+    <w:p>
+      <w:pPr/>
+      <w:r>
+        <w:rPr/>
+        <w:t>Each individual donor concept invoked by that explanation will have its own attribution, including its name or identifier, source edition, exact section or object, and inline author-date citation. The account will state whether the concept is directly reused, adapted through an identified binding, used to constrain interpretation, or considered without an established equivalence. A source may contribute both conceptual meaning and an encoding mechanism, but those contributions will be explained separately. Multiple donors supporting one mapping will remain individually visible, and similarity of terminology will not be treated as evidence of historical derivation.</w:t>
+      </w:r>
+    </w:p>
+    <w:p>
+      <w:pPr/>
+      <w:r>
+        <w:rPr/>
+        <w:t>The donor explanation will distinguish an established contribution to the retained model from a source vocabulary encountered in this experiment. It will also identify MERLIN-authored bindings and experiment-authored transformations rather than crediting them to an external standard. Where the donor relationship is unverified, the mapping will say that it is not established and identify the missing evidence. The following requirements apply to every mapping added to this paper, including metadata and relationships as well as numerical readings.</w:t>
+      </w:r>
+    </w:p>
+    <w:p>
+      <w:pPr>
+        <w:pStyle w:val="PaperCaption"/>
+        <w:keepNext/>
+      </w:pPr>
+      <w:r>
+        <w:rPr>
+          <w:b/>
+        </w:rPr>
+        <w:t>Table 2. Required explanation for each mapping.</w:t>
+      </w:r>
+      <w:r>
+        <w:rPr/>
+        <w:t xml:space="preserve"> Each mapping receives a stable study-local identifier and a narrative covering these layers. Every invoked donor receives a separately attributable concept entry, even when several donors support the same mapping. Unresolved relationships remain visible until source evidence and review support a disposition.</w:t>
+      </w:r>
+    </w:p>
+    <w:tbl>
+      <w:tblPr>
+        <w:tblW w:type="auto" w:w="0"/>
+        <w:jc w:val="center"/>
+        <w:tblLayout w:type="fixed"/>
+        <w:tblLook w:firstColumn="1" w:firstRow="1" w:lastColumn="0" w:lastRow="0" w:noHBand="0" w:noVBand="1" w:val="04A0"/>
+      </w:tblPr>
+      <w:tblGrid>
+        <w:gridCol w:w="2232"/>
+        <w:gridCol w:w="3312"/>
+        <w:gridCol w:w="4248"/>
+      </w:tblGrid>
+      <w:tr>
+        <w:trPr>
+          <w:cantSplit/>
+          <w:tblHeader/>
+        </w:trPr>
+        <w:tc>
+          <w:tcPr>
+            <w:tcW w:type="dxa" w:w="2232"/>
+            <w:vAlign w:val="center"/>
+            <w:tcBorders>
+              <w:top w:val="single" w:sz="4" w:color="D9D9D9"/>
+              <w:left w:val="single" w:sz="4" w:color="D9D9D9"/>
+              <w:bottom w:val="single" w:sz="4" w:color="D9D9D9"/>
+              <w:right w:val="single" w:sz="4" w:color="D9D9D9"/>
+            </w:tcBorders>
+            <w:tcMar>
+              <w:top w:w="90" w:type="dxa"/>
+              <w:left w:w="90" w:type="dxa"/>
+              <w:bottom w:w="90" w:type="dxa"/>
+              <w:right w:w="90" w:type="dxa"/>
+            </w:tcMar>
+            <w:shd w:fill="E8E8E8"/>
+          </w:tcPr>
+          <w:p>
+            <w:pPr>
+              <w:spacing w:after="40" w:line="247" w:lineRule="auto"/>
+            </w:pPr>
+            <w:r>
+              <w:rPr>
+                <w:b/>
+                <w:sz w:val="20"/>
+              </w:rPr>
+              <w:t>Layer</w:t>
+            </w:r>
+          </w:p>
+        </w:tc>
+        <w:tc>
+          <w:tcPr>
+            <w:tcW w:type="dxa" w:w="3312"/>
+            <w:vAlign w:val="center"/>
+            <w:tcBorders>
+              <w:top w:val="single" w:sz="4" w:color="D9D9D9"/>
+              <w:left w:val="single" w:sz="4" w:color="D9D9D9"/>
+              <w:bottom w:val="single" w:sz="4" w:color="D9D9D9"/>
+              <w:right w:val="single" w:sz="4" w:color="D9D9D9"/>
+            </w:tcBorders>
+            <w:tcMar>
+              <w:top w:w="90" w:type="dxa"/>
+              <w:left w:w="90" w:type="dxa"/>
+              <w:bottom w:w="90" w:type="dxa"/>
+              <w:right w:w="90" w:type="dxa"/>
+            </w:tcMar>
+            <w:shd w:fill="E8E8E8"/>
+          </w:tcPr>
+          <w:p>
+            <w:pPr>
+              <w:spacing w:after="40" w:line="247" w:lineRule="auto"/>
+            </w:pPr>
+            <w:r>
+              <w:rPr>
+                <w:b/>
+                <w:sz w:val="20"/>
+              </w:rPr>
+              <w:t>Required explanation</w:t>
+            </w:r>
+          </w:p>
+        </w:tc>
+        <w:tc>
+          <w:tcPr>
+            <w:tcW w:type="dxa" w:w="4248"/>
+            <w:vAlign w:val="center"/>
+            <w:tcBorders>
+              <w:top w:val="single" w:sz="4" w:color="D9D9D9"/>
+              <w:left w:val="single" w:sz="4" w:color="D9D9D9"/>
+              <w:bottom w:val="single" w:sz="4" w:color="D9D9D9"/>
+              <w:right w:val="single" w:sz="4" w:color="D9D9D9"/>
+            </w:tcBorders>
+            <w:tcMar>
+              <w:top w:w="90" w:type="dxa"/>
+              <w:left w:w="90" w:type="dxa"/>
+              <w:bottom w:w="90" w:type="dxa"/>
+              <w:right w:w="90" w:type="dxa"/>
+            </w:tcMar>
+            <w:shd w:fill="E8E8E8"/>
+          </w:tcPr>
+          <w:p>
+            <w:pPr>
+              <w:spacing w:after="40" w:line="247" w:lineRule="auto"/>
+            </w:pPr>
+            <w:r>
+              <w:rPr>
+                <w:b/>
+                <w:sz w:val="20"/>
+              </w:rPr>
+              <w:t>Evidence to identify</w:t>
+            </w:r>
+          </w:p>
+        </w:tc>
+      </w:tr>
+      <w:tr>
+        <w:trPr>
+          <w:cantSplit/>
+        </w:trPr>
+        <w:tc>
+          <w:tcPr>
+            <w:tcW w:type="dxa" w:w="2232"/>
+            <w:vAlign w:val="center"/>
+            <w:tcBorders>
+              <w:top w:val="single" w:sz="4" w:color="D9D9D9"/>
+              <w:left w:val="single" w:sz="4" w:color="D9D9D9"/>
+              <w:bottom w:val="single" w:sz="4" w:color="D9D9D9"/>
+              <w:right w:val="single" w:sz="4" w:color="D9D9D9"/>
+            </w:tcBorders>
+            <w:tcMar>
+              <w:top w:w="90" w:type="dxa"/>
+              <w:left w:w="90" w:type="dxa"/>
+              <w:bottom w:w="90" w:type="dxa"/>
+              <w:right w:w="90" w:type="dxa"/>
+            </w:tcMar>
+            <w:shd w:fill="FFFFFF"/>
+          </w:tcPr>
+          <w:p>
+            <w:pPr>
+              <w:spacing w:after="40" w:line="247" w:lineRule="auto"/>
+            </w:pPr>
+            <w:r>
+              <w:rPr>
+                <w:sz w:val="20"/>
+              </w:rPr>
+              <w:t>Native assertion</w:t>
+            </w:r>
+          </w:p>
+        </w:tc>
+        <w:tc>
+          <w:tcPr>
+            <w:tcW w:type="dxa" w:w="3312"/>
+            <w:vAlign w:val="center"/>
+            <w:tcBorders>
+              <w:top w:val="single" w:sz="4" w:color="D9D9D9"/>
+              <w:left w:val="single" w:sz="4" w:color="D9D9D9"/>
+              <w:bottom w:val="single" w:sz="4" w:color="D9D9D9"/>
+              <w:right w:val="single" w:sz="4" w:color="D9D9D9"/>
+            </w:tcBorders>
+            <w:tcMar>
+              <w:top w:w="90" w:type="dxa"/>
+              <w:left w:w="90" w:type="dxa"/>
+              <w:bottom w:w="90" w:type="dxa"/>
+              <w:right w:w="90" w:type="dxa"/>
+            </w:tcMar>
+            <w:shd w:fill="FFFFFF"/>
+          </w:tcPr>
+          <w:p>
+            <w:pPr>
+              <w:spacing w:after="40" w:line="247" w:lineRule="auto"/>
+            </w:pPr>
+            <w:r>
+              <w:rPr>
+                <w:sz w:val="20"/>
+              </w:rPr>
+              <w:t>What the source actually asserts, about which subject and time</w:t>
+            </w:r>
+          </w:p>
+        </w:tc>
+        <w:tc>
+          <w:tcPr>
+            <w:tcW w:type="dxa" w:w="4248"/>
+            <w:vAlign w:val="center"/>
+            <w:tcBorders>
+              <w:top w:val="single" w:sz="4" w:color="D9D9D9"/>
+              <w:left w:val="single" w:sz="4" w:color="D9D9D9"/>
+              <w:bottom w:val="single" w:sz="4" w:color="D9D9D9"/>
+              <w:right w:val="single" w:sz="4" w:color="D9D9D9"/>
+            </w:tcBorders>
+            <w:tcMar>
+              <w:top w:w="90" w:type="dxa"/>
+              <w:left w:w="90" w:type="dxa"/>
+              <w:bottom w:w="90" w:type="dxa"/>
+              <w:right w:w="90" w:type="dxa"/>
+            </w:tcMar>
+            <w:shd w:fill="FFFFFF"/>
+          </w:tcPr>
+          <w:p>
+            <w:pPr>
+              <w:spacing w:after="40" w:line="247" w:lineRule="auto"/>
+            </w:pPr>
+            <w:r>
+              <w:rPr>
+                <w:sz w:val="20"/>
+              </w:rPr>
+              <w:t>Source path, definition, capture, and limitations</w:t>
+            </w:r>
+          </w:p>
+        </w:tc>
+      </w:tr>
+      <w:tr>
+        <w:trPr>
+          <w:cantSplit/>
+        </w:trPr>
+        <w:tc>
+          <w:tcPr>
+            <w:tcW w:type="dxa" w:w="2232"/>
+            <w:vAlign w:val="center"/>
+            <w:tcBorders>
+              <w:top w:val="single" w:sz="4" w:color="D9D9D9"/>
+              <w:left w:val="single" w:sz="4" w:color="D9D9D9"/>
+              <w:bottom w:val="single" w:sz="4" w:color="D9D9D9"/>
+              <w:right w:val="single" w:sz="4" w:color="D9D9D9"/>
+            </w:tcBorders>
+            <w:tcMar>
+              <w:top w:w="90" w:type="dxa"/>
+              <w:left w:w="90" w:type="dxa"/>
+              <w:bottom w:w="90" w:type="dxa"/>
+              <w:right w:w="90" w:type="dxa"/>
+            </w:tcMar>
+            <w:shd w:fill="F7F7F7"/>
+          </w:tcPr>
+          <w:p>
+            <w:pPr>
+              <w:spacing w:after="40" w:line="247" w:lineRule="auto"/>
+            </w:pPr>
+            <w:r>
+              <w:rPr>
+                <w:sz w:val="20"/>
+              </w:rPr>
+              <w:t>Underlying DIM concept</w:t>
+            </w:r>
+          </w:p>
+        </w:tc>
+        <w:tc>
+          <w:tcPr>
+            <w:tcW w:type="dxa" w:w="3312"/>
+            <w:vAlign w:val="center"/>
+            <w:tcBorders>
+              <w:top w:val="single" w:sz="4" w:color="D9D9D9"/>
+              <w:left w:val="single" w:sz="4" w:color="D9D9D9"/>
+              <w:bottom w:val="single" w:sz="4" w:color="D9D9D9"/>
+              <w:right w:val="single" w:sz="4" w:color="D9D9D9"/>
+            </w:tcBorders>
+            <w:tcMar>
+              <w:top w:w="90" w:type="dxa"/>
+              <w:left w:w="90" w:type="dxa"/>
+              <w:bottom w:w="90" w:type="dxa"/>
+              <w:right w:w="90" w:type="dxa"/>
+            </w:tcMar>
+            <w:shd w:fill="F7F7F7"/>
+          </w:tcPr>
+          <w:p>
+            <w:pPr>
+              <w:spacing w:after="40" w:line="247" w:lineRule="auto"/>
+            </w:pPr>
+            <w:r>
+              <w:rPr>
+                <w:sz w:val="20"/>
+              </w:rPr>
+              <w:t>Entity, property, relationship, and distinctions the mapping preserves</w:t>
+            </w:r>
+          </w:p>
+        </w:tc>
+        <w:tc>
+          <w:tcPr>
+            <w:tcW w:type="dxa" w:w="4248"/>
+            <w:vAlign w:val="center"/>
+            <w:tcBorders>
+              <w:top w:val="single" w:sz="4" w:color="D9D9D9"/>
+              <w:left w:val="single" w:sz="4" w:color="D9D9D9"/>
+              <w:bottom w:val="single" w:sz="4" w:color="D9D9D9"/>
+              <w:right w:val="single" w:sz="4" w:color="D9D9D9"/>
+            </w:tcBorders>
+            <w:tcMar>
+              <w:top w:w="90" w:type="dxa"/>
+              <w:left w:w="90" w:type="dxa"/>
+              <w:bottom w:w="90" w:type="dxa"/>
+              <w:right w:w="90" w:type="dxa"/>
+            </w:tcMar>
+            <w:shd w:fill="F7F7F7"/>
+          </w:tcPr>
+          <w:p>
+            <w:pPr>
+              <w:spacing w:after="40" w:line="247" w:lineRule="auto"/>
+            </w:pPr>
+            <w:r>
+              <w:rPr>
+                <w:sz w:val="20"/>
+              </w:rPr>
+              <w:t>Model concept and exact baseline locator</w:t>
+            </w:r>
+          </w:p>
+        </w:tc>
+      </w:tr>
+      <w:tr>
+        <w:trPr>
+          <w:cantSplit/>
+        </w:trPr>
+        <w:tc>
+          <w:tcPr>
+            <w:tcW w:type="dxa" w:w="2232"/>
+            <w:vAlign w:val="center"/>
+            <w:tcBorders>
+              <w:top w:val="single" w:sz="4" w:color="D9D9D9"/>
+              <w:left w:val="single" w:sz="4" w:color="D9D9D9"/>
+              <w:bottom w:val="single" w:sz="4" w:color="D9D9D9"/>
+              <w:right w:val="single" w:sz="4" w:color="D9D9D9"/>
+            </w:tcBorders>
+            <w:tcMar>
+              <w:top w:w="90" w:type="dxa"/>
+              <w:left w:w="90" w:type="dxa"/>
+              <w:bottom w:w="90" w:type="dxa"/>
+              <w:right w:w="90" w:type="dxa"/>
+            </w:tcMar>
+            <w:shd w:fill="FFFFFF"/>
+          </w:tcPr>
+          <w:p>
+            <w:pPr>
+              <w:spacing w:after="40" w:line="247" w:lineRule="auto"/>
+            </w:pPr>
+            <w:r>
+              <w:rPr>
+                <w:sz w:val="20"/>
+              </w:rPr>
+              <w:t>Individual donor concepts</w:t>
+            </w:r>
+          </w:p>
+        </w:tc>
+        <w:tc>
+          <w:tcPr>
+            <w:tcW w:type="dxa" w:w="3312"/>
+            <w:vAlign w:val="center"/>
+            <w:tcBorders>
+              <w:top w:val="single" w:sz="4" w:color="D9D9D9"/>
+              <w:left w:val="single" w:sz="4" w:color="D9D9D9"/>
+              <w:bottom w:val="single" w:sz="4" w:color="D9D9D9"/>
+              <w:right w:val="single" w:sz="4" w:color="D9D9D9"/>
+            </w:tcBorders>
+            <w:tcMar>
+              <w:top w:w="90" w:type="dxa"/>
+              <w:left w:w="90" w:type="dxa"/>
+              <w:bottom w:w="90" w:type="dxa"/>
+              <w:right w:w="90" w:type="dxa"/>
+            </w:tcMar>
+            <w:shd w:fill="FFFFFF"/>
+          </w:tcPr>
+          <w:p>
+            <w:pPr>
+              <w:spacing w:after="40" w:line="247" w:lineRule="auto"/>
+            </w:pPr>
+            <w:r>
+              <w:rPr>
+                <w:sz w:val="20"/>
+              </w:rPr>
+              <w:t>The meaning contributed by each donor and how it is invoked</w:t>
+            </w:r>
+          </w:p>
+        </w:tc>
+        <w:tc>
+          <w:tcPr>
+            <w:tcW w:type="dxa" w:w="4248"/>
+            <w:vAlign w:val="center"/>
+            <w:tcBorders>
+              <w:top w:val="single" w:sz="4" w:color="D9D9D9"/>
+              <w:left w:val="single" w:sz="4" w:color="D9D9D9"/>
+              <w:bottom w:val="single" w:sz="4" w:color="D9D9D9"/>
+              <w:right w:val="single" w:sz="4" w:color="D9D9D9"/>
+            </w:tcBorders>
+            <w:tcMar>
+              <w:top w:w="90" w:type="dxa"/>
+              <w:left w:w="90" w:type="dxa"/>
+              <w:bottom w:w="90" w:type="dxa"/>
+              <w:right w:w="90" w:type="dxa"/>
+            </w:tcMar>
+            <w:shd w:fill="FFFFFF"/>
+          </w:tcPr>
+          <w:p>
+            <w:pPr>
+              <w:spacing w:after="40" w:line="247" w:lineRule="auto"/>
+            </w:pPr>
+            <w:r>
+              <w:rPr>
+                <w:sz w:val="20"/>
+              </w:rPr>
+              <w:t>Concept identifier, edition, section or object, citation, and reuse status</w:t>
+            </w:r>
+          </w:p>
+        </w:tc>
+      </w:tr>
+      <w:tr>
+        <w:trPr>
+          <w:cantSplit/>
+        </w:trPr>
+        <w:tc>
+          <w:tcPr>
+            <w:tcW w:type="dxa" w:w="2232"/>
+            <w:vAlign w:val="center"/>
+            <w:tcBorders>
+              <w:top w:val="single" w:sz="4" w:color="D9D9D9"/>
+              <w:left w:val="single" w:sz="4" w:color="D9D9D9"/>
+              <w:bottom w:val="single" w:sz="4" w:color="D9D9D9"/>
+              <w:right w:val="single" w:sz="4" w:color="D9D9D9"/>
+            </w:tcBorders>
+            <w:tcMar>
+              <w:top w:w="90" w:type="dxa"/>
+              <w:left w:w="90" w:type="dxa"/>
+              <w:bottom w:w="90" w:type="dxa"/>
+              <w:right w:w="90" w:type="dxa"/>
+            </w:tcMar>
+            <w:shd w:fill="F7F7F7"/>
+          </w:tcPr>
+          <w:p>
+            <w:pPr>
+              <w:spacing w:after="40" w:line="247" w:lineRule="auto"/>
+            </w:pPr>
+            <w:r>
+              <w:rPr>
+                <w:sz w:val="20"/>
+              </w:rPr>
+              <w:t>MPSS binding</w:t>
+            </w:r>
+          </w:p>
+        </w:tc>
+        <w:tc>
+          <w:tcPr>
+            <w:tcW w:type="dxa" w:w="3312"/>
+            <w:vAlign w:val="center"/>
+            <w:tcBorders>
+              <w:top w:val="single" w:sz="4" w:color="D9D9D9"/>
+              <w:left w:val="single" w:sz="4" w:color="D9D9D9"/>
+              <w:bottom w:val="single" w:sz="4" w:color="D9D9D9"/>
+              <w:right w:val="single" w:sz="4" w:color="D9D9D9"/>
+            </w:tcBorders>
+            <w:tcMar>
+              <w:top w:w="90" w:type="dxa"/>
+              <w:left w:w="90" w:type="dxa"/>
+              <w:bottom w:w="90" w:type="dxa"/>
+              <w:right w:w="90" w:type="dxa"/>
+            </w:tcMar>
+            <w:shd w:fill="F7F7F7"/>
+          </w:tcPr>
+          <w:p>
+            <w:pPr>
+              <w:spacing w:after="40" w:line="247" w:lineRule="auto"/>
+            </w:pPr>
+            <w:r>
+              <w:rPr>
+                <w:sz w:val="20"/>
+              </w:rPr>
+              <w:t>Existing rule applied and any project-authored specialization</w:t>
+            </w:r>
+          </w:p>
+        </w:tc>
+        <w:tc>
+          <w:tcPr>
+            <w:tcW w:type="dxa" w:w="4248"/>
+            <w:vAlign w:val="center"/>
+            <w:tcBorders>
+              <w:top w:val="single" w:sz="4" w:color="D9D9D9"/>
+              <w:left w:val="single" w:sz="4" w:color="D9D9D9"/>
+              <w:bottom w:val="single" w:sz="4" w:color="D9D9D9"/>
+              <w:right w:val="single" w:sz="4" w:color="D9D9D9"/>
+            </w:tcBorders>
+            <w:tcMar>
+              <w:top w:w="90" w:type="dxa"/>
+              <w:left w:w="90" w:type="dxa"/>
+              <w:bottom w:w="90" w:type="dxa"/>
+              <w:right w:w="90" w:type="dxa"/>
+            </w:tcMar>
+            <w:shd w:fill="F7F7F7"/>
+          </w:tcPr>
+          <w:p>
+            <w:pPr>
+              <w:spacing w:after="40" w:line="247" w:lineRule="auto"/>
+            </w:pPr>
+            <w:r>
+              <w:rPr>
+                <w:sz w:val="20"/>
+              </w:rPr>
+              <w:t>Exact rule, rationale, and remaining gap</w:t>
+            </w:r>
+          </w:p>
+        </w:tc>
+      </w:tr>
+      <w:tr>
+        <w:trPr>
+          <w:cantSplit/>
+        </w:trPr>
+        <w:tc>
+          <w:tcPr>
+            <w:tcW w:type="dxa" w:w="2232"/>
+            <w:vAlign w:val="center"/>
+            <w:tcBorders>
+              <w:top w:val="single" w:sz="4" w:color="D9D9D9"/>
+              <w:left w:val="single" w:sz="4" w:color="D9D9D9"/>
+              <w:bottom w:val="single" w:sz="4" w:color="D9D9D9"/>
+              <w:right w:val="single" w:sz="4" w:color="D9D9D9"/>
+            </w:tcBorders>
+            <w:tcMar>
+              <w:top w:w="90" w:type="dxa"/>
+              <w:left w:w="90" w:type="dxa"/>
+              <w:bottom w:w="90" w:type="dxa"/>
+              <w:right w:w="90" w:type="dxa"/>
+            </w:tcMar>
+            <w:shd w:fill="FFFFFF"/>
+          </w:tcPr>
+          <w:p>
+            <w:pPr>
+              <w:spacing w:after="40" w:line="247" w:lineRule="auto"/>
+            </w:pPr>
+            <w:r>
+              <w:rPr>
+                <w:sz w:val="20"/>
+              </w:rPr>
+              <w:t>Standard representation</w:t>
+            </w:r>
+          </w:p>
+        </w:tc>
+        <w:tc>
+          <w:tcPr>
+            <w:tcW w:type="dxa" w:w="3312"/>
+            <w:vAlign w:val="center"/>
+            <w:tcBorders>
+              <w:top w:val="single" w:sz="4" w:color="D9D9D9"/>
+              <w:left w:val="single" w:sz="4" w:color="D9D9D9"/>
+              <w:bottom w:val="single" w:sz="4" w:color="D9D9D9"/>
+              <w:right w:val="single" w:sz="4" w:color="D9D9D9"/>
+            </w:tcBorders>
+            <w:tcMar>
+              <w:top w:w="90" w:type="dxa"/>
+              <w:left w:w="90" w:type="dxa"/>
+              <w:bottom w:w="90" w:type="dxa"/>
+              <w:right w:w="90" w:type="dxa"/>
+            </w:tcMar>
+            <w:shd w:fill="FFFFFF"/>
+          </w:tcPr>
+          <w:p>
+            <w:pPr>
+              <w:spacing w:after="40" w:line="247" w:lineRule="auto"/>
+            </w:pPr>
+            <w:r>
+              <w:rPr>
+                <w:sz w:val="20"/>
+              </w:rPr>
+              <w:t>CSAPI resource/association and SensorML/SWE carrier</w:t>
+            </w:r>
+          </w:p>
+        </w:tc>
+        <w:tc>
+          <w:tcPr>
+            <w:tcW w:type="dxa" w:w="4248"/>
+            <w:vAlign w:val="center"/>
+            <w:tcBorders>
+              <w:top w:val="single" w:sz="4" w:color="D9D9D9"/>
+              <w:left w:val="single" w:sz="4" w:color="D9D9D9"/>
+              <w:bottom w:val="single" w:sz="4" w:color="D9D9D9"/>
+              <w:right w:val="single" w:sz="4" w:color="D9D9D9"/>
+            </w:tcBorders>
+            <w:tcMar>
+              <w:top w:w="90" w:type="dxa"/>
+              <w:left w:w="90" w:type="dxa"/>
+              <w:bottom w:w="90" w:type="dxa"/>
+              <w:right w:w="90" w:type="dxa"/>
+            </w:tcMar>
+            <w:shd w:fill="FFFFFF"/>
+          </w:tcPr>
+          <w:p>
+            <w:pPr>
+              <w:spacing w:after="40" w:line="247" w:lineRule="auto"/>
+            </w:pPr>
+            <w:r>
+              <w:rPr>
+                <w:sz w:val="20"/>
+              </w:rPr>
+              <w:t>Standard clause, field/component, definition, and unit</w:t>
+            </w:r>
+          </w:p>
+        </w:tc>
+      </w:tr>
+      <w:tr>
+        <w:trPr>
+          <w:cantSplit/>
+        </w:trPr>
+        <w:tc>
+          <w:tcPr>
+            <w:tcW w:type="dxa" w:w="2232"/>
+            <w:vAlign w:val="center"/>
+            <w:tcBorders>
+              <w:top w:val="single" w:sz="4" w:color="D9D9D9"/>
+              <w:left w:val="single" w:sz="4" w:color="D9D9D9"/>
+              <w:bottom w:val="single" w:sz="4" w:color="D9D9D9"/>
+              <w:right w:val="single" w:sz="4" w:color="D9D9D9"/>
+            </w:tcBorders>
+            <w:tcMar>
+              <w:top w:w="90" w:type="dxa"/>
+              <w:left w:w="90" w:type="dxa"/>
+              <w:bottom w:w="90" w:type="dxa"/>
+              <w:right w:w="90" w:type="dxa"/>
+            </w:tcMar>
+            <w:shd w:fill="F7F7F7"/>
+          </w:tcPr>
+          <w:p>
+            <w:pPr>
+              <w:spacing w:after="40" w:line="247" w:lineRule="auto"/>
+            </w:pPr>
+            <w:r>
+              <w:rPr>
+                <w:sz w:val="20"/>
+              </w:rPr>
+              <w:t>Transformation and presentation</w:t>
+            </w:r>
+          </w:p>
+        </w:tc>
+        <w:tc>
+          <w:tcPr>
+            <w:tcW w:type="dxa" w:w="3312"/>
+            <w:vAlign w:val="center"/>
+            <w:tcBorders>
+              <w:top w:val="single" w:sz="4" w:color="D9D9D9"/>
+              <w:left w:val="single" w:sz="4" w:color="D9D9D9"/>
+              <w:bottom w:val="single" w:sz="4" w:color="D9D9D9"/>
+              <w:right w:val="single" w:sz="4" w:color="D9D9D9"/>
+            </w:tcBorders>
+            <w:tcMar>
+              <w:top w:w="90" w:type="dxa"/>
+              <w:left w:w="90" w:type="dxa"/>
+              <w:bottom w:w="90" w:type="dxa"/>
+              <w:right w:w="90" w:type="dxa"/>
+            </w:tcMar>
+            <w:shd w:fill="F7F7F7"/>
+          </w:tcPr>
+          <w:p>
+            <w:pPr>
+              <w:spacing w:after="40" w:line="247" w:lineRule="auto"/>
+            </w:pPr>
+            <w:r>
+              <w:rPr>
+                <w:sz w:val="20"/>
+              </w:rPr>
+              <w:t>Authored conversion, enrichment, label, or grouping and its reason</w:t>
+            </w:r>
+          </w:p>
+        </w:tc>
+        <w:tc>
+          <w:tcPr>
+            <w:tcW w:type="dxa" w:w="4248"/>
+            <w:vAlign w:val="center"/>
+            <w:tcBorders>
+              <w:top w:val="single" w:sz="4" w:color="D9D9D9"/>
+              <w:left w:val="single" w:sz="4" w:color="D9D9D9"/>
+              <w:bottom w:val="single" w:sz="4" w:color="D9D9D9"/>
+              <w:right w:val="single" w:sz="4" w:color="D9D9D9"/>
+            </w:tcBorders>
+            <w:tcMar>
+              <w:top w:w="90" w:type="dxa"/>
+              <w:left w:w="90" w:type="dxa"/>
+              <w:bottom w:w="90" w:type="dxa"/>
+              <w:right w:w="90" w:type="dxa"/>
+            </w:tcMar>
+            <w:shd w:fill="F7F7F7"/>
+          </w:tcPr>
+          <w:p>
+            <w:pPr>
+              <w:spacing w:after="40" w:line="247" w:lineRule="auto"/>
+            </w:pPr>
+            <w:r>
+              <w:rPr>
+                <w:sz w:val="20"/>
+              </w:rPr>
+              <w:t>Mapping revision, code/listing, and source-to-display trace</w:t>
+            </w:r>
+          </w:p>
+        </w:tc>
+      </w:tr>
+      <w:tr>
+        <w:trPr>
+          <w:cantSplit/>
+        </w:trPr>
+        <w:tc>
+          <w:tcPr>
+            <w:tcW w:type="dxa" w:w="2232"/>
+            <w:vAlign w:val="center"/>
+            <w:tcBorders>
+              <w:top w:val="single" w:sz="4" w:color="D9D9D9"/>
+              <w:left w:val="single" w:sz="4" w:color="D9D9D9"/>
+              <w:bottom w:val="single" w:sz="4" w:color="D9D9D9"/>
+              <w:right w:val="single" w:sz="4" w:color="D9D9D9"/>
+            </w:tcBorders>
+            <w:tcMar>
+              <w:top w:w="90" w:type="dxa"/>
+              <w:left w:w="90" w:type="dxa"/>
+              <w:bottom w:w="90" w:type="dxa"/>
+              <w:right w:w="90" w:type="dxa"/>
+            </w:tcMar>
+            <w:shd w:fill="FFFFFF"/>
+          </w:tcPr>
+          <w:p>
+            <w:pPr>
+              <w:spacing w:after="40" w:line="247" w:lineRule="auto"/>
+            </w:pPr>
+            <w:r>
+              <w:rPr>
+                <w:sz w:val="20"/>
+              </w:rPr>
+              <w:t>Review outcome</w:t>
+            </w:r>
+          </w:p>
+        </w:tc>
+        <w:tc>
+          <w:tcPr>
+            <w:tcW w:type="dxa" w:w="3312"/>
+            <w:vAlign w:val="center"/>
+            <w:tcBorders>
+              <w:top w:val="single" w:sz="4" w:color="D9D9D9"/>
+              <w:left w:val="single" w:sz="4" w:color="D9D9D9"/>
+              <w:bottom w:val="single" w:sz="4" w:color="D9D9D9"/>
+              <w:right w:val="single" w:sz="4" w:color="D9D9D9"/>
+            </w:tcBorders>
+            <w:tcMar>
+              <w:top w:w="90" w:type="dxa"/>
+              <w:left w:w="90" w:type="dxa"/>
+              <w:bottom w:w="90" w:type="dxa"/>
+              <w:right w:w="90" w:type="dxa"/>
+            </w:tcMar>
+            <w:shd w:fill="FFFFFF"/>
+          </w:tcPr>
+          <w:p>
+            <w:pPr>
+              <w:spacing w:after="40" w:line="247" w:lineRule="auto"/>
+            </w:pPr>
+            <w:r>
+              <w:rPr>
+                <w:sz w:val="20"/>
+              </w:rPr>
+              <w:t>What was preserved, unsupported, changed, or left unresolved</w:t>
+            </w:r>
+          </w:p>
+        </w:tc>
+        <w:tc>
+          <w:tcPr>
+            <w:tcW w:type="dxa" w:w="4248"/>
+            <w:vAlign w:val="center"/>
+            <w:tcBorders>
+              <w:top w:val="single" w:sz="4" w:color="D9D9D9"/>
+              <w:left w:val="single" w:sz="4" w:color="D9D9D9"/>
+              <w:bottom w:val="single" w:sz="4" w:color="D9D9D9"/>
+              <w:right w:val="single" w:sz="4" w:color="D9D9D9"/>
+            </w:tcBorders>
+            <w:tcMar>
+              <w:top w:w="90" w:type="dxa"/>
+              <w:left w:w="90" w:type="dxa"/>
+              <w:bottom w:w="90" w:type="dxa"/>
+              <w:right w:w="90" w:type="dxa"/>
+            </w:tcMar>
+            <w:shd w:fill="FFFFFF"/>
+          </w:tcPr>
+          <w:p>
+            <w:pPr>
+              <w:spacing w:after="40" w:line="247" w:lineRule="auto"/>
+            </w:pPr>
+            <w:r>
+              <w:rPr>
+                <w:sz w:val="20"/>
+              </w:rPr>
+              <w:t>Executed check, evidence, and explicit limits</w:t>
+            </w:r>
+          </w:p>
+        </w:tc>
+      </w:tr>
+    </w:tbl>
+    <w:p>
+      <w:pPr>
+        <w:spacing w:after="40" w:before="0" w:line="60" w:lineRule="exact"/>
+      </w:pPr>
+    </w:p>
+    <w:p>
+      <w:pPr>
+        <w:pStyle w:val="Heading2"/>
+      </w:pPr>
+      <w:r>
+        <w:rPr/>
+        <w:t>Illustrative encoding</w:t>
       </w:r>
     </w:p>
     <w:p>
@@ -1417,7 +2245,7 @@
       </w:r>
       <w:r>
         <w:rPr/>
-        <w:t xml:space="preserve"> This JSON fragment is explanatory authored content. It is not a complete System, a served resource, a completed adapter mapping, or an executed conformance result.</w:t>
+        <w:t xml:space="preserve"> This JSON fragment is explanatory authored content. It is not a complete System or a served resource. It does not represent a completed adapter mapping or an executed conformance result.</w:t>
       </w:r>
     </w:p>
     <w:p>
@@ -1551,17 +2379,265 @@
       </w:pPr>
       <w:r>
         <w:rPr/>
-        <w:t>Expected domain coverage</w:t>
+        <w:t>Temperature mapping SC TEMP 01</w:t>
+      </w:r>
+    </w:p>
+    <w:p>
+      <w:pPr/>
+      <w:r>
+        <w:rPr/>
+        <w:t xml:space="preserve">Mapping </w:t>
+      </w:r>
+      <w:r>
+        <w:rPr>
+          <w:rFonts w:ascii="DejaVu Sans Mono" w:hAnsi="DejaVu Sans Mono"/>
+          <w:sz w:val="19"/>
+        </w:rPr>
+        <w:t>SC-TEMP-01</w:t>
+      </w:r>
+      <w:r>
+        <w:rPr/>
+        <w:t xml:space="preserve"> links the captured temperature channel to the proposed output declaration in Listing 2. The source supplies channel identifier 55, the value 19.82, a Celsius unit reference, an air-temperature definition reference, and the channel's source timestamp (MERLIN Project 2026b, record “smart-citizen-current-19639”). In the underlying model, this is an observation of an environmental property produced by a sensing system, with a result that remains distinct from the system description. MPSS R11 requires the producer, observed subject, and temporal context to remain distinguishable, so the observation cannot become a measurement of the kit merely because the kit reported it (MERLIN Project 2026a, sec. 5.8, R11). R10 also keeps a declared output distinct from the availability of recorded data (MERLIN Project 2026a, sec. 5.8, R10).</w:t>
+      </w:r>
+    </w:p>
+    <w:p>
+      <w:pPr/>
+      <w:r>
+        <w:rPr/>
+        <w:t xml:space="preserve">The observation-concept lineage runs through CSAPI to W3C SOSA/SSN: CSAPI explicitly identifies that semantic foundation, while documenting its own adaptations and allowing representations other than RDF (Open Geospatial Consortium 2025a, annex C.1). The individual contributing concepts are </w:t>
+      </w:r>
+      <w:r>
+        <w:rPr>
+          <w:rFonts w:ascii="DejaVu Sans Mono" w:hAnsi="DejaVu Sans Mono"/>
+          <w:sz w:val="19"/>
+        </w:rPr>
+        <w:t>sosa:Sensor</w:t>
+      </w:r>
+      <w:r>
+        <w:rPr/>
+        <w:t xml:space="preserve">, </w:t>
+      </w:r>
+      <w:r>
+        <w:rPr>
+          <w:rFonts w:ascii="DejaVu Sans Mono" w:hAnsi="DejaVu Sans Mono"/>
+          <w:sz w:val="19"/>
+        </w:rPr>
+        <w:t>sosa:Observation</w:t>
+      </w:r>
+      <w:r>
+        <w:rPr/>
+        <w:t xml:space="preserve">, </w:t>
+      </w:r>
+      <w:r>
+        <w:rPr>
+          <w:rFonts w:ascii="DejaVu Sans Mono" w:hAnsi="DejaVu Sans Mono"/>
+          <w:sz w:val="19"/>
+        </w:rPr>
+        <w:t>sosa:ObservableProperty</w:t>
+      </w:r>
+      <w:r>
+        <w:rPr/>
+        <w:t xml:space="preserve">, </w:t>
+      </w:r>
+      <w:r>
+        <w:rPr>
+          <w:rFonts w:ascii="DejaVu Sans Mono" w:hAnsi="DejaVu Sans Mono"/>
+          <w:sz w:val="19"/>
+        </w:rPr>
+        <w:t>sosa:FeatureOfInterest</w:t>
+      </w:r>
+      <w:r>
+        <w:rPr/>
+        <w:t xml:space="preserve">, and </w:t>
+      </w:r>
+      <w:r>
+        <w:rPr>
+          <w:rFonts w:ascii="DejaVu Sans Mono" w:hAnsi="DejaVu Sans Mono"/>
+          <w:sz w:val="19"/>
+        </w:rPr>
+        <w:t>sosa:Result</w:t>
+      </w:r>
+      <w:r>
+        <w:rPr/>
+        <w:t xml:space="preserve">, which distinguish producer, observation activity, observed property, subject, and outcome (World Wide Web Consortium 2017, secs. 4.3.2, 4.6.2, 4.7.2). CSAPI supplies the DataStream and Observation resources and their associations; its observation </w:t>
+      </w:r>
+      <w:r>
+        <w:rPr>
+          <w:rFonts w:ascii="DejaVu Sans Mono" w:hAnsi="DejaVu Sans Mono"/>
+          <w:sz w:val="19"/>
+        </w:rPr>
+        <w:t>result</w:t>
+      </w:r>
+      <w:r>
+        <w:rPr/>
+        <w:t xml:space="preserve"> corresponds to </w:t>
+      </w:r>
+      <w:r>
+        <w:rPr>
+          <w:rFonts w:ascii="DejaVu Sans Mono" w:hAnsi="DejaVu Sans Mono"/>
+          <w:sz w:val="19"/>
+        </w:rPr>
+        <w:t>sosa:hasResult</w:t>
+      </w:r>
+      <w:r>
+        <w:rPr/>
+        <w:t xml:space="preserve">, and </w:t>
+      </w:r>
+      <w:r>
+        <w:rPr>
+          <w:rFonts w:ascii="DejaVu Sans Mono" w:hAnsi="DejaVu Sans Mono"/>
+          <w:sz w:val="19"/>
+        </w:rPr>
+        <w:t>samplingFeature</w:t>
+      </w:r>
+      <w:r>
+        <w:rPr/>
+        <w:t xml:space="preserve"> corresponds to </w:t>
+      </w:r>
+      <w:r>
+        <w:rPr>
+          <w:rFonts w:ascii="DejaVu Sans Mono" w:hAnsi="DejaVu Sans Mono"/>
+          <w:sz w:val="19"/>
+        </w:rPr>
+        <w:t>sosa:hasFeatureOfInterest</w:t>
+      </w:r>
+      <w:r>
+        <w:rPr/>
+        <w:t xml:space="preserve"> (Open Geospatial Consortium 2025b, secs. 9.2, 9.7). This is an identified conceptual contribution through the standard, rather than an assertion that every SOSA/SSN term or constraint is adopted by the experiment.</w:t>
+      </w:r>
+    </w:p>
+    <w:p>
+      <w:pPr/>
+      <w:r>
+        <w:rPr/>
+        <w:t xml:space="preserve">Two further source contributions explain the property and unit: GEMET concept 281 identifies air temperature, and QUDT </w:t>
+      </w:r>
+      <w:r>
+        <w:rPr>
+          <w:rFonts w:ascii="DejaVu Sans Mono" w:hAnsi="DejaVu Sans Mono"/>
+          <w:sz w:val="19"/>
+        </w:rPr>
+        <w:t>unit:DEG_C</w:t>
+      </w:r>
+      <w:r>
+        <w:rPr/>
+        <w:t xml:space="preserve"> identifies degree Celsius (European Environment Agency 2021; QUDT.org n.d.). These are the vocabulary references carried by the native specimen; retaining them does not establish that they were historical donors to every part of the DIM. SWE's Quantity, semantic </w:t>
+      </w:r>
+      <w:r>
+        <w:rPr>
+          <w:rFonts w:ascii="DejaVu Sans Mono" w:hAnsi="DejaVu Sans Mono"/>
+          <w:sz w:val="19"/>
+        </w:rPr>
+        <w:t>definition</w:t>
+      </w:r>
+      <w:r>
+        <w:rPr/>
+        <w:t xml:space="preserve">, and unit-reference mechanisms provide the typed representation, while SensorML's </w:t>
+      </w:r>
+      <w:r>
+        <w:rPr>
+          <w:rFonts w:ascii="DejaVu Sans Mono" w:hAnsi="DejaVu Sans Mono"/>
+          <w:sz w:val="19"/>
+        </w:rPr>
+        <w:t>outputs</w:t>
+      </w:r>
+      <w:r>
+        <w:rPr/>
+        <w:t xml:space="preserve"> member declares the output (Open Geospatial Consortium 2025c, secs. 8.2, 9.1; 2025d, secs. 7.3, 8.2, 9.1). The local name </w:t>
+      </w:r>
+      <w:r>
+        <w:rPr>
+          <w:rFonts w:ascii="DejaVu Sans Mono" w:hAnsi="DejaVu Sans Mono"/>
+          <w:sz w:val="19"/>
+        </w:rPr>
+        <w:t>airTemperature</w:t>
+      </w:r>
+      <w:r>
+        <w:rPr/>
+        <w:t xml:space="preserve"> and display label remain authored choices, while the final producer identity, sampling subject, observation-time interpretation, and executed CSAPI publication remain to be resolved and tested.</w:t>
       </w:r>
     </w:p>
     <w:p>
       <w:pPr>
-        <w:pStyle w:val="PaperCaption"/>
-        <w:keepNext/>
+        <w:pStyle w:val="Heading2"/>
       </w:pPr>
       <w:r>
         <w:rPr/>
-        <w:t>Table 2 describes expected coverage from the inspected public evidence and proposed documentary enrichment. These are assessment expectations, not completed implementation results. The profile's inclusion of a subject does not require an unsupported source assertion (MERLIN Project 2026a, secs. 4, 5.1; 2026b; 2026c).</w:t>
+        <w:t>Battery mapping SC BATT 01</w:t>
+      </w:r>
+    </w:p>
+    <w:p>
+      <w:pPr/>
+      <w:r>
+        <w:rPr/>
+        <w:t xml:space="preserve">Mapping </w:t>
+      </w:r>
+      <w:r>
+        <w:rPr>
+          <w:rFonts w:ascii="DejaVu Sans Mono" w:hAnsi="DejaVu Sans Mono"/>
+          <w:sz w:val="19"/>
+        </w:rPr>
+        <w:t>SC-BATT-01</w:t>
+      </w:r>
+      <w:r>
+        <w:rPr/>
+        <w:t xml:space="preserve"> concerns the source-reported remaining battery level of 99 percent, not a demonstrated physical power arrangement (MERLIN Project 2026b, record “smart-citizen-current-19639”). The underlying model distinguishes a reported property from an identified power-source entity and from a relationship describing which equipment it supplies. MPSS R17 preserves the quantity, subject, measurement point, time, and reading-versus-estimate meaning, while R11 preserves producer-versus-subject context (MERLIN Project 2026a, secs. 5.8, 5.10). Its Sensor, Observation, ObservableProperty, FeatureOfInterest, and Result distinctions follow the same SOSA/SSN lineage explained for </w:t>
+      </w:r>
+      <w:r>
+        <w:rPr>
+          <w:rFonts w:ascii="DejaVu Sans Mono" w:hAnsi="DejaVu Sans Mono"/>
+          <w:sz w:val="19"/>
+        </w:rPr>
+        <w:t>SC-TEMP-01</w:t>
+      </w:r>
+      <w:r>
+        <w:rPr/>
+        <w:t xml:space="preserve"> (World Wide Web Consortium 2017, secs. 4.3.2, 4.6.2, 4.7.2; Open Geospatial Consortium 2025a, annex C.1). A percent-scaled SWE Quantity within a CSAPI stream/observation representation is a proposed carrier, but the exact property definition and observation contract still require a completed mapping record (Open Geospatial Consortium 2025b, secs. 9.2, 9.6–9.7; 2025d, secs. 8.2.8, 9.1.9).</w:t>
+      </w:r>
+    </w:p>
+    <w:p>
+      <w:pPr/>
+      <w:r>
+        <w:rPr/>
+        <w:t>RFC 7326 contributes distinct power-source, metering, and aggregation relationship concepts; its Power Source Relationship concerns the energy-supply interconnection (Parello et al. 2014, secs. 6.6, 8.1–8.3). In this mapping, those concepts constrain interpretation by explaining why a battery percentage does not itself establish a supply edge. R16's OGC relationship binding is authored by MERLIN, so any later topology mapping must identify the reused RFC meaning and assess the binding's adaptations separately (MERLIN Project 2026a, sec. 5.10, R16). The present percentage mapping does not instantiate any of these three relationship concepts, and the paper will report that absence explicitly.</w:t>
+      </w:r>
+    </w:p>
+    <w:p>
+      <w:pPr/>
+      <w:r>
+        <w:rPr/>
+        <w:t xml:space="preserve">RFC 7577 supplies separate battery-monitoring concepts, including </w:t>
+      </w:r>
+      <w:r>
+        <w:rPr>
+          <w:rFonts w:ascii="DejaVu Sans Mono" w:hAnsi="DejaVu Sans Mono"/>
+          <w:sz w:val="19"/>
+        </w:rPr>
+        <w:t>batteryActualCharge</w:t>
+      </w:r>
+      <w:r>
+        <w:rPr/>
+        <w:t xml:space="preserve"> in milliampere hours and </w:t>
+      </w:r>
+      <w:r>
+        <w:rPr>
+          <w:rFonts w:ascii="DejaVu Sans Mono" w:hAnsi="DejaVu Sans Mono"/>
+          <w:sz w:val="19"/>
+        </w:rPr>
+        <w:t>batteryActualVoltage</w:t>
+      </w:r>
+      <w:r>
+        <w:rPr/>
+        <w:t xml:space="preserve"> in millivolts (Quittek et al. 2015, sec. 4). Neither quantity is established by a percentage alone, so this mapping has no demonstrated equivalence to either individual MIB object. The RFC is used here to test and reject unsupported substitutions, rather than to claim a directly reused battery-field definition. The proposed display therefore retains the supplier's percentage and its evidence limits without adding charge in milliampere hours, voltage, runtime, battery identity, or charging state.</w:t>
+      </w:r>
+    </w:p>
+    <w:p>
+      <w:pPr>
+        <w:pStyle w:val="Heading2"/>
+      </w:pPr>
+      <w:r>
+        <w:rPr/>
+        <w:t>Expected domain coverage</w:t>
       </w:r>
     </w:p>
     <w:p>
@@ -1573,7 +2649,11 @@
         <w:rPr>
           <w:b/>
         </w:rPr>
-        <w:t>Table 2. Expected coverage and remaining evidence needs.</w:t>
+        <w:t>Table 3. Expected coverage and remaining evidence needs.</w:t>
+      </w:r>
+      <w:r>
+        <w:rPr/>
+        <w:t xml:space="preserve"> The starting material comes from inspected public evidence and proposed documentary enrichment. These are assessment expectations, not completed implementation results. The profile's inclusion of a subject does not require an unsupported source assertion (MERLIN Project 2026a, secs. 4, 5.1; 2026b; 2026c).</w:t>
       </w:r>
     </w:p>
     <w:tbl>
@@ -2502,13 +3582,6 @@
       </w:r>
     </w:p>
     <w:p>
-      <w:pPr/>
-      <w:r>
-        <w:rPr/>
-        <w:t>Structural checks will use the applicable target schemas, parsers, reference-resolution rules, and actual service responses. Semantic checks will compare the source meaning with the meaning represented and displayed. Each executed check will record the input revision, tool/version, scope, outcome, and evidence location. Illustrative code in this draft remains separate from executed evidence.</w:t>
-      </w:r>
-    </w:p>
-    <w:p>
       <w:pPr>
         <w:pStyle w:val="PaperCaption"/>
         <w:keepNext/>
@@ -2517,7 +3590,11 @@
         <w:rPr>
           <w:b/>
         </w:rPr>
-        <w:t>Table 3. Proposed evaluation criteria.</w:t>
+        <w:t>Table 4. Proposed evaluation criteria.</w:t>
+      </w:r>
+      <w:r>
+        <w:rPr/>
+        <w:t xml:space="preserve"> Structural checks will use the applicable target schemas, parsers, reference-resolution rules, and actual service responses. Semantic checks will compare the source meaning with the meaning represented and displayed. Each executed check will record the input revision, tool/version, scope, outcome, and evidence location. Illustrative code in this draft remains separate from executed evidence.</w:t>
       </w:r>
     </w:p>
     <w:tbl>
@@ -2694,6 +3771,71 @@
               <w:rPr>
                 <w:sz w:val="20"/>
               </w:rPr>
+              <w:t>Concept lineage</w:t>
+            </w:r>
+          </w:p>
+        </w:tc>
+        <w:tc>
+          <w:tcPr>
+            <w:tcW w:type="dxa" w:w="6912"/>
+            <w:vAlign w:val="center"/>
+            <w:tcBorders>
+              <w:top w:val="single" w:sz="4" w:color="D9D9D9"/>
+              <w:left w:val="single" w:sz="4" w:color="D9D9D9"/>
+              <w:bottom w:val="single" w:sz="4" w:color="D9D9D9"/>
+              <w:right w:val="single" w:sz="4" w:color="D9D9D9"/>
+            </w:tcBorders>
+            <w:tcMar>
+              <w:top w:w="90" w:type="dxa"/>
+              <w:left w:w="90" w:type="dxa"/>
+              <w:bottom w:w="90" w:type="dxa"/>
+              <w:right w:w="90" w:type="dxa"/>
+            </w:tcMar>
+            <w:shd w:fill="F7F7F7"/>
+          </w:tcPr>
+          <w:p>
+            <w:pPr>
+              <w:spacing w:after="40" w:line="247" w:lineRule="auto"/>
+            </w:pPr>
+            <w:r>
+              <w:rPr>
+                <w:sz w:val="20"/>
+              </w:rPr>
+              <w:t>Individual donor concepts, exact citations, model/binding connections, reuse or adaptation decisions, and unestablished links</w:t>
+            </w:r>
+          </w:p>
+        </w:tc>
+      </w:tr>
+      <w:tr>
+        <w:trPr>
+          <w:cantSplit/>
+        </w:trPr>
+        <w:tc>
+          <w:tcPr>
+            <w:tcW w:type="dxa" w:w="2880"/>
+            <w:vAlign w:val="center"/>
+            <w:tcBorders>
+              <w:top w:val="single" w:sz="4" w:color="D9D9D9"/>
+              <w:left w:val="single" w:sz="4" w:color="D9D9D9"/>
+              <w:bottom w:val="single" w:sz="4" w:color="D9D9D9"/>
+              <w:right w:val="single" w:sz="4" w:color="D9D9D9"/>
+            </w:tcBorders>
+            <w:tcMar>
+              <w:top w:w="90" w:type="dxa"/>
+              <w:left w:w="90" w:type="dxa"/>
+              <w:bottom w:w="90" w:type="dxa"/>
+              <w:right w:w="90" w:type="dxa"/>
+            </w:tcMar>
+            <w:shd w:fill="FFFFFF"/>
+          </w:tcPr>
+          <w:p>
+            <w:pPr>
+              <w:spacing w:after="40" w:line="247" w:lineRule="auto"/>
+            </w:pPr>
+            <w:r>
+              <w:rPr>
+                <w:sz w:val="20"/>
+              </w:rPr>
               <w:t>Semantic preservation</w:t>
             </w:r>
           </w:p>
@@ -2714,7 +3856,7 @@
               <w:bottom w:w="90" w:type="dxa"/>
               <w:right w:w="90" w:type="dxa"/>
             </w:tcMar>
-            <w:shd w:fill="F7F7F7"/>
+            <w:shd w:fill="FFFFFF"/>
           </w:tcPr>
           <w:p>
             <w:pPr>
@@ -2749,7 +3891,7 @@
               <w:bottom w:w="90" w:type="dxa"/>
               <w:right w:w="90" w:type="dxa"/>
             </w:tcMar>
-            <w:shd w:fill="FFFFFF"/>
+            <w:shd w:fill="F7F7F7"/>
           </w:tcPr>
           <w:p>
             <w:pPr>
@@ -2779,7 +3921,7 @@
               <w:bottom w:w="90" w:type="dxa"/>
               <w:right w:w="90" w:type="dxa"/>
             </w:tcMar>
-            <w:shd w:fill="FFFFFF"/>
+            <w:shd w:fill="F7F7F7"/>
           </w:tcPr>
           <w:p>
             <w:pPr>
@@ -2814,7 +3956,7 @@
               <w:bottom w:w="90" w:type="dxa"/>
               <w:right w:w="90" w:type="dxa"/>
             </w:tcMar>
-            <w:shd w:fill="F7F7F7"/>
+            <w:shd w:fill="FFFFFF"/>
           </w:tcPr>
           <w:p>
             <w:pPr>
@@ -2844,7 +3986,7 @@
               <w:bottom w:w="90" w:type="dxa"/>
               <w:right w:w="90" w:type="dxa"/>
             </w:tcMar>
-            <w:shd w:fill="F7F7F7"/>
+            <w:shd w:fill="FFFFFF"/>
           </w:tcPr>
           <w:p>
             <w:pPr>
@@ -2879,7 +4021,7 @@
               <w:bottom w:w="90" w:type="dxa"/>
               <w:right w:w="90" w:type="dxa"/>
             </w:tcMar>
-            <w:shd w:fill="FFFFFF"/>
+            <w:shd w:fill="F7F7F7"/>
           </w:tcPr>
           <w:p>
             <w:pPr>
@@ -2909,7 +4051,7 @@
               <w:bottom w:w="90" w:type="dxa"/>
               <w:right w:w="90" w:type="dxa"/>
             </w:tcMar>
-            <w:shd w:fill="FFFFFF"/>
+            <w:shd w:fill="F7F7F7"/>
           </w:tcPr>
           <w:p>
             <w:pPr>
@@ -2944,7 +4086,7 @@
               <w:bottom w:w="90" w:type="dxa"/>
               <w:right w:w="90" w:type="dxa"/>
             </w:tcMar>
-            <w:shd w:fill="F7F7F7"/>
+            <w:shd w:fill="FFFFFF"/>
           </w:tcPr>
           <w:p>
             <w:pPr>
@@ -2974,7 +4116,7 @@
               <w:bottom w:w="90" w:type="dxa"/>
               <w:right w:w="90" w:type="dxa"/>
             </w:tcMar>
-            <w:shd w:fill="F7F7F7"/>
+            <w:shd w:fill="FFFFFF"/>
           </w:tcPr>
           <w:p>
             <w:pPr>
@@ -3048,11 +4190,11 @@
         <w:rPr>
           <w:b/>
         </w:rPr>
-        <w:t>Table 4. Planned figures and evidence status.</w:t>
+        <w:t>Table 5. Planned figures and evidence status.</w:t>
       </w:r>
       <w:r>
         <w:rPr/>
-        <w:t xml:space="preserve"> Figures 3–5 are reserved evidence slots; no substitute or simulated screenshots are presented.</w:t>
+        <w:t xml:space="preserve"> Figures 1 and 2 are authored diagrams of the proposed experiment. Figures 3–5 are reserved evidence slots. No substitute or simulated screenshots are presented.</w:t>
       </w:r>
     </w:p>
     <w:tbl>
@@ -3161,7 +4303,7 @@
                 <w:b/>
                 <w:sz w:val="20"/>
               </w:rPr>
-              <w:t>Status in version 0.1</w:t>
+              <w:t>Status in version 0.2</w:t>
             </w:r>
           </w:p>
         </w:tc>
@@ -3673,7 +4815,7 @@
       </w:r>
       <w:r>
         <w:rPr/>
-        <w:t xml:space="preserve"> No experimental success rate, task-time improvement, or user outcome is reported in version 0.1. The public access observations in section 4 establish limited feasibility and remain separate from experimental results.</w:t>
+        <w:t xml:space="preserve"> No experimental success rate, task-time improvement, or user outcome is reported in version 0.2. The public access observations in section 4 establish limited feasibility and remain separate from experimental results.</w:t>
       </w:r>
     </w:p>
     <w:p>
@@ -3740,6 +4882,13 @@
       <w:pPr/>
       <w:r>
         <w:rPr/>
+        <w:t>Narrative paragraphs, including the abstract and explanatory figure, table, and listing captions, will contain three to five sentences. Headings, metadata, research-question items, table cells, code, and reference entries retain their respective structural formats. The publication check will enforce the paragraph rule, while editorial review will assess whether each paragraph develops a coherent point. Each mapping revision must also maintain the individual donor attributions and the explanation of its model and standard-representation roles.</w:t>
+      </w:r>
+    </w:p>
+    <w:p>
+      <w:pPr/>
+      <w:r>
+        <w:rPr/>
         <w:t>References use the Chicago Manual of Style eighteenth-edition author-date system. Undated pages retain access dates; same-author/same-year suffixes are applied consistently; citations identify specific sections or evidence records when useful. “MERLIN Project” is an editorial corporate-author label for the cited project working documents, not a claim of individual authorship or outside institutional endorsement (University of Chicago Press n.d.).</w:t>
       </w:r>
     </w:p>
@@ -3773,6 +4922,25 @@
       <w:r>
         <w:rPr/>
         <w:t>References</w:t>
+      </w:r>
+    </w:p>
+    <w:p>
+      <w:pPr>
+        <w:pStyle w:val="PaperReference"/>
+      </w:pPr>
+      <w:r>
+        <w:rPr/>
+        <w:t xml:space="preserve">European Environment Agency. 2021. “Air Temperature.” </w:t>
+      </w:r>
+      <w:r>
+        <w:rPr>
+          <w:i/>
+        </w:rPr>
+        <w:t>GEMET</w:t>
+      </w:r>
+      <w:r>
+        <w:rPr/>
+        <w:t>, version 4.2.3, December 6. Concept 281. Accessed October 24, 2026. https://www.eionet.europa.eu/gemet/en/concept/281.</w:t>
       </w:r>
     </w:p>
     <w:p>
@@ -3949,6 +5117,25 @@
       </w:pPr>
       <w:r>
         <w:rPr/>
+        <w:t xml:space="preserve">QUDT.org. n.d. “Degree Celsius.” </w:t>
+      </w:r>
+      <w:r>
+        <w:rPr>
+          <w:i/>
+        </w:rPr>
+        <w:t>QUDT Units Vocabulary</w:t>
+      </w:r>
+      <w:r>
+        <w:rPr/>
+        <w:t>, version 3.5.3. Unit DEG_C. Accessed October 24, 2026. https://qudt.org/vocab/unit/DEG_C.</w:t>
+      </w:r>
+    </w:p>
+    <w:p>
+      <w:pPr>
+        <w:pStyle w:val="PaperReference"/>
+      </w:pPr>
+      <w:r>
+        <w:rPr/>
         <w:t xml:space="preserve">Quittek, Juergen, Rolf Winter, and Thomas Dietz. 2015. </w:t>
       </w:r>
       <w:r>
@@ -4056,6 +5243,25 @@
         <w:t>. Accessed October 24, 2026. https://www.chicagomanualofstyle.org/tools_citationguide/citation-guide-2.html.</w:t>
       </w:r>
     </w:p>
+    <w:p>
+      <w:pPr>
+        <w:pStyle w:val="PaperReference"/>
+      </w:pPr>
+      <w:r>
+        <w:rPr/>
+        <w:t xml:space="preserve">World Wide Web Consortium. 2017. </w:t>
+      </w:r>
+      <w:r>
+        <w:rPr>
+          <w:i/>
+        </w:rPr>
+        <w:t>Semantic Sensor Network Ontology</w:t>
+      </w:r>
+      <w:r>
+        <w:rPr/>
+        <w:t>. W3C Recommendation, October 19. https://www.w3.org/TR/2017/REC-vocab-ssn-20171019/.</w:t>
+      </w:r>
+    </w:p>
     <w:sectPr>
       <w:headerReference w:type="default" r:id="rId9"/>
       <w:footerReference w:type="default" r:id="rId10"/>
@@ -4081,7 +5287,7 @@
         <w:color w:val="000000"/>
         <w:sz w:val="18"/>
       </w:rPr>
-      <w:t xml:space="preserve">Research draft 0.1   24 October 2026 EDT   </w:t>
+      <w:t xml:space="preserve">Research draft 0.2   24 October 2026 EDT   </w:t>
     </w:r>
     <w:fldSimple w:instr="PAGE"/>
   </w:p>

</xml_diff>

<commit_message>
docs: introduce the experimental system with sourced Smart Citizen imagery
Add the official SCK 2.3 model photograph and an early system overview to paper v0.3. Identify public registration 19639 and distinguish its reported model from unverified physical installation details. Preserve image attribution and published rights notices, update the maintained Word edition and documentation indexes, and retain proposed experiment status.

Validation: eighteen rendered pages reviewed; all 72 narrative paragraphs satisfy the three-to-five sentence policy; paper publication and original artifact/link checks pass.
</commit_message>
<xml_diff>
--- a/Docs/Research/Studies/Smart_Citizen/SMART_CITIZEN_EXPERIMENT_PAPER.docx
+++ b/Docs/Research/Studies/Smart_Citizen/SMART_CITIZEN_EXPERIMENT_PAPER.docx
@@ -32,7 +32,7 @@
       <w:pPr/>
       <w:r>
         <w:rPr/>
-        <w:t>Working paper version 0.2 | 24 October 2026 | Study protocol and preliminary source assessment</w:t>
+        <w:t>Working paper version 0.3 | 24 October 2026 | Study protocol and preliminary source assessment</w:t>
       </w:r>
     </w:p>
     <w:p>
@@ -85,6 +85,737 @@
       <w:r>
         <w:rPr/>
         <w:t>The MERLIN Resource Details effort began with the problem of presenting information from heterogeneous sensing systems in a consistent, useful view. TRSS and McQ OmniSense II remain motivating cases. The subsequent domain-model work expanded the inquiry from individual manufacturer screens to the physical sensing system in employment: its identity, equipment, functions, deployment, configuration, communications, power, and lifecycle. The retained MPSS draft organizes these concerns through eight information subjects and twenty relationship identifiers, R01–R20 (MERLIN Project 2026a, secs. 4–5).</w:t>
+      </w:r>
+    </w:p>
+    <w:p>
+      <w:pPr>
+        <w:pStyle w:val="Heading2"/>
+      </w:pPr>
+      <w:r>
+        <w:rPr/>
+        <w:t>System selected for the experiment</w:t>
+      </w:r>
+    </w:p>
+    <w:p>
+      <w:pPr>
+        <w:keepLines/>
+      </w:pPr>
+      <w:r>
+        <w:rPr/>
+        <w:t>The Smart Citizen Kit (SCK) is a modular environmental monitoring system. Its documented measurements include air temperature, humidity, particulate matter, noise level, light, and pressure. Figure 1 introduces the SCK2.3 model reported by the first public data specimen selected for this study (Smart Citizen n.d.-c, “What is the Smart Citizen Kit?” and “Measurements”; MERLIN Project 2026b, record “smart-citizen-current-19639”).</w:t>
+      </w:r>
+    </w:p>
+    <w:p>
+      <w:pPr>
+        <w:keepNext/>
+        <w:spacing w:after="40"/>
+        <w:jc w:val="center"/>
+      </w:pPr>
+      <w:r>
+        <w:drawing>
+          <wp:inline xmlns:a="http://schemas.openxmlformats.org/drawingml/2006/main" xmlns:pic="http://schemas.openxmlformats.org/drawingml/2006/picture">
+            <wp:extent cx="6002216" cy="3200400"/>
+            <wp:docPr id="1" name="Picture 1" descr="Official Smart Citizen Kit 2.3 model reference photograph showing the Data Board, Urban Board, and separate particulate-matter module from left to right" title="Official Smart Citizen Kit 2.3 model reference photograph showing the Data Board, Urban Board, and separate particulate-matter module from left to right"/>
+            <wp:cNvGraphicFramePr>
+              <a:graphicFrameLocks noChangeAspect="1"/>
+            </wp:cNvGraphicFramePr>
+            <a:graphic>
+              <a:graphicData uri="http://schemas.openxmlformats.org/drawingml/2006/picture">
+                <pic:pic>
+                  <pic:nvPicPr>
+                    <pic:cNvPr id="0" name="smart_citizen_kit_23.jpg"/>
+                    <pic:cNvPicPr/>
+                  </pic:nvPicPr>
+                  <pic:blipFill>
+                    <a:blip r:embed="rId11"/>
+                    <a:stretch>
+                      <a:fillRect/>
+                    </a:stretch>
+                  </pic:blipFill>
+                  <pic:spPr>
+                    <a:xfrm>
+                      <a:off x="0" y="0"/>
+                      <a:ext cx="6002216" cy="3200400"/>
+                    </a:xfrm>
+                    <a:prstGeom prst="rect"/>
+                  </pic:spPr>
+                </pic:pic>
+              </a:graphicData>
+            </a:graphic>
+          </wp:inline>
+        </w:drawing>
+      </w:r>
+    </w:p>
+    <w:p>
+      <w:pPr>
+        <w:pStyle w:val="PaperCaption"/>
+        <w:keepNext w:val="0"/>
+      </w:pPr>
+      <w:r>
+        <w:rPr>
+          <w:b/>
+        </w:rPr>
+        <w:t>Figure 1. Smart Citizen Kit 2.3 model reference.</w:t>
+      </w:r>
+      <w:r>
+        <w:rPr/>
+        <w:t xml:space="preserve"> The photograph shows the Data Board at left, Urban Board in the center, and particulate-matter module at right. It is reproduced unchanged from the official Smart Citizen / Fab Lab Barcelona documentation (Smart Citizen n.d.-c, “Versions”). It illustrates the product model; it has not been verified as a photograph of the unit associated with registration 19639. The boards and module are shown separately, so the image does not establish that unit's assembled configuration, enclosure, or power connections.</w:t>
+      </w:r>
+    </w:p>
+    <w:p>
+      <w:pPr/>
+      <w:r>
+        <w:rPr/>
+        <w:t>The Data Board provides logging, Wi-Fi, memory-card access, USB, and a battery connector. The Urban Board carries sensing components and connects a separate particulate-matter module (Smart Citizen n.d.-c, “What is the Smart Citizen Kit?”). For this study, those component roles make physical equipment, sensing functions, communications, and power concrete subjects to examine through the DIM and MPSS. Their presence in model documentation does not establish a verified component inventory for an individual installation.</w:t>
+      </w:r>
+    </w:p>
+    <w:p>
+      <w:pPr/>
+      <w:r>
+        <w:rPr/>
+        <w:t>The specific starting specimen is public Smart Citizen registration 19639, captured on 24 October 2026 at 21:57:35 UTC. The returned record identifies its hardware as “SmartCitizen Kit 2.3,” with type “SCK,” version “2.3,” and slug “sck:2,3” (MERLIN Project 2026b, record “smart-citizen-current-19639”). Its channel catalogue includes environmental observations together with equipment-related readings such as battery percentage and Wi-Fi RSSI. A source registration and its reported model identify the selected data specimen, while the enduring physical identity and installed configuration still require separate evidence.</w:t>
+      </w:r>
+    </w:p>
+    <w:p>
+      <w:pPr>
+        <w:pStyle w:val="PaperCaption"/>
+        <w:keepNext/>
+      </w:pPr>
+      <w:r>
+        <w:rPr>
+          <w:b/>
+        </w:rPr>
+        <w:t>Table 1. System identification and study boundary.</w:t>
+      </w:r>
+      <w:r>
+        <w:rPr/>
+        <w:t xml:space="preserve"> The table separates the physical product family, selected source record, and service through which the study will obtain data. Model-level descriptions and registration metadata have different evidentiary roles. These entries identify the first case without implying that its integration has already been executed (Smart Citizen n.d.-a; n.d.-c; MERLIN Project 2026b).</w:t>
+      </w:r>
+    </w:p>
+    <w:tbl>
+      <w:tblPr>
+        <w:tblW w:type="auto" w:w="0"/>
+        <w:jc w:val="center"/>
+        <w:tblLayout w:type="fixed"/>
+        <w:tblLook w:firstColumn="1" w:firstRow="1" w:lastColumn="0" w:lastRow="0" w:noHBand="0" w:noVBand="1" w:val="04A0"/>
+      </w:tblPr>
+      <w:tblGrid>
+        <w:gridCol w:w="2232"/>
+        <w:gridCol w:w="3312"/>
+        <w:gridCol w:w="4248"/>
+      </w:tblGrid>
+      <w:tr>
+        <w:trPr>
+          <w:cantSplit/>
+          <w:tblHeader/>
+        </w:trPr>
+        <w:tc>
+          <w:tcPr>
+            <w:tcW w:type="dxa" w:w="2232"/>
+            <w:vAlign w:val="center"/>
+            <w:tcBorders>
+              <w:top w:val="single" w:sz="4" w:color="D9D9D9"/>
+              <w:left w:val="single" w:sz="4" w:color="D9D9D9"/>
+              <w:bottom w:val="single" w:sz="4" w:color="D9D9D9"/>
+              <w:right w:val="single" w:sz="4" w:color="D9D9D9"/>
+            </w:tcBorders>
+            <w:tcMar>
+              <w:top w:w="90" w:type="dxa"/>
+              <w:left w:w="90" w:type="dxa"/>
+              <w:bottom w:w="90" w:type="dxa"/>
+              <w:right w:w="90" w:type="dxa"/>
+            </w:tcMar>
+            <w:shd w:fill="E8E8E8"/>
+          </w:tcPr>
+          <w:p>
+            <w:pPr>
+              <w:keepNext/>
+              <w:spacing w:after="40" w:line="247" w:lineRule="auto"/>
+            </w:pPr>
+            <w:r>
+              <w:rPr>
+                <w:b/>
+                <w:sz w:val="20"/>
+              </w:rPr>
+              <w:t>Item</w:t>
+            </w:r>
+          </w:p>
+        </w:tc>
+        <w:tc>
+          <w:tcPr>
+            <w:tcW w:type="dxa" w:w="3312"/>
+            <w:vAlign w:val="center"/>
+            <w:tcBorders>
+              <w:top w:val="single" w:sz="4" w:color="D9D9D9"/>
+              <w:left w:val="single" w:sz="4" w:color="D9D9D9"/>
+              <w:bottom w:val="single" w:sz="4" w:color="D9D9D9"/>
+              <w:right w:val="single" w:sz="4" w:color="D9D9D9"/>
+            </w:tcBorders>
+            <w:tcMar>
+              <w:top w:w="90" w:type="dxa"/>
+              <w:left w:w="90" w:type="dxa"/>
+              <w:bottom w:w="90" w:type="dxa"/>
+              <w:right w:w="90" w:type="dxa"/>
+            </w:tcMar>
+            <w:shd w:fill="E8E8E8"/>
+          </w:tcPr>
+          <w:p>
+            <w:pPr>
+              <w:keepNext/>
+              <w:spacing w:after="40" w:line="247" w:lineRule="auto"/>
+            </w:pPr>
+            <w:r>
+              <w:rPr>
+                <w:b/>
+                <w:sz w:val="20"/>
+              </w:rPr>
+              <w:t>Identification</w:t>
+            </w:r>
+          </w:p>
+        </w:tc>
+        <w:tc>
+          <w:tcPr>
+            <w:tcW w:type="dxa" w:w="4248"/>
+            <w:vAlign w:val="center"/>
+            <w:tcBorders>
+              <w:top w:val="single" w:sz="4" w:color="D9D9D9"/>
+              <w:left w:val="single" w:sz="4" w:color="D9D9D9"/>
+              <w:bottom w:val="single" w:sz="4" w:color="D9D9D9"/>
+              <w:right w:val="single" w:sz="4" w:color="D9D9D9"/>
+            </w:tcBorders>
+            <w:tcMar>
+              <w:top w:w="90" w:type="dxa"/>
+              <w:left w:w="90" w:type="dxa"/>
+              <w:bottom w:w="90" w:type="dxa"/>
+              <w:right w:w="90" w:type="dxa"/>
+            </w:tcMar>
+            <w:shd w:fill="E8E8E8"/>
+          </w:tcPr>
+          <w:p>
+            <w:pPr>
+              <w:keepNext/>
+              <w:spacing w:after="40" w:line="247" w:lineRule="auto"/>
+            </w:pPr>
+            <w:r>
+              <w:rPr>
+                <w:b/>
+                <w:sz w:val="20"/>
+              </w:rPr>
+              <w:t>Meaning for this experiment</w:t>
+            </w:r>
+          </w:p>
+        </w:tc>
+      </w:tr>
+      <w:tr>
+        <w:trPr>
+          <w:cantSplit/>
+        </w:trPr>
+        <w:tc>
+          <w:tcPr>
+            <w:tcW w:type="dxa" w:w="2232"/>
+            <w:vAlign w:val="center"/>
+            <w:tcBorders>
+              <w:top w:val="single" w:sz="4" w:color="D9D9D9"/>
+              <w:left w:val="single" w:sz="4" w:color="D9D9D9"/>
+              <w:bottom w:val="single" w:sz="4" w:color="D9D9D9"/>
+              <w:right w:val="single" w:sz="4" w:color="D9D9D9"/>
+            </w:tcBorders>
+            <w:tcMar>
+              <w:top w:w="90" w:type="dxa"/>
+              <w:left w:w="90" w:type="dxa"/>
+              <w:bottom w:w="90" w:type="dxa"/>
+              <w:right w:w="90" w:type="dxa"/>
+            </w:tcMar>
+            <w:shd w:fill="FFFFFF"/>
+          </w:tcPr>
+          <w:p>
+            <w:pPr>
+              <w:keepNext/>
+              <w:spacing w:after="40" w:line="247" w:lineRule="auto"/>
+            </w:pPr>
+            <w:r>
+              <w:rPr>
+                <w:sz w:val="20"/>
+              </w:rPr>
+              <w:t>System type</w:t>
+            </w:r>
+          </w:p>
+        </w:tc>
+        <w:tc>
+          <w:tcPr>
+            <w:tcW w:type="dxa" w:w="3312"/>
+            <w:vAlign w:val="center"/>
+            <w:tcBorders>
+              <w:top w:val="single" w:sz="4" w:color="D9D9D9"/>
+              <w:left w:val="single" w:sz="4" w:color="D9D9D9"/>
+              <w:bottom w:val="single" w:sz="4" w:color="D9D9D9"/>
+              <w:right w:val="single" w:sz="4" w:color="D9D9D9"/>
+            </w:tcBorders>
+            <w:tcMar>
+              <w:top w:w="90" w:type="dxa"/>
+              <w:left w:w="90" w:type="dxa"/>
+              <w:bottom w:w="90" w:type="dxa"/>
+              <w:right w:w="90" w:type="dxa"/>
+            </w:tcMar>
+            <w:shd w:fill="FFFFFF"/>
+          </w:tcPr>
+          <w:p>
+            <w:pPr>
+              <w:keepNext/>
+              <w:spacing w:after="40" w:line="247" w:lineRule="auto"/>
+            </w:pPr>
+            <w:r>
+              <w:rPr>
+                <w:sz w:val="20"/>
+              </w:rPr>
+              <w:t>Modular environmental monitoring kit</w:t>
+            </w:r>
+          </w:p>
+        </w:tc>
+        <w:tc>
+          <w:tcPr>
+            <w:tcW w:type="dxa" w:w="4248"/>
+            <w:vAlign w:val="center"/>
+            <w:tcBorders>
+              <w:top w:val="single" w:sz="4" w:color="D9D9D9"/>
+              <w:left w:val="single" w:sz="4" w:color="D9D9D9"/>
+              <w:bottom w:val="single" w:sz="4" w:color="D9D9D9"/>
+              <w:right w:val="single" w:sz="4" w:color="D9D9D9"/>
+            </w:tcBorders>
+            <w:tcMar>
+              <w:top w:w="90" w:type="dxa"/>
+              <w:left w:w="90" w:type="dxa"/>
+              <w:bottom w:w="90" w:type="dxa"/>
+              <w:right w:w="90" w:type="dxa"/>
+            </w:tcMar>
+            <w:shd w:fill="FFFFFF"/>
+          </w:tcPr>
+          <w:p>
+            <w:pPr>
+              <w:keepNext/>
+              <w:spacing w:after="40" w:line="247" w:lineRule="auto"/>
+            </w:pPr>
+            <w:r>
+              <w:rPr>
+                <w:sz w:val="20"/>
+              </w:rPr>
+              <w:t>Plain-language description of the equipment; not a newly adopted MPSS classification code</w:t>
+            </w:r>
+          </w:p>
+        </w:tc>
+      </w:tr>
+      <w:tr>
+        <w:trPr>
+          <w:cantSplit/>
+        </w:trPr>
+        <w:tc>
+          <w:tcPr>
+            <w:tcW w:type="dxa" w:w="2232"/>
+            <w:vAlign w:val="center"/>
+            <w:tcBorders>
+              <w:top w:val="single" w:sz="4" w:color="D9D9D9"/>
+              <w:left w:val="single" w:sz="4" w:color="D9D9D9"/>
+              <w:bottom w:val="single" w:sz="4" w:color="D9D9D9"/>
+              <w:right w:val="single" w:sz="4" w:color="D9D9D9"/>
+            </w:tcBorders>
+            <w:tcMar>
+              <w:top w:w="90" w:type="dxa"/>
+              <w:left w:w="90" w:type="dxa"/>
+              <w:bottom w:w="90" w:type="dxa"/>
+              <w:right w:w="90" w:type="dxa"/>
+            </w:tcMar>
+            <w:shd w:fill="F7F7F7"/>
+          </w:tcPr>
+          <w:p>
+            <w:pPr>
+              <w:keepNext/>
+              <w:spacing w:after="40" w:line="247" w:lineRule="auto"/>
+            </w:pPr>
+            <w:r>
+              <w:rPr>
+                <w:sz w:val="20"/>
+              </w:rPr>
+              <w:t>Reported product model</w:t>
+            </w:r>
+          </w:p>
+        </w:tc>
+        <w:tc>
+          <w:tcPr>
+            <w:tcW w:type="dxa" w:w="3312"/>
+            <w:vAlign w:val="center"/>
+            <w:tcBorders>
+              <w:top w:val="single" w:sz="4" w:color="D9D9D9"/>
+              <w:left w:val="single" w:sz="4" w:color="D9D9D9"/>
+              <w:bottom w:val="single" w:sz="4" w:color="D9D9D9"/>
+              <w:right w:val="single" w:sz="4" w:color="D9D9D9"/>
+            </w:tcBorders>
+            <w:tcMar>
+              <w:top w:w="90" w:type="dxa"/>
+              <w:left w:w="90" w:type="dxa"/>
+              <w:bottom w:w="90" w:type="dxa"/>
+              <w:right w:w="90" w:type="dxa"/>
+            </w:tcMar>
+            <w:shd w:fill="F7F7F7"/>
+          </w:tcPr>
+          <w:p>
+            <w:pPr>
+              <w:keepNext/>
+              <w:spacing w:after="40" w:line="247" w:lineRule="auto"/>
+            </w:pPr>
+            <w:r>
+              <w:rPr>
+                <w:sz w:val="20"/>
+              </w:rPr>
+              <w:t>SmartCitizen Kit 2.3; type SCK; version 2.3; slug sck:2,3</w:t>
+            </w:r>
+          </w:p>
+        </w:tc>
+        <w:tc>
+          <w:tcPr>
+            <w:tcW w:type="dxa" w:w="4248"/>
+            <w:vAlign w:val="center"/>
+            <w:tcBorders>
+              <w:top w:val="single" w:sz="4" w:color="D9D9D9"/>
+              <w:left w:val="single" w:sz="4" w:color="D9D9D9"/>
+              <w:bottom w:val="single" w:sz="4" w:color="D9D9D9"/>
+              <w:right w:val="single" w:sz="4" w:color="D9D9D9"/>
+            </w:tcBorders>
+            <w:tcMar>
+              <w:top w:w="90" w:type="dxa"/>
+              <w:left w:w="90" w:type="dxa"/>
+              <w:bottom w:w="90" w:type="dxa"/>
+              <w:right w:w="90" w:type="dxa"/>
+            </w:tcMar>
+            <w:shd w:fill="F7F7F7"/>
+          </w:tcPr>
+          <w:p>
+            <w:pPr>
+              <w:keepNext/>
+              <w:spacing w:after="40" w:line="247" w:lineRule="auto"/>
+            </w:pPr>
+            <w:r>
+              <w:rPr>
+                <w:sz w:val="20"/>
+              </w:rPr>
+              <w:t>Native metadata to preserve and compare with official product documentation</w:t>
+            </w:r>
+          </w:p>
+        </w:tc>
+      </w:tr>
+      <w:tr>
+        <w:trPr>
+          <w:cantSplit/>
+        </w:trPr>
+        <w:tc>
+          <w:tcPr>
+            <w:tcW w:type="dxa" w:w="2232"/>
+            <w:vAlign w:val="center"/>
+            <w:tcBorders>
+              <w:top w:val="single" w:sz="4" w:color="D9D9D9"/>
+              <w:left w:val="single" w:sz="4" w:color="D9D9D9"/>
+              <w:bottom w:val="single" w:sz="4" w:color="D9D9D9"/>
+              <w:right w:val="single" w:sz="4" w:color="D9D9D9"/>
+            </w:tcBorders>
+            <w:tcMar>
+              <w:top w:w="90" w:type="dxa"/>
+              <w:left w:w="90" w:type="dxa"/>
+              <w:bottom w:w="90" w:type="dxa"/>
+              <w:right w:w="90" w:type="dxa"/>
+            </w:tcMar>
+            <w:shd w:fill="FFFFFF"/>
+          </w:tcPr>
+          <w:p>
+            <w:pPr>
+              <w:keepNext/>
+              <w:spacing w:after="40" w:line="247" w:lineRule="auto"/>
+            </w:pPr>
+            <w:r>
+              <w:rPr>
+                <w:sz w:val="20"/>
+              </w:rPr>
+              <w:t>Selected public record</w:t>
+            </w:r>
+          </w:p>
+        </w:tc>
+        <w:tc>
+          <w:tcPr>
+            <w:tcW w:type="dxa" w:w="3312"/>
+            <w:vAlign w:val="center"/>
+            <w:tcBorders>
+              <w:top w:val="single" w:sz="4" w:color="D9D9D9"/>
+              <w:left w:val="single" w:sz="4" w:color="D9D9D9"/>
+              <w:bottom w:val="single" w:sz="4" w:color="D9D9D9"/>
+              <w:right w:val="single" w:sz="4" w:color="D9D9D9"/>
+            </w:tcBorders>
+            <w:tcMar>
+              <w:top w:w="90" w:type="dxa"/>
+              <w:left w:w="90" w:type="dxa"/>
+              <w:bottom w:w="90" w:type="dxa"/>
+              <w:right w:w="90" w:type="dxa"/>
+            </w:tcMar>
+            <w:shd w:fill="FFFFFF"/>
+          </w:tcPr>
+          <w:p>
+            <w:pPr>
+              <w:keepNext/>
+              <w:spacing w:after="40" w:line="247" w:lineRule="auto"/>
+            </w:pPr>
+            <w:r>
+              <w:rPr>
+                <w:sz w:val="20"/>
+              </w:rPr>
+              <w:t>Registration 19639; GET https://api.smartcitizen.me/v0/devices/19639</w:t>
+            </w:r>
+          </w:p>
+        </w:tc>
+        <w:tc>
+          <w:tcPr>
+            <w:tcW w:type="dxa" w:w="4248"/>
+            <w:vAlign w:val="center"/>
+            <w:tcBorders>
+              <w:top w:val="single" w:sz="4" w:color="D9D9D9"/>
+              <w:left w:val="single" w:sz="4" w:color="D9D9D9"/>
+              <w:bottom w:val="single" w:sz="4" w:color="D9D9D9"/>
+              <w:right w:val="single" w:sz="4" w:color="D9D9D9"/>
+            </w:tcBorders>
+            <w:tcMar>
+              <w:top w:w="90" w:type="dxa"/>
+              <w:left w:w="90" w:type="dxa"/>
+              <w:bottom w:w="90" w:type="dxa"/>
+              <w:right w:w="90" w:type="dxa"/>
+            </w:tcMar>
+            <w:shd w:fill="FFFFFF"/>
+          </w:tcPr>
+          <w:p>
+            <w:pPr>
+              <w:keepNext/>
+              <w:spacing w:after="40" w:line="247" w:lineRule="auto"/>
+            </w:pPr>
+            <w:r>
+              <w:rPr>
+                <w:sz w:val="20"/>
+              </w:rPr>
+              <w:t>Starting specimen for the proposed public-data integration; not a verified physical serial number</w:t>
+            </w:r>
+          </w:p>
+        </w:tc>
+      </w:tr>
+      <w:tr>
+        <w:trPr>
+          <w:cantSplit/>
+        </w:trPr>
+        <w:tc>
+          <w:tcPr>
+            <w:tcW w:type="dxa" w:w="2232"/>
+            <w:vAlign w:val="center"/>
+            <w:tcBorders>
+              <w:top w:val="single" w:sz="4" w:color="D9D9D9"/>
+              <w:left w:val="single" w:sz="4" w:color="D9D9D9"/>
+              <w:bottom w:val="single" w:sz="4" w:color="D9D9D9"/>
+              <w:right w:val="single" w:sz="4" w:color="D9D9D9"/>
+            </w:tcBorders>
+            <w:tcMar>
+              <w:top w:w="90" w:type="dxa"/>
+              <w:left w:w="90" w:type="dxa"/>
+              <w:bottom w:w="90" w:type="dxa"/>
+              <w:right w:w="90" w:type="dxa"/>
+            </w:tcMar>
+            <w:shd w:fill="F7F7F7"/>
+          </w:tcPr>
+          <w:p>
+            <w:pPr>
+              <w:keepNext/>
+              <w:spacing w:after="40" w:line="247" w:lineRule="auto"/>
+            </w:pPr>
+            <w:r>
+              <w:rPr>
+                <w:sz w:val="20"/>
+              </w:rPr>
+              <w:t>Source software platform</w:t>
+            </w:r>
+          </w:p>
+        </w:tc>
+        <w:tc>
+          <w:tcPr>
+            <w:tcW w:type="dxa" w:w="3312"/>
+            <w:vAlign w:val="center"/>
+            <w:tcBorders>
+              <w:top w:val="single" w:sz="4" w:color="D9D9D9"/>
+              <w:left w:val="single" w:sz="4" w:color="D9D9D9"/>
+              <w:bottom w:val="single" w:sz="4" w:color="D9D9D9"/>
+              <w:right w:val="single" w:sz="4" w:color="D9D9D9"/>
+            </w:tcBorders>
+            <w:tcMar>
+              <w:top w:w="90" w:type="dxa"/>
+              <w:left w:w="90" w:type="dxa"/>
+              <w:bottom w:w="90" w:type="dxa"/>
+              <w:right w:w="90" w:type="dxa"/>
+            </w:tcMar>
+            <w:shd w:fill="F7F7F7"/>
+          </w:tcPr>
+          <w:p>
+            <w:pPr>
+              <w:keepNext/>
+              <w:spacing w:after="40" w:line="247" w:lineRule="auto"/>
+            </w:pPr>
+            <w:r>
+              <w:rPr>
+                <w:sz w:val="20"/>
+              </w:rPr>
+              <w:t>Smart Citizen Platform and its public API</w:t>
+            </w:r>
+          </w:p>
+        </w:tc>
+        <w:tc>
+          <w:tcPr>
+            <w:tcW w:type="dxa" w:w="4248"/>
+            <w:vAlign w:val="center"/>
+            <w:tcBorders>
+              <w:top w:val="single" w:sz="4" w:color="D9D9D9"/>
+              <w:left w:val="single" w:sz="4" w:color="D9D9D9"/>
+              <w:bottom w:val="single" w:sz="4" w:color="D9D9D9"/>
+              <w:right w:val="single" w:sz="4" w:color="D9D9D9"/>
+            </w:tcBorders>
+            <w:tcMar>
+              <w:top w:w="90" w:type="dxa"/>
+              <w:left w:w="90" w:type="dxa"/>
+              <w:bottom w:w="90" w:type="dxa"/>
+              <w:right w:w="90" w:type="dxa"/>
+            </w:tcMar>
+            <w:shd w:fill="F7F7F7"/>
+          </w:tcPr>
+          <w:p>
+            <w:pPr>
+              <w:keepNext/>
+              <w:spacing w:after="40" w:line="247" w:lineRule="auto"/>
+            </w:pPr>
+            <w:r>
+              <w:rPr>
+                <w:sz w:val="20"/>
+              </w:rPr>
+              <w:t>Existing source service for acquiring data; the proposed CSAPI service and Glaux client have different roles</w:t>
+            </w:r>
+          </w:p>
+        </w:tc>
+      </w:tr>
+      <w:tr>
+        <w:trPr>
+          <w:cantSplit/>
+        </w:trPr>
+        <w:tc>
+          <w:tcPr>
+            <w:tcW w:type="dxa" w:w="2232"/>
+            <w:vAlign w:val="center"/>
+            <w:tcBorders>
+              <w:top w:val="single" w:sz="4" w:color="D9D9D9"/>
+              <w:left w:val="single" w:sz="4" w:color="D9D9D9"/>
+              <w:bottom w:val="single" w:sz="4" w:color="D9D9D9"/>
+              <w:right w:val="single" w:sz="4" w:color="D9D9D9"/>
+            </w:tcBorders>
+            <w:tcMar>
+              <w:top w:w="90" w:type="dxa"/>
+              <w:left w:w="90" w:type="dxa"/>
+              <w:bottom w:w="90" w:type="dxa"/>
+              <w:right w:w="90" w:type="dxa"/>
+            </w:tcMar>
+            <w:shd w:fill="FFFFFF"/>
+          </w:tcPr>
+          <w:p>
+            <w:pPr>
+              <w:keepNext w:val="0"/>
+              <w:spacing w:after="40" w:line="247" w:lineRule="auto"/>
+            </w:pPr>
+            <w:r>
+              <w:rPr>
+                <w:sz w:val="20"/>
+              </w:rPr>
+              <w:t>Physical installation</w:t>
+            </w:r>
+          </w:p>
+        </w:tc>
+        <w:tc>
+          <w:tcPr>
+            <w:tcW w:type="dxa" w:w="3312"/>
+            <w:vAlign w:val="center"/>
+            <w:tcBorders>
+              <w:top w:val="single" w:sz="4" w:color="D9D9D9"/>
+              <w:left w:val="single" w:sz="4" w:color="D9D9D9"/>
+              <w:bottom w:val="single" w:sz="4" w:color="D9D9D9"/>
+              <w:right w:val="single" w:sz="4" w:color="D9D9D9"/>
+            </w:tcBorders>
+            <w:tcMar>
+              <w:top w:w="90" w:type="dxa"/>
+              <w:left w:w="90" w:type="dxa"/>
+              <w:bottom w:w="90" w:type="dxa"/>
+              <w:right w:w="90" w:type="dxa"/>
+            </w:tcMar>
+            <w:shd w:fill="FFFFFF"/>
+          </w:tcPr>
+          <w:p>
+            <w:pPr>
+              <w:keepNext w:val="0"/>
+              <w:spacing w:after="40" w:line="247" w:lineRule="auto"/>
+            </w:pPr>
+            <w:r>
+              <w:rPr>
+                <w:sz w:val="20"/>
+              </w:rPr>
+              <w:t>Photograph, serial identity, installed inventory, enclosure, and supply connections unverified</w:t>
+            </w:r>
+          </w:p>
+        </w:tc>
+        <w:tc>
+          <w:tcPr>
+            <w:tcW w:type="dxa" w:w="4248"/>
+            <w:vAlign w:val="center"/>
+            <w:tcBorders>
+              <w:top w:val="single" w:sz="4" w:color="D9D9D9"/>
+              <w:left w:val="single" w:sz="4" w:color="D9D9D9"/>
+              <w:bottom w:val="single" w:sz="4" w:color="D9D9D9"/>
+              <w:right w:val="single" w:sz="4" w:color="D9D9D9"/>
+            </w:tcBorders>
+            <w:tcMar>
+              <w:top w:w="90" w:type="dxa"/>
+              <w:left w:w="90" w:type="dxa"/>
+              <w:bottom w:w="90" w:type="dxa"/>
+              <w:right w:w="90" w:type="dxa"/>
+            </w:tcMar>
+            <w:shd w:fill="FFFFFF"/>
+          </w:tcPr>
+          <w:p>
+            <w:pPr>
+              <w:keepNext w:val="0"/>
+              <w:spacing w:after="40" w:line="247" w:lineRule="auto"/>
+            </w:pPr>
+            <w:r>
+              <w:rPr>
+                <w:sz w:val="20"/>
+              </w:rPr>
+              <w:t>Evidence to obtain before claiming a complete unit-specific equipment or deployment model</w:t>
+            </w:r>
+          </w:p>
+        </w:tc>
+      </w:tr>
+    </w:tbl>
+    <w:p>
+      <w:pPr>
+        <w:spacing w:after="40" w:before="0" w:line="60" w:lineRule="exact"/>
+      </w:pPr>
+    </w:p>
+    <w:p>
+      <w:pPr/>
+      <w:r>
+        <w:rPr/>
+        <w:t>The first case therefore concerns one public Smart Citizen registration, with documentary descriptions of its reported product model. It does not begin with a kit acquired or operated by this project. An owned kit is a later extension for physical and lifecycle evidence, and AirGradient is a later independent comparison. TRSS and McQ OmniSense II remain motivating systems whose accommodation matters to the wider model, but their native datasets are not the input to this first integration case (MERLIN Project 2026c; 2026e).</w:t>
+      </w:r>
+    </w:p>
+    <w:p>
+      <w:pPr>
+        <w:pStyle w:val="Heading2"/>
+      </w:pPr>
+      <w:r>
+        <w:rPr/>
+        <w:t>Integration question and case selection</w:t>
       </w:r>
     </w:p>
     <w:p>
@@ -271,7 +1002,7 @@
         <w:drawing>
           <wp:inline xmlns:a="http://schemas.openxmlformats.org/drawingml/2006/main" xmlns:pic="http://schemas.openxmlformats.org/drawingml/2006/picture">
             <wp:extent cx="6217920" cy="5285232"/>
-            <wp:docPr id="1" name="Picture 1" descr="Proposed architecture connecting source evidence, explicit mapping, a CSAPI service, and separate generic and profile-aware client inspection" title="Proposed architecture connecting source evidence, explicit mapping, a CSAPI service, and separate generic and profile-aware client inspection"/>
+            <wp:docPr id="2" name="Picture 2" descr="Proposed architecture connecting source evidence, explicit mapping, a CSAPI service, and separate generic and profile-aware client inspection" title="Proposed architecture connecting source evidence, explicit mapping, a CSAPI service, and separate generic and profile-aware client inspection"/>
             <wp:cNvGraphicFramePr>
               <a:graphicFrameLocks noChangeAspect="1"/>
             </wp:cNvGraphicFramePr>
@@ -283,7 +1014,7 @@
                     <pic:cNvPicPr/>
                   </pic:nvPicPr>
                   <pic:blipFill>
-                    <a:blip r:embed="rId11"/>
+                    <a:blip r:embed="rId12"/>
                     <a:stretch>
                       <a:fillRect/>
                     </a:stretch>
@@ -311,7 +1042,7 @@
         <w:rPr>
           <w:b/>
         </w:rPr>
-        <w:t>Figure 1. Proposed experiment architecture.</w:t>
+        <w:t>Figure 2. Proposed experiment architecture.</w:t>
       </w:r>
       <w:r>
         <w:rPr/>
@@ -375,7 +1106,7 @@
         <w:rPr>
           <w:b/>
         </w:rPr>
-        <w:t>Table 1. Selected observations from the preliminary public capture.</w:t>
+        <w:t>Table 2. Selected observations from the preliminary public capture.</w:t>
       </w:r>
       <w:r>
         <w:rPr/>
@@ -1331,7 +2062,7 @@
         <w:drawing>
           <wp:inline xmlns:a="http://schemas.openxmlformats.org/drawingml/2006/main" xmlns:pic="http://schemas.openxmlformats.org/drawingml/2006/picture">
             <wp:extent cx="6217920" cy="5129784"/>
-            <wp:docPr id="2" name="Picture 2" descr="Proposed conceptual relationships separating model description, represented system, source registration, observations, observed subjects, and integration provenance" title="Proposed conceptual relationships separating model description, represented system, source registration, observations, observed subjects, and integration provenance"/>
+            <wp:docPr id="3" name="Picture 3" descr="Proposed conceptual relationships separating model description, represented system, source registration, observations, observed subjects, and integration provenance" title="Proposed conceptual relationships separating model description, represented system, source registration, observations, observed subjects, and integration provenance"/>
             <wp:cNvGraphicFramePr>
               <a:graphicFrameLocks noChangeAspect="1"/>
             </wp:cNvGraphicFramePr>
@@ -1343,7 +2074,7 @@
                     <pic:cNvPicPr/>
                   </pic:nvPicPr>
                   <pic:blipFill>
-                    <a:blip r:embed="rId12"/>
+                    <a:blip r:embed="rId13"/>
                     <a:stretch>
                       <a:fillRect/>
                     </a:stretch>
@@ -1371,7 +2102,7 @@
         <w:rPr>
           <w:b/>
         </w:rPr>
-        <w:t>Figure 2. Proposed conceptual distinctions for the mapped specimen.</w:t>
+        <w:t>Figure 3. Proposed conceptual distinctions for the mapped specimen.</w:t>
       </w:r>
       <w:r>
         <w:rPr/>
@@ -1424,7 +2155,7 @@
         <w:rPr>
           <w:b/>
         </w:rPr>
-        <w:t>Table 2. Required explanation for each mapping.</w:t>
+        <w:t>Table 3. Required explanation for each mapping.</w:t>
       </w:r>
       <w:r>
         <w:rPr/>
@@ -2649,7 +3380,7 @@
         <w:rPr>
           <w:b/>
         </w:rPr>
-        <w:t>Table 3. Expected coverage and remaining evidence needs.</w:t>
+        <w:t>Table 4. Expected coverage and remaining evidence needs.</w:t>
       </w:r>
       <w:r>
         <w:rPr/>
@@ -3562,7 +4293,7 @@
       <w:pPr/>
       <w:r>
         <w:rPr/>
-        <w:t>Before execution, the team will identify a public registration with sufficiently recent data and record the evidence used to assess freshness. Polling, caching, and retry behavior will follow the source's documented and observed behavior. Repeated retrieval of the same old observation will not make it new. The adapter will preserve acquisition time separately from source time and will document its duplicate-handling policy.</w:t>
+        <w:t>Before execution, the team will reassess registration 19639 for sufficiently recent data and document any reason for choosing a different public registration. Polling, caching, and retry behavior will follow the source's documented and observed behavior. Repeated retrieval of the same old observation will not make it new. The adapter will preserve acquisition time separately from source time and will document its duplicate-handling policy.</w:t>
       </w:r>
     </w:p>
     <w:p>
@@ -3590,7 +4321,7 @@
         <w:rPr>
           <w:b/>
         </w:rPr>
-        <w:t>Table 4. Proposed evaluation criteria.</w:t>
+        <w:t>Table 5. Proposed evaluation criteria.</w:t>
       </w:r>
       <w:r>
         <w:rPr/>
@@ -4190,11 +4921,11 @@
         <w:rPr>
           <w:b/>
         </w:rPr>
-        <w:t>Table 5. Planned figures and evidence status.</w:t>
+        <w:t>Table 6. Planned figures and evidence status.</w:t>
       </w:r>
       <w:r>
         <w:rPr/>
-        <w:t xml:space="preserve"> Figures 1 and 2 are authored diagrams of the proposed experiment. Figures 3–5 are reserved evidence slots. No substitute or simulated screenshots are presented.</w:t>
+        <w:t xml:space="preserve"> Figure 1 is an official product-model photograph with an identified source and explicit limits. Figures 2 and 3 are authored diagrams of the proposed experiment. Figures 4–6 are reserved evidence slots, and no substitute or simulated screenshots are presented.</w:t>
       </w:r>
     </w:p>
     <w:tbl>
@@ -4303,7 +5034,7 @@
                 <w:b/>
                 <w:sz w:val="20"/>
               </w:rPr>
-              <w:t>Status in version 0.2</w:t>
+              <w:t>Status in version 0.3</w:t>
             </w:r>
           </w:p>
         </w:tc>
@@ -4368,7 +5099,7 @@
               <w:rPr>
                 <w:sz w:val="20"/>
               </w:rPr>
-              <w:t>Proposed acquisition, mapping, service, and comparison architecture</w:t>
+              <w:t>Smart Citizen Kit 2.3 equipment and component roles</w:t>
             </w:r>
           </w:p>
         </w:tc>
@@ -4398,7 +5129,7 @@
               <w:rPr>
                 <w:sz w:val="20"/>
               </w:rPr>
-              <w:t>Included as an authored diagram</w:t>
+              <w:t>Official model reference photograph; not a verified image of registration 19639</w:t>
             </w:r>
           </w:p>
         </w:tc>
@@ -4463,7 +5194,7 @@
               <w:rPr>
                 <w:sz w:val="20"/>
               </w:rPr>
-              <w:t>Proposed model and subject distinctions</w:t>
+              <w:t>Proposed acquisition, mapping, service, and comparison architecture</w:t>
             </w:r>
           </w:p>
         </w:tc>
@@ -4558,7 +5289,7 @@
               <w:rPr>
                 <w:sz w:val="20"/>
               </w:rPr>
-              <w:t>Actual Smart Citizen interface showing the selected channels and interval</w:t>
+              <w:t>Proposed model and subject distinctions</w:t>
             </w:r>
           </w:p>
         </w:tc>
@@ -4588,7 +5319,7 @@
               <w:rPr>
                 <w:sz w:val="20"/>
               </w:rPr>
-              <w:t>Awaiting documented capture</w:t>
+              <w:t>Included as an authored diagram</w:t>
             </w:r>
           </w:p>
         </w:tc>
@@ -4653,7 +5384,7 @@
               <w:rPr>
                 <w:sz w:val="20"/>
               </w:rPr>
-              <w:t>Matched generic and profile-aware Glaux views of the integrated evidence</w:t>
+              <w:t>Actual Smart Citizen interface showing the selected channels and interval</w:t>
             </w:r>
           </w:p>
         </w:tc>
@@ -4683,7 +5414,7 @@
               <w:rPr>
                 <w:sz w:val="20"/>
               </w:rPr>
-              <w:t>Awaiting implementation and capture</w:t>
+              <w:t>Awaiting documented capture</w:t>
             </w:r>
           </w:p>
         </w:tc>
@@ -4748,6 +5479,101 @@
               <w:rPr>
                 <w:sz w:val="20"/>
               </w:rPr>
+              <w:t>Matched generic and profile-aware Glaux views of the integrated evidence</w:t>
+            </w:r>
+          </w:p>
+        </w:tc>
+        <w:tc>
+          <w:tcPr>
+            <w:tcW w:type="dxa" w:w="4392"/>
+            <w:vAlign w:val="center"/>
+            <w:tcBorders>
+              <w:top w:val="single" w:sz="4" w:color="D9D9D9"/>
+              <w:left w:val="single" w:sz="4" w:color="D9D9D9"/>
+              <w:bottom w:val="single" w:sz="4" w:color="D9D9D9"/>
+              <w:right w:val="single" w:sz="4" w:color="D9D9D9"/>
+            </w:tcBorders>
+            <w:tcMar>
+              <w:top w:w="90" w:type="dxa"/>
+              <w:left w:w="90" w:type="dxa"/>
+              <w:bottom w:w="90" w:type="dxa"/>
+              <w:right w:w="90" w:type="dxa"/>
+            </w:tcMar>
+            <w:shd w:fill="FFFFFF"/>
+          </w:tcPr>
+          <w:p>
+            <w:pPr>
+              <w:spacing w:after="40" w:line="247" w:lineRule="auto"/>
+            </w:pPr>
+            <w:r>
+              <w:rPr>
+                <w:sz w:val="20"/>
+              </w:rPr>
+              <w:t>Awaiting implementation and capture</w:t>
+            </w:r>
+          </w:p>
+        </w:tc>
+      </w:tr>
+      <w:tr>
+        <w:trPr>
+          <w:cantSplit/>
+        </w:trPr>
+        <w:tc>
+          <w:tcPr>
+            <w:tcW w:type="dxa" w:w="864"/>
+            <w:vAlign w:val="center"/>
+            <w:tcBorders>
+              <w:top w:val="single" w:sz="4" w:color="D9D9D9"/>
+              <w:left w:val="single" w:sz="4" w:color="D9D9D9"/>
+              <w:bottom w:val="single" w:sz="4" w:color="D9D9D9"/>
+              <w:right w:val="single" w:sz="4" w:color="D9D9D9"/>
+            </w:tcBorders>
+            <w:tcMar>
+              <w:top w:w="90" w:type="dxa"/>
+              <w:left w:w="90" w:type="dxa"/>
+              <w:bottom w:w="90" w:type="dxa"/>
+              <w:right w:w="90" w:type="dxa"/>
+            </w:tcMar>
+            <w:shd w:fill="F7F7F7"/>
+          </w:tcPr>
+          <w:p>
+            <w:pPr>
+              <w:spacing w:after="40" w:line="247" w:lineRule="auto"/>
+            </w:pPr>
+            <w:r>
+              <w:rPr>
+                <w:sz w:val="20"/>
+              </w:rPr>
+              <w:t>6</w:t>
+            </w:r>
+          </w:p>
+        </w:tc>
+        <w:tc>
+          <w:tcPr>
+            <w:tcW w:type="dxa" w:w="4536"/>
+            <w:vAlign w:val="center"/>
+            <w:tcBorders>
+              <w:top w:val="single" w:sz="4" w:color="D9D9D9"/>
+              <w:left w:val="single" w:sz="4" w:color="D9D9D9"/>
+              <w:bottom w:val="single" w:sz="4" w:color="D9D9D9"/>
+              <w:right w:val="single" w:sz="4" w:color="D9D9D9"/>
+            </w:tcBorders>
+            <w:tcMar>
+              <w:top w:w="90" w:type="dxa"/>
+              <w:left w:w="90" w:type="dxa"/>
+              <w:bottom w:w="90" w:type="dxa"/>
+              <w:right w:w="90" w:type="dxa"/>
+            </w:tcMar>
+            <w:shd w:fill="F7F7F7"/>
+          </w:tcPr>
+          <w:p>
+            <w:pPr>
+              <w:spacing w:after="40" w:line="247" w:lineRule="auto"/>
+            </w:pPr>
+            <w:r>
+              <w:rPr>
+                <w:sz w:val="20"/>
+              </w:rPr>
               <w:t>Actual implemented resource relationships and a traced source-to-display example</w:t>
             </w:r>
           </w:p>
@@ -4768,7 +5594,7 @@
               <w:bottom w:w="90" w:type="dxa"/>
               <w:right w:w="90" w:type="dxa"/>
             </w:tcMar>
-            <w:shd w:fill="FFFFFF"/>
+            <w:shd w:fill="F7F7F7"/>
           </w:tcPr>
           <w:p>
             <w:pPr>
@@ -4815,7 +5641,7 @@
       </w:r>
       <w:r>
         <w:rPr/>
-        <w:t xml:space="preserve"> No experimental success rate, task-time improvement, or user outcome is reported in version 0.2. The public access observations in section 4 establish limited feasibility and remain separate from experimental results.</w:t>
+        <w:t xml:space="preserve"> No experimental success rate, task-time improvement, or user outcome is reported in version 0.3. The public access observations in section 4 establish limited feasibility and remain separate from experimental results.</w:t>
       </w:r>
     </w:p>
     <w:p>
@@ -5287,7 +6113,7 @@
         <w:color w:val="000000"/>
         <w:sz w:val="18"/>
       </w:rPr>
-      <w:t xml:space="preserve">Research draft 0.2   24 October 2026 EDT   </w:t>
+      <w:t xml:space="preserve">Research draft 0.3   24 October 2026 EDT   </w:t>
     </w:r>
     <w:fldSimple w:instr="PAGE"/>
   </w:p>

</xml_diff>

<commit_message>
docs: rebuild Smart Citizen paper v0.4
</commit_message>
<xml_diff>
--- a/Docs/Research/Studies/Smart_Citizen/SMART_CITIZEN_EXPERIMENT_PAPER.docx
+++ b/Docs/Research/Studies/Smart_Citizen/SMART_CITIZEN_EXPERIMENT_PAPER.docx
@@ -32,7 +32,7 @@
       <w:pPr/>
       <w:r>
         <w:rPr/>
-        <w:t>Working paper version 0.3 | 24 October 2026 | Study protocol and preliminary source assessment</w:t>
+        <w:t>Working paper version 0.4 | 24 October 2026 | Study protocol and preliminary source assessment</w:t>
       </w:r>
     </w:p>
     <w:p>
@@ -914,7 +914,1465 @@
       </w:pPr>
       <w:r>
         <w:rPr/>
-        <w:t>3 Research questions and study design</w:t>
+        <w:t>3 Experimental CSAPI server</w:t>
+      </w:r>
+    </w:p>
+    <w:p>
+      <w:pPr>
+        <w:pStyle w:val="Heading2"/>
+      </w:pPr>
+      <w:r>
+        <w:rPr/>
+        <w:t>Origin and implementation lineage</w:t>
+      </w:r>
+    </w:p>
+    <w:p>
+      <w:pPr/>
+      <w:r>
+        <w:rPr/>
+        <w:t>pygeoapi is an open-source Python server implementation of the OGC API family, designed around an HTTP API, configuration, core API behavior, and pluggable data, process, and formatter components (pygeoapi Development Team 2026, “How pygeoapi works”). 52°North developed its Connected Systems implementation on that foundation and describes the repository as a proof of concept of OGC API – Connected Systems based on pygeoapi (52°North Spatial Information Research GmbH n.d.-a). 52°North reports that an initial Connected Systems API design and prototype were developed in KI:STE in synergy with MINKE and EMODnet Ingestion III, followed by continued pygeoapi-community work around the prototype (52°North Spatial Information Research GmbH 2023; n.d.-b). This lineage explains where the server implementation came from without implying that pygeoapi itself natively supplies every Connected Systems behavior used by the prototype.</w:t>
+      </w:r>
+    </w:p>
+    <w:p>
+      <w:pPr/>
+      <w:r>
+        <w:rPr/>
+        <w:t xml:space="preserve">The implementation tested by MERLIN was upstream commit </w:t>
+      </w:r>
+      <w:r>
+        <w:rPr>
+          <w:rFonts w:ascii="DejaVu Sans Mono" w:hAnsi="DejaVu Sans Mono"/>
+          <w:sz w:val="19"/>
+        </w:rPr>
+        <w:t>6ad75aa7fbfc76517c8a24c21446471845007855</w:t>
+      </w:r>
+      <w:r>
+        <w:rPr/>
+        <w:t xml:space="preserve">, whose project metadata identifies connected-systems-pygeoapi version 0.6.0 and pins the 52°North pygeoapi fork at commit </w:t>
+      </w:r>
+      <w:r>
+        <w:rPr>
+          <w:rFonts w:ascii="DejaVu Sans Mono" w:hAnsi="DejaVu Sans Mono"/>
+          <w:sz w:val="19"/>
+        </w:rPr>
+        <w:t>ec1eb38d9a64d93ec9a2e1b9db6fea6dc05f194a</w:t>
+      </w:r>
+      <w:r>
+        <w:rPr/>
+        <w:t xml:space="preserve"> (52°North Spatial Information Research GmbH n.d.-a). At that revision, the container starts Hypercorn over </w:t>
+      </w:r>
+      <w:r>
+        <w:rPr>
+          <w:rFonts w:ascii="DejaVu Sans Mono" w:hAnsi="DejaVu Sans Mono"/>
+          <w:sz w:val="19"/>
+        </w:rPr>
+        <w:t>connected-systems-api/app:APP</w:t>
+      </w:r>
+      <w:r>
+        <w:rPr/>
+        <w:t xml:space="preserve"> and includes native geospatial dependencies such as GDAL, PROJ, GEOS, NumPy, and Shapely. The upstream repository provides examples for multiple backends and a simulator for inserting example data, so its source tree represents several deployment possibilities rather than one fixed storage architecture. The exact backend used by the OS4CSAPI instance therefore has to come from our deployment evidence, not from inference based on the upstream dependency list.</w:t>
+      </w:r>
+    </w:p>
+    <w:p>
+      <w:pPr>
+        <w:pStyle w:val="Heading2"/>
+      </w:pPr>
+      <w:r>
+        <w:rPr/>
+        <w:t>OS4CSAPI Oracle deployment</w:t>
+      </w:r>
+    </w:p>
+    <w:p>
+      <w:pPr/>
+      <w:r>
+        <w:rPr/>
+        <w:t xml:space="preserve">The server selected for this experiment is the existing Oracle-hosted OS4CSAPI deployment at </w:t>
+      </w:r>
+      <w:r>
+        <w:rPr>
+          <w:rFonts w:ascii="DejaVu Sans Mono" w:hAnsi="DejaVu Sans Mono"/>
+          <w:sz w:val="19"/>
+        </w:rPr>
+        <w:t>https://129-80-248-53.sslip.io/csapi-pygeoapi</w:t>
+      </w:r>
+      <w:r>
+        <w:rPr/>
+        <w:t xml:space="preserve"> (MERLIN Project 2026f). The tested running build corresponded to upstream commit </w:t>
+      </w:r>
+      <w:r>
+        <w:rPr>
+          <w:rFonts w:ascii="DejaVu Sans Mono" w:hAnsi="DejaVu Sans Mono"/>
+          <w:sz w:val="19"/>
+        </w:rPr>
+        <w:t>6ad75aa7...</w:t>
+      </w:r>
+      <w:r>
+        <w:rPr/>
+        <w:t xml:space="preserve"> plus documented deployment adaptations, with container image ID </w:t>
+      </w:r>
+      <w:r>
+        <w:rPr>
+          <w:rFonts w:ascii="DejaVu Sans Mono" w:hAnsi="DejaVu Sans Mono"/>
+          <w:sz w:val="19"/>
+        </w:rPr>
+        <w:t>sha256:15e6991a3697e5f7130ed50bbb958720f2ffa7954f114a70be66cc93c0c489da</w:t>
+      </w:r>
+      <w:r>
+        <w:rPr/>
+        <w:t>. Those adaptations consisted of a public-URL correction, an asynchronous full-scan/bootstrap-ID patch, and retained ARM64/native-dependency adaptations. Project inventory recorded the endpoint as unauthenticated for the test environment, but that access posture will be reverified before the Smart Citizen run.</w:t>
+      </w:r>
+    </w:p>
+    <w:p>
+      <w:pPr/>
+      <w:r>
+        <w:rPr/>
+        <w:t>The retained evidence does not establish the running instance's exact storage/backend choice, persistent-volume layout, reverse-proxy configuration, restart policy, or complete Docker Compose topology (MERLIN Project 2026f). Upstream examples support multiple backends, and the tested source includes dependencies for more than one potential storage technology, so assigning one of them to the Oracle instance without runtime evidence would be speculation. These configuration details matter because the experiment will eventually evaluate publication, retrieval, relationships, history, and durability rather than only a single request. They are therefore explicit pre-run evidence requirements rather than assumed infrastructure facts.</w:t>
+      </w:r>
+    </w:p>
+    <w:p>
+      <w:pPr/>
+      <w:r>
+        <w:rPr/>
+        <w:t xml:space="preserve">A separate 52°North demonstration is publicly available at </w:t>
+      </w:r>
+      <w:r>
+        <w:rPr>
+          <w:rFonts w:ascii="DejaVu Sans Mono" w:hAnsi="DejaVu Sans Mono"/>
+          <w:sz w:val="19"/>
+        </w:rPr>
+        <w:t>https://csa.demo.52north.org/</w:t>
+      </w:r>
+      <w:r>
+        <w:rPr/>
+        <w:t>, where the landing page identifies 52°North Spatial Information Research GmbH as the provider and advertises Connected Systems assets (52°North Spatial Information Research GmbH n.d.-c). That service is not the Oracle-hosted deployment used in the MERLIN preservation experiment. Earlier verification work explicitly corrected a test package that targeted the 52°North demo when the intended primary comparison was the OS4CSAPI Oracle instance (MERLIN Project 2026f). The Smart Citizen study will preserve that deployment distinction so a result from one environment cannot be attributed to the other.</w:t>
+      </w:r>
+    </w:p>
+    <w:p>
+      <w:pPr>
+        <w:keepNext/>
+        <w:spacing w:after="40"/>
+        <w:jc w:val="center"/>
+      </w:pPr>
+      <w:r>
+        <w:drawing>
+          <wp:inline xmlns:a="http://schemas.openxmlformats.org/drawingml/2006/main" xmlns:pic="http://schemas.openxmlformats.org/drawingml/2006/picture">
+            <wp:extent cx="6217920" cy="4663440"/>
+            <wp:docPr id="2" name="Picture 2" descr="Lineage from pygeoapi through the 52°North Connected Systems proof of concept to the OS4CSAPI Oracle deployment, with the proposed Smart Citizen adapter and Glaux use shown separately" title="Lineage from pygeoapi through the 52°North Connected Systems proof of concept to the OS4CSAPI Oracle deployment, with the proposed Smart Citizen adapter and Glaux use shown separately"/>
+            <wp:cNvGraphicFramePr>
+              <a:graphicFrameLocks noChangeAspect="1"/>
+            </wp:cNvGraphicFramePr>
+            <a:graphic>
+              <a:graphicData uri="http://schemas.openxmlformats.org/drawingml/2006/picture">
+                <pic:pic>
+                  <pic:nvPicPr>
+                    <pic:cNvPr id="0" name="figure_02_server_lineage.png"/>
+                    <pic:cNvPicPr/>
+                  </pic:nvPicPr>
+                  <pic:blipFill>
+                    <a:blip r:embed="rId12"/>
+                    <a:stretch>
+                      <a:fillRect/>
+                    </a:stretch>
+                  </pic:blipFill>
+                  <pic:spPr>
+                    <a:xfrm>
+                      <a:off x="0" y="0"/>
+                      <a:ext cx="6217920" cy="4663440"/>
+                    </a:xfrm>
+                    <a:prstGeom prst="rect"/>
+                  </pic:spPr>
+                </pic:pic>
+              </a:graphicData>
+            </a:graphic>
+          </wp:inline>
+        </w:drawing>
+      </w:r>
+    </w:p>
+    <w:p>
+      <w:pPr>
+        <w:pStyle w:val="PaperCaption"/>
+        <w:keepNext w:val="0"/>
+      </w:pPr>
+      <w:r>
+        <w:rPr>
+          <w:b/>
+        </w:rPr>
+        <w:t>Figure 2. Experimental CSAPI server lineage and study role.</w:t>
+      </w:r>
+      <w:r>
+        <w:rPr/>
+        <w:t xml:space="preserve"> The solid path identifies the implemented lineage from pygeoapi through 52°North's Connected Systems proof of concept to the OS4CSAPI Oracle deployment. The separate 52°North public demo is shown as another deployment rather than as part of the study server. Dashed arrows identify the proposed Smart Citizen adapter and Glaux use, which have not yet been executed. The figure is an authored synthesis of the upstream repositories and the retained deployment baseline (52°North Spatial Information Research GmbH n.d.-a; MERLIN Project 2026f; pygeoapi Development Team 2026).</w:t>
+      </w:r>
+    </w:p>
+    <w:p>
+      <w:pPr>
+        <w:pStyle w:val="PaperCaption"/>
+        <w:keepNext/>
+      </w:pPr>
+      <w:r>
+        <w:rPr>
+          <w:b/>
+        </w:rPr>
+        <w:t>Table 2. Server identity and deployment baseline.</w:t>
+      </w:r>
+      <w:r>
+        <w:rPr/>
+        <w:t xml:space="preserve"> The table records facts established for the tested server and distinguishes them from deployment details that still need to be recovered. The exact image and upstream revisions provide a reproducible software checkpoint, while the unknown backend and persistence settings remain real evidence gaps. These gaps do not prevent beginning the mapping work, but they must be closed before claims about durability or exact deployment reproduction (MERLIN Project 2026f).</w:t>
+      </w:r>
+    </w:p>
+    <w:tbl>
+      <w:tblPr>
+        <w:tblW w:type="auto" w:w="0"/>
+        <w:jc w:val="center"/>
+        <w:tblLayout w:type="fixed"/>
+        <w:tblLook w:firstColumn="1" w:firstRow="1" w:lastColumn="0" w:lastRow="0" w:noHBand="0" w:noVBand="1" w:val="04A0"/>
+      </w:tblPr>
+      <w:tblGrid>
+        <w:gridCol w:w="2232"/>
+        <w:gridCol w:w="3312"/>
+        <w:gridCol w:w="4248"/>
+      </w:tblGrid>
+      <w:tr>
+        <w:trPr>
+          <w:cantSplit/>
+          <w:tblHeader/>
+        </w:trPr>
+        <w:tc>
+          <w:tcPr>
+            <w:tcW w:type="dxa" w:w="2232"/>
+            <w:vAlign w:val="center"/>
+            <w:tcBorders>
+              <w:top w:val="single" w:sz="4" w:color="D9D9D9"/>
+              <w:left w:val="single" w:sz="4" w:color="D9D9D9"/>
+              <w:bottom w:val="single" w:sz="4" w:color="D9D9D9"/>
+              <w:right w:val="single" w:sz="4" w:color="D9D9D9"/>
+            </w:tcBorders>
+            <w:tcMar>
+              <w:top w:w="90" w:type="dxa"/>
+              <w:left w:w="90" w:type="dxa"/>
+              <w:bottom w:w="90" w:type="dxa"/>
+              <w:right w:w="90" w:type="dxa"/>
+            </w:tcMar>
+            <w:shd w:fill="E8E8E8"/>
+          </w:tcPr>
+          <w:p>
+            <w:pPr>
+              <w:spacing w:after="40" w:line="247" w:lineRule="auto"/>
+            </w:pPr>
+            <w:r>
+              <w:rPr>
+                <w:b/>
+                <w:sz w:val="20"/>
+              </w:rPr>
+              <w:t>Item</w:t>
+            </w:r>
+          </w:p>
+        </w:tc>
+        <w:tc>
+          <w:tcPr>
+            <w:tcW w:type="dxa" w:w="3312"/>
+            <w:vAlign w:val="center"/>
+            <w:tcBorders>
+              <w:top w:val="single" w:sz="4" w:color="D9D9D9"/>
+              <w:left w:val="single" w:sz="4" w:color="D9D9D9"/>
+              <w:bottom w:val="single" w:sz="4" w:color="D9D9D9"/>
+              <w:right w:val="single" w:sz="4" w:color="D9D9D9"/>
+            </w:tcBorders>
+            <w:tcMar>
+              <w:top w:w="90" w:type="dxa"/>
+              <w:left w:w="90" w:type="dxa"/>
+              <w:bottom w:w="90" w:type="dxa"/>
+              <w:right w:w="90" w:type="dxa"/>
+            </w:tcMar>
+            <w:shd w:fill="E8E8E8"/>
+          </w:tcPr>
+          <w:p>
+            <w:pPr>
+              <w:spacing w:after="40" w:line="247" w:lineRule="auto"/>
+            </w:pPr>
+            <w:r>
+              <w:rPr>
+                <w:b/>
+                <w:sz w:val="20"/>
+              </w:rPr>
+              <w:t>Recorded baseline</w:t>
+            </w:r>
+          </w:p>
+        </w:tc>
+        <w:tc>
+          <w:tcPr>
+            <w:tcW w:type="dxa" w:w="4248"/>
+            <w:vAlign w:val="center"/>
+            <w:tcBorders>
+              <w:top w:val="single" w:sz="4" w:color="D9D9D9"/>
+              <w:left w:val="single" w:sz="4" w:color="D9D9D9"/>
+              <w:bottom w:val="single" w:sz="4" w:color="D9D9D9"/>
+              <w:right w:val="single" w:sz="4" w:color="D9D9D9"/>
+            </w:tcBorders>
+            <w:tcMar>
+              <w:top w:w="90" w:type="dxa"/>
+              <w:left w:w="90" w:type="dxa"/>
+              <w:bottom w:w="90" w:type="dxa"/>
+              <w:right w:w="90" w:type="dxa"/>
+            </w:tcMar>
+            <w:shd w:fill="E8E8E8"/>
+          </w:tcPr>
+          <w:p>
+            <w:pPr>
+              <w:spacing w:after="40" w:line="247" w:lineRule="auto"/>
+            </w:pPr>
+            <w:r>
+              <w:rPr>
+                <w:b/>
+                <w:sz w:val="20"/>
+              </w:rPr>
+              <w:t>Standing for this study</w:t>
+            </w:r>
+          </w:p>
+        </w:tc>
+      </w:tr>
+      <w:tr>
+        <w:trPr>
+          <w:cantSplit/>
+        </w:trPr>
+        <w:tc>
+          <w:tcPr>
+            <w:tcW w:type="dxa" w:w="2232"/>
+            <w:vAlign w:val="center"/>
+            <w:tcBorders>
+              <w:top w:val="single" w:sz="4" w:color="D9D9D9"/>
+              <w:left w:val="single" w:sz="4" w:color="D9D9D9"/>
+              <w:bottom w:val="single" w:sz="4" w:color="D9D9D9"/>
+              <w:right w:val="single" w:sz="4" w:color="D9D9D9"/>
+            </w:tcBorders>
+            <w:tcMar>
+              <w:top w:w="90" w:type="dxa"/>
+              <w:left w:w="90" w:type="dxa"/>
+              <w:bottom w:w="90" w:type="dxa"/>
+              <w:right w:w="90" w:type="dxa"/>
+            </w:tcMar>
+            <w:shd w:fill="FFFFFF"/>
+          </w:tcPr>
+          <w:p>
+            <w:pPr>
+              <w:spacing w:after="40" w:line="247" w:lineRule="auto"/>
+            </w:pPr>
+            <w:r>
+              <w:rPr>
+                <w:sz w:val="20"/>
+              </w:rPr>
+              <w:t>Upstream implementation</w:t>
+            </w:r>
+          </w:p>
+        </w:tc>
+        <w:tc>
+          <w:tcPr>
+            <w:tcW w:type="dxa" w:w="3312"/>
+            <w:vAlign w:val="center"/>
+            <w:tcBorders>
+              <w:top w:val="single" w:sz="4" w:color="D9D9D9"/>
+              <w:left w:val="single" w:sz="4" w:color="D9D9D9"/>
+              <w:bottom w:val="single" w:sz="4" w:color="D9D9D9"/>
+              <w:right w:val="single" w:sz="4" w:color="D9D9D9"/>
+            </w:tcBorders>
+            <w:tcMar>
+              <w:top w:w="90" w:type="dxa"/>
+              <w:left w:w="90" w:type="dxa"/>
+              <w:bottom w:w="90" w:type="dxa"/>
+              <w:right w:w="90" w:type="dxa"/>
+            </w:tcMar>
+            <w:shd w:fill="FFFFFF"/>
+          </w:tcPr>
+          <w:p>
+            <w:pPr>
+              <w:spacing w:after="40" w:line="247" w:lineRule="auto"/>
+            </w:pPr>
+            <w:r>
+              <w:rPr>
+                <w:sz w:val="20"/>
+              </w:rPr>
+              <w:t>52North/connected-systems-pygeoapi</w:t>
+            </w:r>
+          </w:p>
+        </w:tc>
+        <w:tc>
+          <w:tcPr>
+            <w:tcW w:type="dxa" w:w="4248"/>
+            <w:vAlign w:val="center"/>
+            <w:tcBorders>
+              <w:top w:val="single" w:sz="4" w:color="D9D9D9"/>
+              <w:left w:val="single" w:sz="4" w:color="D9D9D9"/>
+              <w:bottom w:val="single" w:sz="4" w:color="D9D9D9"/>
+              <w:right w:val="single" w:sz="4" w:color="D9D9D9"/>
+            </w:tcBorders>
+            <w:tcMar>
+              <w:top w:w="90" w:type="dxa"/>
+              <w:left w:w="90" w:type="dxa"/>
+              <w:bottom w:w="90" w:type="dxa"/>
+              <w:right w:w="90" w:type="dxa"/>
+            </w:tcMar>
+            <w:shd w:fill="FFFFFF"/>
+          </w:tcPr>
+          <w:p>
+            <w:pPr>
+              <w:spacing w:after="40" w:line="247" w:lineRule="auto"/>
+            </w:pPr>
+            <w:r>
+              <w:rPr>
+                <w:sz w:val="20"/>
+              </w:rPr>
+              <w:t>52°North Connected Systems proof of concept based on pygeoapi</w:t>
+            </w:r>
+          </w:p>
+        </w:tc>
+      </w:tr>
+      <w:tr>
+        <w:trPr>
+          <w:cantSplit/>
+        </w:trPr>
+        <w:tc>
+          <w:tcPr>
+            <w:tcW w:type="dxa" w:w="2232"/>
+            <w:vAlign w:val="center"/>
+            <w:tcBorders>
+              <w:top w:val="single" w:sz="4" w:color="D9D9D9"/>
+              <w:left w:val="single" w:sz="4" w:color="D9D9D9"/>
+              <w:bottom w:val="single" w:sz="4" w:color="D9D9D9"/>
+              <w:right w:val="single" w:sz="4" w:color="D9D9D9"/>
+            </w:tcBorders>
+            <w:tcMar>
+              <w:top w:w="90" w:type="dxa"/>
+              <w:left w:w="90" w:type="dxa"/>
+              <w:bottom w:w="90" w:type="dxa"/>
+              <w:right w:w="90" w:type="dxa"/>
+            </w:tcMar>
+            <w:shd w:fill="F7F7F7"/>
+          </w:tcPr>
+          <w:p>
+            <w:pPr>
+              <w:spacing w:after="40" w:line="247" w:lineRule="auto"/>
+            </w:pPr>
+            <w:r>
+              <w:rPr>
+                <w:sz w:val="20"/>
+              </w:rPr>
+              <w:t>Tested upstream revision</w:t>
+            </w:r>
+          </w:p>
+        </w:tc>
+        <w:tc>
+          <w:tcPr>
+            <w:tcW w:type="dxa" w:w="3312"/>
+            <w:vAlign w:val="center"/>
+            <w:tcBorders>
+              <w:top w:val="single" w:sz="4" w:color="D9D9D9"/>
+              <w:left w:val="single" w:sz="4" w:color="D9D9D9"/>
+              <w:bottom w:val="single" w:sz="4" w:color="D9D9D9"/>
+              <w:right w:val="single" w:sz="4" w:color="D9D9D9"/>
+            </w:tcBorders>
+            <w:tcMar>
+              <w:top w:w="90" w:type="dxa"/>
+              <w:left w:w="90" w:type="dxa"/>
+              <w:bottom w:w="90" w:type="dxa"/>
+              <w:right w:w="90" w:type="dxa"/>
+            </w:tcMar>
+            <w:shd w:fill="F7F7F7"/>
+          </w:tcPr>
+          <w:p>
+            <w:pPr>
+              <w:spacing w:after="40" w:line="247" w:lineRule="auto"/>
+            </w:pPr>
+            <w:r>
+              <w:rPr>
+                <w:rFonts w:ascii="DejaVu Sans Mono" w:hAnsi="DejaVu Sans Mono"/>
+                <w:sz w:val="20"/>
+              </w:rPr>
+              <w:t>6ad75aa7fbfc76517c8a24c21446471845007855</w:t>
+            </w:r>
+          </w:p>
+        </w:tc>
+        <w:tc>
+          <w:tcPr>
+            <w:tcW w:type="dxa" w:w="4248"/>
+            <w:vAlign w:val="center"/>
+            <w:tcBorders>
+              <w:top w:val="single" w:sz="4" w:color="D9D9D9"/>
+              <w:left w:val="single" w:sz="4" w:color="D9D9D9"/>
+              <w:bottom w:val="single" w:sz="4" w:color="D9D9D9"/>
+              <w:right w:val="single" w:sz="4" w:color="D9D9D9"/>
+            </w:tcBorders>
+            <w:tcMar>
+              <w:top w:w="90" w:type="dxa"/>
+              <w:left w:w="90" w:type="dxa"/>
+              <w:bottom w:w="90" w:type="dxa"/>
+              <w:right w:w="90" w:type="dxa"/>
+            </w:tcMar>
+            <w:shd w:fill="F7F7F7"/>
+          </w:tcPr>
+          <w:p>
+            <w:pPr>
+              <w:spacing w:after="40" w:line="247" w:lineRule="auto"/>
+            </w:pPr>
+            <w:r>
+              <w:rPr>
+                <w:sz w:val="20"/>
+              </w:rPr>
+              <w:t>Exact source checkpoint used to identify the running build</w:t>
+            </w:r>
+          </w:p>
+        </w:tc>
+      </w:tr>
+      <w:tr>
+        <w:trPr>
+          <w:cantSplit/>
+        </w:trPr>
+        <w:tc>
+          <w:tcPr>
+            <w:tcW w:type="dxa" w:w="2232"/>
+            <w:vAlign w:val="center"/>
+            <w:tcBorders>
+              <w:top w:val="single" w:sz="4" w:color="D9D9D9"/>
+              <w:left w:val="single" w:sz="4" w:color="D9D9D9"/>
+              <w:bottom w:val="single" w:sz="4" w:color="D9D9D9"/>
+              <w:right w:val="single" w:sz="4" w:color="D9D9D9"/>
+            </w:tcBorders>
+            <w:tcMar>
+              <w:top w:w="90" w:type="dxa"/>
+              <w:left w:w="90" w:type="dxa"/>
+              <w:bottom w:w="90" w:type="dxa"/>
+              <w:right w:w="90" w:type="dxa"/>
+            </w:tcMar>
+            <w:shd w:fill="FFFFFF"/>
+          </w:tcPr>
+          <w:p>
+            <w:pPr>
+              <w:spacing w:after="40" w:line="247" w:lineRule="auto"/>
+            </w:pPr>
+            <w:r>
+              <w:rPr>
+                <w:sz w:val="20"/>
+              </w:rPr>
+              <w:t>Project version at tested revision</w:t>
+            </w:r>
+          </w:p>
+        </w:tc>
+        <w:tc>
+          <w:tcPr>
+            <w:tcW w:type="dxa" w:w="3312"/>
+            <w:vAlign w:val="center"/>
+            <w:tcBorders>
+              <w:top w:val="single" w:sz="4" w:color="D9D9D9"/>
+              <w:left w:val="single" w:sz="4" w:color="D9D9D9"/>
+              <w:bottom w:val="single" w:sz="4" w:color="D9D9D9"/>
+              <w:right w:val="single" w:sz="4" w:color="D9D9D9"/>
+            </w:tcBorders>
+            <w:tcMar>
+              <w:top w:w="90" w:type="dxa"/>
+              <w:left w:w="90" w:type="dxa"/>
+              <w:bottom w:w="90" w:type="dxa"/>
+              <w:right w:w="90" w:type="dxa"/>
+            </w:tcMar>
+            <w:shd w:fill="FFFFFF"/>
+          </w:tcPr>
+          <w:p>
+            <w:pPr>
+              <w:spacing w:after="40" w:line="247" w:lineRule="auto"/>
+            </w:pPr>
+            <w:r>
+              <w:rPr>
+                <w:sz w:val="20"/>
+              </w:rPr>
+              <w:t>0.6.0</w:t>
+            </w:r>
+          </w:p>
+        </w:tc>
+        <w:tc>
+          <w:tcPr>
+            <w:tcW w:type="dxa" w:w="4248"/>
+            <w:vAlign w:val="center"/>
+            <w:tcBorders>
+              <w:top w:val="single" w:sz="4" w:color="D9D9D9"/>
+              <w:left w:val="single" w:sz="4" w:color="D9D9D9"/>
+              <w:bottom w:val="single" w:sz="4" w:color="D9D9D9"/>
+              <w:right w:val="single" w:sz="4" w:color="D9D9D9"/>
+            </w:tcBorders>
+            <w:tcMar>
+              <w:top w:w="90" w:type="dxa"/>
+              <w:left w:w="90" w:type="dxa"/>
+              <w:bottom w:w="90" w:type="dxa"/>
+              <w:right w:w="90" w:type="dxa"/>
+            </w:tcMar>
+            <w:shd w:fill="FFFFFF"/>
+          </w:tcPr>
+          <w:p>
+            <w:pPr>
+              <w:spacing w:after="40" w:line="247" w:lineRule="auto"/>
+            </w:pPr>
+            <w:r>
+              <w:rPr>
+                <w:sz w:val="20"/>
+              </w:rPr>
+              <w:t>Upstream package metadata, not a conformance level</w:t>
+            </w:r>
+          </w:p>
+        </w:tc>
+      </w:tr>
+      <w:tr>
+        <w:trPr>
+          <w:cantSplit/>
+        </w:trPr>
+        <w:tc>
+          <w:tcPr>
+            <w:tcW w:type="dxa" w:w="2232"/>
+            <w:vAlign w:val="center"/>
+            <w:tcBorders>
+              <w:top w:val="single" w:sz="4" w:color="D9D9D9"/>
+              <w:left w:val="single" w:sz="4" w:color="D9D9D9"/>
+              <w:bottom w:val="single" w:sz="4" w:color="D9D9D9"/>
+              <w:right w:val="single" w:sz="4" w:color="D9D9D9"/>
+            </w:tcBorders>
+            <w:tcMar>
+              <w:top w:w="90" w:type="dxa"/>
+              <w:left w:w="90" w:type="dxa"/>
+              <w:bottom w:w="90" w:type="dxa"/>
+              <w:right w:w="90" w:type="dxa"/>
+            </w:tcMar>
+            <w:shd w:fill="F7F7F7"/>
+          </w:tcPr>
+          <w:p>
+            <w:pPr>
+              <w:spacing w:after="40" w:line="247" w:lineRule="auto"/>
+            </w:pPr>
+            <w:r>
+              <w:rPr>
+                <w:sz w:val="20"/>
+              </w:rPr>
+              <w:t>Pinned pygeoapi fork revision</w:t>
+            </w:r>
+          </w:p>
+        </w:tc>
+        <w:tc>
+          <w:tcPr>
+            <w:tcW w:type="dxa" w:w="3312"/>
+            <w:vAlign w:val="center"/>
+            <w:tcBorders>
+              <w:top w:val="single" w:sz="4" w:color="D9D9D9"/>
+              <w:left w:val="single" w:sz="4" w:color="D9D9D9"/>
+              <w:bottom w:val="single" w:sz="4" w:color="D9D9D9"/>
+              <w:right w:val="single" w:sz="4" w:color="D9D9D9"/>
+            </w:tcBorders>
+            <w:tcMar>
+              <w:top w:w="90" w:type="dxa"/>
+              <w:left w:w="90" w:type="dxa"/>
+              <w:bottom w:w="90" w:type="dxa"/>
+              <w:right w:w="90" w:type="dxa"/>
+            </w:tcMar>
+            <w:shd w:fill="F7F7F7"/>
+          </w:tcPr>
+          <w:p>
+            <w:pPr>
+              <w:spacing w:after="40" w:line="247" w:lineRule="auto"/>
+            </w:pPr>
+            <w:r>
+              <w:rPr>
+                <w:rFonts w:ascii="DejaVu Sans Mono" w:hAnsi="DejaVu Sans Mono"/>
+                <w:sz w:val="20"/>
+              </w:rPr>
+              <w:t>ec1eb38d9a64d93ec9a2e1b9db6fea6dc05f194a</w:t>
+            </w:r>
+          </w:p>
+        </w:tc>
+        <w:tc>
+          <w:tcPr>
+            <w:tcW w:type="dxa" w:w="4248"/>
+            <w:vAlign w:val="center"/>
+            <w:tcBorders>
+              <w:top w:val="single" w:sz="4" w:color="D9D9D9"/>
+              <w:left w:val="single" w:sz="4" w:color="D9D9D9"/>
+              <w:bottom w:val="single" w:sz="4" w:color="D9D9D9"/>
+              <w:right w:val="single" w:sz="4" w:color="D9D9D9"/>
+            </w:tcBorders>
+            <w:tcMar>
+              <w:top w:w="90" w:type="dxa"/>
+              <w:left w:w="90" w:type="dxa"/>
+              <w:bottom w:w="90" w:type="dxa"/>
+              <w:right w:w="90" w:type="dxa"/>
+            </w:tcMar>
+            <w:shd w:fill="F7F7F7"/>
+          </w:tcPr>
+          <w:p>
+            <w:pPr>
+              <w:spacing w:after="40" w:line="247" w:lineRule="auto"/>
+            </w:pPr>
+            <w:r>
+              <w:rPr>
+                <w:sz w:val="20"/>
+              </w:rPr>
+              <w:t>Upstream dependency of that source revision</w:t>
+            </w:r>
+          </w:p>
+        </w:tc>
+      </w:tr>
+      <w:tr>
+        <w:trPr>
+          <w:cantSplit/>
+        </w:trPr>
+        <w:tc>
+          <w:tcPr>
+            <w:tcW w:type="dxa" w:w="2232"/>
+            <w:vAlign w:val="center"/>
+            <w:tcBorders>
+              <w:top w:val="single" w:sz="4" w:color="D9D9D9"/>
+              <w:left w:val="single" w:sz="4" w:color="D9D9D9"/>
+              <w:bottom w:val="single" w:sz="4" w:color="D9D9D9"/>
+              <w:right w:val="single" w:sz="4" w:color="D9D9D9"/>
+            </w:tcBorders>
+            <w:tcMar>
+              <w:top w:w="90" w:type="dxa"/>
+              <w:left w:w="90" w:type="dxa"/>
+              <w:bottom w:w="90" w:type="dxa"/>
+              <w:right w:w="90" w:type="dxa"/>
+            </w:tcMar>
+            <w:shd w:fill="FFFFFF"/>
+          </w:tcPr>
+          <w:p>
+            <w:pPr>
+              <w:spacing w:after="40" w:line="247" w:lineRule="auto"/>
+            </w:pPr>
+            <w:r>
+              <w:rPr>
+                <w:sz w:val="20"/>
+              </w:rPr>
+              <w:t>OS4CSAPI endpoint</w:t>
+            </w:r>
+          </w:p>
+        </w:tc>
+        <w:tc>
+          <w:tcPr>
+            <w:tcW w:type="dxa" w:w="3312"/>
+            <w:vAlign w:val="center"/>
+            <w:tcBorders>
+              <w:top w:val="single" w:sz="4" w:color="D9D9D9"/>
+              <w:left w:val="single" w:sz="4" w:color="D9D9D9"/>
+              <w:bottom w:val="single" w:sz="4" w:color="D9D9D9"/>
+              <w:right w:val="single" w:sz="4" w:color="D9D9D9"/>
+            </w:tcBorders>
+            <w:tcMar>
+              <w:top w:w="90" w:type="dxa"/>
+              <w:left w:w="90" w:type="dxa"/>
+              <w:bottom w:w="90" w:type="dxa"/>
+              <w:right w:w="90" w:type="dxa"/>
+            </w:tcMar>
+            <w:shd w:fill="FFFFFF"/>
+          </w:tcPr>
+          <w:p>
+            <w:pPr>
+              <w:spacing w:after="40" w:line="247" w:lineRule="auto"/>
+            </w:pPr>
+            <w:r>
+              <w:rPr>
+                <w:rFonts w:ascii="DejaVu Sans Mono" w:hAnsi="DejaVu Sans Mono"/>
+                <w:sz w:val="20"/>
+              </w:rPr>
+              <w:t>https://129-80-248-53.sslip.io/csapi-pygeoapi</w:t>
+            </w:r>
+          </w:p>
+        </w:tc>
+        <w:tc>
+          <w:tcPr>
+            <w:tcW w:type="dxa" w:w="4248"/>
+            <w:vAlign w:val="center"/>
+            <w:tcBorders>
+              <w:top w:val="single" w:sz="4" w:color="D9D9D9"/>
+              <w:left w:val="single" w:sz="4" w:color="D9D9D9"/>
+              <w:bottom w:val="single" w:sz="4" w:color="D9D9D9"/>
+              <w:right w:val="single" w:sz="4" w:color="D9D9D9"/>
+            </w:tcBorders>
+            <w:tcMar>
+              <w:top w:w="90" w:type="dxa"/>
+              <w:left w:w="90" w:type="dxa"/>
+              <w:bottom w:w="90" w:type="dxa"/>
+              <w:right w:w="90" w:type="dxa"/>
+            </w:tcMar>
+            <w:shd w:fill="FFFFFF"/>
+          </w:tcPr>
+          <w:p>
+            <w:pPr>
+              <w:spacing w:after="40" w:line="247" w:lineRule="auto"/>
+            </w:pPr>
+            <w:r>
+              <w:rPr>
+                <w:sz w:val="20"/>
+              </w:rPr>
+              <w:t>Intended Smart Citizen CSAPI target, subject to fresh pre-run health check</w:t>
+            </w:r>
+          </w:p>
+        </w:tc>
+      </w:tr>
+      <w:tr>
+        <w:trPr>
+          <w:cantSplit/>
+        </w:trPr>
+        <w:tc>
+          <w:tcPr>
+            <w:tcW w:type="dxa" w:w="2232"/>
+            <w:vAlign w:val="center"/>
+            <w:tcBorders>
+              <w:top w:val="single" w:sz="4" w:color="D9D9D9"/>
+              <w:left w:val="single" w:sz="4" w:color="D9D9D9"/>
+              <w:bottom w:val="single" w:sz="4" w:color="D9D9D9"/>
+              <w:right w:val="single" w:sz="4" w:color="D9D9D9"/>
+            </w:tcBorders>
+            <w:tcMar>
+              <w:top w:w="90" w:type="dxa"/>
+              <w:left w:w="90" w:type="dxa"/>
+              <w:bottom w:w="90" w:type="dxa"/>
+              <w:right w:w="90" w:type="dxa"/>
+            </w:tcMar>
+            <w:shd w:fill="F7F7F7"/>
+          </w:tcPr>
+          <w:p>
+            <w:pPr>
+              <w:spacing w:after="40" w:line="247" w:lineRule="auto"/>
+            </w:pPr>
+            <w:r>
+              <w:rPr>
+                <w:sz w:val="20"/>
+              </w:rPr>
+              <w:t>Hosting</w:t>
+            </w:r>
+          </w:p>
+        </w:tc>
+        <w:tc>
+          <w:tcPr>
+            <w:tcW w:type="dxa" w:w="3312"/>
+            <w:vAlign w:val="center"/>
+            <w:tcBorders>
+              <w:top w:val="single" w:sz="4" w:color="D9D9D9"/>
+              <w:left w:val="single" w:sz="4" w:color="D9D9D9"/>
+              <w:bottom w:val="single" w:sz="4" w:color="D9D9D9"/>
+              <w:right w:val="single" w:sz="4" w:color="D9D9D9"/>
+            </w:tcBorders>
+            <w:tcMar>
+              <w:top w:w="90" w:type="dxa"/>
+              <w:left w:w="90" w:type="dxa"/>
+              <w:bottom w:w="90" w:type="dxa"/>
+              <w:right w:w="90" w:type="dxa"/>
+            </w:tcMar>
+            <w:shd w:fill="F7F7F7"/>
+          </w:tcPr>
+          <w:p>
+            <w:pPr>
+              <w:spacing w:after="40" w:line="247" w:lineRule="auto"/>
+            </w:pPr>
+            <w:r>
+              <w:rPr>
+                <w:sz w:val="20"/>
+              </w:rPr>
+              <w:t>Oracle Cloud test environment</w:t>
+            </w:r>
+          </w:p>
+        </w:tc>
+        <w:tc>
+          <w:tcPr>
+            <w:tcW w:type="dxa" w:w="4248"/>
+            <w:vAlign w:val="center"/>
+            <w:tcBorders>
+              <w:top w:val="single" w:sz="4" w:color="D9D9D9"/>
+              <w:left w:val="single" w:sz="4" w:color="D9D9D9"/>
+              <w:bottom w:val="single" w:sz="4" w:color="D9D9D9"/>
+              <w:right w:val="single" w:sz="4" w:color="D9D9D9"/>
+            </w:tcBorders>
+            <w:tcMar>
+              <w:top w:w="90" w:type="dxa"/>
+              <w:left w:w="90" w:type="dxa"/>
+              <w:bottom w:w="90" w:type="dxa"/>
+              <w:right w:w="90" w:type="dxa"/>
+            </w:tcMar>
+            <w:shd w:fill="F7F7F7"/>
+          </w:tcPr>
+          <w:p>
+            <w:pPr>
+              <w:spacing w:after="40" w:line="247" w:lineRule="auto"/>
+            </w:pPr>
+            <w:r>
+              <w:rPr>
+                <w:sz w:val="20"/>
+              </w:rPr>
+              <w:t>Existing project infrastructure; no new server is required for the first run</w:t>
+            </w:r>
+          </w:p>
+        </w:tc>
+      </w:tr>
+      <w:tr>
+        <w:trPr>
+          <w:cantSplit/>
+        </w:trPr>
+        <w:tc>
+          <w:tcPr>
+            <w:tcW w:type="dxa" w:w="2232"/>
+            <w:vAlign w:val="center"/>
+            <w:tcBorders>
+              <w:top w:val="single" w:sz="4" w:color="D9D9D9"/>
+              <w:left w:val="single" w:sz="4" w:color="D9D9D9"/>
+              <w:bottom w:val="single" w:sz="4" w:color="D9D9D9"/>
+              <w:right w:val="single" w:sz="4" w:color="D9D9D9"/>
+            </w:tcBorders>
+            <w:tcMar>
+              <w:top w:w="90" w:type="dxa"/>
+              <w:left w:w="90" w:type="dxa"/>
+              <w:bottom w:w="90" w:type="dxa"/>
+              <w:right w:w="90" w:type="dxa"/>
+            </w:tcMar>
+            <w:shd w:fill="FFFFFF"/>
+          </w:tcPr>
+          <w:p>
+            <w:pPr>
+              <w:spacing w:after="40" w:line="247" w:lineRule="auto"/>
+            </w:pPr>
+            <w:r>
+              <w:rPr>
+                <w:sz w:val="20"/>
+              </w:rPr>
+              <w:t>Tested container image</w:t>
+            </w:r>
+          </w:p>
+        </w:tc>
+        <w:tc>
+          <w:tcPr>
+            <w:tcW w:type="dxa" w:w="3312"/>
+            <w:vAlign w:val="center"/>
+            <w:tcBorders>
+              <w:top w:val="single" w:sz="4" w:color="D9D9D9"/>
+              <w:left w:val="single" w:sz="4" w:color="D9D9D9"/>
+              <w:bottom w:val="single" w:sz="4" w:color="D9D9D9"/>
+              <w:right w:val="single" w:sz="4" w:color="D9D9D9"/>
+            </w:tcBorders>
+            <w:tcMar>
+              <w:top w:w="90" w:type="dxa"/>
+              <w:left w:w="90" w:type="dxa"/>
+              <w:bottom w:w="90" w:type="dxa"/>
+              <w:right w:w="90" w:type="dxa"/>
+            </w:tcMar>
+            <w:shd w:fill="FFFFFF"/>
+          </w:tcPr>
+          <w:p>
+            <w:pPr>
+              <w:spacing w:after="40" w:line="247" w:lineRule="auto"/>
+            </w:pPr>
+            <w:r>
+              <w:rPr>
+                <w:rFonts w:ascii="DejaVu Sans Mono" w:hAnsi="DejaVu Sans Mono"/>
+                <w:sz w:val="20"/>
+              </w:rPr>
+              <w:t>sha256:15e6991a3697e5f7130ed50bbb958720f2ffa7954f114a70be66cc93c0c489da</w:t>
+            </w:r>
+          </w:p>
+        </w:tc>
+        <w:tc>
+          <w:tcPr>
+            <w:tcW w:type="dxa" w:w="4248"/>
+            <w:vAlign w:val="center"/>
+            <w:tcBorders>
+              <w:top w:val="single" w:sz="4" w:color="D9D9D9"/>
+              <w:left w:val="single" w:sz="4" w:color="D9D9D9"/>
+              <w:bottom w:val="single" w:sz="4" w:color="D9D9D9"/>
+              <w:right w:val="single" w:sz="4" w:color="D9D9D9"/>
+            </w:tcBorders>
+            <w:tcMar>
+              <w:top w:w="90" w:type="dxa"/>
+              <w:left w:w="90" w:type="dxa"/>
+              <w:bottom w:w="90" w:type="dxa"/>
+              <w:right w:w="90" w:type="dxa"/>
+            </w:tcMar>
+            <w:shd w:fill="FFFFFF"/>
+          </w:tcPr>
+          <w:p>
+            <w:pPr>
+              <w:spacing w:after="40" w:line="247" w:lineRule="auto"/>
+            </w:pPr>
+            <w:r>
+              <w:rPr>
+                <w:sz w:val="20"/>
+              </w:rPr>
+              <w:t>Exact image identity recorded during October verification</w:t>
+            </w:r>
+          </w:p>
+        </w:tc>
+      </w:tr>
+      <w:tr>
+        <w:trPr>
+          <w:cantSplit/>
+        </w:trPr>
+        <w:tc>
+          <w:tcPr>
+            <w:tcW w:type="dxa" w:w="2232"/>
+            <w:vAlign w:val="center"/>
+            <w:tcBorders>
+              <w:top w:val="single" w:sz="4" w:color="D9D9D9"/>
+              <w:left w:val="single" w:sz="4" w:color="D9D9D9"/>
+              <w:bottom w:val="single" w:sz="4" w:color="D9D9D9"/>
+              <w:right w:val="single" w:sz="4" w:color="D9D9D9"/>
+            </w:tcBorders>
+            <w:tcMar>
+              <w:top w:w="90" w:type="dxa"/>
+              <w:left w:w="90" w:type="dxa"/>
+              <w:bottom w:w="90" w:type="dxa"/>
+              <w:right w:w="90" w:type="dxa"/>
+            </w:tcMar>
+            <w:shd w:fill="F7F7F7"/>
+          </w:tcPr>
+          <w:p>
+            <w:pPr>
+              <w:spacing w:after="40" w:line="247" w:lineRule="auto"/>
+            </w:pPr>
+            <w:r>
+              <w:rPr>
+                <w:sz w:val="20"/>
+              </w:rPr>
+              <w:t>Deployment adaptations</w:t>
+            </w:r>
+          </w:p>
+        </w:tc>
+        <w:tc>
+          <w:tcPr>
+            <w:tcW w:type="dxa" w:w="3312"/>
+            <w:vAlign w:val="center"/>
+            <w:tcBorders>
+              <w:top w:val="single" w:sz="4" w:color="D9D9D9"/>
+              <w:left w:val="single" w:sz="4" w:color="D9D9D9"/>
+              <w:bottom w:val="single" w:sz="4" w:color="D9D9D9"/>
+              <w:right w:val="single" w:sz="4" w:color="D9D9D9"/>
+            </w:tcBorders>
+            <w:tcMar>
+              <w:top w:w="90" w:type="dxa"/>
+              <w:left w:w="90" w:type="dxa"/>
+              <w:bottom w:w="90" w:type="dxa"/>
+              <w:right w:w="90" w:type="dxa"/>
+            </w:tcMar>
+            <w:shd w:fill="F7F7F7"/>
+          </w:tcPr>
+          <w:p>
+            <w:pPr>
+              <w:spacing w:after="40" w:line="247" w:lineRule="auto"/>
+            </w:pPr>
+            <w:r>
+              <w:rPr>
+                <w:sz w:val="20"/>
+              </w:rPr>
+              <w:t>Public-URL fix; async full-scan/bootstrap-ID patch; ARM64/native-dependency adaptations</w:t>
+            </w:r>
+          </w:p>
+        </w:tc>
+        <w:tc>
+          <w:tcPr>
+            <w:tcW w:type="dxa" w:w="4248"/>
+            <w:vAlign w:val="center"/>
+            <w:tcBorders>
+              <w:top w:val="single" w:sz="4" w:color="D9D9D9"/>
+              <w:left w:val="single" w:sz="4" w:color="D9D9D9"/>
+              <w:bottom w:val="single" w:sz="4" w:color="D9D9D9"/>
+              <w:right w:val="single" w:sz="4" w:color="D9D9D9"/>
+            </w:tcBorders>
+            <w:tcMar>
+              <w:top w:w="90" w:type="dxa"/>
+              <w:left w:w="90" w:type="dxa"/>
+              <w:bottom w:w="90" w:type="dxa"/>
+              <w:right w:w="90" w:type="dxa"/>
+            </w:tcMar>
+            <w:shd w:fill="F7F7F7"/>
+          </w:tcPr>
+          <w:p>
+            <w:pPr>
+              <w:spacing w:after="40" w:line="247" w:lineRule="auto"/>
+            </w:pPr>
+            <w:r>
+              <w:rPr>
+                <w:sz w:val="20"/>
+              </w:rPr>
+              <w:t>Local deployment differences from the upstream source checkpoint</w:t>
+            </w:r>
+          </w:p>
+        </w:tc>
+      </w:tr>
+      <w:tr>
+        <w:trPr>
+          <w:cantSplit/>
+        </w:trPr>
+        <w:tc>
+          <w:tcPr>
+            <w:tcW w:type="dxa" w:w="2232"/>
+            <w:vAlign w:val="center"/>
+            <w:tcBorders>
+              <w:top w:val="single" w:sz="4" w:color="D9D9D9"/>
+              <w:left w:val="single" w:sz="4" w:color="D9D9D9"/>
+              <w:bottom w:val="single" w:sz="4" w:color="D9D9D9"/>
+              <w:right w:val="single" w:sz="4" w:color="D9D9D9"/>
+            </w:tcBorders>
+            <w:tcMar>
+              <w:top w:w="90" w:type="dxa"/>
+              <w:left w:w="90" w:type="dxa"/>
+              <w:bottom w:w="90" w:type="dxa"/>
+              <w:right w:w="90" w:type="dxa"/>
+            </w:tcMar>
+            <w:shd w:fill="FFFFFF"/>
+          </w:tcPr>
+          <w:p>
+            <w:pPr>
+              <w:spacing w:after="40" w:line="247" w:lineRule="auto"/>
+            </w:pPr>
+            <w:r>
+              <w:rPr>
+                <w:sz w:val="20"/>
+              </w:rPr>
+              <w:t>Authentication</w:t>
+            </w:r>
+          </w:p>
+        </w:tc>
+        <w:tc>
+          <w:tcPr>
+            <w:tcW w:type="dxa" w:w="3312"/>
+            <w:vAlign w:val="center"/>
+            <w:tcBorders>
+              <w:top w:val="single" w:sz="4" w:color="D9D9D9"/>
+              <w:left w:val="single" w:sz="4" w:color="D9D9D9"/>
+              <w:bottom w:val="single" w:sz="4" w:color="D9D9D9"/>
+              <w:right w:val="single" w:sz="4" w:color="D9D9D9"/>
+            </w:tcBorders>
+            <w:tcMar>
+              <w:top w:w="90" w:type="dxa"/>
+              <w:left w:w="90" w:type="dxa"/>
+              <w:bottom w:w="90" w:type="dxa"/>
+              <w:right w:w="90" w:type="dxa"/>
+            </w:tcMar>
+            <w:shd w:fill="FFFFFF"/>
+          </w:tcPr>
+          <w:p>
+            <w:pPr>
+              <w:spacing w:after="40" w:line="247" w:lineRule="auto"/>
+            </w:pPr>
+            <w:r>
+              <w:rPr>
+                <w:sz w:val="20"/>
+              </w:rPr>
+              <w:t>Recorded as none for the test endpoint</w:t>
+            </w:r>
+          </w:p>
+        </w:tc>
+        <w:tc>
+          <w:tcPr>
+            <w:tcW w:type="dxa" w:w="4248"/>
+            <w:vAlign w:val="center"/>
+            <w:tcBorders>
+              <w:top w:val="single" w:sz="4" w:color="D9D9D9"/>
+              <w:left w:val="single" w:sz="4" w:color="D9D9D9"/>
+              <w:bottom w:val="single" w:sz="4" w:color="D9D9D9"/>
+              <w:right w:val="single" w:sz="4" w:color="D9D9D9"/>
+            </w:tcBorders>
+            <w:tcMar>
+              <w:top w:w="90" w:type="dxa"/>
+              <w:left w:w="90" w:type="dxa"/>
+              <w:bottom w:w="90" w:type="dxa"/>
+              <w:right w:w="90" w:type="dxa"/>
+            </w:tcMar>
+            <w:shd w:fill="FFFFFF"/>
+          </w:tcPr>
+          <w:p>
+            <w:pPr>
+              <w:spacing w:after="40" w:line="247" w:lineRule="auto"/>
+            </w:pPr>
+            <w:r>
+              <w:rPr>
+                <w:sz w:val="20"/>
+              </w:rPr>
+              <w:t>Must be reverified before live publication</w:t>
+            </w:r>
+          </w:p>
+        </w:tc>
+      </w:tr>
+      <w:tr>
+        <w:trPr>
+          <w:cantSplit/>
+        </w:trPr>
+        <w:tc>
+          <w:tcPr>
+            <w:tcW w:type="dxa" w:w="2232"/>
+            <w:vAlign w:val="center"/>
+            <w:tcBorders>
+              <w:top w:val="single" w:sz="4" w:color="D9D9D9"/>
+              <w:left w:val="single" w:sz="4" w:color="D9D9D9"/>
+              <w:bottom w:val="single" w:sz="4" w:color="D9D9D9"/>
+              <w:right w:val="single" w:sz="4" w:color="D9D9D9"/>
+            </w:tcBorders>
+            <w:tcMar>
+              <w:top w:w="90" w:type="dxa"/>
+              <w:left w:w="90" w:type="dxa"/>
+              <w:bottom w:w="90" w:type="dxa"/>
+              <w:right w:w="90" w:type="dxa"/>
+            </w:tcMar>
+            <w:shd w:fill="F7F7F7"/>
+          </w:tcPr>
+          <w:p>
+            <w:pPr>
+              <w:spacing w:after="40" w:line="247" w:lineRule="auto"/>
+            </w:pPr>
+            <w:r>
+              <w:rPr>
+                <w:sz w:val="20"/>
+              </w:rPr>
+              <w:t>Backend, persistent storage, restart policy</w:t>
+            </w:r>
+          </w:p>
+        </w:tc>
+        <w:tc>
+          <w:tcPr>
+            <w:tcW w:type="dxa" w:w="3312"/>
+            <w:vAlign w:val="center"/>
+            <w:tcBorders>
+              <w:top w:val="single" w:sz="4" w:color="D9D9D9"/>
+              <w:left w:val="single" w:sz="4" w:color="D9D9D9"/>
+              <w:bottom w:val="single" w:sz="4" w:color="D9D9D9"/>
+              <w:right w:val="single" w:sz="4" w:color="D9D9D9"/>
+            </w:tcBorders>
+            <w:tcMar>
+              <w:top w:w="90" w:type="dxa"/>
+              <w:left w:w="90" w:type="dxa"/>
+              <w:bottom w:w="90" w:type="dxa"/>
+              <w:right w:w="90" w:type="dxa"/>
+            </w:tcMar>
+            <w:shd w:fill="F7F7F7"/>
+          </w:tcPr>
+          <w:p>
+            <w:pPr>
+              <w:spacing w:after="40" w:line="247" w:lineRule="auto"/>
+            </w:pPr>
+            <w:r>
+              <w:rPr>
+                <w:sz w:val="20"/>
+              </w:rPr>
+              <w:t>Not established by the recovered evidence</w:t>
+            </w:r>
+          </w:p>
+        </w:tc>
+        <w:tc>
+          <w:tcPr>
+            <w:tcW w:type="dxa" w:w="4248"/>
+            <w:vAlign w:val="center"/>
+            <w:tcBorders>
+              <w:top w:val="single" w:sz="4" w:color="D9D9D9"/>
+              <w:left w:val="single" w:sz="4" w:color="D9D9D9"/>
+              <w:bottom w:val="single" w:sz="4" w:color="D9D9D9"/>
+              <w:right w:val="single" w:sz="4" w:color="D9D9D9"/>
+            </w:tcBorders>
+            <w:tcMar>
+              <w:top w:w="90" w:type="dxa"/>
+              <w:left w:w="90" w:type="dxa"/>
+              <w:bottom w:w="90" w:type="dxa"/>
+              <w:right w:w="90" w:type="dxa"/>
+            </w:tcMar>
+            <w:shd w:fill="F7F7F7"/>
+          </w:tcPr>
+          <w:p>
+            <w:pPr>
+              <w:spacing w:after="40" w:line="247" w:lineRule="auto"/>
+            </w:pPr>
+            <w:r>
+              <w:rPr>
+                <w:sz w:val="20"/>
+              </w:rPr>
+              <w:t>Capture from the running deployment before durability or reproducibility claims</w:t>
+            </w:r>
+          </w:p>
+        </w:tc>
+      </w:tr>
+      <w:tr>
+        <w:trPr>
+          <w:cantSplit/>
+        </w:trPr>
+        <w:tc>
+          <w:tcPr>
+            <w:tcW w:type="dxa" w:w="2232"/>
+            <w:vAlign w:val="center"/>
+            <w:tcBorders>
+              <w:top w:val="single" w:sz="4" w:color="D9D9D9"/>
+              <w:left w:val="single" w:sz="4" w:color="D9D9D9"/>
+              <w:bottom w:val="single" w:sz="4" w:color="D9D9D9"/>
+              <w:right w:val="single" w:sz="4" w:color="D9D9D9"/>
+            </w:tcBorders>
+            <w:tcMar>
+              <w:top w:w="90" w:type="dxa"/>
+              <w:left w:w="90" w:type="dxa"/>
+              <w:bottom w:w="90" w:type="dxa"/>
+              <w:right w:w="90" w:type="dxa"/>
+            </w:tcMar>
+            <w:shd w:fill="FFFFFF"/>
+          </w:tcPr>
+          <w:p>
+            <w:pPr>
+              <w:spacing w:after="40" w:line="247" w:lineRule="auto"/>
+            </w:pPr>
+            <w:r>
+              <w:rPr>
+                <w:sz w:val="20"/>
+              </w:rPr>
+              <w:t>52°North public demo</w:t>
+            </w:r>
+          </w:p>
+        </w:tc>
+        <w:tc>
+          <w:tcPr>
+            <w:tcW w:type="dxa" w:w="3312"/>
+            <w:vAlign w:val="center"/>
+            <w:tcBorders>
+              <w:top w:val="single" w:sz="4" w:color="D9D9D9"/>
+              <w:left w:val="single" w:sz="4" w:color="D9D9D9"/>
+              <w:bottom w:val="single" w:sz="4" w:color="D9D9D9"/>
+              <w:right w:val="single" w:sz="4" w:color="D9D9D9"/>
+            </w:tcBorders>
+            <w:tcMar>
+              <w:top w:w="90" w:type="dxa"/>
+              <w:left w:w="90" w:type="dxa"/>
+              <w:bottom w:w="90" w:type="dxa"/>
+              <w:right w:w="90" w:type="dxa"/>
+            </w:tcMar>
+            <w:shd w:fill="FFFFFF"/>
+          </w:tcPr>
+          <w:p>
+            <w:pPr>
+              <w:spacing w:after="40" w:line="247" w:lineRule="auto"/>
+            </w:pPr>
+            <w:r>
+              <w:rPr>
+                <w:rFonts w:ascii="DejaVu Sans Mono" w:hAnsi="DejaVu Sans Mono"/>
+                <w:sz w:val="20"/>
+              </w:rPr>
+              <w:t>https://csa.demo.52north.org/</w:t>
+            </w:r>
+          </w:p>
+        </w:tc>
+        <w:tc>
+          <w:tcPr>
+            <w:tcW w:type="dxa" w:w="4248"/>
+            <w:vAlign w:val="center"/>
+            <w:tcBorders>
+              <w:top w:val="single" w:sz="4" w:color="D9D9D9"/>
+              <w:left w:val="single" w:sz="4" w:color="D9D9D9"/>
+              <w:bottom w:val="single" w:sz="4" w:color="D9D9D9"/>
+              <w:right w:val="single" w:sz="4" w:color="D9D9D9"/>
+            </w:tcBorders>
+            <w:tcMar>
+              <w:top w:w="90" w:type="dxa"/>
+              <w:left w:w="90" w:type="dxa"/>
+              <w:bottom w:w="90" w:type="dxa"/>
+              <w:right w:w="90" w:type="dxa"/>
+            </w:tcMar>
+            <w:shd w:fill="FFFFFF"/>
+          </w:tcPr>
+          <w:p>
+            <w:pPr>
+              <w:spacing w:after="40" w:line="247" w:lineRule="auto"/>
+            </w:pPr>
+            <w:r>
+              <w:rPr>
+                <w:sz w:val="20"/>
+              </w:rPr>
+              <w:t>Separate external deployment; not the primary study server</w:t>
+            </w:r>
+          </w:p>
+        </w:tc>
+      </w:tr>
+    </w:tbl>
+    <w:p>
+      <w:pPr>
+        <w:spacing w:after="40" w:before="0" w:line="60" w:lineRule="exact"/>
+      </w:pPr>
+    </w:p>
+    <w:p>
+      <w:pPr>
+        <w:pStyle w:val="Heading2"/>
+      </w:pPr>
+      <w:r>
+        <w:rPr/>
+        <w:t>Why this implementation is the initial study server</w:t>
+      </w:r>
+    </w:p>
+    <w:p>
+      <w:pPr/>
+      <w:r>
+        <w:rPr/>
+        <w:t xml:space="preserve">The server was not selected by a claim that 52°North/pygeoapi is universally the best Connected Systems implementation. The glaux-client bootstrap already identified the existing pygeoapi CSAPI test server as the intended server for the later prototype, and a subsequent 19 October 2026 comparison supplied a more specific experimental reason to keep it (MERLIN Project 2026f). In that bounded comparison, the same profile-style SensorML System was submitted to three running Oracle deployments: CS-GO rejected </w:t>
+      </w:r>
+      <w:r>
+        <w:rPr>
+          <w:rFonts w:ascii="DejaVu Sans Mono" w:hAnsi="DejaVu Sans Mono"/>
+          <w:sz w:val="19"/>
+        </w:rPr>
+        <w:t>characteristics</w:t>
+      </w:r>
+      <w:r>
+        <w:rPr/>
+        <w:t>, OpenSensorHub accepted the resource but omitted tested group IDs and conditions on retrieval, and pygeoapi accepted the resource and returned all submitted fields. This result aligns directly with the present study's question about whether profile-relevant meaning survives an integration boundary.</w:t>
+      </w:r>
+    </w:p>
+    <w:p>
+      <w:pPr/>
+      <w:r>
+        <w:rPr/>
+        <w:t xml:space="preserve">The pygeoapi creation returned HTTP 201 with an explicit UUID in the response body but no </w:t>
+      </w:r>
+      <w:r>
+        <w:rPr>
+          <w:rFonts w:ascii="DejaVu Sans Mono" w:hAnsi="DejaVu Sans Mono"/>
+          <w:sz w:val="19"/>
+        </w:rPr>
+        <w:t>Location</w:t>
+      </w:r>
+      <w:r>
+        <w:rPr/>
+        <w:t xml:space="preserve"> header, so the harness used that UUID only after verifying the fixture's </w:t>
+      </w:r>
+      <w:r>
+        <w:rPr>
+          <w:rFonts w:ascii="DejaVu Sans Mono" w:hAnsi="DejaVu Sans Mono"/>
+          <w:sz w:val="19"/>
+        </w:rPr>
+        <w:t>uniqueId</w:t>
+      </w:r>
+      <w:r>
+        <w:rPr/>
+        <w:t xml:space="preserve"> before cleanup (MERLIN Project 2026f). The retrieved representation preserved every submitted field under the stated comparison rules, the tested response passed the supplemental schema validation used for that sample, and cleanup returned HTTP 200 followed by GET 404. Those findings establish one successful System-level preservation sample rather than complete CSAPI conformance. Restart durability, time-bearing representations, datastream and observation writes, commands, access control, and the complete set of operations needed by the Smart Citizen experiment remain to be exercised separately.</w:t>
+      </w:r>
+    </w:p>
+    <w:p>
+      <w:pPr>
+        <w:pStyle w:val="Heading2"/>
+      </w:pPr>
+      <w:r>
+        <w:rPr/>
+        <w:t>Role in the Smart Citizen experiment</w:t>
+      </w:r>
+    </w:p>
+    <w:p>
+      <w:pPr/>
+      <w:r>
+        <w:rPr/>
+        <w:t>The proposed adapter will obtain documented Smart Citizen source data, construct the selected CSAPI/SensorML/SWE representations, and publish them to the Oracle deployment. Glaux will then retrieve the server-hosted resources rather than reading the Smart Citizen API directly for the profile-aware comparison. This makes the server an explicit experimental boundary at which meaning can be preserved, changed, rejected, or lost. A successful server write will therefore be reported separately from the correctness of the mapping and from the usefulness of the resulting client presentation.</w:t>
+      </w:r>
+    </w:p>
+    <w:p>
+      <w:pPr/>
+      <w:r>
+        <w:rPr/>
+        <w:t>Before the first live run, the study will capture the active server revision, image, local patch state, backend/provider, storage configuration, proxy/public-base-URL settings, persistence/restart behavior, authentication posture, and the specific publication interfaces used. Any change from the October 2026 verified build will become part of the execution record rather than being silently treated as the same environment. The experiment will also perform the smallest read/write checks necessary for the actual System, DataStream, schema, and Observation operations it intends to use. This turns deployment configuration into reproducibility evidence instead of background infrastructure that the paper assumes.</w:t>
+      </w:r>
+    </w:p>
+    <w:p>
+      <w:pPr>
+        <w:pStyle w:val="Heading1"/>
+      </w:pPr>
+      <w:r>
+        <w:rPr/>
+        <w:t>4 Research questions and study design</w:t>
       </w:r>
     </w:p>
     <w:p>
@@ -1002,7 +2460,7 @@
         <w:drawing>
           <wp:inline xmlns:a="http://schemas.openxmlformats.org/drawingml/2006/main" xmlns:pic="http://schemas.openxmlformats.org/drawingml/2006/picture">
             <wp:extent cx="6217920" cy="5285232"/>
-            <wp:docPr id="2" name="Picture 2" descr="Proposed architecture connecting source evidence, explicit mapping, a CSAPI service, and separate generic and profile-aware client inspection" title="Proposed architecture connecting source evidence, explicit mapping, a CSAPI service, and separate generic and profile-aware client inspection"/>
+            <wp:docPr id="3" name="Picture 3" descr="Proposed architecture connecting source evidence, explicit mapping, a CSAPI service, and separate generic and profile-aware client inspection" title="Proposed architecture connecting source evidence, explicit mapping, a CSAPI service, and separate generic and profile-aware client inspection"/>
             <wp:cNvGraphicFramePr>
               <a:graphicFrameLocks noChangeAspect="1"/>
             </wp:cNvGraphicFramePr>
@@ -1014,7 +2472,7 @@
                     <pic:cNvPicPr/>
                   </pic:nvPicPr>
                   <pic:blipFill>
-                    <a:blip r:embed="rId12"/>
+                    <a:blip r:embed="rId13"/>
                     <a:stretch>
                       <a:fillRect/>
                     </a:stretch>
@@ -1042,7 +2500,7 @@
         <w:rPr>
           <w:b/>
         </w:rPr>
-        <w:t>Figure 2. Proposed experiment architecture.</w:t>
+        <w:t>Figure 3. Proposed experiment architecture.</w:t>
       </w:r>
       <w:r>
         <w:rPr/>
@@ -1055,7 +2513,7 @@
       </w:pPr>
       <w:r>
         <w:rPr/>
-        <w:t>4 Source selection and preliminary observations</w:t>
+        <w:t>5 Source selection and preliminary observations</w:t>
       </w:r>
     </w:p>
     <w:p>
@@ -1106,7 +2564,7 @@
         <w:rPr>
           <w:b/>
         </w:rPr>
-        <w:t>Table 2. Selected observations from the preliminary public capture.</w:t>
+        <w:t>Table 3. Selected observations from the preliminary public capture.</w:t>
       </w:r>
       <w:r>
         <w:rPr/>
@@ -1996,7 +3454,7 @@
       </w:pPr>
       <w:r>
         <w:rPr/>
-        <w:t>5 Proposed dataset and mapping method</w:t>
+        <w:t>6 Proposed dataset and mapping method</w:t>
       </w:r>
     </w:p>
     <w:p>
@@ -2062,7 +3520,7 @@
         <w:drawing>
           <wp:inline xmlns:a="http://schemas.openxmlformats.org/drawingml/2006/main" xmlns:pic="http://schemas.openxmlformats.org/drawingml/2006/picture">
             <wp:extent cx="6217920" cy="5129784"/>
-            <wp:docPr id="3" name="Picture 3" descr="Proposed conceptual relationships separating model description, represented system, source registration, observations, observed subjects, and integration provenance" title="Proposed conceptual relationships separating model description, represented system, source registration, observations, observed subjects, and integration provenance"/>
+            <wp:docPr id="4" name="Picture 4" descr="Proposed conceptual relationships separating model description, represented system, source registration, observations, observed subjects, and integration provenance" title="Proposed conceptual relationships separating model description, represented system, source registration, observations, observed subjects, and integration provenance"/>
             <wp:cNvGraphicFramePr>
               <a:graphicFrameLocks noChangeAspect="1"/>
             </wp:cNvGraphicFramePr>
@@ -2074,7 +3532,7 @@
                     <pic:cNvPicPr/>
                   </pic:nvPicPr>
                   <pic:blipFill>
-                    <a:blip r:embed="rId13"/>
+                    <a:blip r:embed="rId14"/>
                     <a:stretch>
                       <a:fillRect/>
                     </a:stretch>
@@ -2102,7 +3560,7 @@
         <w:rPr>
           <w:b/>
         </w:rPr>
-        <w:t>Figure 3. Proposed conceptual distinctions for the mapped specimen.</w:t>
+        <w:t>Figure 4. Proposed conceptual distinctions for the mapped specimen.</w:t>
       </w:r>
       <w:r>
         <w:rPr/>
@@ -2155,7 +3613,7 @@
         <w:rPr>
           <w:b/>
         </w:rPr>
-        <w:t>Table 3. Required explanation for each mapping.</w:t>
+        <w:t>Table 4. Required explanation for each mapping.</w:t>
       </w:r>
       <w:r>
         <w:rPr/>
@@ -3380,7 +4838,7 @@
         <w:rPr>
           <w:b/>
         </w:rPr>
-        <w:t>Table 4. Expected coverage and remaining evidence needs.</w:t>
+        <w:t>Table 5. Expected coverage and remaining evidence needs.</w:t>
       </w:r>
       <w:r>
         <w:rPr/>
@@ -4277,7 +5735,7 @@
       </w:pPr>
       <w:r>
         <w:rPr/>
-        <w:t>6 Integration and evaluation protocol</w:t>
+        <w:t>7 Integration and evaluation protocol</w:t>
       </w:r>
     </w:p>
     <w:p>
@@ -4321,7 +5779,7 @@
         <w:rPr>
           <w:b/>
         </w:rPr>
-        <w:t>Table 5. Proposed evaluation criteria.</w:t>
+        <w:t>Table 6. Proposed evaluation criteria.</w:t>
       </w:r>
       <w:r>
         <w:rPr/>
@@ -4888,7 +6346,7 @@
       </w:pPr>
       <w:r>
         <w:rPr/>
-        <w:t>7 Interface comparison and figure protocol</w:t>
+        <w:t>8 Interface comparison and figure protocol</w:t>
       </w:r>
     </w:p>
     <w:p>
@@ -4921,11 +6379,11 @@
         <w:rPr>
           <w:b/>
         </w:rPr>
-        <w:t>Table 6. Planned figures and evidence status.</w:t>
+        <w:t>Table 7. Planned figures and evidence status.</w:t>
       </w:r>
       <w:r>
         <w:rPr/>
-        <w:t xml:space="preserve"> Figure 1 is an official product-model photograph with an identified source and explicit limits. Figures 2 and 3 are authored diagrams of the proposed experiment. Figures 4–6 are reserved evidence slots, and no substitute or simulated screenshots are presented.</w:t>
+        <w:t xml:space="preserve"> Figure 1 is an official product-model photograph with an identified source and explicit limits. Figure 2 is an authored server-lineage diagram, while Figures 3 and 4 are authored diagrams of the proposed experiment. Figures 5–7 are reserved evidence slots, and no substitute or simulated screenshots are presented.</w:t>
       </w:r>
     </w:p>
     <w:tbl>
@@ -5034,7 +6492,7 @@
                 <w:b/>
                 <w:sz w:val="20"/>
               </w:rPr>
-              <w:t>Status in version 0.3</w:t>
+              <w:t>Status in version 0.4</w:t>
             </w:r>
           </w:p>
         </w:tc>
@@ -5194,7 +6652,7 @@
               <w:rPr>
                 <w:sz w:val="20"/>
               </w:rPr>
-              <w:t>Proposed acquisition, mapping, service, and comparison architecture</w:t>
+              <w:t>Experimental CSAPI server lineage and study role</w:t>
             </w:r>
           </w:p>
         </w:tc>
@@ -5289,7 +6747,7 @@
               <w:rPr>
                 <w:sz w:val="20"/>
               </w:rPr>
-              <w:t>Proposed model and subject distinctions</w:t>
+              <w:t>Proposed acquisition, mapping, service, and comparison architecture</w:t>
             </w:r>
           </w:p>
         </w:tc>
@@ -5384,7 +6842,7 @@
               <w:rPr>
                 <w:sz w:val="20"/>
               </w:rPr>
-              <w:t>Actual Smart Citizen interface showing the selected channels and interval</w:t>
+              <w:t>Proposed model and subject distinctions</w:t>
             </w:r>
           </w:p>
         </w:tc>
@@ -5414,7 +6872,7 @@
               <w:rPr>
                 <w:sz w:val="20"/>
               </w:rPr>
-              <w:t>Awaiting documented capture</w:t>
+              <w:t>Included as an authored diagram</w:t>
             </w:r>
           </w:p>
         </w:tc>
@@ -5479,7 +6937,7 @@
               <w:rPr>
                 <w:sz w:val="20"/>
               </w:rPr>
-              <w:t>Matched generic and profile-aware Glaux views of the integrated evidence</w:t>
+              <w:t>Actual Smart Citizen interface showing the selected channels and interval</w:t>
             </w:r>
           </w:p>
         </w:tc>
@@ -5509,7 +6967,7 @@
               <w:rPr>
                 <w:sz w:val="20"/>
               </w:rPr>
-              <w:t>Awaiting implementation and capture</w:t>
+              <w:t>Awaiting documented capture</w:t>
             </w:r>
           </w:p>
         </w:tc>
@@ -5574,6 +7032,101 @@
               <w:rPr>
                 <w:sz w:val="20"/>
               </w:rPr>
+              <w:t>Matched generic and profile-aware Glaux views of the integrated evidence</w:t>
+            </w:r>
+          </w:p>
+        </w:tc>
+        <w:tc>
+          <w:tcPr>
+            <w:tcW w:type="dxa" w:w="4392"/>
+            <w:vAlign w:val="center"/>
+            <w:tcBorders>
+              <w:top w:val="single" w:sz="4" w:color="D9D9D9"/>
+              <w:left w:val="single" w:sz="4" w:color="D9D9D9"/>
+              <w:bottom w:val="single" w:sz="4" w:color="D9D9D9"/>
+              <w:right w:val="single" w:sz="4" w:color="D9D9D9"/>
+            </w:tcBorders>
+            <w:tcMar>
+              <w:top w:w="90" w:type="dxa"/>
+              <w:left w:w="90" w:type="dxa"/>
+              <w:bottom w:w="90" w:type="dxa"/>
+              <w:right w:w="90" w:type="dxa"/>
+            </w:tcMar>
+            <w:shd w:fill="F7F7F7"/>
+          </w:tcPr>
+          <w:p>
+            <w:pPr>
+              <w:spacing w:after="40" w:line="247" w:lineRule="auto"/>
+            </w:pPr>
+            <w:r>
+              <w:rPr>
+                <w:sz w:val="20"/>
+              </w:rPr>
+              <w:t>Awaiting implementation and capture</w:t>
+            </w:r>
+          </w:p>
+        </w:tc>
+      </w:tr>
+      <w:tr>
+        <w:trPr>
+          <w:cantSplit/>
+        </w:trPr>
+        <w:tc>
+          <w:tcPr>
+            <w:tcW w:type="dxa" w:w="864"/>
+            <w:vAlign w:val="center"/>
+            <w:tcBorders>
+              <w:top w:val="single" w:sz="4" w:color="D9D9D9"/>
+              <w:left w:val="single" w:sz="4" w:color="D9D9D9"/>
+              <w:bottom w:val="single" w:sz="4" w:color="D9D9D9"/>
+              <w:right w:val="single" w:sz="4" w:color="D9D9D9"/>
+            </w:tcBorders>
+            <w:tcMar>
+              <w:top w:w="90" w:type="dxa"/>
+              <w:left w:w="90" w:type="dxa"/>
+              <w:bottom w:w="90" w:type="dxa"/>
+              <w:right w:w="90" w:type="dxa"/>
+            </w:tcMar>
+            <w:shd w:fill="FFFFFF"/>
+          </w:tcPr>
+          <w:p>
+            <w:pPr>
+              <w:spacing w:after="40" w:line="247" w:lineRule="auto"/>
+            </w:pPr>
+            <w:r>
+              <w:rPr>
+                <w:sz w:val="20"/>
+              </w:rPr>
+              <w:t>7</w:t>
+            </w:r>
+          </w:p>
+        </w:tc>
+        <w:tc>
+          <w:tcPr>
+            <w:tcW w:type="dxa" w:w="4536"/>
+            <w:vAlign w:val="center"/>
+            <w:tcBorders>
+              <w:top w:val="single" w:sz="4" w:color="D9D9D9"/>
+              <w:left w:val="single" w:sz="4" w:color="D9D9D9"/>
+              <w:bottom w:val="single" w:sz="4" w:color="D9D9D9"/>
+              <w:right w:val="single" w:sz="4" w:color="D9D9D9"/>
+            </w:tcBorders>
+            <w:tcMar>
+              <w:top w:w="90" w:type="dxa"/>
+              <w:left w:w="90" w:type="dxa"/>
+              <w:bottom w:w="90" w:type="dxa"/>
+              <w:right w:w="90" w:type="dxa"/>
+            </w:tcMar>
+            <w:shd w:fill="FFFFFF"/>
+          </w:tcPr>
+          <w:p>
+            <w:pPr>
+              <w:spacing w:after="40" w:line="247" w:lineRule="auto"/>
+            </w:pPr>
+            <w:r>
+              <w:rPr>
+                <w:sz w:val="20"/>
+              </w:rPr>
               <w:t>Actual implemented resource relationships and a traced source-to-display example</w:t>
             </w:r>
           </w:p>
@@ -5594,7 +7147,7 @@
               <w:bottom w:w="90" w:type="dxa"/>
               <w:right w:w="90" w:type="dxa"/>
             </w:tcMar>
-            <w:shd w:fill="F7F7F7"/>
+            <w:shd w:fill="FFFFFF"/>
           </w:tcPr>
           <w:p>
             <w:pPr>
@@ -5628,7 +7181,7 @@
       </w:pPr>
       <w:r>
         <w:rPr/>
-        <w:t>8 Results to be reported</w:t>
+        <w:t>9 Results to be reported</w:t>
       </w:r>
     </w:p>
     <w:p>
@@ -5641,7 +7194,7 @@
       </w:r>
       <w:r>
         <w:rPr/>
-        <w:t xml:space="preserve"> No experimental success rate, task-time improvement, or user outcome is reported in version 0.3. The public access observations in section 4 establish limited feasibility and remain separate from experimental results.</w:t>
+        <w:t xml:space="preserve"> No experimental success rate, task-time improvement, or user outcome is reported in version 0.3. The public access observations in section 5 establish limited feasibility and remain separate from experimental results.</w:t>
       </w:r>
     </w:p>
     <w:p>
@@ -5664,7 +7217,7 @@
       </w:pPr>
       <w:r>
         <w:rPr/>
-        <w:t>9 Discussion and limitations</w:t>
+        <w:t>10 Discussion and limitations</w:t>
       </w:r>
     </w:p>
     <w:p>
@@ -5694,7 +7247,7 @@
       </w:pPr>
       <w:r>
         <w:rPr/>
-        <w:t>10 Reproducibility and document maintenance</w:t>
+        <w:t>11 Reproducibility and document maintenance</w:t>
       </w:r>
     </w:p>
     <w:p>
@@ -5731,7 +7284,7 @@
       </w:pPr>
       <w:r>
         <w:rPr/>
-        <w:t>11 Conclusion</w:t>
+        <w:t>12 Conclusion</w:t>
       </w:r>
     </w:p>
     <w:p>
@@ -5748,6 +7301,52 @@
       <w:r>
         <w:rPr/>
         <w:t>References</w:t>
+      </w:r>
+    </w:p>
+    <w:p>
+      <w:pPr>
+        <w:pStyle w:val="PaperReference"/>
+      </w:pPr>
+      <w:r>
+        <w:rPr/>
+        <w:t xml:space="preserve">52°North Spatial Information Research GmbH. 2023. </w:t>
+      </w:r>
+      <w:r>
+        <w:rPr>
+          <w:i/>
+        </w:rPr>
+        <w:t>52°North Annual Report 2023</w:t>
+      </w:r>
+      <w:r>
+        <w:rPr/>
+        <w:t>. Münster, Germany. https://52north.org/delivery/annual_report/52%C2%B0North_Annual_Report_2023.pdf.</w:t>
+      </w:r>
+    </w:p>
+    <w:p>
+      <w:pPr>
+        <w:pStyle w:val="PaperReference"/>
+      </w:pPr>
+      <w:r>
+        <w:rPr/>
+        <w:t>52°North Spatial Information Research GmbH. n.d.-a. “connected-systems-pygeoapi.” GitHub repository, tested revision 6ad75aa7fbfc76517c8a24c21446471845007855. Accessed October 24, 2026. https://github.com/52North/connected-systems-pygeoapi/tree/6ad75aa7fbfc76517c8a24c21446471845007855.</w:t>
+      </w:r>
+    </w:p>
+    <w:p>
+      <w:pPr>
+        <w:pStyle w:val="PaperReference"/>
+      </w:pPr>
+      <w:r>
+        <w:rPr/>
+        <w:t>52°North Spatial Information Research GmbH. n.d.-b. “Open Source Projects Contributions.” Accessed October 24, 2026. https://52north.org/software/software-components/open-source-projects-contributions/.</w:t>
+      </w:r>
+    </w:p>
+    <w:p>
+      <w:pPr>
+        <w:pStyle w:val="PaperReference"/>
+      </w:pPr>
+      <w:r>
+        <w:rPr/>
+        <w:t>52°North Spatial Information Research GmbH. n.d.-c. “connected-systems-pygeoapi.” Public demonstration service. Accessed October 24, 2026. https://csa.demo.52north.org/.</w:t>
       </w:r>
     </w:p>
     <w:p>
@@ -5822,6 +7421,15 @@
       <w:r>
         <w:rPr/>
         <w:t>MERLIN Project. 2026e. “Smart Citizen Experiment Plan.” October 24. Proposed experiment plan. https://github.com/OS4CSAPI/glaux-client/blob/1a24fdff71ef801d9b326d2b42a63743db737a8e/Docs/Plans/SMART_CITIZEN_EXPERIMENT_PLAN.md.</w:t>
+      </w:r>
+    </w:p>
+    <w:p>
+      <w:pPr>
+        <w:pStyle w:val="PaperReference"/>
+      </w:pPr>
+      <w:r>
+        <w:rPr/>
+        <w:t>MERLIN Project. 2026f. “52°North connected-systems-pygeoapi Experimental Server Baseline.” October 24. Research evidence record. https://github.com/OS4CSAPI/glaux-client/blob/work/details-view-20261023/Docs/Research/Evidence/PYGEOAPI_SERVER_BASELINE_2026-10-24.md.</w:t>
       </w:r>
     </w:p>
     <w:p>
@@ -5935,6 +7543,25 @@
       <w:r>
         <w:rPr/>
         <w:t>. RFC 7326. Informational. September. https://doi.org/10.17487/RFC7326.</w:t>
+      </w:r>
+    </w:p>
+    <w:p>
+      <w:pPr>
+        <w:pStyle w:val="PaperReference"/>
+      </w:pPr>
+      <w:r>
+        <w:rPr/>
+        <w:t xml:space="preserve">pygeoapi Development Team. 2026. </w:t>
+      </w:r>
+      <w:r>
+        <w:rPr>
+          <w:i/>
+        </w:rPr>
+        <w:t>pygeoapi 0.25.dev0 Documentation</w:t>
+      </w:r>
+      <w:r>
+        <w:rPr/>
+        <w:t>. October 22. https://docs.pygeoapi.io/en/latest/.</w:t>
       </w:r>
     </w:p>
     <w:p>
@@ -6113,7 +7740,7 @@
         <w:color w:val="000000"/>
         <w:sz w:val="18"/>
       </w:rPr>
-      <w:t xml:space="preserve">Research draft 0.3   24 October 2026 EDT   </w:t>
+      <w:t xml:space="preserve">Research draft 0.4   24 October 2026 EDT   </w:t>
     </w:r>
     <w:fldSimple w:instr="PAGE"/>
   </w:p>

</xml_diff>

<commit_message>
docs: regenerate Smart Citizen paper v0.5
</commit_message>
<xml_diff>
--- a/Docs/Research/Studies/Smart_Citizen/SMART_CITIZEN_EXPERIMENT_PAPER.docx
+++ b/Docs/Research/Studies/Smart_Citizen/SMART_CITIZEN_EXPERIMENT_PAPER.docx
@@ -32,7 +32,7 @@
       <w:pPr/>
       <w:r>
         <w:rPr/>
-        <w:t>Working paper version 0.4 | 24 October 2026 | Study protocol and preliminary source assessment</w:t>
+        <w:t>Working paper version 0.5 | 24 October 2026 | Study protocol and preliminary source assessment</w:t>
       </w:r>
     </w:p>
     <w:p>
@@ -914,7 +914,7 @@
       </w:pPr>
       <w:r>
         <w:rPr/>
-        <w:t>3 Experimental CSAPI server</w:t>
+        <w:t>3 Experimental integration infrastructure</w:t>
       </w:r>
     </w:p>
     <w:p>
@@ -923,6 +923,15 @@
       </w:pPr>
       <w:r>
         <w:rPr/>
+        <w:t>3.1 Experimental CSAPI server</w:t>
+      </w:r>
+    </w:p>
+    <w:p>
+      <w:pPr>
+        <w:pStyle w:val="Heading3"/>
+      </w:pPr>
+      <w:r>
+        <w:rPr/>
         <w:t>Origin and implementation lineage</w:t>
       </w:r>
     </w:p>
@@ -975,7 +984,7 @@
     </w:p>
     <w:p>
       <w:pPr>
-        <w:pStyle w:val="Heading2"/>
+        <w:pStyle w:val="Heading3"/>
       </w:pPr>
       <w:r>
         <w:rPr/>
@@ -2289,7 +2298,7 @@
     </w:p>
     <w:p>
       <w:pPr>
-        <w:pStyle w:val="Heading2"/>
+        <w:pStyle w:val="Heading3"/>
       </w:pPr>
       <w:r>
         <w:rPr/>
@@ -2345,7 +2354,7 @@
     </w:p>
     <w:p>
       <w:pPr>
-        <w:pStyle w:val="Heading2"/>
+        <w:pStyle w:val="Heading3"/>
       </w:pPr>
       <w:r>
         <w:rPr/>
@@ -2368,86 +2377,201 @@
     </w:p>
     <w:p>
       <w:pPr>
-        <w:pStyle w:val="Heading1"/>
+        <w:pStyle w:val="Heading2"/>
       </w:pPr>
       <w:r>
         <w:rPr/>
-        <w:t>4 Research questions and study design</w:t>
+        <w:t>3.2 Experimental Glaux client</w:t>
+      </w:r>
+    </w:p>
+    <w:p>
+      <w:pPr>
+        <w:pStyle w:val="Heading3"/>
+      </w:pPr>
+      <w:r>
+        <w:rPr/>
+        <w:t>Origin and implementation lineage</w:t>
       </w:r>
     </w:p>
     <w:p>
       <w:pPr/>
       <w:r>
         <w:rPr/>
-        <w:t>The study proposes a traceable integration case. A controlled comparison of information presentation will follow that integration. Together, these stages address three research questions.</w:t>
+        <w:t xml:space="preserve">The experimental client is </w:t>
+      </w:r>
+      <w:r>
+        <w:rPr>
+          <w:rFonts w:ascii="DejaVu Sans Mono" w:hAnsi="DejaVu Sans Mono"/>
+          <w:sz w:val="19"/>
+        </w:rPr>
+        <w:t>OS4CSAPI/glaux-client</w:t>
+      </w:r>
+      <w:r>
+        <w:rPr/>
+        <w:t>, a standalone TypeScript/Vite browser application created for this study rather than a fork of the existing Glaux, CSAPI Explorer, Alephex, or client-library applications. Its purpose is to keep standards access, MERLIN interpretation, and operator presentation under one observable application boundary while allowing each layer to be tested separately (MERLIN Project 2026g). The name reflects its relationship to the broader Glaux effort and possible future contribution, not an adoption or endorsement by DGIWG or another organization. The current study therefore treats Glaux Client as project-authored experimental software whose behavior must be versioned and examined like the server and adapter.</w:t>
+      </w:r>
+    </w:p>
+    <w:p>
+      <w:pPr/>
+      <w:r>
+        <w:rPr/>
+        <w:t xml:space="preserve">Standards access is supplied by </w:t>
+      </w:r>
+      <w:r>
+        <w:rPr>
+          <w:rFonts w:ascii="DejaVu Sans Mono" w:hAnsi="DejaVu Sans Mono"/>
+          <w:sz w:val="19"/>
+        </w:rPr>
+        <w:t>OS4CSAPI/ogc-client-CSAPI_2</w:t>
+      </w:r>
+      <w:r>
+        <w:rPr/>
+        <w:t xml:space="preserve">, an OS4CSAPI fork of Camptocamp's TypeScript </w:t>
+      </w:r>
+      <w:r>
+        <w:rPr>
+          <w:rFonts w:ascii="DejaVu Sans Mono" w:hAnsi="DejaVu Sans Mono"/>
+          <w:sz w:val="19"/>
+        </w:rPr>
+        <w:t>ogc-client</w:t>
+      </w:r>
+      <w:r>
+        <w:rPr/>
+        <w:t xml:space="preserve"> library, while the application code remains a separate repository. The selected </w:t>
+      </w:r>
+      <w:r>
+        <w:rPr>
+          <w:rFonts w:ascii="DejaVu Sans Mono" w:hAnsi="DejaVu Sans Mono"/>
+          <w:sz w:val="19"/>
+        </w:rPr>
+        <w:t>phase-10</w:t>
+      </w:r>
+      <w:r>
+        <w:rPr/>
+        <w:t xml:space="preserve"> revision is pinned at </w:t>
+      </w:r>
+      <w:r>
+        <w:rPr>
+          <w:rFonts w:ascii="DejaVu Sans Mono" w:hAnsi="DejaVu Sans Mono"/>
+          <w:sz w:val="19"/>
+        </w:rPr>
+        <w:t>4ca1d7db9b1ccdf545adbef42ef941139fe11977</w:t>
+      </w:r>
+      <w:r>
+        <w:rPr/>
+        <w:t xml:space="preserve"> and is consumed under the upstream package identity </w:t>
+      </w:r>
+      <w:r>
+        <w:rPr>
+          <w:rFonts w:ascii="DejaVu Sans Mono" w:hAnsi="DejaVu Sans Mono"/>
+          <w:sz w:val="19"/>
+        </w:rPr>
+        <w:t>@camptocamp/ogc-client</w:t>
+      </w:r>
+      <w:r>
+        <w:rPr/>
+        <w:t xml:space="preserve"> through the explicit </w:t>
+      </w:r>
+      <w:r>
+        <w:rPr>
+          <w:rFonts w:ascii="DejaVu Sans Mono" w:hAnsi="DejaVu Sans Mono"/>
+          <w:sz w:val="19"/>
+        </w:rPr>
+        <w:t>@camptocamp/ogc-client/csapi</w:t>
+      </w:r>
+      <w:r>
+        <w:rPr/>
+        <w:t xml:space="preserve"> export (MERLIN Project 2026h; OS4CSAPI 2026). The dependency is linked as a Git submodule and built from its own committed lockfile, so a moving branch or npm release cannot silently change the experiment. Camptocamp's BSD-3-Clause license and attribution are retained, and the application records the library revision independently of its own source revision (Camptocamp n.d.; MERLIN Project 2026h).</w:t>
       </w:r>
     </w:p>
     <w:p>
       <w:pPr>
-        <w:pStyle w:val="PaperList"/>
+        <w:pStyle w:val="Heading3"/>
       </w:pPr>
       <w:r>
-        <w:t xml:space="preserve">1. </w:t>
+        <w:rPr/>
+        <w:t>Why a standalone client and selected library</w:t>
+      </w:r>
+    </w:p>
+    <w:p>
+      <w:pPr/>
+      <w:r>
+        <w:rPr/>
+        <w:t xml:space="preserve">An earlier architecture review compared forking CSAPI Explorer with building a smaller application on a client library. Explorer offered useful navigation and inspection features, but it also added application behavior such as discovery fallbacks, proxy-relative URL substitutions, and other state that would complicate attribution when a relationship appeared to work or fail (MERLIN Project 2026g). The same review considered </w:t>
       </w:r>
       <w:r>
         <w:rPr>
-          <w:b/>
+          <w:rFonts w:ascii="DejaVu Sans Mono" w:hAnsi="DejaVu Sans Mono"/>
+          <w:sz w:val="19"/>
         </w:rPr>
-        <w:t>Semantic preservation.</w:t>
+        <w:t>cs-client-ts</w:t>
       </w:r>
       <w:r>
         <w:rPr/>
-        <w:t xml:space="preserve"> Which source-supported meanings survive acquisition, adaptation, CSAPI publication, retrieval, and presentation, and where does meaning become ambiguous or lost?</w:t>
+        <w:t xml:space="preserve"> a strong alternative because it provides authentication, pagination, validation, and transport hooks. Its convenient common model, however, would add another normalization layer between the wire representation and MERLIN's own interpretation, which is undesirable when the interpretation itself is the object of study. The control-first choice was therefore a standalone application using the ogc-client CSAPI fork, while retaining Explorer and other clients as external inspection or comparison tools rather than experimental foundations.</w:t>
+      </w:r>
+    </w:p>
+    <w:p>
+      <w:pPr/>
+      <w:r>
+        <w:rPr/>
+        <w:t>This choice is task-specific rather than a claim that the selected library is the best general CSAPI SDK. The key experimental advantage is that request behavior and original responses remain under application control, allowing the study to distinguish what the server returned from what the parser extracted and what the profile interpreter concluded (MERLIN Project 2026g). The client also preserves unknown or unsupported content for Standard View rather than requiring the profile to explain every supplied field. A future library replacement should therefore be judged by whether it preserves this observable boundary, not by API similarity alone.</w:t>
       </w:r>
     </w:p>
     <w:p>
       <w:pPr>
-        <w:pStyle w:val="PaperList"/>
+        <w:pStyle w:val="Heading3"/>
       </w:pPr>
       <w:r>
-        <w:t xml:space="preserve">2. </w:t>
-      </w:r>
-      <w:r>
-        <w:rPr>
-          <w:b/>
-        </w:rPr>
-        <w:t>Profile contribution.</w:t>
-      </w:r>
-      <w:r>
         <w:rPr/>
-        <w:t xml:space="preserve"> Which operator questions become easier to answer through the DIM and MPSS when compared with competent presentation of the same standard resources without profile-specific organization?</w:t>
-      </w:r>
-    </w:p>
-    <w:p>
-      <w:pPr>
-        <w:pStyle w:val="PaperList"/>
-      </w:pPr>
-      <w:r>
-        <w:t xml:space="preserve">3. </w:t>
-      </w:r>
-      <w:r>
-        <w:rPr>
-          <w:b/>
-        </w:rPr>
-        <w:t>Coverage and transfer.</w:t>
-      </w:r>
-      <w:r>
-        <w:rPr/>
-        <w:t xml:space="preserve"> Which information subjects and relationships are exercised, and which mappings remain reusable when a second producer is introduced?</w:t>
+        <w:t>Application architecture and comparison boundary</w:t>
       </w:r>
     </w:p>
     <w:p>
       <w:pPr/>
       <w:r>
         <w:rPr/>
-        <w:t>The unit of technical analysis is a traceable assertion: a value, identity, relationship, or contextual statement with an identified source and interpretation. A sample may contain several such assertions. The evaluation will avoid equating the number of observations with domain coverage or treating R01–R20 as twenty interchangeable checklist points. Findings about transport, interpretation, and presentation will be reported separately.</w:t>
+        <w:t xml:space="preserve">Glaux Client deliberately separates three responsibilities: </w:t>
+      </w:r>
+      <w:r>
+        <w:rPr>
+          <w:rFonts w:ascii="DejaVu Sans Mono" w:hAnsi="DejaVu Sans Mono"/>
+          <w:sz w:val="19"/>
+        </w:rPr>
+        <w:t>src/data</w:t>
+      </w:r>
+      <w:r>
+        <w:rPr/>
+        <w:t xml:space="preserve"> performs read-only retrieval, independent source capture, pinned-library parsing, and generic extraction; </w:t>
+      </w:r>
+      <w:r>
+        <w:rPr>
+          <w:rFonts w:ascii="DejaVu Sans Mono" w:hAnsi="DejaVu Sans Mono"/>
+          <w:sz w:val="19"/>
+        </w:rPr>
+        <w:t>src/profile</w:t>
+      </w:r>
+      <w:r>
+        <w:rPr/>
+        <w:t xml:space="preserve"> applies bounded MPSS/DIM interpretation; and </w:t>
+      </w:r>
+      <w:r>
+        <w:rPr>
+          <w:rFonts w:ascii="DejaVu Sans Mono" w:hAnsi="DejaVu Sans Mono"/>
+          <w:sz w:val="19"/>
+        </w:rPr>
+        <w:t>src/presentation</w:t>
+      </w:r>
+      <w:r>
+        <w:rPr/>
+        <w:t xml:space="preserve"> implements the operator-facing views (MERLIN Project 2026g). This separation supports the experimental chain from server representation, through generic parsing, through profile interpretation, to presentation without collapsing those stages into one opaque transformation. Standard View exposes supplied properties, types, units, definitions, relationships, warnings, original text or JSON, and response-body downloads even when the profile does not recognize their meaning. Operator View uses the bounded interpretation layer to organize only supported meanings and retains per-fact source and mapping disclosures.</w:t>
       </w:r>
     </w:p>
     <w:p>
       <w:pPr/>
       <w:r>
         <w:rPr/>
-        <w:t>The immediate proposed path is public Smart Citizen acquisition through a documented adapter into an identified CSAPI test service, followed by Glaux retrieval. The exact server, write interfaces, version, adapter revision, and execution environment will be recorded before the first run. They are not selected by implication in this protocol. An owned kit is a later extension for facts that a public feed does not establish.</w:t>
+        <w:t>Both presentation modes operate over the same captured source information, so switching between them is not supposed to retrieve a more favorable dataset. Unsupported or ambiguous content remains available for generic inspection rather than being suppressed to make profile-aware behavior appear better (MERLIN Project 2026g). The current client also preserves the distinction among source time, retrieval time, measurement, estimate, configuration, and reported status when the source provides those meanings. These constraints make the client useful as an experimental instrument because a visible result can be traced backward to the server response and the interpretation rule that produced it.</w:t>
       </w:r>
     </w:p>
     <w:p>
@@ -2459,8 +2583,1410 @@
       <w:r>
         <w:drawing>
           <wp:inline xmlns:a="http://schemas.openxmlformats.org/drawingml/2006/main" xmlns:pic="http://schemas.openxmlformats.org/drawingml/2006/picture">
+            <wp:extent cx="6217920" cy="5078910"/>
+            <wp:docPr id="3" name="Picture 3" descr="Architecture of the Glaux experimental client, showing the same captured CSAPI evidence feeding Standard View and bounded DIM/MPSS interpretation before Operator View" title="Architecture of the Glaux experimental client, showing the same captured CSAPI evidence feeding Standard View and bounded DIM/MPSS interpretation before Operator View"/>
+            <wp:cNvGraphicFramePr>
+              <a:graphicFrameLocks noChangeAspect="1"/>
+            </wp:cNvGraphicFramePr>
+            <a:graphic>
+              <a:graphicData uri="http://schemas.openxmlformats.org/drawingml/2006/picture">
+                <pic:pic>
+                  <pic:nvPicPr>
+                    <pic:cNvPr id="0" name="figure_03_client_architecture.png"/>
+                    <pic:cNvPicPr/>
+                  </pic:nvPicPr>
+                  <pic:blipFill>
+                    <a:blip r:embed="rId13"/>
+                    <a:stretch>
+                      <a:fillRect/>
+                    </a:stretch>
+                  </pic:blipFill>
+                  <pic:spPr>
+                    <a:xfrm>
+                      <a:off x="0" y="0"/>
+                      <a:ext cx="6217920" cy="5078910"/>
+                    </a:xfrm>
+                    <a:prstGeom prst="rect"/>
+                  </pic:spPr>
+                </pic:pic>
+              </a:graphicData>
+            </a:graphic>
+          </wp:inline>
+        </w:drawing>
+      </w:r>
+    </w:p>
+    <w:p>
+      <w:pPr>
+        <w:pStyle w:val="PaperCaption"/>
+        <w:keepNext w:val="0"/>
+      </w:pPr>
+      <w:r>
+        <w:rPr>
+          <w:b/>
+        </w:rPr>
+        <w:t>Figure 3. Glaux experimental client architecture and interpretation boundary.</w:t>
+      </w:r>
+      <w:r>
+        <w:rPr/>
+        <w:t xml:space="preserve"> The </w:t>
+      </w:r>
+      <w:r>
+        <w:rPr>
+          <w:rFonts w:ascii="DejaVu Sans Mono" w:hAnsi="DejaVu Sans Mono"/>
+          <w:sz w:val="19"/>
+        </w:rPr>
+        <w:t>src/data</w:t>
+      </w:r>
+      <w:r>
+        <w:rPr/>
+        <w:t xml:space="preserve"> layer captures the server response and supplies generic extraction before the evidence branches to competent Standard View inspection and bounded MPSS/DIM interpretation. The </w:t>
+      </w:r>
+      <w:r>
+        <w:rPr>
+          <w:rFonts w:ascii="DejaVu Sans Mono" w:hAnsi="DejaVu Sans Mono"/>
+          <w:sz w:val="19"/>
+        </w:rPr>
+        <w:t>src/profile</w:t>
+      </w:r>
+      <w:r>
+        <w:rPr/>
+        <w:t xml:space="preserve"> layer is the only branch in this diagram that applies project-specific semantic interpretation, while </w:t>
+      </w:r>
+      <w:r>
+        <w:rPr>
+          <w:rFonts w:ascii="DejaVu Sans Mono" w:hAnsi="DejaVu Sans Mono"/>
+          <w:sz w:val="19"/>
+        </w:rPr>
+        <w:t>src/presentation</w:t>
+      </w:r>
+      <w:r>
+        <w:rPr/>
+        <w:t xml:space="preserve"> organizes those recognized meanings for the operator. Both branches therefore begin from the same captured evidence rather than from separate favorable and unfavorable datasets. Smart Citizen connected-resource traversal is shown only as the experiment's next client increment and is not current deployed behavior (MERLIN Project 2026g).</w:t>
+      </w:r>
+    </w:p>
+    <w:p>
+      <w:pPr>
+        <w:pStyle w:val="Heading3"/>
+      </w:pPr>
+      <w:r>
+        <w:rPr/>
+        <w:t>Deployed client baseline</w:t>
+      </w:r>
+    </w:p>
+    <w:p>
+      <w:pPr/>
+      <w:r>
+        <w:rPr/>
+        <w:t xml:space="preserve">The public experimental application is deployed as the Cloudflare Pages project </w:t>
+      </w:r>
+      <w:r>
+        <w:rPr>
+          <w:rFonts w:ascii="DejaVu Sans Mono" w:hAnsi="DejaVu Sans Mono"/>
+          <w:sz w:val="19"/>
+        </w:rPr>
+        <w:t>glaux-client</w:t>
+      </w:r>
+      <w:r>
+        <w:rPr/>
+        <w:t xml:space="preserve"> at </w:t>
+      </w:r>
+      <w:r>
+        <w:rPr>
+          <w:rFonts w:ascii="DejaVu Sans Mono" w:hAnsi="DejaVu Sans Mono"/>
+          <w:sz w:val="19"/>
+        </w:rPr>
+        <w:t>https://glaux-client.pages.dev/</w:t>
+      </w:r>
+      <w:r>
+        <w:rPr/>
+        <w:t xml:space="preserve"> (MERLIN Project 2026i). The current recorded runtime is Git commit </w:t>
+      </w:r>
+      <w:r>
+        <w:rPr>
+          <w:rFonts w:ascii="DejaVu Sans Mono" w:hAnsi="DejaVu Sans Mono"/>
+          <w:sz w:val="19"/>
+        </w:rPr>
+        <w:t>71297c971e2e7532f7c7139600f41e9b58bdcc22</w:t>
+      </w:r>
+      <w:r>
+        <w:rPr/>
+        <w:t xml:space="preserve">, Cloudflare deployment </w:t>
+      </w:r>
+      <w:r>
+        <w:rPr>
+          <w:rFonts w:ascii="DejaVu Sans Mono" w:hAnsi="DejaVu Sans Mono"/>
+          <w:sz w:val="19"/>
+        </w:rPr>
+        <w:t>97c801c4-c44f-4484-a175-e6651639fe07</w:t>
+      </w:r>
+      <w:r>
+        <w:rPr/>
+        <w:t>, published by Direct Upload rather than Git-triggered deployment. Its Resource Details template opens at the recovered 560 × 440 CSS-pixel working frame and preserves fixed identity/navigation regions around a scrolling content body. Later research and manuscript commits do not alter that deployed runtime unless a separate application build and Pages upload occurs.</w:t>
+      </w:r>
+    </w:p>
+    <w:p>
+      <w:pPr>
+        <w:pStyle w:val="PaperCaption"/>
+        <w:keepNext/>
+      </w:pPr>
+      <w:r>
+        <w:rPr>
+          <w:b/>
+        </w:rPr>
+        <w:t>Table 3. Client identity and deployment baseline.</w:t>
+      </w:r>
+      <w:r>
+        <w:rPr/>
+        <w:t xml:space="preserve"> The table records the application, pinned standards-access dependency, public deployment, and current remote-read boundary that exist before the Smart Citizen integration. Application, library, and deployed-runtime revisions are separate identifiers because each can change independently. The proposed Smart Citizen traversal is not attributed to the deployed client until that behavior is implemented and verified (MERLIN Project 2026g; 2026h; 2026i).</w:t>
+      </w:r>
+    </w:p>
+    <w:tbl>
+      <w:tblPr>
+        <w:tblW w:type="auto" w:w="0"/>
+        <w:jc w:val="center"/>
+        <w:tblLayout w:type="fixed"/>
+        <w:tblLook w:firstColumn="1" w:firstRow="1" w:lastColumn="0" w:lastRow="0" w:noHBand="0" w:noVBand="1" w:val="04A0"/>
+      </w:tblPr>
+      <w:tblGrid>
+        <w:gridCol w:w="2232"/>
+        <w:gridCol w:w="3312"/>
+        <w:gridCol w:w="4248"/>
+      </w:tblGrid>
+      <w:tr>
+        <w:trPr>
+          <w:cantSplit/>
+          <w:tblHeader/>
+        </w:trPr>
+        <w:tc>
+          <w:tcPr>
+            <w:tcW w:type="dxa" w:w="2232"/>
+            <w:vAlign w:val="center"/>
+            <w:tcBorders>
+              <w:top w:val="single" w:sz="4" w:color="D9D9D9"/>
+              <w:left w:val="single" w:sz="4" w:color="D9D9D9"/>
+              <w:bottom w:val="single" w:sz="4" w:color="D9D9D9"/>
+              <w:right w:val="single" w:sz="4" w:color="D9D9D9"/>
+            </w:tcBorders>
+            <w:tcMar>
+              <w:top w:w="90" w:type="dxa"/>
+              <w:left w:w="90" w:type="dxa"/>
+              <w:bottom w:w="90" w:type="dxa"/>
+              <w:right w:w="90" w:type="dxa"/>
+            </w:tcMar>
+            <w:shd w:fill="E8E8E8"/>
+          </w:tcPr>
+          <w:p>
+            <w:pPr>
+              <w:spacing w:after="40" w:line="247" w:lineRule="auto"/>
+            </w:pPr>
+            <w:r>
+              <w:rPr>
+                <w:b/>
+                <w:sz w:val="20"/>
+              </w:rPr>
+              <w:t>Item</w:t>
+            </w:r>
+          </w:p>
+        </w:tc>
+        <w:tc>
+          <w:tcPr>
+            <w:tcW w:type="dxa" w:w="3312"/>
+            <w:vAlign w:val="center"/>
+            <w:tcBorders>
+              <w:top w:val="single" w:sz="4" w:color="D9D9D9"/>
+              <w:left w:val="single" w:sz="4" w:color="D9D9D9"/>
+              <w:bottom w:val="single" w:sz="4" w:color="D9D9D9"/>
+              <w:right w:val="single" w:sz="4" w:color="D9D9D9"/>
+            </w:tcBorders>
+            <w:tcMar>
+              <w:top w:w="90" w:type="dxa"/>
+              <w:left w:w="90" w:type="dxa"/>
+              <w:bottom w:w="90" w:type="dxa"/>
+              <w:right w:w="90" w:type="dxa"/>
+            </w:tcMar>
+            <w:shd w:fill="E8E8E8"/>
+          </w:tcPr>
+          <w:p>
+            <w:pPr>
+              <w:spacing w:after="40" w:line="247" w:lineRule="auto"/>
+            </w:pPr>
+            <w:r>
+              <w:rPr>
+                <w:b/>
+                <w:sz w:val="20"/>
+              </w:rPr>
+              <w:t>Recorded baseline</w:t>
+            </w:r>
+          </w:p>
+        </w:tc>
+        <w:tc>
+          <w:tcPr>
+            <w:tcW w:type="dxa" w:w="4248"/>
+            <w:vAlign w:val="center"/>
+            <w:tcBorders>
+              <w:top w:val="single" w:sz="4" w:color="D9D9D9"/>
+              <w:left w:val="single" w:sz="4" w:color="D9D9D9"/>
+              <w:bottom w:val="single" w:sz="4" w:color="D9D9D9"/>
+              <w:right w:val="single" w:sz="4" w:color="D9D9D9"/>
+            </w:tcBorders>
+            <w:tcMar>
+              <w:top w:w="90" w:type="dxa"/>
+              <w:left w:w="90" w:type="dxa"/>
+              <w:bottom w:w="90" w:type="dxa"/>
+              <w:right w:w="90" w:type="dxa"/>
+            </w:tcMar>
+            <w:shd w:fill="E8E8E8"/>
+          </w:tcPr>
+          <w:p>
+            <w:pPr>
+              <w:spacing w:after="40" w:line="247" w:lineRule="auto"/>
+            </w:pPr>
+            <w:r>
+              <w:rPr>
+                <w:b/>
+                <w:sz w:val="20"/>
+              </w:rPr>
+              <w:t>Standing for this study</w:t>
+            </w:r>
+          </w:p>
+        </w:tc>
+      </w:tr>
+      <w:tr>
+        <w:trPr>
+          <w:cantSplit/>
+        </w:trPr>
+        <w:tc>
+          <w:tcPr>
+            <w:tcW w:type="dxa" w:w="2232"/>
+            <w:vAlign w:val="center"/>
+            <w:tcBorders>
+              <w:top w:val="single" w:sz="4" w:color="D9D9D9"/>
+              <w:left w:val="single" w:sz="4" w:color="D9D9D9"/>
+              <w:bottom w:val="single" w:sz="4" w:color="D9D9D9"/>
+              <w:right w:val="single" w:sz="4" w:color="D9D9D9"/>
+            </w:tcBorders>
+            <w:tcMar>
+              <w:top w:w="90" w:type="dxa"/>
+              <w:left w:w="90" w:type="dxa"/>
+              <w:bottom w:w="90" w:type="dxa"/>
+              <w:right w:w="90" w:type="dxa"/>
+            </w:tcMar>
+            <w:shd w:fill="FFFFFF"/>
+          </w:tcPr>
+          <w:p>
+            <w:pPr>
+              <w:spacing w:after="40" w:line="247" w:lineRule="auto"/>
+            </w:pPr>
+            <w:r>
+              <w:rPr>
+                <w:sz w:val="20"/>
+              </w:rPr>
+              <w:t>Application repository</w:t>
+            </w:r>
+          </w:p>
+        </w:tc>
+        <w:tc>
+          <w:tcPr>
+            <w:tcW w:type="dxa" w:w="3312"/>
+            <w:vAlign w:val="center"/>
+            <w:tcBorders>
+              <w:top w:val="single" w:sz="4" w:color="D9D9D9"/>
+              <w:left w:val="single" w:sz="4" w:color="D9D9D9"/>
+              <w:bottom w:val="single" w:sz="4" w:color="D9D9D9"/>
+              <w:right w:val="single" w:sz="4" w:color="D9D9D9"/>
+            </w:tcBorders>
+            <w:tcMar>
+              <w:top w:w="90" w:type="dxa"/>
+              <w:left w:w="90" w:type="dxa"/>
+              <w:bottom w:w="90" w:type="dxa"/>
+              <w:right w:w="90" w:type="dxa"/>
+            </w:tcMar>
+            <w:shd w:fill="FFFFFF"/>
+          </w:tcPr>
+          <w:p>
+            <w:pPr>
+              <w:spacing w:after="40" w:line="247" w:lineRule="auto"/>
+            </w:pPr>
+            <w:r>
+              <w:rPr>
+                <w:rFonts w:ascii="DejaVu Sans Mono" w:hAnsi="DejaVu Sans Mono"/>
+                <w:sz w:val="20"/>
+              </w:rPr>
+              <w:t>OS4CSAPI/glaux-client</w:t>
+            </w:r>
+          </w:p>
+        </w:tc>
+        <w:tc>
+          <w:tcPr>
+            <w:tcW w:type="dxa" w:w="4248"/>
+            <w:vAlign w:val="center"/>
+            <w:tcBorders>
+              <w:top w:val="single" w:sz="4" w:color="D9D9D9"/>
+              <w:left w:val="single" w:sz="4" w:color="D9D9D9"/>
+              <w:bottom w:val="single" w:sz="4" w:color="D9D9D9"/>
+              <w:right w:val="single" w:sz="4" w:color="D9D9D9"/>
+            </w:tcBorders>
+            <w:tcMar>
+              <w:top w:w="90" w:type="dxa"/>
+              <w:left w:w="90" w:type="dxa"/>
+              <w:bottom w:w="90" w:type="dxa"/>
+              <w:right w:w="90" w:type="dxa"/>
+            </w:tcMar>
+            <w:shd w:fill="FFFFFF"/>
+          </w:tcPr>
+          <w:p>
+            <w:pPr>
+              <w:spacing w:after="40" w:line="247" w:lineRule="auto"/>
+            </w:pPr>
+            <w:r>
+              <w:rPr>
+                <w:sz w:val="20"/>
+              </w:rPr>
+              <w:t>Project-authored standalone experimental client; not a fork of Glaux or Explorer</w:t>
+            </w:r>
+          </w:p>
+        </w:tc>
+      </w:tr>
+      <w:tr>
+        <w:trPr>
+          <w:cantSplit/>
+        </w:trPr>
+        <w:tc>
+          <w:tcPr>
+            <w:tcW w:type="dxa" w:w="2232"/>
+            <w:vAlign w:val="center"/>
+            <w:tcBorders>
+              <w:top w:val="single" w:sz="4" w:color="D9D9D9"/>
+              <w:left w:val="single" w:sz="4" w:color="D9D9D9"/>
+              <w:bottom w:val="single" w:sz="4" w:color="D9D9D9"/>
+              <w:right w:val="single" w:sz="4" w:color="D9D9D9"/>
+            </w:tcBorders>
+            <w:tcMar>
+              <w:top w:w="90" w:type="dxa"/>
+              <w:left w:w="90" w:type="dxa"/>
+              <w:bottom w:w="90" w:type="dxa"/>
+              <w:right w:w="90" w:type="dxa"/>
+            </w:tcMar>
+            <w:shd w:fill="F7F7F7"/>
+          </w:tcPr>
+          <w:p>
+            <w:pPr>
+              <w:spacing w:after="40" w:line="247" w:lineRule="auto"/>
+            </w:pPr>
+            <w:r>
+              <w:rPr>
+                <w:sz w:val="20"/>
+              </w:rPr>
+              <w:t>Application stack</w:t>
+            </w:r>
+          </w:p>
+        </w:tc>
+        <w:tc>
+          <w:tcPr>
+            <w:tcW w:type="dxa" w:w="3312"/>
+            <w:vAlign w:val="center"/>
+            <w:tcBorders>
+              <w:top w:val="single" w:sz="4" w:color="D9D9D9"/>
+              <w:left w:val="single" w:sz="4" w:color="D9D9D9"/>
+              <w:bottom w:val="single" w:sz="4" w:color="D9D9D9"/>
+              <w:right w:val="single" w:sz="4" w:color="D9D9D9"/>
+            </w:tcBorders>
+            <w:tcMar>
+              <w:top w:w="90" w:type="dxa"/>
+              <w:left w:w="90" w:type="dxa"/>
+              <w:bottom w:w="90" w:type="dxa"/>
+              <w:right w:w="90" w:type="dxa"/>
+            </w:tcMar>
+            <w:shd w:fill="F7F7F7"/>
+          </w:tcPr>
+          <w:p>
+            <w:pPr>
+              <w:spacing w:after="40" w:line="247" w:lineRule="auto"/>
+            </w:pPr>
+            <w:r>
+              <w:rPr>
+                <w:sz w:val="20"/>
+              </w:rPr>
+              <w:t>TypeScript / Vite browser application</w:t>
+            </w:r>
+          </w:p>
+        </w:tc>
+        <w:tc>
+          <w:tcPr>
+            <w:tcW w:type="dxa" w:w="4248"/>
+            <w:vAlign w:val="center"/>
+            <w:tcBorders>
+              <w:top w:val="single" w:sz="4" w:color="D9D9D9"/>
+              <w:left w:val="single" w:sz="4" w:color="D9D9D9"/>
+              <w:bottom w:val="single" w:sz="4" w:color="D9D9D9"/>
+              <w:right w:val="single" w:sz="4" w:color="D9D9D9"/>
+            </w:tcBorders>
+            <w:tcMar>
+              <w:top w:w="90" w:type="dxa"/>
+              <w:left w:w="90" w:type="dxa"/>
+              <w:bottom w:w="90" w:type="dxa"/>
+              <w:right w:w="90" w:type="dxa"/>
+            </w:tcMar>
+            <w:shd w:fill="F7F7F7"/>
+          </w:tcPr>
+          <w:p>
+            <w:pPr>
+              <w:spacing w:after="40" w:line="247" w:lineRule="auto"/>
+            </w:pPr>
+            <w:r>
+              <w:rPr>
+                <w:sz w:val="20"/>
+              </w:rPr>
+              <w:t>Current implementation technology, not a DIM or profile requirement</w:t>
+            </w:r>
+          </w:p>
+        </w:tc>
+      </w:tr>
+      <w:tr>
+        <w:trPr>
+          <w:cantSplit/>
+        </w:trPr>
+        <w:tc>
+          <w:tcPr>
+            <w:tcW w:type="dxa" w:w="2232"/>
+            <w:vAlign w:val="center"/>
+            <w:tcBorders>
+              <w:top w:val="single" w:sz="4" w:color="D9D9D9"/>
+              <w:left w:val="single" w:sz="4" w:color="D9D9D9"/>
+              <w:bottom w:val="single" w:sz="4" w:color="D9D9D9"/>
+              <w:right w:val="single" w:sz="4" w:color="D9D9D9"/>
+            </w:tcBorders>
+            <w:tcMar>
+              <w:top w:w="90" w:type="dxa"/>
+              <w:left w:w="90" w:type="dxa"/>
+              <w:bottom w:w="90" w:type="dxa"/>
+              <w:right w:w="90" w:type="dxa"/>
+            </w:tcMar>
+            <w:shd w:fill="FFFFFF"/>
+          </w:tcPr>
+          <w:p>
+            <w:pPr>
+              <w:spacing w:after="40" w:line="247" w:lineRule="auto"/>
+            </w:pPr>
+            <w:r>
+              <w:rPr>
+                <w:sz w:val="20"/>
+              </w:rPr>
+              <w:t>CSAPI library</w:t>
+            </w:r>
+          </w:p>
+        </w:tc>
+        <w:tc>
+          <w:tcPr>
+            <w:tcW w:type="dxa" w:w="3312"/>
+            <w:vAlign w:val="center"/>
+            <w:tcBorders>
+              <w:top w:val="single" w:sz="4" w:color="D9D9D9"/>
+              <w:left w:val="single" w:sz="4" w:color="D9D9D9"/>
+              <w:bottom w:val="single" w:sz="4" w:color="D9D9D9"/>
+              <w:right w:val="single" w:sz="4" w:color="D9D9D9"/>
+            </w:tcBorders>
+            <w:tcMar>
+              <w:top w:w="90" w:type="dxa"/>
+              <w:left w:w="90" w:type="dxa"/>
+              <w:bottom w:w="90" w:type="dxa"/>
+              <w:right w:w="90" w:type="dxa"/>
+            </w:tcMar>
+            <w:shd w:fill="FFFFFF"/>
+          </w:tcPr>
+          <w:p>
+            <w:pPr>
+              <w:spacing w:after="40" w:line="247" w:lineRule="auto"/>
+            </w:pPr>
+            <w:r>
+              <w:rPr>
+                <w:rFonts w:ascii="DejaVu Sans Mono" w:hAnsi="DejaVu Sans Mono"/>
+                <w:sz w:val="20"/>
+              </w:rPr>
+              <w:t>OS4CSAPI/ogc-client-CSAPI_2</w:t>
+            </w:r>
+            <w:r>
+              <w:rPr>
+                <w:sz w:val="20"/>
+              </w:rPr>
+              <w:t xml:space="preserve">, branch </w:t>
+            </w:r>
+            <w:r>
+              <w:rPr>
+                <w:rFonts w:ascii="DejaVu Sans Mono" w:hAnsi="DejaVu Sans Mono"/>
+                <w:sz w:val="20"/>
+              </w:rPr>
+              <w:t>phase-10</w:t>
+            </w:r>
+          </w:p>
+        </w:tc>
+        <w:tc>
+          <w:tcPr>
+            <w:tcW w:type="dxa" w:w="4248"/>
+            <w:vAlign w:val="center"/>
+            <w:tcBorders>
+              <w:top w:val="single" w:sz="4" w:color="D9D9D9"/>
+              <w:left w:val="single" w:sz="4" w:color="D9D9D9"/>
+              <w:bottom w:val="single" w:sz="4" w:color="D9D9D9"/>
+              <w:right w:val="single" w:sz="4" w:color="D9D9D9"/>
+            </w:tcBorders>
+            <w:tcMar>
+              <w:top w:w="90" w:type="dxa"/>
+              <w:left w:w="90" w:type="dxa"/>
+              <w:bottom w:w="90" w:type="dxa"/>
+              <w:right w:w="90" w:type="dxa"/>
+            </w:tcMar>
+            <w:shd w:fill="FFFFFF"/>
+          </w:tcPr>
+          <w:p>
+            <w:pPr>
+              <w:spacing w:after="40" w:line="247" w:lineRule="auto"/>
+            </w:pPr>
+            <w:r>
+              <w:rPr>
+                <w:sz w:val="20"/>
+              </w:rPr>
+              <w:t>Pinned standards-access dependency; separate from application source</w:t>
+            </w:r>
+          </w:p>
+        </w:tc>
+      </w:tr>
+      <w:tr>
+        <w:trPr>
+          <w:cantSplit/>
+        </w:trPr>
+        <w:tc>
+          <w:tcPr>
+            <w:tcW w:type="dxa" w:w="2232"/>
+            <w:vAlign w:val="center"/>
+            <w:tcBorders>
+              <w:top w:val="single" w:sz="4" w:color="D9D9D9"/>
+              <w:left w:val="single" w:sz="4" w:color="D9D9D9"/>
+              <w:bottom w:val="single" w:sz="4" w:color="D9D9D9"/>
+              <w:right w:val="single" w:sz="4" w:color="D9D9D9"/>
+            </w:tcBorders>
+            <w:tcMar>
+              <w:top w:w="90" w:type="dxa"/>
+              <w:left w:w="90" w:type="dxa"/>
+              <w:bottom w:w="90" w:type="dxa"/>
+              <w:right w:w="90" w:type="dxa"/>
+            </w:tcMar>
+            <w:shd w:fill="F7F7F7"/>
+          </w:tcPr>
+          <w:p>
+            <w:pPr>
+              <w:spacing w:after="40" w:line="247" w:lineRule="auto"/>
+            </w:pPr>
+            <w:r>
+              <w:rPr>
+                <w:sz w:val="20"/>
+              </w:rPr>
+              <w:t>Exact library revision</w:t>
+            </w:r>
+          </w:p>
+        </w:tc>
+        <w:tc>
+          <w:tcPr>
+            <w:tcW w:type="dxa" w:w="3312"/>
+            <w:vAlign w:val="center"/>
+            <w:tcBorders>
+              <w:top w:val="single" w:sz="4" w:color="D9D9D9"/>
+              <w:left w:val="single" w:sz="4" w:color="D9D9D9"/>
+              <w:bottom w:val="single" w:sz="4" w:color="D9D9D9"/>
+              <w:right w:val="single" w:sz="4" w:color="D9D9D9"/>
+            </w:tcBorders>
+            <w:tcMar>
+              <w:top w:w="90" w:type="dxa"/>
+              <w:left w:w="90" w:type="dxa"/>
+              <w:bottom w:w="90" w:type="dxa"/>
+              <w:right w:w="90" w:type="dxa"/>
+            </w:tcMar>
+            <w:shd w:fill="F7F7F7"/>
+          </w:tcPr>
+          <w:p>
+            <w:pPr>
+              <w:spacing w:after="40" w:line="247" w:lineRule="auto"/>
+            </w:pPr>
+            <w:r>
+              <w:rPr>
+                <w:rFonts w:ascii="DejaVu Sans Mono" w:hAnsi="DejaVu Sans Mono"/>
+                <w:sz w:val="20"/>
+              </w:rPr>
+              <w:t>4ca1d7db9b1ccdf545adbef42ef941139fe11977</w:t>
+            </w:r>
+          </w:p>
+        </w:tc>
+        <w:tc>
+          <w:tcPr>
+            <w:tcW w:type="dxa" w:w="4248"/>
+            <w:vAlign w:val="center"/>
+            <w:tcBorders>
+              <w:top w:val="single" w:sz="4" w:color="D9D9D9"/>
+              <w:left w:val="single" w:sz="4" w:color="D9D9D9"/>
+              <w:bottom w:val="single" w:sz="4" w:color="D9D9D9"/>
+              <w:right w:val="single" w:sz="4" w:color="D9D9D9"/>
+            </w:tcBorders>
+            <w:tcMar>
+              <w:top w:w="90" w:type="dxa"/>
+              <w:left w:w="90" w:type="dxa"/>
+              <w:bottom w:w="90" w:type="dxa"/>
+              <w:right w:w="90" w:type="dxa"/>
+            </w:tcMar>
+            <w:shd w:fill="F7F7F7"/>
+          </w:tcPr>
+          <w:p>
+            <w:pPr>
+              <w:spacing w:after="40" w:line="247" w:lineRule="auto"/>
+            </w:pPr>
+            <w:r>
+              <w:rPr>
+                <w:sz w:val="20"/>
+              </w:rPr>
+              <w:t>Reproducible client-library checkpoint used by the current application</w:t>
+            </w:r>
+          </w:p>
+        </w:tc>
+      </w:tr>
+      <w:tr>
+        <w:trPr>
+          <w:cantSplit/>
+        </w:trPr>
+        <w:tc>
+          <w:tcPr>
+            <w:tcW w:type="dxa" w:w="2232"/>
+            <w:vAlign w:val="center"/>
+            <w:tcBorders>
+              <w:top w:val="single" w:sz="4" w:color="D9D9D9"/>
+              <w:left w:val="single" w:sz="4" w:color="D9D9D9"/>
+              <w:bottom w:val="single" w:sz="4" w:color="D9D9D9"/>
+              <w:right w:val="single" w:sz="4" w:color="D9D9D9"/>
+            </w:tcBorders>
+            <w:tcMar>
+              <w:top w:w="90" w:type="dxa"/>
+              <w:left w:w="90" w:type="dxa"/>
+              <w:bottom w:w="90" w:type="dxa"/>
+              <w:right w:w="90" w:type="dxa"/>
+            </w:tcMar>
+            <w:shd w:fill="FFFFFF"/>
+          </w:tcPr>
+          <w:p>
+            <w:pPr>
+              <w:spacing w:after="40" w:line="247" w:lineRule="auto"/>
+            </w:pPr>
+            <w:r>
+              <w:rPr>
+                <w:sz w:val="20"/>
+              </w:rPr>
+              <w:t>Package/export</w:t>
+            </w:r>
+          </w:p>
+        </w:tc>
+        <w:tc>
+          <w:tcPr>
+            <w:tcW w:type="dxa" w:w="3312"/>
+            <w:vAlign w:val="center"/>
+            <w:tcBorders>
+              <w:top w:val="single" w:sz="4" w:color="D9D9D9"/>
+              <w:left w:val="single" w:sz="4" w:color="D9D9D9"/>
+              <w:bottom w:val="single" w:sz="4" w:color="D9D9D9"/>
+              <w:right w:val="single" w:sz="4" w:color="D9D9D9"/>
+            </w:tcBorders>
+            <w:tcMar>
+              <w:top w:w="90" w:type="dxa"/>
+              <w:left w:w="90" w:type="dxa"/>
+              <w:bottom w:w="90" w:type="dxa"/>
+              <w:right w:w="90" w:type="dxa"/>
+            </w:tcMar>
+            <w:shd w:fill="FFFFFF"/>
+          </w:tcPr>
+          <w:p>
+            <w:pPr>
+              <w:spacing w:after="40" w:line="247" w:lineRule="auto"/>
+            </w:pPr>
+            <w:r>
+              <w:rPr>
+                <w:rFonts w:ascii="DejaVu Sans Mono" w:hAnsi="DejaVu Sans Mono"/>
+                <w:sz w:val="20"/>
+              </w:rPr>
+              <w:t>@camptocamp/ogc-client</w:t>
+            </w:r>
+            <w:r>
+              <w:rPr>
+                <w:sz w:val="20"/>
+              </w:rPr>
+              <w:t xml:space="preserve"> 1.3.1-dev / </w:t>
+            </w:r>
+            <w:r>
+              <w:rPr>
+                <w:rFonts w:ascii="DejaVu Sans Mono" w:hAnsi="DejaVu Sans Mono"/>
+                <w:sz w:val="20"/>
+              </w:rPr>
+              <w:t>@camptocamp/ogc-client/csapi</w:t>
+            </w:r>
+          </w:p>
+        </w:tc>
+        <w:tc>
+          <w:tcPr>
+            <w:tcW w:type="dxa" w:w="4248"/>
+            <w:vAlign w:val="center"/>
+            <w:tcBorders>
+              <w:top w:val="single" w:sz="4" w:color="D9D9D9"/>
+              <w:left w:val="single" w:sz="4" w:color="D9D9D9"/>
+              <w:bottom w:val="single" w:sz="4" w:color="D9D9D9"/>
+              <w:right w:val="single" w:sz="4" w:color="D9D9D9"/>
+            </w:tcBorders>
+            <w:tcMar>
+              <w:top w:w="90" w:type="dxa"/>
+              <w:left w:w="90" w:type="dxa"/>
+              <w:bottom w:w="90" w:type="dxa"/>
+              <w:right w:w="90" w:type="dxa"/>
+            </w:tcMar>
+            <w:shd w:fill="FFFFFF"/>
+          </w:tcPr>
+          <w:p>
+            <w:pPr>
+              <w:spacing w:after="40" w:line="247" w:lineRule="auto"/>
+            </w:pPr>
+            <w:r>
+              <w:rPr>
+                <w:sz w:val="20"/>
+              </w:rPr>
+              <w:t>Actual package identity and explicit CSAPI import boundary</w:t>
+            </w:r>
+          </w:p>
+        </w:tc>
+      </w:tr>
+      <w:tr>
+        <w:trPr>
+          <w:cantSplit/>
+        </w:trPr>
+        <w:tc>
+          <w:tcPr>
+            <w:tcW w:type="dxa" w:w="2232"/>
+            <w:vAlign w:val="center"/>
+            <w:tcBorders>
+              <w:top w:val="single" w:sz="4" w:color="D9D9D9"/>
+              <w:left w:val="single" w:sz="4" w:color="D9D9D9"/>
+              <w:bottom w:val="single" w:sz="4" w:color="D9D9D9"/>
+              <w:right w:val="single" w:sz="4" w:color="D9D9D9"/>
+            </w:tcBorders>
+            <w:tcMar>
+              <w:top w:w="90" w:type="dxa"/>
+              <w:left w:w="90" w:type="dxa"/>
+              <w:bottom w:w="90" w:type="dxa"/>
+              <w:right w:w="90" w:type="dxa"/>
+            </w:tcMar>
+            <w:shd w:fill="F7F7F7"/>
+          </w:tcPr>
+          <w:p>
+            <w:pPr>
+              <w:spacing w:after="40" w:line="247" w:lineRule="auto"/>
+            </w:pPr>
+            <w:r>
+              <w:rPr>
+                <w:sz w:val="20"/>
+              </w:rPr>
+              <w:t>Public application</w:t>
+            </w:r>
+          </w:p>
+        </w:tc>
+        <w:tc>
+          <w:tcPr>
+            <w:tcW w:type="dxa" w:w="3312"/>
+            <w:vAlign w:val="center"/>
+            <w:tcBorders>
+              <w:top w:val="single" w:sz="4" w:color="D9D9D9"/>
+              <w:left w:val="single" w:sz="4" w:color="D9D9D9"/>
+              <w:bottom w:val="single" w:sz="4" w:color="D9D9D9"/>
+              <w:right w:val="single" w:sz="4" w:color="D9D9D9"/>
+            </w:tcBorders>
+            <w:tcMar>
+              <w:top w:w="90" w:type="dxa"/>
+              <w:left w:w="90" w:type="dxa"/>
+              <w:bottom w:w="90" w:type="dxa"/>
+              <w:right w:w="90" w:type="dxa"/>
+            </w:tcMar>
+            <w:shd w:fill="F7F7F7"/>
+          </w:tcPr>
+          <w:p>
+            <w:pPr>
+              <w:spacing w:after="40" w:line="247" w:lineRule="auto"/>
+            </w:pPr>
+            <w:r>
+              <w:rPr>
+                <w:rFonts w:ascii="DejaVu Sans Mono" w:hAnsi="DejaVu Sans Mono"/>
+                <w:sz w:val="20"/>
+              </w:rPr>
+              <w:t>https://glaux-client.pages.dev/</w:t>
+            </w:r>
+          </w:p>
+        </w:tc>
+        <w:tc>
+          <w:tcPr>
+            <w:tcW w:type="dxa" w:w="4248"/>
+            <w:vAlign w:val="center"/>
+            <w:tcBorders>
+              <w:top w:val="single" w:sz="4" w:color="D9D9D9"/>
+              <w:left w:val="single" w:sz="4" w:color="D9D9D9"/>
+              <w:bottom w:val="single" w:sz="4" w:color="D9D9D9"/>
+              <w:right w:val="single" w:sz="4" w:color="D9D9D9"/>
+            </w:tcBorders>
+            <w:tcMar>
+              <w:top w:w="90" w:type="dxa"/>
+              <w:left w:w="90" w:type="dxa"/>
+              <w:bottom w:w="90" w:type="dxa"/>
+              <w:right w:w="90" w:type="dxa"/>
+            </w:tcMar>
+            <w:shd w:fill="F7F7F7"/>
+          </w:tcPr>
+          <w:p>
+            <w:pPr>
+              <w:spacing w:after="40" w:line="247" w:lineRule="auto"/>
+            </w:pPr>
+            <w:r>
+              <w:rPr>
+                <w:sz w:val="20"/>
+              </w:rPr>
+              <w:t>Cloudflare Pages production origin for the experiment UI</w:t>
+            </w:r>
+          </w:p>
+        </w:tc>
+      </w:tr>
+      <w:tr>
+        <w:trPr>
+          <w:cantSplit/>
+        </w:trPr>
+        <w:tc>
+          <w:tcPr>
+            <w:tcW w:type="dxa" w:w="2232"/>
+            <w:vAlign w:val="center"/>
+            <w:tcBorders>
+              <w:top w:val="single" w:sz="4" w:color="D9D9D9"/>
+              <w:left w:val="single" w:sz="4" w:color="D9D9D9"/>
+              <w:bottom w:val="single" w:sz="4" w:color="D9D9D9"/>
+              <w:right w:val="single" w:sz="4" w:color="D9D9D9"/>
+            </w:tcBorders>
+            <w:tcMar>
+              <w:top w:w="90" w:type="dxa"/>
+              <w:left w:w="90" w:type="dxa"/>
+              <w:bottom w:w="90" w:type="dxa"/>
+              <w:right w:w="90" w:type="dxa"/>
+            </w:tcMar>
+            <w:shd w:fill="FFFFFF"/>
+          </w:tcPr>
+          <w:p>
+            <w:pPr>
+              <w:spacing w:after="40" w:line="247" w:lineRule="auto"/>
+            </w:pPr>
+            <w:r>
+              <w:rPr>
+                <w:sz w:val="20"/>
+              </w:rPr>
+              <w:t>Deployed runtime commit</w:t>
+            </w:r>
+          </w:p>
+        </w:tc>
+        <w:tc>
+          <w:tcPr>
+            <w:tcW w:type="dxa" w:w="3312"/>
+            <w:vAlign w:val="center"/>
+            <w:tcBorders>
+              <w:top w:val="single" w:sz="4" w:color="D9D9D9"/>
+              <w:left w:val="single" w:sz="4" w:color="D9D9D9"/>
+              <w:bottom w:val="single" w:sz="4" w:color="D9D9D9"/>
+              <w:right w:val="single" w:sz="4" w:color="D9D9D9"/>
+            </w:tcBorders>
+            <w:tcMar>
+              <w:top w:w="90" w:type="dxa"/>
+              <w:left w:w="90" w:type="dxa"/>
+              <w:bottom w:w="90" w:type="dxa"/>
+              <w:right w:w="90" w:type="dxa"/>
+            </w:tcMar>
+            <w:shd w:fill="FFFFFF"/>
+          </w:tcPr>
+          <w:p>
+            <w:pPr>
+              <w:spacing w:after="40" w:line="247" w:lineRule="auto"/>
+            </w:pPr>
+            <w:r>
+              <w:rPr>
+                <w:rFonts w:ascii="DejaVu Sans Mono" w:hAnsi="DejaVu Sans Mono"/>
+                <w:sz w:val="20"/>
+              </w:rPr>
+              <w:t>71297c971e2e7532f7c7139600f41e9b58bdcc22</w:t>
+            </w:r>
+          </w:p>
+        </w:tc>
+        <w:tc>
+          <w:tcPr>
+            <w:tcW w:type="dxa" w:w="4248"/>
+            <w:vAlign w:val="center"/>
+            <w:tcBorders>
+              <w:top w:val="single" w:sz="4" w:color="D9D9D9"/>
+              <w:left w:val="single" w:sz="4" w:color="D9D9D9"/>
+              <w:bottom w:val="single" w:sz="4" w:color="D9D9D9"/>
+              <w:right w:val="single" w:sz="4" w:color="D9D9D9"/>
+            </w:tcBorders>
+            <w:tcMar>
+              <w:top w:w="90" w:type="dxa"/>
+              <w:left w:w="90" w:type="dxa"/>
+              <w:bottom w:w="90" w:type="dxa"/>
+              <w:right w:w="90" w:type="dxa"/>
+            </w:tcMar>
+            <w:shd w:fill="FFFFFF"/>
+          </w:tcPr>
+          <w:p>
+            <w:pPr>
+              <w:spacing w:after="40" w:line="247" w:lineRule="auto"/>
+            </w:pPr>
+            <w:r>
+              <w:rPr>
+                <w:sz w:val="20"/>
+              </w:rPr>
+              <w:t>Application revision actually represented by the current public runtime</w:t>
+            </w:r>
+          </w:p>
+        </w:tc>
+      </w:tr>
+      <w:tr>
+        <w:trPr>
+          <w:cantSplit/>
+        </w:trPr>
+        <w:tc>
+          <w:tcPr>
+            <w:tcW w:type="dxa" w:w="2232"/>
+            <w:vAlign w:val="center"/>
+            <w:tcBorders>
+              <w:top w:val="single" w:sz="4" w:color="D9D9D9"/>
+              <w:left w:val="single" w:sz="4" w:color="D9D9D9"/>
+              <w:bottom w:val="single" w:sz="4" w:color="D9D9D9"/>
+              <w:right w:val="single" w:sz="4" w:color="D9D9D9"/>
+            </w:tcBorders>
+            <w:tcMar>
+              <w:top w:w="90" w:type="dxa"/>
+              <w:left w:w="90" w:type="dxa"/>
+              <w:bottom w:w="90" w:type="dxa"/>
+              <w:right w:w="90" w:type="dxa"/>
+            </w:tcMar>
+            <w:shd w:fill="F7F7F7"/>
+          </w:tcPr>
+          <w:p>
+            <w:pPr>
+              <w:spacing w:after="40" w:line="247" w:lineRule="auto"/>
+            </w:pPr>
+            <w:r>
+              <w:rPr>
+                <w:sz w:val="20"/>
+              </w:rPr>
+              <w:t>Cloudflare deployment</w:t>
+            </w:r>
+          </w:p>
+        </w:tc>
+        <w:tc>
+          <w:tcPr>
+            <w:tcW w:type="dxa" w:w="3312"/>
+            <w:vAlign w:val="center"/>
+            <w:tcBorders>
+              <w:top w:val="single" w:sz="4" w:color="D9D9D9"/>
+              <w:left w:val="single" w:sz="4" w:color="D9D9D9"/>
+              <w:bottom w:val="single" w:sz="4" w:color="D9D9D9"/>
+              <w:right w:val="single" w:sz="4" w:color="D9D9D9"/>
+            </w:tcBorders>
+            <w:tcMar>
+              <w:top w:w="90" w:type="dxa"/>
+              <w:left w:w="90" w:type="dxa"/>
+              <w:bottom w:w="90" w:type="dxa"/>
+              <w:right w:w="90" w:type="dxa"/>
+            </w:tcMar>
+            <w:shd w:fill="F7F7F7"/>
+          </w:tcPr>
+          <w:p>
+            <w:pPr>
+              <w:spacing w:after="40" w:line="247" w:lineRule="auto"/>
+            </w:pPr>
+            <w:r>
+              <w:rPr>
+                <w:rFonts w:ascii="DejaVu Sans Mono" w:hAnsi="DejaVu Sans Mono"/>
+                <w:sz w:val="20"/>
+              </w:rPr>
+              <w:t>97c801c4-c44f-4484-a175-e6651639fe07</w:t>
+            </w:r>
+          </w:p>
+        </w:tc>
+        <w:tc>
+          <w:tcPr>
+            <w:tcW w:type="dxa" w:w="4248"/>
+            <w:vAlign w:val="center"/>
+            <w:tcBorders>
+              <w:top w:val="single" w:sz="4" w:color="D9D9D9"/>
+              <w:left w:val="single" w:sz="4" w:color="D9D9D9"/>
+              <w:bottom w:val="single" w:sz="4" w:color="D9D9D9"/>
+              <w:right w:val="single" w:sz="4" w:color="D9D9D9"/>
+            </w:tcBorders>
+            <w:tcMar>
+              <w:top w:w="90" w:type="dxa"/>
+              <w:left w:w="90" w:type="dxa"/>
+              <w:bottom w:w="90" w:type="dxa"/>
+              <w:right w:w="90" w:type="dxa"/>
+            </w:tcMar>
+            <w:shd w:fill="F7F7F7"/>
+          </w:tcPr>
+          <w:p>
+            <w:pPr>
+              <w:spacing w:after="40" w:line="247" w:lineRule="auto"/>
+            </w:pPr>
+            <w:r>
+              <w:rPr>
+                <w:sz w:val="20"/>
+              </w:rPr>
+              <w:t>Direct Upload deployment associated with the recorded runtime</w:t>
+            </w:r>
+          </w:p>
+        </w:tc>
+      </w:tr>
+      <w:tr>
+        <w:trPr>
+          <w:cantSplit/>
+        </w:trPr>
+        <w:tc>
+          <w:tcPr>
+            <w:tcW w:type="dxa" w:w="2232"/>
+            <w:vAlign w:val="center"/>
+            <w:tcBorders>
+              <w:top w:val="single" w:sz="4" w:color="D9D9D9"/>
+              <w:left w:val="single" w:sz="4" w:color="D9D9D9"/>
+              <w:bottom w:val="single" w:sz="4" w:color="D9D9D9"/>
+              <w:right w:val="single" w:sz="4" w:color="D9D9D9"/>
+            </w:tcBorders>
+            <w:tcMar>
+              <w:top w:w="90" w:type="dxa"/>
+              <w:left w:w="90" w:type="dxa"/>
+              <w:bottom w:w="90" w:type="dxa"/>
+              <w:right w:w="90" w:type="dxa"/>
+            </w:tcMar>
+            <w:shd w:fill="FFFFFF"/>
+          </w:tcPr>
+          <w:p>
+            <w:pPr>
+              <w:spacing w:after="40" w:line="247" w:lineRule="auto"/>
+            </w:pPr>
+            <w:r>
+              <w:rPr>
+                <w:sz w:val="20"/>
+              </w:rPr>
+              <w:t>Default review frame</w:t>
+            </w:r>
+          </w:p>
+        </w:tc>
+        <w:tc>
+          <w:tcPr>
+            <w:tcW w:type="dxa" w:w="3312"/>
+            <w:vAlign w:val="center"/>
+            <w:tcBorders>
+              <w:top w:val="single" w:sz="4" w:color="D9D9D9"/>
+              <w:left w:val="single" w:sz="4" w:color="D9D9D9"/>
+              <w:bottom w:val="single" w:sz="4" w:color="D9D9D9"/>
+              <w:right w:val="single" w:sz="4" w:color="D9D9D9"/>
+            </w:tcBorders>
+            <w:tcMar>
+              <w:top w:w="90" w:type="dxa"/>
+              <w:left w:w="90" w:type="dxa"/>
+              <w:bottom w:w="90" w:type="dxa"/>
+              <w:right w:w="90" w:type="dxa"/>
+            </w:tcMar>
+            <w:shd w:fill="FFFFFF"/>
+          </w:tcPr>
+          <w:p>
+            <w:pPr>
+              <w:spacing w:after="40" w:line="247" w:lineRule="auto"/>
+            </w:pPr>
+            <w:r>
+              <w:rPr>
+                <w:sz w:val="20"/>
+              </w:rPr>
+              <w:t>560 × 440 CSS pixels</w:t>
+            </w:r>
+          </w:p>
+        </w:tc>
+        <w:tc>
+          <w:tcPr>
+            <w:tcW w:type="dxa" w:w="4248"/>
+            <w:vAlign w:val="center"/>
+            <w:tcBorders>
+              <w:top w:val="single" w:sz="4" w:color="D9D9D9"/>
+              <w:left w:val="single" w:sz="4" w:color="D9D9D9"/>
+              <w:bottom w:val="single" w:sz="4" w:color="D9D9D9"/>
+              <w:right w:val="single" w:sz="4" w:color="D9D9D9"/>
+            </w:tcBorders>
+            <w:tcMar>
+              <w:top w:w="90" w:type="dxa"/>
+              <w:left w:w="90" w:type="dxa"/>
+              <w:bottom w:w="90" w:type="dxa"/>
+              <w:right w:w="90" w:type="dxa"/>
+            </w:tcMar>
+            <w:shd w:fill="FFFFFF"/>
+          </w:tcPr>
+          <w:p>
+            <w:pPr>
+              <w:spacing w:after="40" w:line="247" w:lineRule="auto"/>
+            </w:pPr>
+            <w:r>
+              <w:rPr>
+                <w:sz w:val="20"/>
+              </w:rPr>
+              <w:t>Recovered Resource Details working size; not a final Dockview constraint</w:t>
+            </w:r>
+          </w:p>
+        </w:tc>
+      </w:tr>
+      <w:tr>
+        <w:trPr>
+          <w:cantSplit/>
+        </w:trPr>
+        <w:tc>
+          <w:tcPr>
+            <w:tcW w:type="dxa" w:w="2232"/>
+            <w:vAlign w:val="center"/>
+            <w:tcBorders>
+              <w:top w:val="single" w:sz="4" w:color="D9D9D9"/>
+              <w:left w:val="single" w:sz="4" w:color="D9D9D9"/>
+              <w:bottom w:val="single" w:sz="4" w:color="D9D9D9"/>
+              <w:right w:val="single" w:sz="4" w:color="D9D9D9"/>
+            </w:tcBorders>
+            <w:tcMar>
+              <w:top w:w="90" w:type="dxa"/>
+              <w:left w:w="90" w:type="dxa"/>
+              <w:bottom w:w="90" w:type="dxa"/>
+              <w:right w:w="90" w:type="dxa"/>
+            </w:tcMar>
+            <w:shd w:fill="F7F7F7"/>
+          </w:tcPr>
+          <w:p>
+            <w:pPr>
+              <w:spacing w:after="40" w:line="247" w:lineRule="auto"/>
+            </w:pPr>
+            <w:r>
+              <w:rPr>
+                <w:sz w:val="20"/>
+              </w:rPr>
+              <w:t>Current remote read boundary</w:t>
+            </w:r>
+          </w:p>
+        </w:tc>
+        <w:tc>
+          <w:tcPr>
+            <w:tcW w:type="dxa" w:w="3312"/>
+            <w:vAlign w:val="center"/>
+            <w:tcBorders>
+              <w:top w:val="single" w:sz="4" w:color="D9D9D9"/>
+              <w:left w:val="single" w:sz="4" w:color="D9D9D9"/>
+              <w:bottom w:val="single" w:sz="4" w:color="D9D9D9"/>
+              <w:right w:val="single" w:sz="4" w:color="D9D9D9"/>
+            </w:tcBorders>
+            <w:tcMar>
+              <w:top w:w="90" w:type="dxa"/>
+              <w:left w:w="90" w:type="dxa"/>
+              <w:bottom w:w="90" w:type="dxa"/>
+              <w:right w:w="90" w:type="dxa"/>
+            </w:tcMar>
+            <w:shd w:fill="F7F7F7"/>
+          </w:tcPr>
+          <w:p>
+            <w:pPr>
+              <w:spacing w:after="40" w:line="247" w:lineRule="auto"/>
+            </w:pPr>
+            <w:r>
+              <w:rPr>
+                <w:sz w:val="20"/>
+              </w:rPr>
+              <w:t>Direct System URL, no credentials, at most one advertised SensorML alternate/describedby</w:t>
+            </w:r>
+          </w:p>
+        </w:tc>
+        <w:tc>
+          <w:tcPr>
+            <w:tcW w:type="dxa" w:w="4248"/>
+            <w:vAlign w:val="center"/>
+            <w:tcBorders>
+              <w:top w:val="single" w:sz="4" w:color="D9D9D9"/>
+              <w:left w:val="single" w:sz="4" w:color="D9D9D9"/>
+              <w:bottom w:val="single" w:sz="4" w:color="D9D9D9"/>
+              <w:right w:val="single" w:sz="4" w:color="D9D9D9"/>
+            </w:tcBorders>
+            <w:tcMar>
+              <w:top w:w="90" w:type="dxa"/>
+              <w:left w:w="90" w:type="dxa"/>
+              <w:bottom w:w="90" w:type="dxa"/>
+              <w:right w:w="90" w:type="dxa"/>
+            </w:tcMar>
+            <w:shd w:fill="F7F7F7"/>
+          </w:tcPr>
+          <w:p>
+            <w:pPr>
+              <w:spacing w:after="40" w:line="247" w:lineRule="auto"/>
+            </w:pPr>
+            <w:r>
+              <w:rPr>
+                <w:sz w:val="20"/>
+              </w:rPr>
+              <w:t>Existing capability; full connected-resource traversal remains to be implemented</w:t>
+            </w:r>
+          </w:p>
+        </w:tc>
+      </w:tr>
+    </w:tbl>
+    <w:p>
+      <w:pPr>
+        <w:spacing w:after="40" w:before="0" w:line="60" w:lineRule="exact"/>
+      </w:pPr>
+    </w:p>
+    <w:p>
+      <w:pPr/>
+      <w:r>
+        <w:rPr/>
+        <w:t xml:space="preserve">The deployed client can currently read an explicitly supplied System resource URL, issue a credential-free GET, preserve the received body, and follow at most one advertised typed SensorML </w:t>
+      </w:r>
+      <w:r>
+        <w:rPr>
+          <w:rFonts w:ascii="DejaVu Sans Mono" w:hAnsi="DejaVu Sans Mono"/>
+          <w:sz w:val="19"/>
+        </w:rPr>
+        <w:t>alternate</w:t>
+      </w:r>
+      <w:r>
+        <w:rPr/>
+        <w:t xml:space="preserve"> or </w:t>
+      </w:r>
+      <w:r>
+        <w:rPr>
+          <w:rFonts w:ascii="DejaVu Sans Mono" w:hAnsi="DejaVu Sans Mono"/>
+          <w:sz w:val="19"/>
+        </w:rPr>
+        <w:t>describedby</w:t>
+      </w:r>
+      <w:r>
+        <w:rPr/>
+        <w:t xml:space="preserve"> link (MERLIN Project 2026g). It does not yet authenticate to a service, discover arbitrary collections, or traverse the full System-to-equipment/deployment/DataStream/schema/Observation graph required by the proposed Smart Citizen study. The existing synthetic power example resolves a fixed local bundle rather than discovering that graph from a server. Consequently, the Smart Citizen experiment includes a client implementation increment rather than assuming the current deployment already provides the necessary traversal.</w:t>
+      </w:r>
+    </w:p>
+    <w:p>
+      <w:pPr>
+        <w:pStyle w:val="Heading3"/>
+      </w:pPr>
+      <w:r>
+        <w:rPr/>
+        <w:t>Role in the Smart Citizen experiment</w:t>
+      </w:r>
+    </w:p>
+    <w:p>
+      <w:pPr/>
+      <w:r>
+        <w:rPr/>
+        <w:t>For the live experiment, Glaux will consume the connected resources published through the selected 52°North CSAPI server rather than reading Smart Citizen's native API directly for the operator comparison. The data layer must retrieve and retain the relevant standardized resources and responses, the profile layer must recognize only supported MPSS/DIM meanings, and the presentation layer must reconstruct the Resource Details experience from those meanings. The generic condition will remain competent enough to expose the same standard properties, relationships, units, times, and raw evidence without profile-specific organization. A profile-aware benefit will therefore require an observable difference in supported interpretation or task performance, not merely a more polished layout.</w:t>
+      </w:r>
+    </w:p>
+    <w:p>
+      <w:pPr/>
+      <w:r>
+        <w:rPr/>
+        <w:t>Each executed run will record the Smart Citizen capture revision, adapter revision, CSAPI server revision and image, Glaux source revision, Glaux deployed-runtime revision, pinned client-library revision, and MPSS profile revision. This version chain is necessary because a change at any one layer could alter the final display without changing the others. The first client increment will add the connected-resource retrieval and Smart Citizen presentation needed for the study while retaining the existing original-response and Standard View boundaries. Until that increment is built and verified, Figures 6–8 and any claim that Glaux reconstructed the live Smart Citizen dataset remain pending experimental evidence.</w:t>
+      </w:r>
+    </w:p>
+    <w:p>
+      <w:pPr>
+        <w:pStyle w:val="Heading1"/>
+      </w:pPr>
+      <w:r>
+        <w:rPr/>
+        <w:t>4 Research questions and study design</w:t>
+      </w:r>
+    </w:p>
+    <w:p>
+      <w:pPr/>
+      <w:r>
+        <w:rPr/>
+        <w:t>The study proposes a traceable integration case. A controlled comparison of information presentation will follow that integration. Together, these stages address three research questions.</w:t>
+      </w:r>
+    </w:p>
+    <w:p>
+      <w:pPr>
+        <w:pStyle w:val="PaperList"/>
+      </w:pPr>
+      <w:r>
+        <w:t xml:space="preserve">1. </w:t>
+      </w:r>
+      <w:r>
+        <w:rPr>
+          <w:b/>
+        </w:rPr>
+        <w:t>Semantic preservation.</w:t>
+      </w:r>
+      <w:r>
+        <w:rPr/>
+        <w:t xml:space="preserve"> Which source-supported meanings survive acquisition, adaptation, CSAPI publication, retrieval, and presentation, and where does meaning become ambiguous or lost?</w:t>
+      </w:r>
+    </w:p>
+    <w:p>
+      <w:pPr>
+        <w:pStyle w:val="PaperList"/>
+      </w:pPr>
+      <w:r>
+        <w:t xml:space="preserve">2. </w:t>
+      </w:r>
+      <w:r>
+        <w:rPr>
+          <w:b/>
+        </w:rPr>
+        <w:t>Profile contribution.</w:t>
+      </w:r>
+      <w:r>
+        <w:rPr/>
+        <w:t xml:space="preserve"> Which operator questions become easier to answer through the DIM and MPSS when compared with competent presentation of the same standard resources without profile-specific organization?</w:t>
+      </w:r>
+    </w:p>
+    <w:p>
+      <w:pPr>
+        <w:pStyle w:val="PaperList"/>
+      </w:pPr>
+      <w:r>
+        <w:t xml:space="preserve">3. </w:t>
+      </w:r>
+      <w:r>
+        <w:rPr>
+          <w:b/>
+        </w:rPr>
+        <w:t>Coverage and transfer.</w:t>
+      </w:r>
+      <w:r>
+        <w:rPr/>
+        <w:t xml:space="preserve"> Which information subjects and relationships are exercised, and which mappings remain reusable when a second producer is introduced?</w:t>
+      </w:r>
+    </w:p>
+    <w:p>
+      <w:pPr/>
+      <w:r>
+        <w:rPr/>
+        <w:t>The unit of technical analysis is a traceable assertion: a value, identity, relationship, or contextual statement with an identified source and interpretation. A sample may contain several such assertions. The evaluation will avoid equating the number of observations with domain coverage or treating R01–R20 as twenty interchangeable checklist points. Findings about transport, interpretation, and presentation will be reported separately.</w:t>
+      </w:r>
+    </w:p>
+    <w:p>
+      <w:pPr/>
+      <w:r>
+        <w:rPr/>
+        <w:t>The immediate proposed path is public Smart Citizen acquisition through a documented adapter into an identified CSAPI test service, followed by Glaux retrieval. The exact server, write interfaces, version, adapter revision, and execution environment will be recorded before the first run. They are not selected by implication in this protocol. An owned kit is a later extension for facts that a public feed does not establish.</w:t>
+      </w:r>
+    </w:p>
+    <w:p>
+      <w:pPr>
+        <w:keepNext/>
+        <w:spacing w:after="40"/>
+        <w:jc w:val="center"/>
+      </w:pPr>
+      <w:r>
+        <w:drawing>
+          <wp:inline xmlns:a="http://schemas.openxmlformats.org/drawingml/2006/main" xmlns:pic="http://schemas.openxmlformats.org/drawingml/2006/picture">
             <wp:extent cx="6217920" cy="5285232"/>
-            <wp:docPr id="3" name="Picture 3" descr="Proposed architecture connecting source evidence, explicit mapping, a CSAPI service, and separate generic and profile-aware client inspection" title="Proposed architecture connecting source evidence, explicit mapping, a CSAPI service, and separate generic and profile-aware client inspection"/>
+            <wp:docPr id="4" name="Picture 4" descr="Proposed architecture connecting source evidence, explicit mapping, a CSAPI service, and separate generic and profile-aware client inspection" title="Proposed architecture connecting source evidence, explicit mapping, a CSAPI service, and separate generic and profile-aware client inspection"/>
             <wp:cNvGraphicFramePr>
               <a:graphicFrameLocks noChangeAspect="1"/>
             </wp:cNvGraphicFramePr>
@@ -2472,7 +3998,7 @@
                     <pic:cNvPicPr/>
                   </pic:nvPicPr>
                   <pic:blipFill>
-                    <a:blip r:embed="rId13"/>
+                    <a:blip r:embed="rId14"/>
                     <a:stretch>
                       <a:fillRect/>
                     </a:stretch>
@@ -2500,7 +4026,7 @@
         <w:rPr>
           <w:b/>
         </w:rPr>
-        <w:t>Figure 3. Proposed experiment architecture.</w:t>
+        <w:t>Figure 4. Proposed experiment architecture.</w:t>
       </w:r>
       <w:r>
         <w:rPr/>
@@ -2564,7 +4090,7 @@
         <w:rPr>
           <w:b/>
         </w:rPr>
-        <w:t>Table 3. Selected observations from the preliminary public capture.</w:t>
+        <w:t>Table 4. Selected observations from the preliminary public capture.</w:t>
       </w:r>
       <w:r>
         <w:rPr/>
@@ -3520,7 +5046,7 @@
         <w:drawing>
           <wp:inline xmlns:a="http://schemas.openxmlformats.org/drawingml/2006/main" xmlns:pic="http://schemas.openxmlformats.org/drawingml/2006/picture">
             <wp:extent cx="6217920" cy="5129784"/>
-            <wp:docPr id="4" name="Picture 4" descr="Proposed conceptual relationships separating model description, represented system, source registration, observations, observed subjects, and integration provenance" title="Proposed conceptual relationships separating model description, represented system, source registration, observations, observed subjects, and integration provenance"/>
+            <wp:docPr id="5" name="Picture 5" descr="Proposed conceptual relationships separating model description, represented system, source registration, observations, observed subjects, and integration provenance" title="Proposed conceptual relationships separating model description, represented system, source registration, observations, observed subjects, and integration provenance"/>
             <wp:cNvGraphicFramePr>
               <a:graphicFrameLocks noChangeAspect="1"/>
             </wp:cNvGraphicFramePr>
@@ -3532,7 +5058,7 @@
                     <pic:cNvPicPr/>
                   </pic:nvPicPr>
                   <pic:blipFill>
-                    <a:blip r:embed="rId14"/>
+                    <a:blip r:embed="rId15"/>
                     <a:stretch>
                       <a:fillRect/>
                     </a:stretch>
@@ -3560,7 +5086,7 @@
         <w:rPr>
           <w:b/>
         </w:rPr>
-        <w:t>Figure 4. Proposed conceptual distinctions for the mapped specimen.</w:t>
+        <w:t>Figure 5. Proposed conceptual distinctions for the mapped specimen.</w:t>
       </w:r>
       <w:r>
         <w:rPr/>
@@ -3613,7 +5139,7 @@
         <w:rPr>
           <w:b/>
         </w:rPr>
-        <w:t>Table 4. Required explanation for each mapping.</w:t>
+        <w:t>Table 5. Required explanation for each mapping.</w:t>
       </w:r>
       <w:r>
         <w:rPr/>
@@ -4838,7 +6364,7 @@
         <w:rPr>
           <w:b/>
         </w:rPr>
-        <w:t>Table 5. Expected coverage and remaining evidence needs.</w:t>
+        <w:t>Table 6. Expected coverage and remaining evidence needs.</w:t>
       </w:r>
       <w:r>
         <w:rPr/>
@@ -5779,7 +7305,7 @@
         <w:rPr>
           <w:b/>
         </w:rPr>
-        <w:t>Table 6. Proposed evaluation criteria.</w:t>
+        <w:t>Table 7. Proposed evaluation criteria.</w:t>
       </w:r>
       <w:r>
         <w:rPr/>
@@ -6379,11 +7905,11 @@
         <w:rPr>
           <w:b/>
         </w:rPr>
-        <w:t>Table 7. Planned figures and evidence status.</w:t>
+        <w:t>Table 8. Planned figures and evidence status.</w:t>
       </w:r>
       <w:r>
         <w:rPr/>
-        <w:t xml:space="preserve"> Figure 1 is an official product-model photograph with an identified source and explicit limits. Figure 2 is an authored server-lineage diagram, while Figures 3 and 4 are authored diagrams of the proposed experiment. Figures 5–7 are reserved evidence slots, and no substitute or simulated screenshots are presented.</w:t>
+        <w:t xml:space="preserve"> Figure 1 is an official product-model photograph with an identified source and explicit limits. Figure 2 is an authored server-lineage diagram, Figure 3 is an authored client-architecture diagram, and Figures 4 and 5 are authored diagrams of the proposed experiment. Figures 6–8 are reserved evidence slots, and no substitute or simulated screenshots are presented.</w:t>
       </w:r>
     </w:p>
     <w:tbl>
@@ -6492,7 +8018,7 @@
                 <w:b/>
                 <w:sz w:val="20"/>
               </w:rPr>
-              <w:t>Status in version 0.4</w:t>
+              <w:t>Status in version 0.5</w:t>
             </w:r>
           </w:p>
         </w:tc>
@@ -6682,7 +8208,7 @@
               <w:rPr>
                 <w:sz w:val="20"/>
               </w:rPr>
-              <w:t>Included as an authored diagram</w:t>
+              <w:t>Included as an authored server-lineage diagram</w:t>
             </w:r>
           </w:p>
         </w:tc>
@@ -6747,7 +8273,7 @@
               <w:rPr>
                 <w:sz w:val="20"/>
               </w:rPr>
-              <w:t>Proposed acquisition, mapping, service, and comparison architecture</w:t>
+              <w:t>Glaux experimental client architecture and interpretation boundary</w:t>
             </w:r>
           </w:p>
         </w:tc>
@@ -6777,7 +8303,7 @@
               <w:rPr>
                 <w:sz w:val="20"/>
               </w:rPr>
-              <w:t>Included as an authored diagram</w:t>
+              <w:t>Included as an authored client-architecture diagram; Smart Citizen graph traversal remains planned</w:t>
             </w:r>
           </w:p>
         </w:tc>
@@ -6842,7 +8368,7 @@
               <w:rPr>
                 <w:sz w:val="20"/>
               </w:rPr>
-              <w:t>Proposed model and subject distinctions</w:t>
+              <w:t>Proposed acquisition, mapping, service, and comparison architecture</w:t>
             </w:r>
           </w:p>
         </w:tc>
@@ -6937,7 +8463,7 @@
               <w:rPr>
                 <w:sz w:val="20"/>
               </w:rPr>
-              <w:t>Actual Smart Citizen interface showing the selected channels and interval</w:t>
+              <w:t>Proposed model and subject distinctions</w:t>
             </w:r>
           </w:p>
         </w:tc>
@@ -6967,7 +8493,7 @@
               <w:rPr>
                 <w:sz w:val="20"/>
               </w:rPr>
-              <w:t>Awaiting documented capture</w:t>
+              <w:t>Included as an authored diagram</w:t>
             </w:r>
           </w:p>
         </w:tc>
@@ -7032,7 +8558,7 @@
               <w:rPr>
                 <w:sz w:val="20"/>
               </w:rPr>
-              <w:t>Matched generic and profile-aware Glaux views of the integrated evidence</w:t>
+              <w:t>Actual Smart Citizen interface showing the selected channels and interval</w:t>
             </w:r>
           </w:p>
         </w:tc>
@@ -7062,7 +8588,7 @@
               <w:rPr>
                 <w:sz w:val="20"/>
               </w:rPr>
-              <w:t>Awaiting implementation and capture</w:t>
+              <w:t>Awaiting documented capture</w:t>
             </w:r>
           </w:p>
         </w:tc>
@@ -7127,7 +8653,7 @@
               <w:rPr>
                 <w:sz w:val="20"/>
               </w:rPr>
-              <w:t>Actual implemented resource relationships and a traced source-to-display example</w:t>
+              <w:t>Matched generic and profile-aware Glaux views of the integrated evidence</w:t>
             </w:r>
           </w:p>
         </w:tc>
@@ -7157,6 +8683,101 @@
               <w:rPr>
                 <w:sz w:val="20"/>
               </w:rPr>
+              <w:t>Awaiting implementation and capture</w:t>
+            </w:r>
+          </w:p>
+        </w:tc>
+      </w:tr>
+      <w:tr>
+        <w:trPr>
+          <w:cantSplit/>
+        </w:trPr>
+        <w:tc>
+          <w:tcPr>
+            <w:tcW w:type="dxa" w:w="864"/>
+            <w:vAlign w:val="center"/>
+            <w:tcBorders>
+              <w:top w:val="single" w:sz="4" w:color="D9D9D9"/>
+              <w:left w:val="single" w:sz="4" w:color="D9D9D9"/>
+              <w:bottom w:val="single" w:sz="4" w:color="D9D9D9"/>
+              <w:right w:val="single" w:sz="4" w:color="D9D9D9"/>
+            </w:tcBorders>
+            <w:tcMar>
+              <w:top w:w="90" w:type="dxa"/>
+              <w:left w:w="90" w:type="dxa"/>
+              <w:bottom w:w="90" w:type="dxa"/>
+              <w:right w:w="90" w:type="dxa"/>
+            </w:tcMar>
+            <w:shd w:fill="F7F7F7"/>
+          </w:tcPr>
+          <w:p>
+            <w:pPr>
+              <w:spacing w:after="40" w:line="247" w:lineRule="auto"/>
+            </w:pPr>
+            <w:r>
+              <w:rPr>
+                <w:sz w:val="20"/>
+              </w:rPr>
+              <w:t>8</w:t>
+            </w:r>
+          </w:p>
+        </w:tc>
+        <w:tc>
+          <w:tcPr>
+            <w:tcW w:type="dxa" w:w="4536"/>
+            <w:vAlign w:val="center"/>
+            <w:tcBorders>
+              <w:top w:val="single" w:sz="4" w:color="D9D9D9"/>
+              <w:left w:val="single" w:sz="4" w:color="D9D9D9"/>
+              <w:bottom w:val="single" w:sz="4" w:color="D9D9D9"/>
+              <w:right w:val="single" w:sz="4" w:color="D9D9D9"/>
+            </w:tcBorders>
+            <w:tcMar>
+              <w:top w:w="90" w:type="dxa"/>
+              <w:left w:w="90" w:type="dxa"/>
+              <w:bottom w:w="90" w:type="dxa"/>
+              <w:right w:w="90" w:type="dxa"/>
+            </w:tcMar>
+            <w:shd w:fill="F7F7F7"/>
+          </w:tcPr>
+          <w:p>
+            <w:pPr>
+              <w:spacing w:after="40" w:line="247" w:lineRule="auto"/>
+            </w:pPr>
+            <w:r>
+              <w:rPr>
+                <w:sz w:val="20"/>
+              </w:rPr>
+              <w:t>Actual implemented resource relationships and a traced source-to-display example</w:t>
+            </w:r>
+          </w:p>
+        </w:tc>
+        <w:tc>
+          <w:tcPr>
+            <w:tcW w:type="dxa" w:w="4392"/>
+            <w:vAlign w:val="center"/>
+            <w:tcBorders>
+              <w:top w:val="single" w:sz="4" w:color="D9D9D9"/>
+              <w:left w:val="single" w:sz="4" w:color="D9D9D9"/>
+              <w:bottom w:val="single" w:sz="4" w:color="D9D9D9"/>
+              <w:right w:val="single" w:sz="4" w:color="D9D9D9"/>
+            </w:tcBorders>
+            <w:tcMar>
+              <w:top w:w="90" w:type="dxa"/>
+              <w:left w:w="90" w:type="dxa"/>
+              <w:bottom w:w="90" w:type="dxa"/>
+              <w:right w:w="90" w:type="dxa"/>
+            </w:tcMar>
+            <w:shd w:fill="F7F7F7"/>
+          </w:tcPr>
+          <w:p>
+            <w:pPr>
+              <w:spacing w:after="40" w:line="247" w:lineRule="auto"/>
+            </w:pPr>
+            <w:r>
+              <w:rPr>
+                <w:sz w:val="20"/>
+              </w:rPr>
               <w:t>Awaiting server records and mapping results</w:t>
             </w:r>
           </w:p>
@@ -7194,7 +8815,7 @@
       </w:r>
       <w:r>
         <w:rPr/>
-        <w:t xml:space="preserve"> No experimental success rate, task-time improvement, or user outcome is reported in version 0.4. The public access observations in section 5 establish limited feasibility and remain separate from experimental results.</w:t>
+        <w:t xml:space="preserve"> No experimental success rate, task-time improvement, or user outcome is reported in version 0.5. The public access observations in section 5 establish limited feasibility and remain separate from experimental results.</w:t>
       </w:r>
     </w:p>
     <w:p>
@@ -7355,17 +8976,7 @@
       </w:pPr>
       <w:r>
         <w:rPr/>
-        <w:t xml:space="preserve">European Environment Agency. 2021. “Air Temperature.” </w:t>
-      </w:r>
-      <w:r>
-        <w:rPr>
-          <w:i/>
-        </w:rPr>
-        <w:t>GEMET</w:t>
-      </w:r>
-      <w:r>
-        <w:rPr/>
-        <w:t>, version 4.2.3, December 6. Concept 281. Accessed October 24, 2026. https://www.eionet.europa.eu/gemet/en/concept/281.</w:t>
+        <w:t>Camptocamp. n.d. “ogc-client.” GitHub repository. Accessed October 24, 2026. https://github.com/camptocamp/ogc-client.</w:t>
       </w:r>
     </w:p>
     <w:p>
@@ -7374,17 +8985,17 @@
       </w:pPr>
       <w:r>
         <w:rPr/>
-        <w:t xml:space="preserve">MERLIN Project. 2026a. </w:t>
+        <w:t xml:space="preserve">European Environment Agency. 2021. “Air Temperature.” </w:t>
       </w:r>
       <w:r>
         <w:rPr>
           <w:i/>
         </w:rPr>
-        <w:t>Managed Physical Sensing Systems and Deployments: Profile Scope, Content Outline and Integrated Binding Draft</w:t>
+        <w:t>GEMET</w:t>
       </w:r>
       <w:r>
         <w:rPr/>
-        <w:t>. Version 0.3.5. October 17. Project working draft. https://github.com/OS4CSAPI/glaux-client/blob/1a24fdff71ef801d9b326d2b42a63743db737a8e/Docs/Design/MPSS/MERLIN_Managed_Physical_Sensing_Systems_Profile_Integrated_Binding_Draft_v0.3.5_17OCT2026.docx.</w:t>
+        <w:t>, version 4.2.3, December 6. Concept 281. Accessed October 24, 2026. https://www.eionet.europa.eu/gemet/en/concept/281.</w:t>
       </w:r>
     </w:p>
     <w:p>
@@ -7393,7 +9004,17 @@
       </w:pPr>
       <w:r>
         <w:rPr/>
-        <w:t>MERLIN Project. 2026b. “Open Sensor Candidate Access Observations.” October 24. Research evidence record, schema version 1. https://github.com/OS4CSAPI/glaux-client/blob/1a24fdff71ef801d9b326d2b42a63743db737a8e/Docs/Research/Evidence/OPEN_SENSOR_ACCESS_2026-10-24.json.</w:t>
+        <w:t xml:space="preserve">MERLIN Project. 2026a. </w:t>
+      </w:r>
+      <w:r>
+        <w:rPr>
+          <w:i/>
+        </w:rPr>
+        <w:t>Managed Physical Sensing Systems and Deployments: Profile Scope, Content Outline and Integrated Binding Draft</w:t>
+      </w:r>
+      <w:r>
+        <w:rPr/>
+        <w:t>. Version 0.3.5. October 17. Project working draft. https://github.com/OS4CSAPI/glaux-client/blob/1a24fdff71ef801d9b326d2b42a63743db737a8e/Docs/Design/MPSS/MERLIN_Managed_Physical_Sensing_Systems_Profile_Integrated_Binding_Draft_v0.3.5_17OCT2026.docx.</w:t>
       </w:r>
     </w:p>
     <w:p>
@@ -7402,7 +9023,7 @@
       </w:pPr>
       <w:r>
         <w:rPr/>
-        <w:t>MERLIN Project. 2026c. “Open Sensor Candidates for MERLIN DIM and MPSS Experiments.” October 24. Research report. https://github.com/OS4CSAPI/glaux-client/blob/1a24fdff71ef801d9b326d2b42a63743db737a8e/Docs/Research/Reports/OPEN_SENSOR_CANDIDATES_2026-10-24.md.</w:t>
+        <w:t>MERLIN Project. 2026b. “Open Sensor Candidate Access Observations.” October 24. Research evidence record, schema version 1. https://github.com/OS4CSAPI/glaux-client/blob/1a24fdff71ef801d9b326d2b42a63743db737a8e/Docs/Research/Evidence/OPEN_SENSOR_ACCESS_2026-10-24.json.</w:t>
       </w:r>
     </w:p>
     <w:p>
@@ -7411,7 +9032,7 @@
       </w:pPr>
       <w:r>
         <w:rPr/>
-        <w:t>MERLIN Project. 2026d. “Resource Details Wireframe Template.” October 24. Design and implementation record. https://github.com/OS4CSAPI/glaux-client/blob/1a24fdff71ef801d9b326d2b42a63743db737a8e/Docs/Design/RESOURCE_DETAILS_TEMPLATE.md.</w:t>
+        <w:t>MERLIN Project. 2026c. “Open Sensor Candidates for MERLIN DIM and MPSS Experiments.” October 24. Research report. https://github.com/OS4CSAPI/glaux-client/blob/1a24fdff71ef801d9b326d2b42a63743db737a8e/Docs/Research/Reports/OPEN_SENSOR_CANDIDATES_2026-10-24.md.</w:t>
       </w:r>
     </w:p>
     <w:p>
@@ -7420,7 +9041,7 @@
       </w:pPr>
       <w:r>
         <w:rPr/>
-        <w:t>MERLIN Project. 2026e. “Smart Citizen Experiment Plan.” October 24. Proposed experiment plan. https://github.com/OS4CSAPI/glaux-client/blob/1a24fdff71ef801d9b326d2b42a63743db737a8e/Docs/Plans/SMART_CITIZEN_EXPERIMENT_PLAN.md.</w:t>
+        <w:t>MERLIN Project. 2026d. “Resource Details Wireframe Template.” October 24. Design and implementation record. https://github.com/OS4CSAPI/glaux-client/blob/1a24fdff71ef801d9b326d2b42a63743db737a8e/Docs/Design/RESOURCE_DETAILS_TEMPLATE.md.</w:t>
       </w:r>
     </w:p>
     <w:p>
@@ -7429,7 +9050,7 @@
       </w:pPr>
       <w:r>
         <w:rPr/>
-        <w:t>MERLIN Project. 2026f. “52°North connected-systems-pygeoapi Experimental Server Baseline.” October 24. Research evidence record. https://github.com/OS4CSAPI/glaux-client/blob/work/details-view-20261023/Docs/Research/Evidence/PYGEOAPI_SERVER_BASELINE_2026-10-24.md.</w:t>
+        <w:t>MERLIN Project. 2026e. “Smart Citizen Experiment Plan.” October 24. Proposed experiment plan. https://github.com/OS4CSAPI/glaux-client/blob/1a24fdff71ef801d9b326d2b42a63743db737a8e/Docs/Plans/SMART_CITIZEN_EXPERIMENT_PLAN.md.</w:t>
       </w:r>
     </w:p>
     <w:p>
@@ -7438,17 +9059,7 @@
       </w:pPr>
       <w:r>
         <w:rPr/>
-        <w:t xml:space="preserve">Open Geospatial Consortium. 2025a. </w:t>
-      </w:r>
-      <w:r>
-        <w:rPr>
-          <w:i/>
-        </w:rPr>
-        <w:t>OGC API—Connected Systems—Part 1: Feature Resources</w:t>
-      </w:r>
-      <w:r>
-        <w:rPr/>
-        <w:t>. Version 1.0. OGC 23-001. Edited by Alexandre Robin. July 16. https://docs.ogc.org/is/23-001/23-001.html.</w:t>
+        <w:t>MERLIN Project. 2026f. “52°North connected-systems-pygeoapi Experimental Server Baseline.” October 24. Research evidence record. https://github.com/OS4CSAPI/glaux-client/blob/work/details-view-20261023/Docs/Research/Evidence/PYGEOAPI_SERVER_BASELINE_2026-10-24.md.</w:t>
       </w:r>
     </w:p>
     <w:p>
@@ -7457,17 +9068,7 @@
       </w:pPr>
       <w:r>
         <w:rPr/>
-        <w:t xml:space="preserve">Open Geospatial Consortium. 2025b. </w:t>
-      </w:r>
-      <w:r>
-        <w:rPr>
-          <w:i/>
-        </w:rPr>
-        <w:t>OGC API—Connected Systems—Part 2: Dynamic Data</w:t>
-      </w:r>
-      <w:r>
-        <w:rPr/>
-        <w:t>. Version 1.0. OGC 23-002. Edited by Alexandre Robin. July 16. https://docs.ogc.org/is/23-002/23-002.html.</w:t>
+        <w:t>MERLIN Project. 2026g. “Glaux Client Selection and Experimental Architecture Baseline.” October 24. Research evidence record. https://github.com/OS4CSAPI/glaux-client/blob/work/details-view-20261023/Docs/Research/Evidence/GLAUX_CLIENT_BASELINE_2026-10-24.md.</w:t>
       </w:r>
     </w:p>
     <w:p>
@@ -7476,17 +9077,7 @@
       </w:pPr>
       <w:r>
         <w:rPr/>
-        <w:t xml:space="preserve">Open Geospatial Consortium. 2025c. </w:t>
-      </w:r>
-      <w:r>
-        <w:rPr>
-          <w:i/>
-        </w:rPr>
-        <w:t>OGC SensorML Encoding Standard</w:t>
-      </w:r>
-      <w:r>
-        <w:rPr/>
-        <w:t>. Version 3.0. OGC 23-000. Edited by Alexandre Robin. July 16. https://docs.ogc.org/is/23-000/23-000.html.</w:t>
+        <w:t>MERLIN Project. 2026h. “Dependency Provenance and Reproducibility.” October 23. Project dependency record. https://github.com/OS4CSAPI/glaux-client/blob/work/details-view-20261023/Docs/DEPENDENCIES.md.</w:t>
       </w:r>
     </w:p>
     <w:p>
@@ -7495,17 +9086,7 @@
       </w:pPr>
       <w:r>
         <w:rPr/>
-        <w:t xml:space="preserve">Open Geospatial Consortium. 2025d. </w:t>
-      </w:r>
-      <w:r>
-        <w:rPr>
-          <w:i/>
-        </w:rPr>
-        <w:t>OGC SWE Common Data Model Encoding Standard</w:t>
-      </w:r>
-      <w:r>
-        <w:rPr/>
-        <w:t>. Version 3.0.0. OGC 24-014. Edited by Alexandre Robin. July 16. https://docs.ogc.org/is/24-014/24-014.html.</w:t>
+        <w:t>MERLIN Project. 2026i. “Cloudflare Deployment Continuation.” October 24. Deployment record. https://github.com/OS4CSAPI/glaux-client/blob/work/details-view-20261023/Docs/Plans/CLOUDFLARE_DEPLOYMENT.md.</w:t>
       </w:r>
     </w:p>
     <w:p>
@@ -7514,7 +9095,17 @@
       </w:pPr>
       <w:r>
         <w:rPr/>
-        <w:t>Open Geospatial Consortium. n.d.-a. “Index of /sensorML/3.0/json.” Official SensorML 3.0 JSON schema repository. Accessed October 24, 2026. https://schemas.opengis.net/sensorML/3.0/json/.</w:t>
+        <w:t xml:space="preserve">Open Geospatial Consortium. 2025a. </w:t>
+      </w:r>
+      <w:r>
+        <w:rPr>
+          <w:i/>
+        </w:rPr>
+        <w:t>OGC API—Connected Systems—Part 1: Feature Resources</w:t>
+      </w:r>
+      <w:r>
+        <w:rPr/>
+        <w:t>. Version 1.0. OGC 23-001. Edited by Alexandre Robin. July 16. https://docs.ogc.org/is/23-001/23-001.html.</w:t>
       </w:r>
     </w:p>
     <w:p>
@@ -7523,7 +9114,82 @@
       </w:pPr>
       <w:r>
         <w:rPr/>
+        <w:t xml:space="preserve">Open Geospatial Consortium. 2025b. </w:t>
+      </w:r>
+      <w:r>
+        <w:rPr>
+          <w:i/>
+        </w:rPr>
+        <w:t>OGC API—Connected Systems—Part 2: Dynamic Data</w:t>
+      </w:r>
+      <w:r>
+        <w:rPr/>
+        <w:t>. Version 1.0. OGC 23-002. Edited by Alexandre Robin. July 16. https://docs.ogc.org/is/23-002/23-002.html.</w:t>
+      </w:r>
+    </w:p>
+    <w:p>
+      <w:pPr>
+        <w:pStyle w:val="PaperReference"/>
+      </w:pPr>
+      <w:r>
+        <w:rPr/>
+        <w:t xml:space="preserve">Open Geospatial Consortium. 2025c. </w:t>
+      </w:r>
+      <w:r>
+        <w:rPr>
+          <w:i/>
+        </w:rPr>
+        <w:t>OGC SensorML Encoding Standard</w:t>
+      </w:r>
+      <w:r>
+        <w:rPr/>
+        <w:t>. Version 3.0. OGC 23-000. Edited by Alexandre Robin. July 16. https://docs.ogc.org/is/23-000/23-000.html.</w:t>
+      </w:r>
+    </w:p>
+    <w:p>
+      <w:pPr>
+        <w:pStyle w:val="PaperReference"/>
+      </w:pPr>
+      <w:r>
+        <w:rPr/>
+        <w:t xml:space="preserve">Open Geospatial Consortium. 2025d. </w:t>
+      </w:r>
+      <w:r>
+        <w:rPr>
+          <w:i/>
+        </w:rPr>
+        <w:t>OGC SWE Common Data Model Encoding Standard</w:t>
+      </w:r>
+      <w:r>
+        <w:rPr/>
+        <w:t>. Version 3.0.0. OGC 24-014. Edited by Alexandre Robin. July 16. https://docs.ogc.org/is/24-014/24-014.html.</w:t>
+      </w:r>
+    </w:p>
+    <w:p>
+      <w:pPr>
+        <w:pStyle w:val="PaperReference"/>
+      </w:pPr>
+      <w:r>
+        <w:rPr/>
+        <w:t>Open Geospatial Consortium. n.d.-a. “Index of /sensorML/3.0/json.” Official SensorML 3.0 JSON schema repository. Accessed October 24, 2026. https://schemas.opengis.net/sensorML/3.0/json/.</w:t>
+      </w:r>
+    </w:p>
+    <w:p>
+      <w:pPr>
+        <w:pStyle w:val="PaperReference"/>
+      </w:pPr>
+      <w:r>
+        <w:rPr/>
         <w:t>Open Geospatial Consortium. n.d.-b. “Index of /sweCommon/3.0/json.” Official SWE Common 3.0 JSON schema repository. Accessed October 24, 2026. https://schemas.opengis.net/sweCommon/3.0/json/.</w:t>
+      </w:r>
+    </w:p>
+    <w:p>
+      <w:pPr>
+        <w:pStyle w:val="PaperReference"/>
+      </w:pPr>
+      <w:r>
+        <w:rPr/>
+        <w:t>OS4CSAPI. 2026. “ogc-client-CSAPI_2.” GitHub repository, phase-10 revision 4ca1d7db9b1ccdf545adbef42ef941139fe11977. Accessed October 24, 2026. https://github.com/OS4CSAPI/ogc-client-CSAPI_2/tree/4ca1d7db9b1ccdf545adbef42ef941139fe11977.</w:t>
       </w:r>
     </w:p>
     <w:p>
@@ -7740,7 +9406,7 @@
         <w:color w:val="000000"/>
         <w:sz w:val="18"/>
       </w:rPr>
-      <w:t xml:space="preserve">Research draft 0.4   24 October 2026 EDT   </w:t>
+      <w:t xml:space="preserve">Research draft 0.5   24 October 2026 EDT   </w:t>
     </w:r>
     <w:fldSimple w:instr="PAGE"/>
   </w:p>

</xml_diff>

<commit_message>
docs: rebuild Smart Citizen paper v0.6
</commit_message>
<xml_diff>
--- a/Docs/Research/Studies/Smart_Citizen/SMART_CITIZEN_EXPERIMENT_PAPER.docx
+++ b/Docs/Research/Studies/Smart_Citizen/SMART_CITIZEN_EXPERIMENT_PAPER.docx
@@ -32,7 +32,7 @@
       <w:pPr/>
       <w:r>
         <w:rPr/>
-        <w:t>Working paper version 0.5 | 24 October 2026 | Study protocol and preliminary source assessment</w:t>
+        <w:t>Working paper version 0.6 | 24 October 2026 | Study protocol and preliminary source assessment</w:t>
       </w:r>
     </w:p>
     <w:p>
@@ -7876,24 +7876,147 @@
       </w:r>
     </w:p>
     <w:p>
-      <w:pPr/>
+      <w:pPr>
+        <w:pStyle w:val="Heading2"/>
+      </w:pPr>
       <w:r>
         <w:rPr/>
-        <w:t>The planned comparison has three conditions: the actual Smart Citizen interface, a competent generic OGC presentation, and a profile-aware Glaux presentation. The source platform documents front-end access to its data, but no matched screenshot comparison is reported in this draft (Smart Citizen n.d.-a). Generic handling will retain useful labels, types, units, timestamps, relationships, and inspection access. It will not be reduced to a deliberately inconvenient JSON dump.</w:t>
+        <w:t>Vendor presentation baseline</w:t>
       </w:r>
     </w:p>
     <w:p>
       <w:pPr/>
       <w:r>
         <w:rPr/>
-        <w:t>The generic and profile-aware conditions will use the same captured standardized resources. Differences will be attributed to documented presentation rules. Proposed operator tasks will ask a reader to identify the represented resource, distinguish newer readings from older channels, explain an aggregate, locate source evidence, and recognize what remains unknown. Initial evaluation will be investigator inspection, without claims about representative users. A later participant study would require its own recruitment, procedure, and analysis plan.</w:t>
+        <w:t>Before implementing the CSAPI and Glaux comparison, the study fixes a source-provider presentation baseline using first-party Smart Citizen documentation. This reduces post hoc selection risk: the vendor-side examples are chosen before the experiment produces a preferred client result. Smart Citizen describes its website as a near-real-time exploration interface that combines device data with contextual information, and its onboarding guide instructs users to visit the Kit on the platform after it begins publishing and then scroll down to make basic explorations (Smart Citizen n.d.-a; n.d.-e). These documented screens are therefore evidence of intended presentation patterns, not merely decorative examples selected by this study.</w:t>
+      </w:r>
+    </w:p>
+    <w:p>
+      <w:pPr>
+        <w:keepNext/>
+        <w:spacing w:after="40"/>
+        <w:jc w:val="center"/>
+      </w:pPr>
+      <w:r>
+        <w:drawing>
+          <wp:inline xmlns:a="http://schemas.openxmlformats.org/drawingml/2006/main" xmlns:pic="http://schemas.openxmlformats.org/drawingml/2006/picture">
+            <wp:extent cx="6217920" cy="3971071"/>
+            <wp:docPr id="6" name="Picture 6" descr="Official Smart Citizen documentation screenshot of the core platform measurement-exploration screen" title="Official Smart Citizen documentation screenshot of the core platform measurement-exploration screen"/>
+            <wp:cNvGraphicFramePr>
+              <a:graphicFrameLocks noChangeAspect="1"/>
+            </wp:cNvGraphicFramePr>
+            <a:graphic>
+              <a:graphicData uri="http://schemas.openxmlformats.org/drawingml/2006/picture">
+                <pic:pic>
+                  <pic:nvPicPr>
+                    <pic:cNvPr id="0" name="smart_citizen_platform_basic_exploration.png"/>
+                    <pic:cNvPicPr/>
+                  </pic:nvPicPr>
+                  <pic:blipFill>
+                    <a:blip r:embed="rId16"/>
+                    <a:stretch>
+                      <a:fillRect/>
+                    </a:stretch>
+                  </pic:blipFill>
+                  <pic:spPr>
+                    <a:xfrm>
+                      <a:off x="0" y="0"/>
+                      <a:ext cx="6217920" cy="3971071"/>
+                    </a:xfrm>
+                    <a:prstGeom prst="rect"/>
+                  </pic:spPr>
+                </pic:pic>
+              </a:graphicData>
+            </a:graphic>
+          </wp:inline>
+        </w:drawing>
+      </w:r>
+    </w:p>
+    <w:p>
+      <w:pPr>
+        <w:pStyle w:val="PaperCaption"/>
+        <w:keepNext w:val="0"/>
+      </w:pPr>
+      <w:r>
+        <w:rPr>
+          <w:b/>
+        </w:rPr>
+        <w:t>Figure 6. Official Smart Citizen platform example of device measurement exploration.</w:t>
+      </w:r>
+      <w:r>
+        <w:rPr/>
+        <w:t xml:space="preserve"> The first-party onboarding documentation presents this screen immediately after instructing a user to visit a newly publishing Kit and scroll down for basic exploration (Smart Citizen n.d.-e). The historical example shows kit page 14410, a device-level header with a 44 percent battery indication and last-data-received time, a horizontal strip of current light, noise, air-temperature, humidity, pressure, and particulate measurements, and a selected PM2.5 detail with property explanation, date controls, and a time-series graph. The visible data are dated 14 July 2021 and are not observations from registration 19639 or evidence that the current production interface is pixel-identical. The source pixels are reproduced unchanged from Smart Citizen's documentation and their provenance and published rights notices are retained with the study figures (MERLIN Project 2026j).</w:t>
       </w:r>
     </w:p>
     <w:p>
       <w:pPr/>
       <w:r>
         <w:rPr/>
-        <w:t>Each screenshot will record the registration, channel, observation or interval, aggregation, units, capture time, application revision where available, browser, zoom, viewport, and relevant controls. Glaux will be evaluated at the recovered 560 × 440 module size; other sizes will be reported explicitly. The source interface will retain its actual viewport and layout. Where it cannot replay the same sample or interval, images will be described as illustrative interface evidence rather than a matched comparison (MERLIN Project 2026d).</w:t>
+        <w:t>The screen reveals a vendor presentation strategy that is useful to the experiment independently of its visual styling. Device-level context remains visible while multiple current quantities are summarized with values and units, after which one measurement can be expanded into a semantic explanation and temporal view. The presentation therefore connects resource identity/status, measurement inventory, selected-property meaning, and history instead of treating each API field as an isolated row. MERLIN does not need to copy this layout, but a standards-based reconstruction should preserve enough meaning to support the same kinds of operator questions when the source evidence permits them.</w:t>
+      </w:r>
+    </w:p>
+    <w:p>
+      <w:pPr>
+        <w:keepNext/>
+        <w:spacing w:after="40"/>
+        <w:jc w:val="center"/>
+      </w:pPr>
+      <w:r>
+        <w:drawing>
+          <wp:inline xmlns:a="http://schemas.openxmlformats.org/drawingml/2006/main" xmlns:pic="http://schemas.openxmlformats.org/drawingml/2006/picture">
+            <wp:extent cx="6217920" cy="3565588"/>
+            <wp:docPr id="7" name="Picture 7" descr="Official Smart Citizen documentation screenshot of the Smart Citizen custom dashboard" title="Official Smart Citizen documentation screenshot of the Smart Citizen custom dashboard"/>
+            <wp:cNvGraphicFramePr>
+              <a:graphicFrameLocks noChangeAspect="1"/>
+            </wp:cNvGraphicFramePr>
+            <a:graphic>
+              <a:graphicData uri="http://schemas.openxmlformats.org/drawingml/2006/picture">
+                <pic:pic>
+                  <pic:nvPicPr>
+                    <pic:cNvPr id="0" name="smart_citizen_custom_dashboard.png"/>
+                    <pic:cNvPicPr/>
+                  </pic:nvPicPr>
+                  <pic:blipFill>
+                    <a:blip r:embed="rId17"/>
+                    <a:stretch>
+                      <a:fillRect/>
+                    </a:stretch>
+                  </pic:blipFill>
+                  <pic:spPr>
+                    <a:xfrm>
+                      <a:off x="0" y="0"/>
+                      <a:ext cx="6217920" cy="3565588"/>
+                    </a:xfrm>
+                    <a:prstGeom prst="rect"/>
+                  </pic:spPr>
+                </pic:pic>
+              </a:graphicData>
+            </a:graphic>
+          </wp:inline>
+        </w:drawing>
+      </w:r>
+    </w:p>
+    <w:p>
+      <w:pPr>
+        <w:pStyle w:val="PaperCaption"/>
+        <w:keepNext w:val="0"/>
+      </w:pPr>
+      <w:r>
+        <w:rPr>
+          <w:b/>
+        </w:rPr>
+        <w:t>Figure 7. Official Smart Citizen custom-dashboard example.</w:t>
+      </w:r>
+      <w:r>
+        <w:rPr/>
+        <w:t xml:space="preserve"> Smart Citizen's Data Tools documentation distinguishes the classic Smart Citizen Map from a separate JavaScript dashboard and describes the latter as a simpler but more advanced visualization with device status, filtering, customizable time-series plots, WebSocket notifications, and CSV download (Smart Citizen n.d.-f). The historical screenshot identifies device ERLIO as a Smart Citizen Kit 2.1 with Urban Sensor Board and presents current temperature and humidity values beside sensor designations and multi-day trend plots, with particulate sections continuing below the visible frame. It is an official example of an alternate Smart Citizen presentation, not the core platform screen shown in Figure 6 and not the SCK2.3 specimen selected for this experiment. The source image is reproduced unchanged from the first-party documentation and is retained as design evidence rather than a matched experimental condition (MERLIN Project 2026j).</w:t>
+      </w:r>
+    </w:p>
+    <w:p>
+      <w:pPr/>
+      <w:r>
+        <w:rPr/>
+        <w:t>The two vendor examples show that Smart Citizen itself supports more than one valid presentation of the same broader information ecosystem. The core platform emphasizes a compact set of current metrics plus selected-measurement explanation and history, while the custom dashboard makes model/sensor labels and parallel trends more prominent. That variation is useful to the DIM/Profile study because it reinforces that the domain model should preserve reusable concepts without prescribing one universal screen arrangement. It also gives the Resource Details PBI concrete source-provider questions to preserve: what resource is being viewed, what can it report, what are the current values and units, what does a selected property mean, how recent is the information, and what history is available.</w:t>
       </w:r>
     </w:p>
     <w:p>
@@ -7905,11 +8028,735 @@
         <w:rPr>
           <w:b/>
         </w:rPr>
-        <w:t>Table 8. Planned figures and evidence status.</w:t>
+        <w:t>Table 8. Vendor presentation elements and reconstruction questions.</w:t>
       </w:r>
       <w:r>
         <w:rPr/>
-        <w:t xml:space="preserve"> Figure 1 is an official product-model photograph with an identified source and explicit limits. Figure 2 is an authored server-lineage diagram, Figure 3 is an authored client-architecture diagram, and Figures 4 and 5 are authored diagrams of the proposed experiment. Figures 6–8 are reserved evidence slots, and no substitute or simulated screenshots are presented.</w:t>
+        <w:t xml:space="preserve"> The table records information made visible in the two first-party examples and converts it into questions for the standards-based reconstruction. It does not assert that every element belongs in the default 560 × 440 Resource Details frame or that the MPSS profile already supplies every required binding. The eventual Glaux result will be evaluated against the underlying questions and preserved meanings rather than against pixel-level imitation of Smart Citizen's interface.</w:t>
+      </w:r>
+    </w:p>
+    <w:tbl>
+      <w:tblPr>
+        <w:tblW w:type="auto" w:w="0"/>
+        <w:jc w:val="center"/>
+        <w:tblLayout w:type="fixed"/>
+        <w:tblLook w:firstColumn="1" w:firstRow="1" w:lastColumn="0" w:lastRow="0" w:noHBand="0" w:noVBand="1" w:val="04A0"/>
+      </w:tblPr>
+      <w:tblGrid>
+        <w:gridCol w:w="2232"/>
+        <w:gridCol w:w="3312"/>
+        <w:gridCol w:w="4248"/>
+      </w:tblGrid>
+      <w:tr>
+        <w:trPr>
+          <w:cantSplit/>
+          <w:tblHeader/>
+        </w:trPr>
+        <w:tc>
+          <w:tcPr>
+            <w:tcW w:type="dxa" w:w="2232"/>
+            <w:vAlign w:val="center"/>
+            <w:tcBorders>
+              <w:top w:val="single" w:sz="4" w:color="D9D9D9"/>
+              <w:left w:val="single" w:sz="4" w:color="D9D9D9"/>
+              <w:bottom w:val="single" w:sz="4" w:color="D9D9D9"/>
+              <w:right w:val="single" w:sz="4" w:color="D9D9D9"/>
+            </w:tcBorders>
+            <w:tcMar>
+              <w:top w:w="90" w:type="dxa"/>
+              <w:left w:w="90" w:type="dxa"/>
+              <w:bottom w:w="90" w:type="dxa"/>
+              <w:right w:w="90" w:type="dxa"/>
+            </w:tcMar>
+            <w:shd w:fill="E8E8E8"/>
+          </w:tcPr>
+          <w:p>
+            <w:pPr>
+              <w:spacing w:after="40" w:line="247" w:lineRule="auto"/>
+            </w:pPr>
+            <w:r>
+              <w:rPr>
+                <w:b/>
+                <w:sz w:val="20"/>
+              </w:rPr>
+              <w:t>Vendor presentation element</w:t>
+            </w:r>
+          </w:p>
+        </w:tc>
+        <w:tc>
+          <w:tcPr>
+            <w:tcW w:type="dxa" w:w="3312"/>
+            <w:vAlign w:val="center"/>
+            <w:tcBorders>
+              <w:top w:val="single" w:sz="4" w:color="D9D9D9"/>
+              <w:left w:val="single" w:sz="4" w:color="D9D9D9"/>
+              <w:bottom w:val="single" w:sz="4" w:color="D9D9D9"/>
+              <w:right w:val="single" w:sz="4" w:color="D9D9D9"/>
+            </w:tcBorders>
+            <w:tcMar>
+              <w:top w:w="90" w:type="dxa"/>
+              <w:left w:w="90" w:type="dxa"/>
+              <w:bottom w:w="90" w:type="dxa"/>
+              <w:right w:w="90" w:type="dxa"/>
+            </w:tcMar>
+            <w:shd w:fill="E8E8E8"/>
+          </w:tcPr>
+          <w:p>
+            <w:pPr>
+              <w:spacing w:after="40" w:line="247" w:lineRule="auto"/>
+            </w:pPr>
+            <w:r>
+              <w:rPr>
+                <w:b/>
+                <w:sz w:val="20"/>
+              </w:rPr>
+              <w:t>Visible source-provider role</w:t>
+            </w:r>
+          </w:p>
+        </w:tc>
+        <w:tc>
+          <w:tcPr>
+            <w:tcW w:type="dxa" w:w="4248"/>
+            <w:vAlign w:val="center"/>
+            <w:tcBorders>
+              <w:top w:val="single" w:sz="4" w:color="D9D9D9"/>
+              <w:left w:val="single" w:sz="4" w:color="D9D9D9"/>
+              <w:bottom w:val="single" w:sz="4" w:color="D9D9D9"/>
+              <w:right w:val="single" w:sz="4" w:color="D9D9D9"/>
+            </w:tcBorders>
+            <w:tcMar>
+              <w:top w:w="90" w:type="dxa"/>
+              <w:left w:w="90" w:type="dxa"/>
+              <w:bottom w:w="90" w:type="dxa"/>
+              <w:right w:w="90" w:type="dxa"/>
+            </w:tcMar>
+            <w:shd w:fill="E8E8E8"/>
+          </w:tcPr>
+          <w:p>
+            <w:pPr>
+              <w:spacing w:after="40" w:line="247" w:lineRule="auto"/>
+            </w:pPr>
+            <w:r>
+              <w:rPr>
+                <w:b/>
+                <w:sz w:val="20"/>
+              </w:rPr>
+              <w:t>Question for the DIM/Profile and Glaux reconstruction</w:t>
+            </w:r>
+          </w:p>
+        </w:tc>
+      </w:tr>
+      <w:tr>
+        <w:trPr>
+          <w:cantSplit/>
+        </w:trPr>
+        <w:tc>
+          <w:tcPr>
+            <w:tcW w:type="dxa" w:w="2232"/>
+            <w:vAlign w:val="center"/>
+            <w:tcBorders>
+              <w:top w:val="single" w:sz="4" w:color="D9D9D9"/>
+              <w:left w:val="single" w:sz="4" w:color="D9D9D9"/>
+              <w:bottom w:val="single" w:sz="4" w:color="D9D9D9"/>
+              <w:right w:val="single" w:sz="4" w:color="D9D9D9"/>
+            </w:tcBorders>
+            <w:tcMar>
+              <w:top w:w="90" w:type="dxa"/>
+              <w:left w:w="90" w:type="dxa"/>
+              <w:bottom w:w="90" w:type="dxa"/>
+              <w:right w:w="90" w:type="dxa"/>
+            </w:tcMar>
+            <w:shd w:fill="FFFFFF"/>
+          </w:tcPr>
+          <w:p>
+            <w:pPr>
+              <w:spacing w:after="40" w:line="247" w:lineRule="auto"/>
+            </w:pPr>
+            <w:r>
+              <w:rPr>
+                <w:sz w:val="20"/>
+              </w:rPr>
+              <w:t>Device/resource header</w:t>
+            </w:r>
+          </w:p>
+        </w:tc>
+        <w:tc>
+          <w:tcPr>
+            <w:tcW w:type="dxa" w:w="3312"/>
+            <w:vAlign w:val="center"/>
+            <w:tcBorders>
+              <w:top w:val="single" w:sz="4" w:color="D9D9D9"/>
+              <w:left w:val="single" w:sz="4" w:color="D9D9D9"/>
+              <w:bottom w:val="single" w:sz="4" w:color="D9D9D9"/>
+              <w:right w:val="single" w:sz="4" w:color="D9D9D9"/>
+            </w:tcBorders>
+            <w:tcMar>
+              <w:top w:w="90" w:type="dxa"/>
+              <w:left w:w="90" w:type="dxa"/>
+              <w:bottom w:w="90" w:type="dxa"/>
+              <w:right w:w="90" w:type="dxa"/>
+            </w:tcMar>
+            <w:shd w:fill="FFFFFF"/>
+          </w:tcPr>
+          <w:p>
+            <w:pPr>
+              <w:spacing w:after="40" w:line="247" w:lineRule="auto"/>
+            </w:pPr>
+            <w:r>
+              <w:rPr>
+                <w:sz w:val="20"/>
+              </w:rPr>
+              <w:t>Keeps the selected Kit and recent reporting context visible</w:t>
+            </w:r>
+          </w:p>
+        </w:tc>
+        <w:tc>
+          <w:tcPr>
+            <w:tcW w:type="dxa" w:w="4248"/>
+            <w:vAlign w:val="center"/>
+            <w:tcBorders>
+              <w:top w:val="single" w:sz="4" w:color="D9D9D9"/>
+              <w:left w:val="single" w:sz="4" w:color="D9D9D9"/>
+              <w:bottom w:val="single" w:sz="4" w:color="D9D9D9"/>
+              <w:right w:val="single" w:sz="4" w:color="D9D9D9"/>
+            </w:tcBorders>
+            <w:tcMar>
+              <w:top w:w="90" w:type="dxa"/>
+              <w:left w:w="90" w:type="dxa"/>
+              <w:bottom w:w="90" w:type="dxa"/>
+              <w:right w:w="90" w:type="dxa"/>
+            </w:tcMar>
+            <w:shd w:fill="FFFFFF"/>
+          </w:tcPr>
+          <w:p>
+            <w:pPr>
+              <w:spacing w:after="40" w:line="247" w:lineRule="auto"/>
+            </w:pPr>
+            <w:r>
+              <w:rPr>
+                <w:sz w:val="20"/>
+              </w:rPr>
+              <w:t>Can the client identify the represented resource and distinguish resource status/context from observations?</w:t>
+            </w:r>
+          </w:p>
+        </w:tc>
+      </w:tr>
+      <w:tr>
+        <w:trPr>
+          <w:cantSplit/>
+        </w:trPr>
+        <w:tc>
+          <w:tcPr>
+            <w:tcW w:type="dxa" w:w="2232"/>
+            <w:vAlign w:val="center"/>
+            <w:tcBorders>
+              <w:top w:val="single" w:sz="4" w:color="D9D9D9"/>
+              <w:left w:val="single" w:sz="4" w:color="D9D9D9"/>
+              <w:bottom w:val="single" w:sz="4" w:color="D9D9D9"/>
+              <w:right w:val="single" w:sz="4" w:color="D9D9D9"/>
+            </w:tcBorders>
+            <w:tcMar>
+              <w:top w:w="90" w:type="dxa"/>
+              <w:left w:w="90" w:type="dxa"/>
+              <w:bottom w:w="90" w:type="dxa"/>
+              <w:right w:w="90" w:type="dxa"/>
+            </w:tcMar>
+            <w:shd w:fill="F7F7F7"/>
+          </w:tcPr>
+          <w:p>
+            <w:pPr>
+              <w:spacing w:after="40" w:line="247" w:lineRule="auto"/>
+            </w:pPr>
+            <w:r>
+              <w:rPr>
+                <w:sz w:val="20"/>
+              </w:rPr>
+              <w:t>Current-measurement strip</w:t>
+            </w:r>
+          </w:p>
+        </w:tc>
+        <w:tc>
+          <w:tcPr>
+            <w:tcW w:type="dxa" w:w="3312"/>
+            <w:vAlign w:val="center"/>
+            <w:tcBorders>
+              <w:top w:val="single" w:sz="4" w:color="D9D9D9"/>
+              <w:left w:val="single" w:sz="4" w:color="D9D9D9"/>
+              <w:bottom w:val="single" w:sz="4" w:color="D9D9D9"/>
+              <w:right w:val="single" w:sz="4" w:color="D9D9D9"/>
+            </w:tcBorders>
+            <w:tcMar>
+              <w:top w:w="90" w:type="dxa"/>
+              <w:left w:w="90" w:type="dxa"/>
+              <w:bottom w:w="90" w:type="dxa"/>
+              <w:right w:w="90" w:type="dxa"/>
+            </w:tcMar>
+            <w:shd w:fill="F7F7F7"/>
+          </w:tcPr>
+          <w:p>
+            <w:pPr>
+              <w:spacing w:after="40" w:line="247" w:lineRule="auto"/>
+            </w:pPr>
+            <w:r>
+              <w:rPr>
+                <w:sz w:val="20"/>
+              </w:rPr>
+              <w:t>Summarizes several quantities with values and units at once</w:t>
+            </w:r>
+          </w:p>
+        </w:tc>
+        <w:tc>
+          <w:tcPr>
+            <w:tcW w:type="dxa" w:w="4248"/>
+            <w:vAlign w:val="center"/>
+            <w:tcBorders>
+              <w:top w:val="single" w:sz="4" w:color="D9D9D9"/>
+              <w:left w:val="single" w:sz="4" w:color="D9D9D9"/>
+              <w:bottom w:val="single" w:sz="4" w:color="D9D9D9"/>
+              <w:right w:val="single" w:sz="4" w:color="D9D9D9"/>
+            </w:tcBorders>
+            <w:tcMar>
+              <w:top w:w="90" w:type="dxa"/>
+              <w:left w:w="90" w:type="dxa"/>
+              <w:bottom w:w="90" w:type="dxa"/>
+              <w:right w:w="90" w:type="dxa"/>
+            </w:tcMar>
+            <w:shd w:fill="F7F7F7"/>
+          </w:tcPr>
+          <w:p>
+            <w:pPr>
+              <w:spacing w:after="40" w:line="247" w:lineRule="auto"/>
+            </w:pPr>
+            <w:r>
+              <w:rPr>
+                <w:sz w:val="20"/>
+              </w:rPr>
+              <w:t>Can heterogeneous outputs remain individually meaningful while sharing a compact overview?</w:t>
+            </w:r>
+          </w:p>
+        </w:tc>
+      </w:tr>
+      <w:tr>
+        <w:trPr>
+          <w:cantSplit/>
+        </w:trPr>
+        <w:tc>
+          <w:tcPr>
+            <w:tcW w:type="dxa" w:w="2232"/>
+            <w:vAlign w:val="center"/>
+            <w:tcBorders>
+              <w:top w:val="single" w:sz="4" w:color="D9D9D9"/>
+              <w:left w:val="single" w:sz="4" w:color="D9D9D9"/>
+              <w:bottom w:val="single" w:sz="4" w:color="D9D9D9"/>
+              <w:right w:val="single" w:sz="4" w:color="D9D9D9"/>
+            </w:tcBorders>
+            <w:tcMar>
+              <w:top w:w="90" w:type="dxa"/>
+              <w:left w:w="90" w:type="dxa"/>
+              <w:bottom w:w="90" w:type="dxa"/>
+              <w:right w:w="90" w:type="dxa"/>
+            </w:tcMar>
+            <w:shd w:fill="FFFFFF"/>
+          </w:tcPr>
+          <w:p>
+            <w:pPr>
+              <w:spacing w:after="40" w:line="247" w:lineRule="auto"/>
+            </w:pPr>
+            <w:r>
+              <w:rPr>
+                <w:sz w:val="20"/>
+              </w:rPr>
+              <w:t>Battery and last-data context</w:t>
+            </w:r>
+          </w:p>
+        </w:tc>
+        <w:tc>
+          <w:tcPr>
+            <w:tcW w:type="dxa" w:w="3312"/>
+            <w:vAlign w:val="center"/>
+            <w:tcBorders>
+              <w:top w:val="single" w:sz="4" w:color="D9D9D9"/>
+              <w:left w:val="single" w:sz="4" w:color="D9D9D9"/>
+              <w:bottom w:val="single" w:sz="4" w:color="D9D9D9"/>
+              <w:right w:val="single" w:sz="4" w:color="D9D9D9"/>
+            </w:tcBorders>
+            <w:tcMar>
+              <w:top w:w="90" w:type="dxa"/>
+              <w:left w:w="90" w:type="dxa"/>
+              <w:bottom w:w="90" w:type="dxa"/>
+              <w:right w:w="90" w:type="dxa"/>
+            </w:tcMar>
+            <w:shd w:fill="FFFFFF"/>
+          </w:tcPr>
+          <w:p>
+            <w:pPr>
+              <w:spacing w:after="40" w:line="247" w:lineRule="auto"/>
+            </w:pPr>
+            <w:r>
+              <w:rPr>
+                <w:sz w:val="20"/>
+              </w:rPr>
+              <w:t>Shows equipment-related status alongside sensing outputs</w:t>
+            </w:r>
+          </w:p>
+        </w:tc>
+        <w:tc>
+          <w:tcPr>
+            <w:tcW w:type="dxa" w:w="4248"/>
+            <w:vAlign w:val="center"/>
+            <w:tcBorders>
+              <w:top w:val="single" w:sz="4" w:color="D9D9D9"/>
+              <w:left w:val="single" w:sz="4" w:color="D9D9D9"/>
+              <w:bottom w:val="single" w:sz="4" w:color="D9D9D9"/>
+              <w:right w:val="single" w:sz="4" w:color="D9D9D9"/>
+            </w:tcBorders>
+            <w:tcMar>
+              <w:top w:w="90" w:type="dxa"/>
+              <w:left w:w="90" w:type="dxa"/>
+              <w:bottom w:w="90" w:type="dxa"/>
+              <w:right w:w="90" w:type="dxa"/>
+            </w:tcMar>
+            <w:shd w:fill="FFFFFF"/>
+          </w:tcPr>
+          <w:p>
+            <w:pPr>
+              <w:spacing w:after="40" w:line="247" w:lineRule="auto"/>
+            </w:pPr>
+            <w:r>
+              <w:rPr>
+                <w:sz w:val="20"/>
+              </w:rPr>
+              <w:t>Can battery reporting and data freshness remain qualified without becoming readiness or power-topology claims?</w:t>
+            </w:r>
+          </w:p>
+        </w:tc>
+      </w:tr>
+      <w:tr>
+        <w:trPr>
+          <w:cantSplit/>
+        </w:trPr>
+        <w:tc>
+          <w:tcPr>
+            <w:tcW w:type="dxa" w:w="2232"/>
+            <w:vAlign w:val="center"/>
+            <w:tcBorders>
+              <w:top w:val="single" w:sz="4" w:color="D9D9D9"/>
+              <w:left w:val="single" w:sz="4" w:color="D9D9D9"/>
+              <w:bottom w:val="single" w:sz="4" w:color="D9D9D9"/>
+              <w:right w:val="single" w:sz="4" w:color="D9D9D9"/>
+            </w:tcBorders>
+            <w:tcMar>
+              <w:top w:w="90" w:type="dxa"/>
+              <w:left w:w="90" w:type="dxa"/>
+              <w:bottom w:w="90" w:type="dxa"/>
+              <w:right w:w="90" w:type="dxa"/>
+            </w:tcMar>
+            <w:shd w:fill="F7F7F7"/>
+          </w:tcPr>
+          <w:p>
+            <w:pPr>
+              <w:spacing w:after="40" w:line="247" w:lineRule="auto"/>
+            </w:pPr>
+            <w:r>
+              <w:rPr>
+                <w:sz w:val="20"/>
+              </w:rPr>
+              <w:t>Selected PM2.5 detail</w:t>
+            </w:r>
+          </w:p>
+        </w:tc>
+        <w:tc>
+          <w:tcPr>
+            <w:tcW w:type="dxa" w:w="3312"/>
+            <w:vAlign w:val="center"/>
+            <w:tcBorders>
+              <w:top w:val="single" w:sz="4" w:color="D9D9D9"/>
+              <w:left w:val="single" w:sz="4" w:color="D9D9D9"/>
+              <w:bottom w:val="single" w:sz="4" w:color="D9D9D9"/>
+              <w:right w:val="single" w:sz="4" w:color="D9D9D9"/>
+            </w:tcBorders>
+            <w:tcMar>
+              <w:top w:w="90" w:type="dxa"/>
+              <w:left w:w="90" w:type="dxa"/>
+              <w:bottom w:w="90" w:type="dxa"/>
+              <w:right w:w="90" w:type="dxa"/>
+            </w:tcMar>
+            <w:shd w:fill="F7F7F7"/>
+          </w:tcPr>
+          <w:p>
+            <w:pPr>
+              <w:spacing w:after="40" w:line="247" w:lineRule="auto"/>
+            </w:pPr>
+            <w:r>
+              <w:rPr>
+                <w:sz w:val="20"/>
+              </w:rPr>
+              <w:t>Adds a human explanation to the selected property</w:t>
+            </w:r>
+          </w:p>
+        </w:tc>
+        <w:tc>
+          <w:tcPr>
+            <w:tcW w:type="dxa" w:w="4248"/>
+            <w:vAlign w:val="center"/>
+            <w:tcBorders>
+              <w:top w:val="single" w:sz="4" w:color="D9D9D9"/>
+              <w:left w:val="single" w:sz="4" w:color="D9D9D9"/>
+              <w:bottom w:val="single" w:sz="4" w:color="D9D9D9"/>
+              <w:right w:val="single" w:sz="4" w:color="D9D9D9"/>
+            </w:tcBorders>
+            <w:tcMar>
+              <w:top w:w="90" w:type="dxa"/>
+              <w:left w:w="90" w:type="dxa"/>
+              <w:bottom w:w="90" w:type="dxa"/>
+              <w:right w:w="90" w:type="dxa"/>
+            </w:tcMar>
+            <w:shd w:fill="F7F7F7"/>
+          </w:tcPr>
+          <w:p>
+            <w:pPr>
+              <w:spacing w:after="40" w:line="247" w:lineRule="auto"/>
+            </w:pPr>
+            <w:r>
+              <w:rPr>
+                <w:sz w:val="20"/>
+              </w:rPr>
+              <w:t>Can the standardized representation preserve a semantic property definition that the client can explain?</w:t>
+            </w:r>
+          </w:p>
+        </w:tc>
+      </w:tr>
+      <w:tr>
+        <w:trPr>
+          <w:cantSplit/>
+        </w:trPr>
+        <w:tc>
+          <w:tcPr>
+            <w:tcW w:type="dxa" w:w="2232"/>
+            <w:vAlign w:val="center"/>
+            <w:tcBorders>
+              <w:top w:val="single" w:sz="4" w:color="D9D9D9"/>
+              <w:left w:val="single" w:sz="4" w:color="D9D9D9"/>
+              <w:bottom w:val="single" w:sz="4" w:color="D9D9D9"/>
+              <w:right w:val="single" w:sz="4" w:color="D9D9D9"/>
+            </w:tcBorders>
+            <w:tcMar>
+              <w:top w:w="90" w:type="dxa"/>
+              <w:left w:w="90" w:type="dxa"/>
+              <w:bottom w:w="90" w:type="dxa"/>
+              <w:right w:w="90" w:type="dxa"/>
+            </w:tcMar>
+            <w:shd w:fill="FFFFFF"/>
+          </w:tcPr>
+          <w:p>
+            <w:pPr>
+              <w:spacing w:after="40" w:line="247" w:lineRule="auto"/>
+            </w:pPr>
+            <w:r>
+              <w:rPr>
+                <w:sz w:val="20"/>
+              </w:rPr>
+              <w:t>Date controls and time-series graph</w:t>
+            </w:r>
+          </w:p>
+        </w:tc>
+        <w:tc>
+          <w:tcPr>
+            <w:tcW w:type="dxa" w:w="3312"/>
+            <w:vAlign w:val="center"/>
+            <w:tcBorders>
+              <w:top w:val="single" w:sz="4" w:color="D9D9D9"/>
+              <w:left w:val="single" w:sz="4" w:color="D9D9D9"/>
+              <w:bottom w:val="single" w:sz="4" w:color="D9D9D9"/>
+              <w:right w:val="single" w:sz="4" w:color="D9D9D9"/>
+            </w:tcBorders>
+            <w:tcMar>
+              <w:top w:w="90" w:type="dxa"/>
+              <w:left w:w="90" w:type="dxa"/>
+              <w:bottom w:w="90" w:type="dxa"/>
+              <w:right w:w="90" w:type="dxa"/>
+            </w:tcMar>
+            <w:shd w:fill="FFFFFF"/>
+          </w:tcPr>
+          <w:p>
+            <w:pPr>
+              <w:spacing w:after="40" w:line="247" w:lineRule="auto"/>
+            </w:pPr>
+            <w:r>
+              <w:rPr>
+                <w:sz w:val="20"/>
+              </w:rPr>
+              <w:t>Gives temporal context and history for a selected quantity</w:t>
+            </w:r>
+          </w:p>
+        </w:tc>
+        <w:tc>
+          <w:tcPr>
+            <w:tcW w:type="dxa" w:w="4248"/>
+            <w:vAlign w:val="center"/>
+            <w:tcBorders>
+              <w:top w:val="single" w:sz="4" w:color="D9D9D9"/>
+              <w:left w:val="single" w:sz="4" w:color="D9D9D9"/>
+              <w:bottom w:val="single" w:sz="4" w:color="D9D9D9"/>
+              <w:right w:val="single" w:sz="4" w:color="D9D9D9"/>
+            </w:tcBorders>
+            <w:tcMar>
+              <w:top w:w="90" w:type="dxa"/>
+              <w:left w:w="90" w:type="dxa"/>
+              <w:bottom w:w="90" w:type="dxa"/>
+              <w:right w:w="90" w:type="dxa"/>
+            </w:tcMar>
+            <w:shd w:fill="FFFFFF"/>
+          </w:tcPr>
+          <w:p>
+            <w:pPr>
+              <w:spacing w:after="40" w:line="247" w:lineRule="auto"/>
+            </w:pPr>
+            <w:r>
+              <w:rPr>
+                <w:sz w:val="20"/>
+              </w:rPr>
+              <w:t>Can source time, requested interval, aggregation, and retrieved history remain distinguishable?</w:t>
+            </w:r>
+          </w:p>
+        </w:tc>
+      </w:tr>
+      <w:tr>
+        <w:trPr>
+          <w:cantSplit/>
+        </w:trPr>
+        <w:tc>
+          <w:tcPr>
+            <w:tcW w:type="dxa" w:w="2232"/>
+            <w:vAlign w:val="center"/>
+            <w:tcBorders>
+              <w:top w:val="single" w:sz="4" w:color="D9D9D9"/>
+              <w:left w:val="single" w:sz="4" w:color="D9D9D9"/>
+              <w:bottom w:val="single" w:sz="4" w:color="D9D9D9"/>
+              <w:right w:val="single" w:sz="4" w:color="D9D9D9"/>
+            </w:tcBorders>
+            <w:tcMar>
+              <w:top w:w="90" w:type="dxa"/>
+              <w:left w:w="90" w:type="dxa"/>
+              <w:bottom w:w="90" w:type="dxa"/>
+              <w:right w:w="90" w:type="dxa"/>
+            </w:tcMar>
+            <w:shd w:fill="F7F7F7"/>
+          </w:tcPr>
+          <w:p>
+            <w:pPr>
+              <w:spacing w:after="40" w:line="247" w:lineRule="auto"/>
+            </w:pPr>
+            <w:r>
+              <w:rPr>
+                <w:sz w:val="20"/>
+              </w:rPr>
+              <w:t>Sensor/model labels in dashboard</w:t>
+            </w:r>
+          </w:p>
+        </w:tc>
+        <w:tc>
+          <w:tcPr>
+            <w:tcW w:type="dxa" w:w="3312"/>
+            <w:vAlign w:val="center"/>
+            <w:tcBorders>
+              <w:top w:val="single" w:sz="4" w:color="D9D9D9"/>
+              <w:left w:val="single" w:sz="4" w:color="D9D9D9"/>
+              <w:bottom w:val="single" w:sz="4" w:color="D9D9D9"/>
+              <w:right w:val="single" w:sz="4" w:color="D9D9D9"/>
+            </w:tcBorders>
+            <w:tcMar>
+              <w:top w:w="90" w:type="dxa"/>
+              <w:left w:w="90" w:type="dxa"/>
+              <w:bottom w:w="90" w:type="dxa"/>
+              <w:right w:w="90" w:type="dxa"/>
+            </w:tcMar>
+            <w:shd w:fill="F7F7F7"/>
+          </w:tcPr>
+          <w:p>
+            <w:pPr>
+              <w:spacing w:after="40" w:line="247" w:lineRule="auto"/>
+            </w:pPr>
+            <w:r>
+              <w:rPr>
+                <w:sz w:val="20"/>
+              </w:rPr>
+              <w:t>Exposes technical description near current values and trends</w:t>
+            </w:r>
+          </w:p>
+        </w:tc>
+        <w:tc>
+          <w:tcPr>
+            <w:tcW w:type="dxa" w:w="4248"/>
+            <w:vAlign w:val="center"/>
+            <w:tcBorders>
+              <w:top w:val="single" w:sz="4" w:color="D9D9D9"/>
+              <w:left w:val="single" w:sz="4" w:color="D9D9D9"/>
+              <w:bottom w:val="single" w:sz="4" w:color="D9D9D9"/>
+              <w:right w:val="single" w:sz="4" w:color="D9D9D9"/>
+            </w:tcBorders>
+            <w:tcMar>
+              <w:top w:w="90" w:type="dxa"/>
+              <w:left w:w="90" w:type="dxa"/>
+              <w:bottom w:w="90" w:type="dxa"/>
+              <w:right w:w="90" w:type="dxa"/>
+            </w:tcMar>
+            <w:shd w:fill="F7F7F7"/>
+          </w:tcPr>
+          <w:p>
+            <w:pPr>
+              <w:spacing w:after="40" w:line="247" w:lineRule="auto"/>
+            </w:pPr>
+            <w:r>
+              <w:rPr>
+                <w:sz w:val="20"/>
+              </w:rPr>
+              <w:t>Can model, sensing component/function, observed property, and result remain separate but navigable?</w:t>
+            </w:r>
+          </w:p>
+        </w:tc>
+      </w:tr>
+    </w:tbl>
+    <w:p>
+      <w:pPr>
+        <w:spacing w:after="40" w:before="0" w:line="60" w:lineRule="exact"/>
+      </w:pPr>
+    </w:p>
+    <w:p>
+      <w:pPr/>
+      <w:r>
+        <w:rPr/>
+        <w:t>The eventual matched comparison has three conditions: the Smart Citizen source presentation for the selected specimen where a contemporaneous view can be obtained, a competent generic OGC presentation, and a profile-aware Glaux presentation. Figures 6 and 7 establish first-party historical presentation evidence before implementation, but neither is a matched screenshot of public registration 19639. Generic handling will retain useful labels, types, units, timestamps, relationships, and inspection access. It will not be reduced to a deliberately inconvenient JSON dump.</w:t>
+      </w:r>
+    </w:p>
+    <w:p>
+      <w:pPr/>
+      <w:r>
+        <w:rPr/>
+        <w:t>The generic and profile-aware conditions will use the same captured standardized resources. Differences will be attributed to documented presentation rules. Proposed operator tasks will ask a reader to identify the represented resource, distinguish newer readings from older channels, explain an aggregate, locate source evidence, and recognize what remains unknown. Initial evaluation will be investigator inspection, without claims about representative users. A later participant study would require its own recruitment, procedure, and analysis plan.</w:t>
+      </w:r>
+    </w:p>
+    <w:p>
+      <w:pPr/>
+      <w:r>
+        <w:rPr/>
+        <w:t>Each screenshot will record the registration, channel, observation or interval, aggregation, units, capture time, application revision where available, browser, zoom, viewport, and relevant controls. Glaux will be evaluated at the recovered 560 × 440 module size; other sizes will be reported explicitly. The source interface will retain its actual viewport and layout. Where it cannot replay the same sample or interval, images will be described as illustrative interface evidence rather than a matched comparison (MERLIN Project 2026d).</w:t>
+      </w:r>
+    </w:p>
+    <w:p>
+      <w:pPr>
+        <w:pStyle w:val="PaperCaption"/>
+        <w:keepNext/>
+      </w:pPr>
+      <w:r>
+        <w:rPr>
+          <w:b/>
+        </w:rPr>
+        <w:t>Table 9. Planned figures and evidence status.</w:t>
+      </w:r>
+      <w:r>
+        <w:rPr/>
+        <w:t xml:space="preserve"> Figures 1–5 identify the system, server, client, experiment architecture, and conceptual model. Figures 6 and 7 now provide first-party historical Smart Citizen UI evidence selected before the CSAPI/Glaux result exists. Figures 8–10 remain reserved for contemporaneous or executed evidence and will not be filled with simulated substitutes.</w:t>
       </w:r>
     </w:p>
     <w:tbl>
@@ -8018,7 +8865,7 @@
                 <w:b/>
                 <w:sz w:val="20"/>
               </w:rPr>
-              <w:t>Status in version 0.5</w:t>
+              <w:t>Status in version 0.6</w:t>
             </w:r>
           </w:p>
         </w:tc>
@@ -8558,7 +9405,7 @@
               <w:rPr>
                 <w:sz w:val="20"/>
               </w:rPr>
-              <w:t>Actual Smart Citizen interface showing the selected channels and interval</w:t>
+              <w:t>Smart Citizen core-platform measurement exploration</w:t>
             </w:r>
           </w:p>
         </w:tc>
@@ -8588,7 +9435,7 @@
               <w:rPr>
                 <w:sz w:val="20"/>
               </w:rPr>
-              <w:t>Awaiting documented capture</w:t>
+              <w:t>Included first-party documentation screenshot; historical kit 14410 example, not registration 19639</w:t>
             </w:r>
           </w:p>
         </w:tc>
@@ -8653,7 +9500,197 @@
               <w:rPr>
                 <w:sz w:val="20"/>
               </w:rPr>
-              <w:t>Matched generic and profile-aware Glaux views of the integrated evidence</w:t>
+              <w:t>Smart Citizen custom-dashboard presentation</w:t>
+            </w:r>
+          </w:p>
+        </w:tc>
+        <w:tc>
+          <w:tcPr>
+            <w:tcW w:type="dxa" w:w="4392"/>
+            <w:vAlign w:val="center"/>
+            <w:tcBorders>
+              <w:top w:val="single" w:sz="4" w:color="D9D9D9"/>
+              <w:left w:val="single" w:sz="4" w:color="D9D9D9"/>
+              <w:bottom w:val="single" w:sz="4" w:color="D9D9D9"/>
+              <w:right w:val="single" w:sz="4" w:color="D9D9D9"/>
+            </w:tcBorders>
+            <w:tcMar>
+              <w:top w:w="90" w:type="dxa"/>
+              <w:left w:w="90" w:type="dxa"/>
+              <w:bottom w:w="90" w:type="dxa"/>
+              <w:right w:w="90" w:type="dxa"/>
+            </w:tcMar>
+            <w:shd w:fill="FFFFFF"/>
+          </w:tcPr>
+          <w:p>
+            <w:pPr>
+              <w:spacing w:after="40" w:line="247" w:lineRule="auto"/>
+            </w:pPr>
+            <w:r>
+              <w:rPr>
+                <w:sz w:val="20"/>
+              </w:rPr>
+              <w:t>Included first-party documentation screenshot; historical SCK2.1 dashboard example</w:t>
+            </w:r>
+          </w:p>
+        </w:tc>
+      </w:tr>
+      <w:tr>
+        <w:trPr>
+          <w:cantSplit/>
+        </w:trPr>
+        <w:tc>
+          <w:tcPr>
+            <w:tcW w:type="dxa" w:w="864"/>
+            <w:vAlign w:val="center"/>
+            <w:tcBorders>
+              <w:top w:val="single" w:sz="4" w:color="D9D9D9"/>
+              <w:left w:val="single" w:sz="4" w:color="D9D9D9"/>
+              <w:bottom w:val="single" w:sz="4" w:color="D9D9D9"/>
+              <w:right w:val="single" w:sz="4" w:color="D9D9D9"/>
+            </w:tcBorders>
+            <w:tcMar>
+              <w:top w:w="90" w:type="dxa"/>
+              <w:left w:w="90" w:type="dxa"/>
+              <w:bottom w:w="90" w:type="dxa"/>
+              <w:right w:w="90" w:type="dxa"/>
+            </w:tcMar>
+            <w:shd w:fill="F7F7F7"/>
+          </w:tcPr>
+          <w:p>
+            <w:pPr>
+              <w:spacing w:after="40" w:line="247" w:lineRule="auto"/>
+            </w:pPr>
+            <w:r>
+              <w:rPr>
+                <w:sz w:val="20"/>
+              </w:rPr>
+              <w:t>8</w:t>
+            </w:r>
+          </w:p>
+        </w:tc>
+        <w:tc>
+          <w:tcPr>
+            <w:tcW w:type="dxa" w:w="4536"/>
+            <w:vAlign w:val="center"/>
+            <w:tcBorders>
+              <w:top w:val="single" w:sz="4" w:color="D9D9D9"/>
+              <w:left w:val="single" w:sz="4" w:color="D9D9D9"/>
+              <w:bottom w:val="single" w:sz="4" w:color="D9D9D9"/>
+              <w:right w:val="single" w:sz="4" w:color="D9D9D9"/>
+            </w:tcBorders>
+            <w:tcMar>
+              <w:top w:w="90" w:type="dxa"/>
+              <w:left w:w="90" w:type="dxa"/>
+              <w:bottom w:w="90" w:type="dxa"/>
+              <w:right w:w="90" w:type="dxa"/>
+            </w:tcMar>
+            <w:shd w:fill="F7F7F7"/>
+          </w:tcPr>
+          <w:p>
+            <w:pPr>
+              <w:spacing w:after="40" w:line="247" w:lineRule="auto"/>
+            </w:pPr>
+            <w:r>
+              <w:rPr>
+                <w:sz w:val="20"/>
+              </w:rPr>
+              <w:t>Contemporaneous Smart Citizen view for the selected registration/interval, if reproducible</w:t>
+            </w:r>
+          </w:p>
+        </w:tc>
+        <w:tc>
+          <w:tcPr>
+            <w:tcW w:type="dxa" w:w="4392"/>
+            <w:vAlign w:val="center"/>
+            <w:tcBorders>
+              <w:top w:val="single" w:sz="4" w:color="D9D9D9"/>
+              <w:left w:val="single" w:sz="4" w:color="D9D9D9"/>
+              <w:bottom w:val="single" w:sz="4" w:color="D9D9D9"/>
+              <w:right w:val="single" w:sz="4" w:color="D9D9D9"/>
+            </w:tcBorders>
+            <w:tcMar>
+              <w:top w:w="90" w:type="dxa"/>
+              <w:left w:w="90" w:type="dxa"/>
+              <w:bottom w:w="90" w:type="dxa"/>
+              <w:right w:w="90" w:type="dxa"/>
+            </w:tcMar>
+            <w:shd w:fill="F7F7F7"/>
+          </w:tcPr>
+          <w:p>
+            <w:pPr>
+              <w:spacing w:after="40" w:line="247" w:lineRule="auto"/>
+            </w:pPr>
+            <w:r>
+              <w:rPr>
+                <w:sz w:val="20"/>
+              </w:rPr>
+              <w:t>Awaiting documented capture; absence will be reported rather than substituted</w:t>
+            </w:r>
+          </w:p>
+        </w:tc>
+      </w:tr>
+      <w:tr>
+        <w:trPr>
+          <w:cantSplit/>
+        </w:trPr>
+        <w:tc>
+          <w:tcPr>
+            <w:tcW w:type="dxa" w:w="864"/>
+            <w:vAlign w:val="center"/>
+            <w:tcBorders>
+              <w:top w:val="single" w:sz="4" w:color="D9D9D9"/>
+              <w:left w:val="single" w:sz="4" w:color="D9D9D9"/>
+              <w:bottom w:val="single" w:sz="4" w:color="D9D9D9"/>
+              <w:right w:val="single" w:sz="4" w:color="D9D9D9"/>
+            </w:tcBorders>
+            <w:tcMar>
+              <w:top w:w="90" w:type="dxa"/>
+              <w:left w:w="90" w:type="dxa"/>
+              <w:bottom w:w="90" w:type="dxa"/>
+              <w:right w:w="90" w:type="dxa"/>
+            </w:tcMar>
+            <w:shd w:fill="FFFFFF"/>
+          </w:tcPr>
+          <w:p>
+            <w:pPr>
+              <w:spacing w:after="40" w:line="247" w:lineRule="auto"/>
+            </w:pPr>
+            <w:r>
+              <w:rPr>
+                <w:sz w:val="20"/>
+              </w:rPr>
+              <w:t>9</w:t>
+            </w:r>
+          </w:p>
+        </w:tc>
+        <w:tc>
+          <w:tcPr>
+            <w:tcW w:type="dxa" w:w="4536"/>
+            <w:vAlign w:val="center"/>
+            <w:tcBorders>
+              <w:top w:val="single" w:sz="4" w:color="D9D9D9"/>
+              <w:left w:val="single" w:sz="4" w:color="D9D9D9"/>
+              <w:bottom w:val="single" w:sz="4" w:color="D9D9D9"/>
+              <w:right w:val="single" w:sz="4" w:color="D9D9D9"/>
+            </w:tcBorders>
+            <w:tcMar>
+              <w:top w:w="90" w:type="dxa"/>
+              <w:left w:w="90" w:type="dxa"/>
+              <w:bottom w:w="90" w:type="dxa"/>
+              <w:right w:w="90" w:type="dxa"/>
+            </w:tcMar>
+            <w:shd w:fill="FFFFFF"/>
+          </w:tcPr>
+          <w:p>
+            <w:pPr>
+              <w:spacing w:after="40" w:line="247" w:lineRule="auto"/>
+            </w:pPr>
+            <w:r>
+              <w:rPr>
+                <w:sz w:val="20"/>
+              </w:rPr>
+              <w:t>Matched generic and profile-aware Glaux views of integrated evidence</w:t>
             </w:r>
           </w:p>
         </w:tc>
@@ -8718,7 +9755,7 @@
               <w:rPr>
                 <w:sz w:val="20"/>
               </w:rPr>
-              <w:t>8</w:t>
+              <w:t>10</w:t>
             </w:r>
           </w:p>
         </w:tc>
@@ -8748,7 +9785,7 @@
               <w:rPr>
                 <w:sz w:val="20"/>
               </w:rPr>
-              <w:t>Actual implemented resource relationships and a traced source-to-display example</w:t>
+              <w:t>Actual CSAPI resource relationships and a traced source-to-display example</w:t>
             </w:r>
           </w:p>
         </w:tc>
@@ -8815,7 +9852,7 @@
       </w:r>
       <w:r>
         <w:rPr/>
-        <w:t xml:space="preserve"> No experimental success rate, task-time improvement, or user outcome is reported in version 0.5. The public access observations in section 5 establish limited feasibility and remain separate from experimental results.</w:t>
+        <w:t xml:space="preserve"> No experimental success rate, task-time improvement, or user outcome is reported in version 0.6. The public access observations in section 5 and the historical vendor UI evidence in section 8 establish feasibility and presentation context; neither is a matched experimental result.</w:t>
       </w:r>
     </w:p>
     <w:p>
@@ -9095,17 +10132,7 @@
       </w:pPr>
       <w:r>
         <w:rPr/>
-        <w:t xml:space="preserve">Open Geospatial Consortium. 2025a. </w:t>
-      </w:r>
-      <w:r>
-        <w:rPr>
-          <w:i/>
-        </w:rPr>
-        <w:t>OGC API—Connected Systems—Part 1: Feature Resources</w:t>
-      </w:r>
-      <w:r>
-        <w:rPr/>
-        <w:t>. Version 1.0. OGC 23-001. Edited by Alexandre Robin. July 16. https://docs.ogc.org/is/23-001/23-001.html.</w:t>
+        <w:t>MERLIN Project. 2026j. “Smart Citizen Vendor Presentation Baseline.” October 24. Research evidence record. https://github.com/OS4CSAPI/glaux-client/blob/work/details-view-20261023/Docs/Research/Evidence/SMART_CITIZEN_VENDOR_UI_BASELINE_2026-10-24.md.</w:t>
       </w:r>
     </w:p>
     <w:p>
@@ -9114,17 +10141,17 @@
       </w:pPr>
       <w:r>
         <w:rPr/>
-        <w:t xml:space="preserve">Open Geospatial Consortium. 2025b. </w:t>
+        <w:t xml:space="preserve">Open Geospatial Consortium. 2025a. </w:t>
       </w:r>
       <w:r>
         <w:rPr>
           <w:i/>
         </w:rPr>
-        <w:t>OGC API—Connected Systems—Part 2: Dynamic Data</w:t>
+        <w:t>OGC API—Connected Systems—Part 1: Feature Resources</w:t>
       </w:r>
       <w:r>
         <w:rPr/>
-        <w:t>. Version 1.0. OGC 23-002. Edited by Alexandre Robin. July 16. https://docs.ogc.org/is/23-002/23-002.html.</w:t>
+        <w:t>. Version 1.0. OGC 23-001. Edited by Alexandre Robin. July 16. https://docs.ogc.org/is/23-001/23-001.html.</w:t>
       </w:r>
     </w:p>
     <w:p>
@@ -9133,17 +10160,17 @@
       </w:pPr>
       <w:r>
         <w:rPr/>
-        <w:t xml:space="preserve">Open Geospatial Consortium. 2025c. </w:t>
+        <w:t xml:space="preserve">Open Geospatial Consortium. 2025b. </w:t>
       </w:r>
       <w:r>
         <w:rPr>
           <w:i/>
         </w:rPr>
-        <w:t>OGC SensorML Encoding Standard</w:t>
+        <w:t>OGC API—Connected Systems—Part 2: Dynamic Data</w:t>
       </w:r>
       <w:r>
         <w:rPr/>
-        <w:t>. Version 3.0. OGC 23-000. Edited by Alexandre Robin. July 16. https://docs.ogc.org/is/23-000/23-000.html.</w:t>
+        <w:t>. Version 1.0. OGC 23-002. Edited by Alexandre Robin. July 16. https://docs.ogc.org/is/23-002/23-002.html.</w:t>
       </w:r>
     </w:p>
     <w:p>
@@ -9152,17 +10179,17 @@
       </w:pPr>
       <w:r>
         <w:rPr/>
-        <w:t xml:space="preserve">Open Geospatial Consortium. 2025d. </w:t>
+        <w:t xml:space="preserve">Open Geospatial Consortium. 2025c. </w:t>
       </w:r>
       <w:r>
         <w:rPr>
           <w:i/>
         </w:rPr>
-        <w:t>OGC SWE Common Data Model Encoding Standard</w:t>
+        <w:t>OGC SensorML Encoding Standard</w:t>
       </w:r>
       <w:r>
         <w:rPr/>
-        <w:t>. Version 3.0.0. OGC 24-014. Edited by Alexandre Robin. July 16. https://docs.ogc.org/is/24-014/24-014.html.</w:t>
+        <w:t>. Version 3.0. OGC 23-000. Edited by Alexandre Robin. July 16. https://docs.ogc.org/is/23-000/23-000.html.</w:t>
       </w:r>
     </w:p>
     <w:p>
@@ -9171,7 +10198,17 @@
       </w:pPr>
       <w:r>
         <w:rPr/>
-        <w:t>Open Geospatial Consortium. n.d.-a. “Index of /sensorML/3.0/json.” Official SensorML 3.0 JSON schema repository. Accessed October 24, 2026. https://schemas.opengis.net/sensorML/3.0/json/.</w:t>
+        <w:t xml:space="preserve">Open Geospatial Consortium. 2025d. </w:t>
+      </w:r>
+      <w:r>
+        <w:rPr>
+          <w:i/>
+        </w:rPr>
+        <w:t>OGC SWE Common Data Model Encoding Standard</w:t>
+      </w:r>
+      <w:r>
+        <w:rPr/>
+        <w:t>. Version 3.0.0. OGC 24-014. Edited by Alexandre Robin. July 16. https://docs.ogc.org/is/24-014/24-014.html.</w:t>
       </w:r>
     </w:p>
     <w:p>
@@ -9180,7 +10217,7 @@
       </w:pPr>
       <w:r>
         <w:rPr/>
-        <w:t>Open Geospatial Consortium. n.d.-b. “Index of /sweCommon/3.0/json.” Official SWE Common 3.0 JSON schema repository. Accessed October 24, 2026. https://schemas.opengis.net/sweCommon/3.0/json/.</w:t>
+        <w:t>Open Geospatial Consortium. n.d.-a. “Index of /sensorML/3.0/json.” Official SensorML 3.0 JSON schema repository. Accessed October 24, 2026. https://schemas.opengis.net/sensorML/3.0/json/.</w:t>
       </w:r>
     </w:p>
     <w:p>
@@ -9189,7 +10226,7 @@
       </w:pPr>
       <w:r>
         <w:rPr/>
-        <w:t>OS4CSAPI. 2026. “ogc-client-CSAPI_2.” GitHub repository, phase-10 revision 4ca1d7db9b1ccdf545adbef42ef941139fe11977. Accessed October 24, 2026. https://github.com/OS4CSAPI/ogc-client-CSAPI_2/tree/4ca1d7db9b1ccdf545adbef42ef941139fe11977.</w:t>
+        <w:t>Open Geospatial Consortium. n.d.-b. “Index of /sweCommon/3.0/json.” Official SWE Common 3.0 JSON schema repository. Accessed October 24, 2026. https://schemas.opengis.net/sweCommon/3.0/json/.</w:t>
       </w:r>
     </w:p>
     <w:p>
@@ -9198,17 +10235,7 @@
       </w:pPr>
       <w:r>
         <w:rPr/>
-        <w:t xml:space="preserve">Parello, John, Benoit Claise, Brad Schoening, and Juergen Quittek. 2014. </w:t>
-      </w:r>
-      <w:r>
-        <w:rPr>
-          <w:i/>
-        </w:rPr>
-        <w:t>Energy Management Framework</w:t>
-      </w:r>
-      <w:r>
-        <w:rPr/>
-        <w:t>. RFC 7326. Informational. September. https://doi.org/10.17487/RFC7326.</w:t>
+        <w:t>OS4CSAPI. 2026. “ogc-client-CSAPI_2.” GitHub repository, phase-10 revision 4ca1d7db9b1ccdf545adbef42ef941139fe11977. Accessed October 24, 2026. https://github.com/OS4CSAPI/ogc-client-CSAPI_2/tree/4ca1d7db9b1ccdf545adbef42ef941139fe11977.</w:t>
       </w:r>
     </w:p>
     <w:p>
@@ -9217,17 +10244,17 @@
       </w:pPr>
       <w:r>
         <w:rPr/>
-        <w:t xml:space="preserve">pygeoapi Development Team. 2026. </w:t>
+        <w:t xml:space="preserve">Parello, John, Benoit Claise, Brad Schoening, and Juergen Quittek. 2014. </w:t>
       </w:r>
       <w:r>
         <w:rPr>
           <w:i/>
         </w:rPr>
-        <w:t>pygeoapi 0.25.dev0 Documentation</w:t>
+        <w:t>Energy Management Framework</w:t>
       </w:r>
       <w:r>
         <w:rPr/>
-        <w:t>. October 22. https://docs.pygeoapi.io/en/latest/.</w:t>
+        <w:t>. RFC 7326. Informational. September. https://doi.org/10.17487/RFC7326.</w:t>
       </w:r>
     </w:p>
     <w:p>
@@ -9236,17 +10263,17 @@
       </w:pPr>
       <w:r>
         <w:rPr/>
-        <w:t xml:space="preserve">QUDT.org. n.d. “Degree Celsius.” </w:t>
+        <w:t xml:space="preserve">pygeoapi Development Team. 2026. </w:t>
       </w:r>
       <w:r>
         <w:rPr>
           <w:i/>
         </w:rPr>
-        <w:t>QUDT Units Vocabulary</w:t>
+        <w:t>pygeoapi 0.25.dev0 Documentation</w:t>
       </w:r>
       <w:r>
         <w:rPr/>
-        <w:t>, version 3.5.3. Unit DEG_C. Accessed October 24, 2026. https://qudt.org/vocab/unit/DEG_C.</w:t>
+        <w:t>. October 22. https://docs.pygeoapi.io/en/latest/.</w:t>
       </w:r>
     </w:p>
     <w:p>
@@ -9255,17 +10282,17 @@
       </w:pPr>
       <w:r>
         <w:rPr/>
-        <w:t xml:space="preserve">Quittek, Juergen, Rolf Winter, and Thomas Dietz. 2015. </w:t>
+        <w:t xml:space="preserve">QUDT.org. n.d. “Degree Celsius.” </w:t>
       </w:r>
       <w:r>
         <w:rPr>
           <w:i/>
         </w:rPr>
-        <w:t>Definition of Managed Objects for Battery Monitoring</w:t>
+        <w:t>QUDT Units Vocabulary</w:t>
       </w:r>
       <w:r>
         <w:rPr/>
-        <w:t>. RFC 7577. Standards Track. July. https://doi.org/10.17487/RFC7577.</w:t>
+        <w:t>, version 3.5.3. Unit DEG_C. Accessed October 24, 2026. https://qudt.org/vocab/unit/DEG_C.</w:t>
       </w:r>
     </w:p>
     <w:p>
@@ -9274,7 +10301,17 @@
       </w:pPr>
       <w:r>
         <w:rPr/>
-        <w:t>Seeed Studio. n.d. “Smart Citizen Kit 2.3—Open Source Environmental Monitoring Kit.” SKU 114993536. Accessed October 24, 2026. https://www.seeedstudio.com/Smart-Citizen2-3-p-6327.html.</w:t>
+        <w:t xml:space="preserve">Quittek, Juergen, Rolf Winter, and Thomas Dietz. 2015. </w:t>
+      </w:r>
+      <w:r>
+        <w:rPr>
+          <w:i/>
+        </w:rPr>
+        <w:t>Definition of Managed Objects for Battery Monitoring</w:t>
+      </w:r>
+      <w:r>
+        <w:rPr/>
+        <w:t>. RFC 7577. Standards Track. July. https://doi.org/10.17487/RFC7577.</w:t>
       </w:r>
     </w:p>
     <w:p>
@@ -9283,17 +10320,7 @@
       </w:pPr>
       <w:r>
         <w:rPr/>
-        <w:t xml:space="preserve">Smart Citizen. n.d.-a. “Data Platform.” </w:t>
-      </w:r>
-      <w:r>
-        <w:rPr>
-          <w:i/>
-        </w:rPr>
-        <w:t>Smart Citizen Docs</w:t>
-      </w:r>
-      <w:r>
-        <w:rPr/>
-        <w:t>. Accessed October 24, 2026. https://docs.smartcitizen.me/data/data-platform/.</w:t>
+        <w:t>Seeed Studio. n.d. “Smart Citizen Kit 2.3—Open Source Environmental Monitoring Kit.” SKU 114993536. Accessed October 24, 2026. https://www.seeedstudio.com/Smart-Citizen2-3-p-6327.html.</w:t>
       </w:r>
     </w:p>
     <w:p>
@@ -9302,7 +10329,7 @@
       </w:pPr>
       <w:r>
         <w:rPr/>
-        <w:t xml:space="preserve">Smart Citizen. n.d.-b. “Open Source.” </w:t>
+        <w:t xml:space="preserve">Smart Citizen. n.d.-a. “Data Platform.” </w:t>
       </w:r>
       <w:r>
         <w:rPr>
@@ -9312,7 +10339,7 @@
       </w:r>
       <w:r>
         <w:rPr/>
-        <w:t>. Accessed October 24, 2026. https://docs.smartcitizen.me/about/open-source/.</w:t>
+        <w:t>. Accessed October 24, 2026. https://docs.smartcitizen.me/data/data-platform/.</w:t>
       </w:r>
     </w:p>
     <w:p>
@@ -9321,7 +10348,7 @@
       </w:pPr>
       <w:r>
         <w:rPr/>
-        <w:t xml:space="preserve">Smart Citizen. n.d.-c. “Smart Citizen Kit.” </w:t>
+        <w:t xml:space="preserve">Smart Citizen. n.d.-b. “Open Source.” </w:t>
       </w:r>
       <w:r>
         <w:rPr>
@@ -9331,7 +10358,7 @@
       </w:r>
       <w:r>
         <w:rPr/>
-        <w:t>. Accessed October 24, 2026. https://docs.smartcitizen.me/hardware/kit/.</w:t>
+        <w:t>. Accessed October 24, 2026. https://docs.smartcitizen.me/about/open-source/.</w:t>
       </w:r>
     </w:p>
     <w:p>
@@ -9340,7 +10367,64 @@
       </w:pPr>
       <w:r>
         <w:rPr/>
+        <w:t xml:space="preserve">Smart Citizen. n.d.-c. “Smart Citizen Kit.” </w:t>
+      </w:r>
+      <w:r>
+        <w:rPr>
+          <w:i/>
+        </w:rPr>
+        <w:t>Smart Citizen Docs</w:t>
+      </w:r>
+      <w:r>
+        <w:rPr/>
+        <w:t>. Accessed October 24, 2026. https://docs.smartcitizen.me/hardware/kit/.</w:t>
+      </w:r>
+    </w:p>
+    <w:p>
+      <w:pPr>
+        <w:pStyle w:val="PaperReference"/>
+      </w:pPr>
+      <w:r>
+        <w:rPr/>
         <w:t>Smart Citizen. n.d.-d. “SmartCitizen API Reference.” Accessed October 24, 2026. https://developer.smartcitizen.me/.</w:t>
+      </w:r>
+    </w:p>
+    <w:p>
+      <w:pPr>
+        <w:pStyle w:val="PaperReference"/>
+      </w:pPr>
+      <w:r>
+        <w:rPr/>
+        <w:t xml:space="preserve">Smart Citizen. n.d.-e. “Onboarding Your Kit.” </w:t>
+      </w:r>
+      <w:r>
+        <w:rPr>
+          <w:i/>
+        </w:rPr>
+        <w:t>Smart Citizen Docs</w:t>
+      </w:r>
+      <w:r>
+        <w:rPr/>
+        <w:t>. Accessed October 24, 2026. https://docs.smartcitizen.me/guides/getting-started/onboarding-your-kit/.</w:t>
+      </w:r>
+    </w:p>
+    <w:p>
+      <w:pPr>
+        <w:pStyle w:val="PaperReference"/>
+      </w:pPr>
+      <w:r>
+        <w:rPr/>
+        <w:t xml:space="preserve">Smart Citizen. n.d.-f. “Data Tools.” </w:t>
+      </w:r>
+      <w:r>
+        <w:rPr>
+          <w:i/>
+        </w:rPr>
+        <w:t>Smart Citizen Docs</w:t>
+      </w:r>
+      <w:r>
+        <w:rPr/>
+        <w:t>. Accessed October 24, 2026. https://docs.smartcitizen.me/data/data-tools/.</w:t>
       </w:r>
     </w:p>
     <w:p>
@@ -9406,7 +10490,7 @@
         <w:color w:val="000000"/>
         <w:sz w:val="18"/>
       </w:rPr>
-      <w:t xml:space="preserve">Research draft 0.5   24 October 2026 EDT   </w:t>
+      <w:t xml:space="preserve">Research draft 0.6   24 October 2026 EDT   </w:t>
     </w:r>
     <w:fldSimple w:instr="PAGE"/>
   </w:p>

</xml_diff>

<commit_message>
docs: rebuild Smart Citizen paper v0.7
</commit_message>
<xml_diff>
--- a/Docs/Research/Studies/Smart_Citizen/SMART_CITIZEN_EXPERIMENT_PAPER.docx
+++ b/Docs/Research/Studies/Smart_Citizen/SMART_CITIZEN_EXPERIMENT_PAPER.docx
@@ -32,7 +32,7 @@
       <w:pPr/>
       <w:r>
         <w:rPr/>
-        <w:t>Working paper version 0.6 | 24 October 2026 | Study protocol and preliminary source assessment</w:t>
+        <w:t>Working paper version 0.7 | 25 October 2026 | Study protocol with reviewed Phase 1–3 evidence</w:t>
       </w:r>
     </w:p>
     <w:p>
@@ -48,14 +48,14 @@
       <w:pPr/>
       <w:r>
         <w:rPr/>
-        <w:t>Integrating a sensing system requires preserving the meaning of its information as well as transporting its measurements. An operator may need to distinguish a product model from an installed unit, a producing sensor from the subject it observes, and a reported condition from an interpretation of that condition. This paper defines a proposed experiment using public Smart Citizen data, an authored adapter, an OGC API Connected Systems service, and the Glaux client to evaluate the MERLIN domain information model and Managed Physical Sensing Systems profile. The study will combine published source definitions with captured responses, document each consequential transformation, and compare competent generic and profile-aware presentations of the same standardized resources. Each mapping will explain both its standard representation and its relationship to the underlying domain model and individually identified donor concepts.</w:t>
+        <w:t>Integrating a sensing system requires preserving the meaning of its information as well as transporting its measurements. An operator may need to distinguish a product model from an installed unit, a producing system from the subject it observes, a source-reported status from an interpretation of that status, and a direct reading from a platform-derived product. This paper defines and begins a Smart Citizen experiment using public source data, an authored adapter, an OGC API — Connected Systems service, and the Glaux client to evaluate the MERLIN domain information model and Managed Physical Sensing Systems profile. Each consequential mapping is required to identify its native assertion, underlying domain concept, donor concepts, MPSS binding, standard carrier, authored transformation, presentation implication, and review outcome.</w:t>
       </w:r>
     </w:p>
     <w:p>
       <w:pPr/>
       <w:r>
         <w:rPr/>
-        <w:t>Preliminary access checks establish that selected public measurements and aggregate history were retrievable; they do not establish a running adapter, a loaded CSAPI dataset, or a presentation benefit. The evaluation will report semantic preservation, domain coverage, and operator-facing utility separately. Initial diagrams and code fragments explain the proposed method. Paired source-interface and Glaux screenshots, executed mappings, and measured results will be added as evidence becomes available. The expected contribution is a reproducible account of which meanings survive integration, which require explicit enrichment, and which remain unsupported by the source.</w:t>
+        <w:t>Phases 1–3 have now frozen a reproducible public specimen, characterized its native identities, channels, times and source semantics, and reviewed nine current-state plus two aggregate-history mappings. This revision also establishes sourced definitions for terms whose casual use could otherwise obscure the experiment, including telemetry, provenance, measurement, calibration, Observation, DataStream, phenomenon time and result time. The adapter, CSAPI publication and round trip, connected Glaux traversal, and matched generic/profile-aware interface comparison remain unexecuted, so no interoperability or operator-benefit result is claimed. The expected contribution remains a reproducible account of which meanings survive integration, which require explicit enrichment, which are transformed by source-platform processing, and which remain unsupported.</w:t>
       </w:r>
     </w:p>
     <w:p>
@@ -173,7 +173,7 @@
       <w:pPr/>
       <w:r>
         <w:rPr/>
-        <w:t>The specific starting specimen is public Smart Citizen registration 19639, captured on 24 October 2026 at 21:57:35 UTC. The returned record identifies its hardware as “SmartCitizen Kit 2.3,” with type “SCK,” version “2.3,” and slug “sck:2,3” (MERLIN Project 2026b, record “smart-citizen-current-19639”). Its channel catalogue includes environmental observations together with equipment-related readings such as battery percentage and Wi-Fi RSSI. A source registration and its reported model identify the selected data specimen, while the enduring physical identity and installed configuration still require separate evidence.</w:t>
+        <w:t>The selected specimen is public Smart Citizen registration 19639. A formal capture made on 25 October 2026 at 02:43:48 UTC retained the complete Device response, response headers, and bounded temperature and PM2.5 histories with request URLs and SHA-256 hashes; it supersedes the earlier 24 October feasibility values as the evidence basis for formal mappings (MERLIN Project 2026k). The source reports hardware “SmartCitizen Kit 2.3,” type “SCK,” version “2.3,” and slug “sck:2,3,” while its channel catalogue includes environmental observations and system-related telemetry such as battery level, RSSI and SD-card indication. The registration and reported model identify the selected data specimen, but enduring physical identity and installed configuration remain separate evidence questions.</w:t>
       </w:r>
     </w:p>
     <w:p>
@@ -564,7 +564,7 @@
               <w:rPr>
                 <w:sz w:val="20"/>
               </w:rPr>
-              <w:t>Registration 19639; GET https://api.smartcitizen.me/v0/devices/19639</w:t>
+              <w:t>Registration 19639; formal frozen capture 20261025T024348Z</w:t>
             </w:r>
           </w:p>
         </w:tc>
@@ -595,7 +595,7 @@
               <w:rPr>
                 <w:sz w:val="20"/>
               </w:rPr>
-              <w:t>Starting specimen for the proposed public-data integration; not a verified physical serial number</w:t>
+              <w:t>Evidence basis for the Phase 1–3 mappings; not a verified physical serial number</w:t>
             </w:r>
           </w:p>
         </w:tc>
@@ -836,7 +836,7 @@
       <w:pPr/>
       <w:r>
         <w:rPr/>
-        <w:t>This paper is being written before execution of the proposed integration. Its purpose is to state what will be built, why the experiment is needed, how evidence will be collected and interpreted, and what would justify a conclusion. The initial staged plan is refined here by placing public-data integration before hardware acquisition (MERLIN Project 2026e). An owned kit is a later means of obtaining physical installation and lifecycle evidence. Deterministic captures will accompany live access so that the same observations can be examined throughout the integration chain.</w:t>
+        <w:t>This paper is maintained while the experiment proceeds rather than being written only before execution. Source acquisition, native characterization and the first mapping review are now executed and documented, while adapter publication, CSAPI round-trip testing and client comparison remain future phases (MERLIN Project 2026k; 2026l). Public-data integration still precedes hardware acquisition, and an owned kit remains a later route to physical installation and lifecycle evidence (MERLIN Project 2026e). The frozen specimen provides deterministic replay evidence while any later live acquisition is recorded separately.</w:t>
       </w:r>
     </w:p>
     <w:p>
@@ -845,7 +845,1615 @@
       </w:pPr>
       <w:r>
         <w:rPr/>
-        <w:t>2 Background and technical baseline</w:t>
+        <w:t>2 Terms and definitions</w:t>
+      </w:r>
+    </w:p>
+    <w:p>
+      <w:pPr/>
+      <w:r>
+        <w:rPr/>
+        <w:t>The study uses several technical terms that carry narrower meanings than their everyday equivalents. The definitions below are taken from the cited standards or source documentation where an authoritative definition exists, while study-specific terms are explicitly identified as operational definitions rather than external standards. Later uses in the paper are intended to remain consistent with these meanings, and ambiguous source labels are not allowed to override them.</w:t>
+      </w:r>
+    </w:p>
+    <w:p>
+      <w:pPr/>
+      <w:r>
+        <w:rPr/>
+        <w:t xml:space="preserve">The distinction between a sourced definition and the study's application is important. For example, W3C PROV defines provenance generally, while this study applies that concept to source, processing and integration provenance; NIST defines telemetry around remote measurement transmission, while the paper does not call static model metadata telemetry. Likewise, a source-code method named </w:t>
+      </w:r>
+      <w:r>
+        <w:rPr>
+          <w:rFonts w:ascii="DejaVu Sans Mono" w:hAnsi="DejaVu Sans Mono"/>
+          <w:sz w:val="19"/>
+        </w:rPr>
+        <w:t>calibrated_value</w:t>
+      </w:r>
+      <w:r>
+        <w:rPr/>
+        <w:t xml:space="preserve"> is not treated as proof of calibration in the metrological sense.</w:t>
+      </w:r>
+    </w:p>
+    <w:tbl>
+      <w:tblPr>
+        <w:tblW w:type="auto" w:w="0"/>
+        <w:jc w:val="center"/>
+        <w:tblLayout w:type="fixed"/>
+        <w:tblLook w:firstColumn="1" w:firstRow="1" w:lastColumn="0" w:lastRow="0" w:noHBand="0" w:noVBand="1" w:val="04A0"/>
+      </w:tblPr>
+      <w:tblGrid>
+        <w:gridCol w:w="2232"/>
+        <w:gridCol w:w="3312"/>
+        <w:gridCol w:w="4248"/>
+      </w:tblGrid>
+      <w:tr>
+        <w:trPr>
+          <w:cantSplit/>
+          <w:tblHeader/>
+        </w:trPr>
+        <w:tc>
+          <w:tcPr>
+            <w:tcW w:type="dxa" w:w="2232"/>
+            <w:vAlign w:val="center"/>
+            <w:tcBorders>
+              <w:top w:val="single" w:sz="4" w:color="D9D9D9"/>
+              <w:left w:val="single" w:sz="4" w:color="D9D9D9"/>
+              <w:bottom w:val="single" w:sz="4" w:color="D9D9D9"/>
+              <w:right w:val="single" w:sz="4" w:color="D9D9D9"/>
+            </w:tcBorders>
+            <w:tcMar>
+              <w:top w:w="90" w:type="dxa"/>
+              <w:left w:w="90" w:type="dxa"/>
+              <w:bottom w:w="90" w:type="dxa"/>
+              <w:right w:w="90" w:type="dxa"/>
+            </w:tcMar>
+            <w:shd w:fill="E8E8E8"/>
+          </w:tcPr>
+          <w:p>
+            <w:pPr>
+              <w:spacing w:after="40" w:line="247" w:lineRule="auto"/>
+            </w:pPr>
+            <w:r>
+              <w:rPr>
+                <w:b/>
+                <w:sz w:val="20"/>
+              </w:rPr>
+              <w:t>Term</w:t>
+            </w:r>
+          </w:p>
+        </w:tc>
+        <w:tc>
+          <w:tcPr>
+            <w:tcW w:type="dxa" w:w="3312"/>
+            <w:vAlign w:val="center"/>
+            <w:tcBorders>
+              <w:top w:val="single" w:sz="4" w:color="D9D9D9"/>
+              <w:left w:val="single" w:sz="4" w:color="D9D9D9"/>
+              <w:bottom w:val="single" w:sz="4" w:color="D9D9D9"/>
+              <w:right w:val="single" w:sz="4" w:color="D9D9D9"/>
+            </w:tcBorders>
+            <w:tcMar>
+              <w:top w:w="90" w:type="dxa"/>
+              <w:left w:w="90" w:type="dxa"/>
+              <w:bottom w:w="90" w:type="dxa"/>
+              <w:right w:w="90" w:type="dxa"/>
+            </w:tcMar>
+            <w:shd w:fill="E8E8E8"/>
+          </w:tcPr>
+          <w:p>
+            <w:pPr>
+              <w:spacing w:after="40" w:line="247" w:lineRule="auto"/>
+            </w:pPr>
+            <w:r>
+              <w:rPr>
+                <w:b/>
+                <w:sz w:val="20"/>
+              </w:rPr>
+              <w:t>Sourced definition or basis</w:t>
+            </w:r>
+          </w:p>
+        </w:tc>
+        <w:tc>
+          <w:tcPr>
+            <w:tcW w:type="dxa" w:w="4248"/>
+            <w:vAlign w:val="center"/>
+            <w:tcBorders>
+              <w:top w:val="single" w:sz="4" w:color="D9D9D9"/>
+              <w:left w:val="single" w:sz="4" w:color="D9D9D9"/>
+              <w:bottom w:val="single" w:sz="4" w:color="D9D9D9"/>
+              <w:right w:val="single" w:sz="4" w:color="D9D9D9"/>
+            </w:tcBorders>
+            <w:tcMar>
+              <w:top w:w="90" w:type="dxa"/>
+              <w:left w:w="90" w:type="dxa"/>
+              <w:bottom w:w="90" w:type="dxa"/>
+              <w:right w:w="90" w:type="dxa"/>
+            </w:tcMar>
+            <w:shd w:fill="E8E8E8"/>
+          </w:tcPr>
+          <w:p>
+            <w:pPr>
+              <w:spacing w:after="40" w:line="247" w:lineRule="auto"/>
+            </w:pPr>
+            <w:r>
+              <w:rPr>
+                <w:b/>
+                <w:sz w:val="20"/>
+              </w:rPr>
+              <w:t>Meaning used in this study</w:t>
+            </w:r>
+          </w:p>
+        </w:tc>
+      </w:tr>
+      <w:tr>
+        <w:trPr>
+          <w:cantSplit/>
+        </w:trPr>
+        <w:tc>
+          <w:tcPr>
+            <w:tcW w:type="dxa" w:w="2232"/>
+            <w:vAlign w:val="center"/>
+            <w:tcBorders>
+              <w:top w:val="single" w:sz="4" w:color="D9D9D9"/>
+              <w:left w:val="single" w:sz="4" w:color="D9D9D9"/>
+              <w:bottom w:val="single" w:sz="4" w:color="D9D9D9"/>
+              <w:right w:val="single" w:sz="4" w:color="D9D9D9"/>
+            </w:tcBorders>
+            <w:tcMar>
+              <w:top w:w="90" w:type="dxa"/>
+              <w:left w:w="90" w:type="dxa"/>
+              <w:bottom w:w="90" w:type="dxa"/>
+              <w:right w:w="90" w:type="dxa"/>
+            </w:tcMar>
+            <w:shd w:fill="FFFFFF"/>
+          </w:tcPr>
+          <w:p>
+            <w:pPr>
+              <w:spacing w:after="40" w:line="247" w:lineRule="auto"/>
+            </w:pPr>
+            <w:r>
+              <w:rPr>
+                <w:b/>
+                <w:sz w:val="20"/>
+              </w:rPr>
+              <w:t>Telemetry</w:t>
+            </w:r>
+          </w:p>
+        </w:tc>
+        <w:tc>
+          <w:tcPr>
+            <w:tcW w:type="dxa" w:w="3312"/>
+            <w:vAlign w:val="center"/>
+            <w:tcBorders>
+              <w:top w:val="single" w:sz="4" w:color="D9D9D9"/>
+              <w:left w:val="single" w:sz="4" w:color="D9D9D9"/>
+              <w:bottom w:val="single" w:sz="4" w:color="D9D9D9"/>
+              <w:right w:val="single" w:sz="4" w:color="D9D9D9"/>
+            </w:tcBorders>
+            <w:tcMar>
+              <w:top w:w="90" w:type="dxa"/>
+              <w:left w:w="90" w:type="dxa"/>
+              <w:bottom w:w="90" w:type="dxa"/>
+              <w:right w:w="90" w:type="dxa"/>
+            </w:tcMar>
+            <w:shd w:fill="FFFFFF"/>
+          </w:tcPr>
+          <w:p>
+            <w:pPr>
+              <w:spacing w:after="40" w:line="247" w:lineRule="auto"/>
+            </w:pPr>
+            <w:r>
+              <w:rPr>
+                <w:sz w:val="20"/>
+              </w:rPr>
+              <w:t>NIST defines telemetry as measuring one or more quantities, transmitting the results to a distant station, and interpreting, indicating or recording what was measured (Scholl and Suloway 2023).</w:t>
+            </w:r>
+          </w:p>
+        </w:tc>
+        <w:tc>
+          <w:tcPr>
+            <w:tcW w:type="dxa" w:w="4248"/>
+            <w:vAlign w:val="center"/>
+            <w:tcBorders>
+              <w:top w:val="single" w:sz="4" w:color="D9D9D9"/>
+              <w:left w:val="single" w:sz="4" w:color="D9D9D9"/>
+              <w:bottom w:val="single" w:sz="4" w:color="D9D9D9"/>
+              <w:right w:val="single" w:sz="4" w:color="D9D9D9"/>
+            </w:tcBorders>
+            <w:tcMar>
+              <w:top w:w="90" w:type="dxa"/>
+              <w:left w:w="90" w:type="dxa"/>
+              <w:bottom w:w="90" w:type="dxa"/>
+              <w:right w:w="90" w:type="dxa"/>
+            </w:tcMar>
+            <w:shd w:fill="FFFFFF"/>
+          </w:tcPr>
+          <w:p>
+            <w:pPr>
+              <w:spacing w:after="40" w:line="247" w:lineRule="auto"/>
+            </w:pPr>
+            <w:r>
+              <w:rPr>
+                <w:sz w:val="20"/>
+              </w:rPr>
+              <w:t>Remotely transmitted environmental readings and system-related measurement/status reports can be called telemetry. Static catalogue/model metadata, identifiers and documentation are not telemetry merely because they arrive through an API.</w:t>
+            </w:r>
+          </w:p>
+        </w:tc>
+      </w:tr>
+      <w:tr>
+        <w:trPr>
+          <w:cantSplit/>
+        </w:trPr>
+        <w:tc>
+          <w:tcPr>
+            <w:tcW w:type="dxa" w:w="2232"/>
+            <w:vAlign w:val="center"/>
+            <w:tcBorders>
+              <w:top w:val="single" w:sz="4" w:color="D9D9D9"/>
+              <w:left w:val="single" w:sz="4" w:color="D9D9D9"/>
+              <w:bottom w:val="single" w:sz="4" w:color="D9D9D9"/>
+              <w:right w:val="single" w:sz="4" w:color="D9D9D9"/>
+            </w:tcBorders>
+            <w:tcMar>
+              <w:top w:w="90" w:type="dxa"/>
+              <w:left w:w="90" w:type="dxa"/>
+              <w:bottom w:w="90" w:type="dxa"/>
+              <w:right w:w="90" w:type="dxa"/>
+            </w:tcMar>
+            <w:shd w:fill="F7F7F7"/>
+          </w:tcPr>
+          <w:p>
+            <w:pPr>
+              <w:spacing w:after="40" w:line="247" w:lineRule="auto"/>
+            </w:pPr>
+            <w:r>
+              <w:rPr>
+                <w:b/>
+                <w:sz w:val="20"/>
+              </w:rPr>
+              <w:t>Provenance</w:t>
+            </w:r>
+          </w:p>
+        </w:tc>
+        <w:tc>
+          <w:tcPr>
+            <w:tcW w:type="dxa" w:w="3312"/>
+            <w:vAlign w:val="center"/>
+            <w:tcBorders>
+              <w:top w:val="single" w:sz="4" w:color="D9D9D9"/>
+              <w:left w:val="single" w:sz="4" w:color="D9D9D9"/>
+              <w:bottom w:val="single" w:sz="4" w:color="D9D9D9"/>
+              <w:right w:val="single" w:sz="4" w:color="D9D9D9"/>
+            </w:tcBorders>
+            <w:tcMar>
+              <w:top w:w="90" w:type="dxa"/>
+              <w:left w:w="90" w:type="dxa"/>
+              <w:bottom w:w="90" w:type="dxa"/>
+              <w:right w:w="90" w:type="dxa"/>
+            </w:tcMar>
+            <w:shd w:fill="F7F7F7"/>
+          </w:tcPr>
+          <w:p>
+            <w:pPr>
+              <w:spacing w:after="40" w:line="247" w:lineRule="auto"/>
+            </w:pPr>
+            <w:r>
+              <w:rPr>
+                <w:sz w:val="20"/>
+              </w:rPr>
+              <w:t>W3C PROV describes provenance as information about entities, activities and people/agents involved in producing data or another thing, supporting assessments of quality, reliability or trustworthiness (World Wide Web Consortium 2013).</w:t>
+            </w:r>
+          </w:p>
+        </w:tc>
+        <w:tc>
+          <w:tcPr>
+            <w:tcW w:type="dxa" w:w="4248"/>
+            <w:vAlign w:val="center"/>
+            <w:tcBorders>
+              <w:top w:val="single" w:sz="4" w:color="D9D9D9"/>
+              <w:left w:val="single" w:sz="4" w:color="D9D9D9"/>
+              <w:bottom w:val="single" w:sz="4" w:color="D9D9D9"/>
+              <w:right w:val="single" w:sz="4" w:color="D9D9D9"/>
+            </w:tcBorders>
+            <w:tcMar>
+              <w:top w:w="90" w:type="dxa"/>
+              <w:left w:w="90" w:type="dxa"/>
+              <w:bottom w:w="90" w:type="dxa"/>
+              <w:right w:w="90" w:type="dxa"/>
+            </w:tcMar>
+            <w:shd w:fill="F7F7F7"/>
+          </w:tcPr>
+          <w:p>
+            <w:pPr>
+              <w:spacing w:after="40" w:line="247" w:lineRule="auto"/>
+            </w:pPr>
+            <w:r>
+              <w:rPr>
+                <w:b/>
+                <w:sz w:val="20"/>
+              </w:rPr>
+              <w:t>Source provenance</w:t>
+            </w:r>
+            <w:r>
+              <w:rPr>
+                <w:sz w:val="20"/>
+              </w:rPr>
+              <w:t xml:space="preserve"> records where source assertions came from; </w:t>
+            </w:r>
+            <w:r>
+              <w:rPr>
+                <w:b/>
+                <w:sz w:val="20"/>
+              </w:rPr>
+              <w:t>processing provenance</w:t>
+            </w:r>
+            <w:r>
+              <w:rPr>
+                <w:sz w:val="20"/>
+              </w:rPr>
+              <w:t xml:space="preserve"> records transformations such as Smart Citizen/Kairos aggregation; </w:t>
+            </w:r>
+            <w:r>
+              <w:rPr>
+                <w:b/>
+                <w:sz w:val="20"/>
+              </w:rPr>
+              <w:t>integration provenance</w:t>
+            </w:r>
+            <w:r>
+              <w:rPr>
+                <w:sz w:val="20"/>
+              </w:rPr>
+              <w:t xml:space="preserve"> records adapter/server/client acquisition and transformation steps. Rights/licensing metadata can accompany provenance but is not itself the same concept.</w:t>
+            </w:r>
+          </w:p>
+        </w:tc>
+      </w:tr>
+      <w:tr>
+        <w:trPr>
+          <w:cantSplit/>
+        </w:trPr>
+        <w:tc>
+          <w:tcPr>
+            <w:tcW w:type="dxa" w:w="2232"/>
+            <w:vAlign w:val="center"/>
+            <w:tcBorders>
+              <w:top w:val="single" w:sz="4" w:color="D9D9D9"/>
+              <w:left w:val="single" w:sz="4" w:color="D9D9D9"/>
+              <w:bottom w:val="single" w:sz="4" w:color="D9D9D9"/>
+              <w:right w:val="single" w:sz="4" w:color="D9D9D9"/>
+            </w:tcBorders>
+            <w:tcMar>
+              <w:top w:w="90" w:type="dxa"/>
+              <w:left w:w="90" w:type="dxa"/>
+              <w:bottom w:w="90" w:type="dxa"/>
+              <w:right w:w="90" w:type="dxa"/>
+            </w:tcMar>
+            <w:shd w:fill="FFFFFF"/>
+          </w:tcPr>
+          <w:p>
+            <w:pPr>
+              <w:spacing w:after="40" w:line="247" w:lineRule="auto"/>
+            </w:pPr>
+            <w:r>
+              <w:rPr>
+                <w:b/>
+                <w:sz w:val="20"/>
+              </w:rPr>
+              <w:t>Measurement</w:t>
+            </w:r>
+          </w:p>
+        </w:tc>
+        <w:tc>
+          <w:tcPr>
+            <w:tcW w:type="dxa" w:w="3312"/>
+            <w:vAlign w:val="center"/>
+            <w:tcBorders>
+              <w:top w:val="single" w:sz="4" w:color="D9D9D9"/>
+              <w:left w:val="single" w:sz="4" w:color="D9D9D9"/>
+              <w:bottom w:val="single" w:sz="4" w:color="D9D9D9"/>
+              <w:right w:val="single" w:sz="4" w:color="D9D9D9"/>
+            </w:tcBorders>
+            <w:tcMar>
+              <w:top w:w="90" w:type="dxa"/>
+              <w:left w:w="90" w:type="dxa"/>
+              <w:bottom w:w="90" w:type="dxa"/>
+              <w:right w:w="90" w:type="dxa"/>
+            </w:tcMar>
+            <w:shd w:fill="FFFFFF"/>
+          </w:tcPr>
+          <w:p>
+            <w:pPr>
+              <w:spacing w:after="40" w:line="247" w:lineRule="auto"/>
+            </w:pPr>
+            <w:r>
+              <w:rPr>
+                <w:sz w:val="20"/>
+              </w:rPr>
+              <w:t>VIM 3 defines measurement as the process of experimentally obtaining one or more quantity values reasonably attributable to a quantity (Joint Committee for Guides in Metrology 2012, sec. 2.1).</w:t>
+            </w:r>
+          </w:p>
+        </w:tc>
+        <w:tc>
+          <w:tcPr>
+            <w:tcW w:type="dxa" w:w="4248"/>
+            <w:vAlign w:val="center"/>
+            <w:tcBorders>
+              <w:top w:val="single" w:sz="4" w:color="D9D9D9"/>
+              <w:left w:val="single" w:sz="4" w:color="D9D9D9"/>
+              <w:bottom w:val="single" w:sz="4" w:color="D9D9D9"/>
+              <w:right w:val="single" w:sz="4" w:color="D9D9D9"/>
+            </w:tcBorders>
+            <w:tcMar>
+              <w:top w:w="90" w:type="dxa"/>
+              <w:left w:w="90" w:type="dxa"/>
+              <w:bottom w:w="90" w:type="dxa"/>
+              <w:right w:w="90" w:type="dxa"/>
+            </w:tcMar>
+            <w:shd w:fill="FFFFFF"/>
+          </w:tcPr>
+          <w:p>
+            <w:pPr>
+              <w:spacing w:after="40" w:line="247" w:lineRule="auto"/>
+            </w:pPr>
+            <w:r>
+              <w:rPr>
+                <w:sz w:val="20"/>
+              </w:rPr>
+              <w:t>When quoting Smart Citizen, “measurement” may also denote the source platform's Measurement vocabulary resource. The study does not infer uncertainty, accuracy or formal calibration merely because the source uses the word measurement.</w:t>
+            </w:r>
+          </w:p>
+        </w:tc>
+      </w:tr>
+      <w:tr>
+        <w:trPr>
+          <w:cantSplit/>
+        </w:trPr>
+        <w:tc>
+          <w:tcPr>
+            <w:tcW w:type="dxa" w:w="2232"/>
+            <w:vAlign w:val="center"/>
+            <w:tcBorders>
+              <w:top w:val="single" w:sz="4" w:color="D9D9D9"/>
+              <w:left w:val="single" w:sz="4" w:color="D9D9D9"/>
+              <w:bottom w:val="single" w:sz="4" w:color="D9D9D9"/>
+              <w:right w:val="single" w:sz="4" w:color="D9D9D9"/>
+            </w:tcBorders>
+            <w:tcMar>
+              <w:top w:w="90" w:type="dxa"/>
+              <w:left w:w="90" w:type="dxa"/>
+              <w:bottom w:w="90" w:type="dxa"/>
+              <w:right w:w="90" w:type="dxa"/>
+            </w:tcMar>
+            <w:shd w:fill="F7F7F7"/>
+          </w:tcPr>
+          <w:p>
+            <w:pPr>
+              <w:spacing w:after="40" w:line="247" w:lineRule="auto"/>
+            </w:pPr>
+            <w:r>
+              <w:rPr>
+                <w:b/>
+                <w:sz w:val="20"/>
+              </w:rPr>
+              <w:t>Calibration</w:t>
+            </w:r>
+          </w:p>
+        </w:tc>
+        <w:tc>
+          <w:tcPr>
+            <w:tcW w:type="dxa" w:w="3312"/>
+            <w:vAlign w:val="center"/>
+            <w:tcBorders>
+              <w:top w:val="single" w:sz="4" w:color="D9D9D9"/>
+              <w:left w:val="single" w:sz="4" w:color="D9D9D9"/>
+              <w:bottom w:val="single" w:sz="4" w:color="D9D9D9"/>
+              <w:right w:val="single" w:sz="4" w:color="D9D9D9"/>
+            </w:tcBorders>
+            <w:tcMar>
+              <w:top w:w="90" w:type="dxa"/>
+              <w:left w:w="90" w:type="dxa"/>
+              <w:bottom w:w="90" w:type="dxa"/>
+              <w:right w:w="90" w:type="dxa"/>
+            </w:tcMar>
+            <w:shd w:fill="F7F7F7"/>
+          </w:tcPr>
+          <w:p>
+            <w:pPr>
+              <w:spacing w:after="40" w:line="247" w:lineRule="auto"/>
+            </w:pPr>
+            <w:r>
+              <w:rPr>
+                <w:sz w:val="20"/>
+              </w:rPr>
+              <w:t>VIM 3 defines calibration as an operation that first relates standards and indications with their uncertainties and then uses that relationship to obtain a measurement result (Joint Committee for Guides in Metrology 2012, sec. 2.39).</w:t>
+            </w:r>
+          </w:p>
+        </w:tc>
+        <w:tc>
+          <w:tcPr>
+            <w:tcW w:type="dxa" w:w="4248"/>
+            <w:vAlign w:val="center"/>
+            <w:tcBorders>
+              <w:top w:val="single" w:sz="4" w:color="D9D9D9"/>
+              <w:left w:val="single" w:sz="4" w:color="D9D9D9"/>
+              <w:bottom w:val="single" w:sz="4" w:color="D9D9D9"/>
+              <w:right w:val="single" w:sz="4" w:color="D9D9D9"/>
+            </w:tcBorders>
+            <w:tcMar>
+              <w:top w:w="90" w:type="dxa"/>
+              <w:left w:w="90" w:type="dxa"/>
+              <w:bottom w:w="90" w:type="dxa"/>
+              <w:right w:w="90" w:type="dxa"/>
+            </w:tcMar>
+            <w:shd w:fill="F7F7F7"/>
+          </w:tcPr>
+          <w:p>
+            <w:pPr>
+              <w:spacing w:after="40" w:line="247" w:lineRule="auto"/>
+            </w:pPr>
+            <w:r>
+              <w:rPr>
+                <w:sz w:val="20"/>
+              </w:rPr>
+              <w:t xml:space="preserve">The paper reserves formal calibration claims for evidence satisfying that meaning. The Smart Citizen source-code method name </w:t>
+            </w:r>
+            <w:r>
+              <w:rPr>
+                <w:rFonts w:ascii="DejaVu Sans Mono" w:hAnsi="DejaVu Sans Mono"/>
+                <w:sz w:val="20"/>
+              </w:rPr>
+              <w:t>calibrated_value</w:t>
+            </w:r>
+            <w:r>
+              <w:rPr>
+                <w:sz w:val="20"/>
+              </w:rPr>
+              <w:t xml:space="preserve"> is quoted as implementation terminology only.</w:t>
+            </w:r>
+          </w:p>
+        </w:tc>
+      </w:tr>
+      <w:tr>
+        <w:trPr>
+          <w:cantSplit/>
+        </w:trPr>
+        <w:tc>
+          <w:tcPr>
+            <w:tcW w:type="dxa" w:w="2232"/>
+            <w:vAlign w:val="center"/>
+            <w:tcBorders>
+              <w:top w:val="single" w:sz="4" w:color="D9D9D9"/>
+              <w:left w:val="single" w:sz="4" w:color="D9D9D9"/>
+              <w:bottom w:val="single" w:sz="4" w:color="D9D9D9"/>
+              <w:right w:val="single" w:sz="4" w:color="D9D9D9"/>
+            </w:tcBorders>
+            <w:tcMar>
+              <w:top w:w="90" w:type="dxa"/>
+              <w:left w:w="90" w:type="dxa"/>
+              <w:bottom w:w="90" w:type="dxa"/>
+              <w:right w:w="90" w:type="dxa"/>
+            </w:tcMar>
+            <w:shd w:fill="FFFFFF"/>
+          </w:tcPr>
+          <w:p>
+            <w:pPr>
+              <w:spacing w:after="40" w:line="247" w:lineRule="auto"/>
+            </w:pPr>
+            <w:r>
+              <w:rPr>
+                <w:b/>
+                <w:sz w:val="20"/>
+              </w:rPr>
+              <w:t>System / Procedure</w:t>
+            </w:r>
+          </w:p>
+        </w:tc>
+        <w:tc>
+          <w:tcPr>
+            <w:tcW w:type="dxa" w:w="3312"/>
+            <w:vAlign w:val="center"/>
+            <w:tcBorders>
+              <w:top w:val="single" w:sz="4" w:color="D9D9D9"/>
+              <w:left w:val="single" w:sz="4" w:color="D9D9D9"/>
+              <w:bottom w:val="single" w:sz="4" w:color="D9D9D9"/>
+              <w:right w:val="single" w:sz="4" w:color="D9D9D9"/>
+            </w:tcBorders>
+            <w:tcMar>
+              <w:top w:w="90" w:type="dxa"/>
+              <w:left w:w="90" w:type="dxa"/>
+              <w:bottom w:w="90" w:type="dxa"/>
+              <w:right w:w="90" w:type="dxa"/>
+            </w:tcMar>
+            <w:shd w:fill="FFFFFF"/>
+          </w:tcPr>
+          <w:p>
+            <w:pPr>
+              <w:spacing w:after="40" w:line="247" w:lineRule="auto"/>
+            </w:pPr>
+            <w:r>
+              <w:rPr>
+                <w:sz w:val="20"/>
+              </w:rPr>
+              <w:t xml:space="preserve">CSAPI uses </w:t>
+            </w:r>
+            <w:r>
+              <w:rPr>
+                <w:b/>
+                <w:sz w:val="20"/>
+              </w:rPr>
+              <w:t>System</w:t>
+            </w:r>
+            <w:r>
+              <w:rPr>
+                <w:sz w:val="20"/>
+              </w:rPr>
+              <w:t xml:space="preserve"> for an instance of infrastructure implementing Procedures and </w:t>
+            </w:r>
+            <w:r>
+              <w:rPr>
+                <w:b/>
+                <w:sz w:val="20"/>
+              </w:rPr>
+              <w:t>Procedure</w:t>
+            </w:r>
+            <w:r>
+              <w:rPr>
+                <w:sz w:val="20"/>
+              </w:rPr>
+              <w:t xml:space="preserve"> for a datasheet or methodology that can be implemented by multiple System instances (Open Geospatial Consortium 2025a, secs. 9, 13).</w:t>
+            </w:r>
+          </w:p>
+        </w:tc>
+        <w:tc>
+          <w:tcPr>
+            <w:tcW w:type="dxa" w:w="4248"/>
+            <w:vAlign w:val="center"/>
+            <w:tcBorders>
+              <w:top w:val="single" w:sz="4" w:color="D9D9D9"/>
+              <w:left w:val="single" w:sz="4" w:color="D9D9D9"/>
+              <w:bottom w:val="single" w:sz="4" w:color="D9D9D9"/>
+              <w:right w:val="single" w:sz="4" w:color="D9D9D9"/>
+            </w:tcBorders>
+            <w:tcMar>
+              <w:top w:w="90" w:type="dxa"/>
+              <w:left w:w="90" w:type="dxa"/>
+              <w:bottom w:w="90" w:type="dxa"/>
+              <w:right w:w="90" w:type="dxa"/>
+            </w:tcMar>
+            <w:shd w:fill="FFFFFF"/>
+          </w:tcPr>
+          <w:p>
+            <w:pPr>
+              <w:spacing w:after="40" w:line="247" w:lineRule="auto"/>
+            </w:pPr>
+            <w:r>
+              <w:rPr>
+                <w:sz w:val="20"/>
+              </w:rPr>
+              <w:t>The represented SCK instance is distinct from the reusable SCK2.3 model description. Source-platform processing may also be represented as a process System with an associated Procedure when evidence supports that role.</w:t>
+            </w:r>
+          </w:p>
+        </w:tc>
+      </w:tr>
+      <w:tr>
+        <w:trPr>
+          <w:cantSplit/>
+        </w:trPr>
+        <w:tc>
+          <w:tcPr>
+            <w:tcW w:type="dxa" w:w="2232"/>
+            <w:vAlign w:val="center"/>
+            <w:tcBorders>
+              <w:top w:val="single" w:sz="4" w:color="D9D9D9"/>
+              <w:left w:val="single" w:sz="4" w:color="D9D9D9"/>
+              <w:bottom w:val="single" w:sz="4" w:color="D9D9D9"/>
+              <w:right w:val="single" w:sz="4" w:color="D9D9D9"/>
+            </w:tcBorders>
+            <w:tcMar>
+              <w:top w:w="90" w:type="dxa"/>
+              <w:left w:w="90" w:type="dxa"/>
+              <w:bottom w:w="90" w:type="dxa"/>
+              <w:right w:w="90" w:type="dxa"/>
+            </w:tcMar>
+            <w:shd w:fill="F7F7F7"/>
+          </w:tcPr>
+          <w:p>
+            <w:pPr>
+              <w:spacing w:after="40" w:line="247" w:lineRule="auto"/>
+            </w:pPr>
+            <w:r>
+              <w:rPr>
+                <w:b/>
+                <w:sz w:val="20"/>
+              </w:rPr>
+              <w:t>Observation</w:t>
+            </w:r>
+          </w:p>
+        </w:tc>
+        <w:tc>
+          <w:tcPr>
+            <w:tcW w:type="dxa" w:w="3312"/>
+            <w:vAlign w:val="center"/>
+            <w:tcBorders>
+              <w:top w:val="single" w:sz="4" w:color="D9D9D9"/>
+              <w:left w:val="single" w:sz="4" w:color="D9D9D9"/>
+              <w:bottom w:val="single" w:sz="4" w:color="D9D9D9"/>
+              <w:right w:val="single" w:sz="4" w:color="D9D9D9"/>
+            </w:tcBorders>
+            <w:tcMar>
+              <w:top w:w="90" w:type="dxa"/>
+              <w:left w:w="90" w:type="dxa"/>
+              <w:bottom w:w="90" w:type="dxa"/>
+              <w:right w:w="90" w:type="dxa"/>
+            </w:tcMar>
+            <w:shd w:fill="F7F7F7"/>
+          </w:tcPr>
+          <w:p>
+            <w:pPr>
+              <w:spacing w:after="40" w:line="247" w:lineRule="auto"/>
+            </w:pPr>
+            <w:r>
+              <w:rPr>
+                <w:sz w:val="20"/>
+              </w:rPr>
+              <w:t>CSAPI Observation implements the SOSA Observation concept and carries a result plus required phenomenonTime/resultTime, within a DataStream (Open Geospatial Consortium 2025b, sec. 9.7).</w:t>
+            </w:r>
+          </w:p>
+        </w:tc>
+        <w:tc>
+          <w:tcPr>
+            <w:tcW w:type="dxa" w:w="4248"/>
+            <w:vAlign w:val="center"/>
+            <w:tcBorders>
+              <w:top w:val="single" w:sz="4" w:color="D9D9D9"/>
+              <w:left w:val="single" w:sz="4" w:color="D9D9D9"/>
+              <w:bottom w:val="single" w:sz="4" w:color="D9D9D9"/>
+              <w:right w:val="single" w:sz="4" w:color="D9D9D9"/>
+            </w:tcBorders>
+            <w:tcMar>
+              <w:top w:w="90" w:type="dxa"/>
+              <w:left w:w="90" w:type="dxa"/>
+              <w:bottom w:w="90" w:type="dxa"/>
+              <w:right w:w="90" w:type="dxa"/>
+            </w:tcMar>
+            <w:shd w:fill="F7F7F7"/>
+          </w:tcPr>
+          <w:p>
+            <w:pPr>
+              <w:spacing w:after="40" w:line="247" w:lineRule="auto"/>
+            </w:pPr>
+            <w:r>
+              <w:rPr>
+                <w:sz w:val="20"/>
+              </w:rPr>
+              <w:t>A reading or derived result is not interchangeable with the System, observed property or observed subject.</w:t>
+            </w:r>
+          </w:p>
+        </w:tc>
+      </w:tr>
+      <w:tr>
+        <w:trPr>
+          <w:cantSplit/>
+        </w:trPr>
+        <w:tc>
+          <w:tcPr>
+            <w:tcW w:type="dxa" w:w="2232"/>
+            <w:vAlign w:val="center"/>
+            <w:tcBorders>
+              <w:top w:val="single" w:sz="4" w:color="D9D9D9"/>
+              <w:left w:val="single" w:sz="4" w:color="D9D9D9"/>
+              <w:bottom w:val="single" w:sz="4" w:color="D9D9D9"/>
+              <w:right w:val="single" w:sz="4" w:color="D9D9D9"/>
+            </w:tcBorders>
+            <w:tcMar>
+              <w:top w:w="90" w:type="dxa"/>
+              <w:left w:w="90" w:type="dxa"/>
+              <w:bottom w:w="90" w:type="dxa"/>
+              <w:right w:w="90" w:type="dxa"/>
+            </w:tcMar>
+            <w:shd w:fill="FFFFFF"/>
+          </w:tcPr>
+          <w:p>
+            <w:pPr>
+              <w:spacing w:after="40" w:line="247" w:lineRule="auto"/>
+            </w:pPr>
+            <w:r>
+              <w:rPr>
+                <w:b/>
+                <w:sz w:val="20"/>
+              </w:rPr>
+              <w:t>Feature of Interest / Sampling Feature</w:t>
+            </w:r>
+          </w:p>
+        </w:tc>
+        <w:tc>
+          <w:tcPr>
+            <w:tcW w:type="dxa" w:w="3312"/>
+            <w:vAlign w:val="center"/>
+            <w:tcBorders>
+              <w:top w:val="single" w:sz="4" w:color="D9D9D9"/>
+              <w:left w:val="single" w:sz="4" w:color="D9D9D9"/>
+              <w:bottom w:val="single" w:sz="4" w:color="D9D9D9"/>
+              <w:right w:val="single" w:sz="4" w:color="D9D9D9"/>
+            </w:tcBorders>
+            <w:tcMar>
+              <w:top w:w="90" w:type="dxa"/>
+              <w:left w:w="90" w:type="dxa"/>
+              <w:bottom w:w="90" w:type="dxa"/>
+              <w:right w:w="90" w:type="dxa"/>
+            </w:tcMar>
+            <w:shd w:fill="FFFFFF"/>
+          </w:tcPr>
+          <w:p>
+            <w:pPr>
+              <w:spacing w:after="40" w:line="247" w:lineRule="auto"/>
+            </w:pPr>
+            <w:r>
+              <w:rPr>
+                <w:sz w:val="20"/>
+              </w:rPr>
+              <w:t>CSAPI calls the real-world domain feature whose properties are ultimately observed the Feature of Interest; a Sampling Feature represents the subset/sample on which observations are actually made (Open Geospatial Consortium 2025a, sec. 14).</w:t>
+            </w:r>
+          </w:p>
+        </w:tc>
+        <w:tc>
+          <w:tcPr>
+            <w:tcW w:type="dxa" w:w="4248"/>
+            <w:vAlign w:val="center"/>
+            <w:tcBorders>
+              <w:top w:val="single" w:sz="4" w:color="D9D9D9"/>
+              <w:left w:val="single" w:sz="4" w:color="D9D9D9"/>
+              <w:bottom w:val="single" w:sz="4" w:color="D9D9D9"/>
+              <w:right w:val="single" w:sz="4" w:color="D9D9D9"/>
+            </w:tcBorders>
+            <w:tcMar>
+              <w:top w:w="90" w:type="dxa"/>
+              <w:left w:w="90" w:type="dxa"/>
+              <w:bottom w:w="90" w:type="dxa"/>
+              <w:right w:w="90" w:type="dxa"/>
+            </w:tcMar>
+            <w:shd w:fill="FFFFFF"/>
+          </w:tcPr>
+          <w:p>
+            <w:pPr>
+              <w:spacing w:after="40" w:line="247" w:lineRule="auto"/>
+            </w:pPr>
+            <w:r>
+              <w:rPr>
+                <w:sz w:val="20"/>
+              </w:rPr>
+              <w:t>The kit is not automatically the observed environmental subject. If the source does not identify a defensible Sampling Feature, the study leaves that association absent rather than inventing one.</w:t>
+            </w:r>
+          </w:p>
+        </w:tc>
+      </w:tr>
+      <w:tr>
+        <w:trPr>
+          <w:cantSplit/>
+        </w:trPr>
+        <w:tc>
+          <w:tcPr>
+            <w:tcW w:type="dxa" w:w="2232"/>
+            <w:vAlign w:val="center"/>
+            <w:tcBorders>
+              <w:top w:val="single" w:sz="4" w:color="D9D9D9"/>
+              <w:left w:val="single" w:sz="4" w:color="D9D9D9"/>
+              <w:bottom w:val="single" w:sz="4" w:color="D9D9D9"/>
+              <w:right w:val="single" w:sz="4" w:color="D9D9D9"/>
+            </w:tcBorders>
+            <w:tcMar>
+              <w:top w:w="90" w:type="dxa"/>
+              <w:left w:w="90" w:type="dxa"/>
+              <w:bottom w:w="90" w:type="dxa"/>
+              <w:right w:w="90" w:type="dxa"/>
+            </w:tcMar>
+            <w:shd w:fill="F7F7F7"/>
+          </w:tcPr>
+          <w:p>
+            <w:pPr>
+              <w:spacing w:after="40" w:line="247" w:lineRule="auto"/>
+            </w:pPr>
+            <w:r>
+              <w:rPr>
+                <w:b/>
+                <w:sz w:val="20"/>
+              </w:rPr>
+              <w:t>DataStream</w:t>
+            </w:r>
+          </w:p>
+        </w:tc>
+        <w:tc>
+          <w:tcPr>
+            <w:tcW w:type="dxa" w:w="3312"/>
+            <w:vAlign w:val="center"/>
+            <w:tcBorders>
+              <w:top w:val="single" w:sz="4" w:color="D9D9D9"/>
+              <w:left w:val="single" w:sz="4" w:color="D9D9D9"/>
+              <w:bottom w:val="single" w:sz="4" w:color="D9D9D9"/>
+              <w:right w:val="single" w:sz="4" w:color="D9D9D9"/>
+            </w:tcBorders>
+            <w:tcMar>
+              <w:top w:w="90" w:type="dxa"/>
+              <w:left w:w="90" w:type="dxa"/>
+              <w:bottom w:w="90" w:type="dxa"/>
+              <w:right w:w="90" w:type="dxa"/>
+            </w:tcMar>
+            <w:shd w:fill="F7F7F7"/>
+          </w:tcPr>
+          <w:p>
+            <w:pPr>
+              <w:spacing w:after="40" w:line="247" w:lineRule="auto"/>
+            </w:pPr>
+            <w:r>
+              <w:rPr>
+                <w:sz w:val="20"/>
+              </w:rPr>
+              <w:t xml:space="preserve">CSAPI defines a DataStream as observations acquired by the same System and sharing observed properties; </w:t>
+            </w:r>
+            <w:r>
+              <w:rPr>
+                <w:rFonts w:ascii="DejaVu Sans Mono" w:hAnsi="DejaVu Sans Mono"/>
+                <w:sz w:val="20"/>
+              </w:rPr>
+              <w:t>status</w:t>
+            </w:r>
+            <w:r>
+              <w:rPr>
+                <w:sz w:val="20"/>
+              </w:rPr>
+              <w:t xml:space="preserve"> is for status observations of the parent System/subsystems, while </w:t>
+            </w:r>
+            <w:r>
+              <w:rPr>
+                <w:rFonts w:ascii="DejaVu Sans Mono" w:hAnsi="DejaVu Sans Mono"/>
+                <w:sz w:val="20"/>
+              </w:rPr>
+              <w:t>observation</w:t>
+            </w:r>
+            <w:r>
+              <w:rPr>
+                <w:sz w:val="20"/>
+              </w:rPr>
+              <w:t xml:space="preserve"> is for other features of interest (Open Geospatial Consortium 2025b, secs. 4.7, 9.2).</w:t>
+            </w:r>
+          </w:p>
+        </w:tc>
+        <w:tc>
+          <w:tcPr>
+            <w:tcW w:type="dxa" w:w="4248"/>
+            <w:vAlign w:val="center"/>
+            <w:tcBorders>
+              <w:top w:val="single" w:sz="4" w:color="D9D9D9"/>
+              <w:left w:val="single" w:sz="4" w:color="D9D9D9"/>
+              <w:bottom w:val="single" w:sz="4" w:color="D9D9D9"/>
+              <w:right w:val="single" w:sz="4" w:color="D9D9D9"/>
+            </w:tcBorders>
+            <w:tcMar>
+              <w:top w:w="90" w:type="dxa"/>
+              <w:left w:w="90" w:type="dxa"/>
+              <w:bottom w:w="90" w:type="dxa"/>
+              <w:right w:w="90" w:type="dxa"/>
+            </w:tcMar>
+            <w:shd w:fill="F7F7F7"/>
+          </w:tcPr>
+          <w:p>
+            <w:pPr>
+              <w:spacing w:after="40" w:line="247" w:lineRule="auto"/>
+            </w:pPr>
+            <w:r>
+              <w:rPr>
+                <w:sz w:val="20"/>
+              </w:rPr>
+              <w:t xml:space="preserve">DataStream type is selected only after the observed subject is supported. RSSI therefore remains untyped at the Phase 3 design stage rather than being forced into </w:t>
+            </w:r>
+            <w:r>
+              <w:rPr>
+                <w:rFonts w:ascii="DejaVu Sans Mono" w:hAnsi="DejaVu Sans Mono"/>
+                <w:sz w:val="20"/>
+              </w:rPr>
+              <w:t>status</w:t>
+            </w:r>
+            <w:r>
+              <w:rPr>
+                <w:sz w:val="20"/>
+              </w:rPr>
+              <w:t>.</w:t>
+            </w:r>
+          </w:p>
+        </w:tc>
+      </w:tr>
+      <w:tr>
+        <w:trPr>
+          <w:cantSplit/>
+        </w:trPr>
+        <w:tc>
+          <w:tcPr>
+            <w:tcW w:type="dxa" w:w="2232"/>
+            <w:vAlign w:val="center"/>
+            <w:tcBorders>
+              <w:top w:val="single" w:sz="4" w:color="D9D9D9"/>
+              <w:left w:val="single" w:sz="4" w:color="D9D9D9"/>
+              <w:bottom w:val="single" w:sz="4" w:color="D9D9D9"/>
+              <w:right w:val="single" w:sz="4" w:color="D9D9D9"/>
+            </w:tcBorders>
+            <w:tcMar>
+              <w:top w:w="90" w:type="dxa"/>
+              <w:left w:w="90" w:type="dxa"/>
+              <w:bottom w:w="90" w:type="dxa"/>
+              <w:right w:w="90" w:type="dxa"/>
+            </w:tcMar>
+            <w:shd w:fill="FFFFFF"/>
+          </w:tcPr>
+          <w:p>
+            <w:pPr>
+              <w:spacing w:after="40" w:line="247" w:lineRule="auto"/>
+            </w:pPr>
+            <w:r>
+              <w:rPr>
+                <w:b/>
+                <w:sz w:val="20"/>
+              </w:rPr>
+              <w:t>phenomenonTime / resultTime</w:t>
+            </w:r>
+          </w:p>
+        </w:tc>
+        <w:tc>
+          <w:tcPr>
+            <w:tcW w:type="dxa" w:w="3312"/>
+            <w:vAlign w:val="center"/>
+            <w:tcBorders>
+              <w:top w:val="single" w:sz="4" w:color="D9D9D9"/>
+              <w:left w:val="single" w:sz="4" w:color="D9D9D9"/>
+              <w:bottom w:val="single" w:sz="4" w:color="D9D9D9"/>
+              <w:right w:val="single" w:sz="4" w:color="D9D9D9"/>
+            </w:tcBorders>
+            <w:tcMar>
+              <w:top w:w="90" w:type="dxa"/>
+              <w:left w:w="90" w:type="dxa"/>
+              <w:bottom w:w="90" w:type="dxa"/>
+              <w:right w:w="90" w:type="dxa"/>
+            </w:tcMar>
+            <w:shd w:fill="FFFFFF"/>
+          </w:tcPr>
+          <w:p>
+            <w:pPr>
+              <w:spacing w:after="40" w:line="247" w:lineRule="auto"/>
+            </w:pPr>
+            <w:r>
+              <w:rPr>
+                <w:sz w:val="20"/>
+              </w:rPr>
+              <w:t>CSAPI defines phenomenonTime as the time the observed property value applies to the feature of interest and resultTime as the time the result value was obtained (Open Geospatial Consortium 2025b, sec. 9.7).</w:t>
+            </w:r>
+          </w:p>
+        </w:tc>
+        <w:tc>
+          <w:tcPr>
+            <w:tcW w:type="dxa" w:w="4248"/>
+            <w:vAlign w:val="center"/>
+            <w:tcBorders>
+              <w:top w:val="single" w:sz="4" w:color="D9D9D9"/>
+              <w:left w:val="single" w:sz="4" w:color="D9D9D9"/>
+              <w:bottom w:val="single" w:sz="4" w:color="D9D9D9"/>
+              <w:right w:val="single" w:sz="4" w:color="D9D9D9"/>
+            </w:tcBorders>
+            <w:tcMar>
+              <w:top w:w="90" w:type="dxa"/>
+              <w:left w:w="90" w:type="dxa"/>
+              <w:bottom w:w="90" w:type="dxa"/>
+              <w:right w:w="90" w:type="dxa"/>
+            </w:tcMar>
+            <w:shd w:fill="FFFFFF"/>
+          </w:tcPr>
+          <w:p>
+            <w:pPr>
+              <w:spacing w:after="40" w:line="247" w:lineRule="auto"/>
+            </w:pPr>
+            <w:r>
+              <w:rPr>
+                <w:sz w:val="20"/>
+              </w:rPr>
+              <w:t>Smart Citizen's channel timestamp is preserved as source time and is a candidate phenomenonTime. Experiment acquisition time is not substituted for an unavailable source resultTime.</w:t>
+            </w:r>
+          </w:p>
+        </w:tc>
+      </w:tr>
+      <w:tr>
+        <w:trPr>
+          <w:cantSplit/>
+        </w:trPr>
+        <w:tc>
+          <w:tcPr>
+            <w:tcW w:type="dxa" w:w="2232"/>
+            <w:vAlign w:val="center"/>
+            <w:tcBorders>
+              <w:top w:val="single" w:sz="4" w:color="D9D9D9"/>
+              <w:left w:val="single" w:sz="4" w:color="D9D9D9"/>
+              <w:bottom w:val="single" w:sz="4" w:color="D9D9D9"/>
+              <w:right w:val="single" w:sz="4" w:color="D9D9D9"/>
+            </w:tcBorders>
+            <w:tcMar>
+              <w:top w:w="90" w:type="dxa"/>
+              <w:left w:w="90" w:type="dxa"/>
+              <w:bottom w:w="90" w:type="dxa"/>
+              <w:right w:w="90" w:type="dxa"/>
+            </w:tcMar>
+            <w:shd w:fill="F7F7F7"/>
+          </w:tcPr>
+          <w:p>
+            <w:pPr>
+              <w:spacing w:after="40" w:line="247" w:lineRule="auto"/>
+            </w:pPr>
+            <w:r>
+              <w:rPr>
+                <w:b/>
+                <w:sz w:val="20"/>
+              </w:rPr>
+              <w:t>Registration / Component</w:t>
+            </w:r>
+          </w:p>
+        </w:tc>
+        <w:tc>
+          <w:tcPr>
+            <w:tcW w:type="dxa" w:w="3312"/>
+            <w:vAlign w:val="center"/>
+            <w:tcBorders>
+              <w:top w:val="single" w:sz="4" w:color="D9D9D9"/>
+              <w:left w:val="single" w:sz="4" w:color="D9D9D9"/>
+              <w:bottom w:val="single" w:sz="4" w:color="D9D9D9"/>
+              <w:right w:val="single" w:sz="4" w:color="D9D9D9"/>
+            </w:tcBorders>
+            <w:tcMar>
+              <w:top w:w="90" w:type="dxa"/>
+              <w:left w:w="90" w:type="dxa"/>
+              <w:bottom w:w="90" w:type="dxa"/>
+              <w:right w:w="90" w:type="dxa"/>
+            </w:tcMar>
+            <w:shd w:fill="F7F7F7"/>
+          </w:tcPr>
+          <w:p>
+            <w:pPr>
+              <w:spacing w:after="40" w:line="247" w:lineRule="auto"/>
+            </w:pPr>
+            <w:r>
+              <w:rPr>
+                <w:sz w:val="20"/>
+              </w:rPr>
+              <w:t>Smart Citizen says a real device can be registered multiple times; its Component is the platform join between a Device and a Sensor (Smart Citizen n.d.-d, “Schema” and “Components”).</w:t>
+            </w:r>
+          </w:p>
+        </w:tc>
+        <w:tc>
+          <w:tcPr>
+            <w:tcW w:type="dxa" w:w="4248"/>
+            <w:vAlign w:val="center"/>
+            <w:tcBorders>
+              <w:top w:val="single" w:sz="4" w:color="D9D9D9"/>
+              <w:left w:val="single" w:sz="4" w:color="D9D9D9"/>
+              <w:bottom w:val="single" w:sz="4" w:color="D9D9D9"/>
+              <w:right w:val="single" w:sz="4" w:color="D9D9D9"/>
+            </w:tcBorders>
+            <w:tcMar>
+              <w:top w:w="90" w:type="dxa"/>
+              <w:left w:w="90" w:type="dxa"/>
+              <w:bottom w:w="90" w:type="dxa"/>
+              <w:right w:w="90" w:type="dxa"/>
+            </w:tcMar>
+            <w:shd w:fill="F7F7F7"/>
+          </w:tcPr>
+          <w:p>
+            <w:pPr>
+              <w:spacing w:after="40" w:line="247" w:lineRule="auto"/>
+            </w:pPr>
+            <w:r>
+              <w:rPr>
+                <w:sz w:val="20"/>
+              </w:rPr>
+              <w:t>Registration IDs/UUIDs and Component IDs remain source-platform identities, not manufacturer serials or independently identified physical components.</w:t>
+            </w:r>
+          </w:p>
+        </w:tc>
+      </w:tr>
+      <w:tr>
+        <w:trPr>
+          <w:cantSplit/>
+        </w:trPr>
+        <w:tc>
+          <w:tcPr>
+            <w:tcW w:type="dxa" w:w="2232"/>
+            <w:vAlign w:val="center"/>
+            <w:tcBorders>
+              <w:top w:val="single" w:sz="4" w:color="D9D9D9"/>
+              <w:left w:val="single" w:sz="4" w:color="D9D9D9"/>
+              <w:bottom w:val="single" w:sz="4" w:color="D9D9D9"/>
+              <w:right w:val="single" w:sz="4" w:color="D9D9D9"/>
+            </w:tcBorders>
+            <w:tcMar>
+              <w:top w:w="90" w:type="dxa"/>
+              <w:left w:w="90" w:type="dxa"/>
+              <w:bottom w:w="90" w:type="dxa"/>
+              <w:right w:w="90" w:type="dxa"/>
+            </w:tcMar>
+            <w:shd w:fill="FFFFFF"/>
+          </w:tcPr>
+          <w:p>
+            <w:pPr>
+              <w:spacing w:after="40" w:line="247" w:lineRule="auto"/>
+            </w:pPr>
+            <w:r>
+              <w:rPr>
+                <w:b/>
+                <w:sz w:val="20"/>
+              </w:rPr>
+              <w:t>Aggregation</w:t>
+            </w:r>
+          </w:p>
+        </w:tc>
+        <w:tc>
+          <w:tcPr>
+            <w:tcW w:type="dxa" w:w="3312"/>
+            <w:vAlign w:val="center"/>
+            <w:tcBorders>
+              <w:top w:val="single" w:sz="4" w:color="D9D9D9"/>
+              <w:left w:val="single" w:sz="4" w:color="D9D9D9"/>
+              <w:bottom w:val="single" w:sz="4" w:color="D9D9D9"/>
+              <w:right w:val="single" w:sz="4" w:color="D9D9D9"/>
+            </w:tcBorders>
+            <w:tcMar>
+              <w:top w:w="90" w:type="dxa"/>
+              <w:left w:w="90" w:type="dxa"/>
+              <w:bottom w:w="90" w:type="dxa"/>
+              <w:right w:w="90" w:type="dxa"/>
+            </w:tcMar>
+            <w:shd w:fill="FFFFFF"/>
+          </w:tcPr>
+          <w:p>
+            <w:pPr>
+              <w:spacing w:after="40" w:line="247" w:lineRule="auto"/>
+            </w:pPr>
+            <w:r>
+              <w:rPr>
+                <w:sz w:val="20"/>
+              </w:rPr>
+              <w:t xml:space="preserve">Smart Citizen </w:t>
+            </w:r>
+            <w:r>
+              <w:rPr>
+                <w:rFonts w:ascii="DejaVu Sans Mono" w:hAnsi="DejaVu Sans Mono"/>
+                <w:sz w:val="20"/>
+              </w:rPr>
+              <w:t>rollup</w:t>
+            </w:r>
+            <w:r>
+              <w:rPr>
+                <w:sz w:val="20"/>
+              </w:rPr>
+              <w:t xml:space="preserve"> defines the grouping timespan, </w:t>
+            </w:r>
+            <w:r>
+              <w:rPr>
+                <w:rFonts w:ascii="DejaVu Sans Mono" w:hAnsi="DejaVu Sans Mono"/>
+                <w:sz w:val="20"/>
+              </w:rPr>
+              <w:t>function</w:t>
+            </w:r>
+            <w:r>
+              <w:rPr>
+                <w:sz w:val="20"/>
+              </w:rPr>
+              <w:t xml:space="preserve"> defines the grouping method, and </w:t>
+            </w:r>
+            <w:r>
+              <w:rPr>
+                <w:rFonts w:ascii="DejaVu Sans Mono" w:hAnsi="DejaVu Sans Mono"/>
+                <w:sz w:val="20"/>
+              </w:rPr>
+              <w:t>sample_size</w:t>
+            </w:r>
+            <w:r>
+              <w:rPr>
+                <w:sz w:val="20"/>
+              </w:rPr>
+              <w:t xml:space="preserve"> is the count of readings examined to build the response (Smart Citizen n.d.-d, “Get Historical Readings”).</w:t>
+            </w:r>
+          </w:p>
+        </w:tc>
+        <w:tc>
+          <w:tcPr>
+            <w:tcW w:type="dxa" w:w="4248"/>
+            <w:vAlign w:val="center"/>
+            <w:tcBorders>
+              <w:top w:val="single" w:sz="4" w:color="D9D9D9"/>
+              <w:left w:val="single" w:sz="4" w:color="D9D9D9"/>
+              <w:bottom w:val="single" w:sz="4" w:color="D9D9D9"/>
+              <w:right w:val="single" w:sz="4" w:color="D9D9D9"/>
+            </w:tcBorders>
+            <w:tcMar>
+              <w:top w:w="90" w:type="dxa"/>
+              <w:left w:w="90" w:type="dxa"/>
+              <w:bottom w:w="90" w:type="dxa"/>
+              <w:right w:w="90" w:type="dxa"/>
+            </w:tcMar>
+            <w:shd w:fill="FFFFFF"/>
+          </w:tcPr>
+          <w:p>
+            <w:pPr>
+              <w:spacing w:after="40" w:line="247" w:lineRule="auto"/>
+            </w:pPr>
+            <w:r>
+              <w:rPr>
+                <w:sz w:val="20"/>
+              </w:rPr>
+              <w:t xml:space="preserve">“One-hour average” means the source-platform </w:t>
+            </w:r>
+            <w:r>
+              <w:rPr>
+                <w:rFonts w:ascii="DejaVu Sans Mono" w:hAnsi="DejaVu Sans Mono"/>
+                <w:sz w:val="20"/>
+              </w:rPr>
+              <w:t>rollup=1h</w:t>
+            </w:r>
+            <w:r>
+              <w:rPr>
+                <w:sz w:val="20"/>
+              </w:rPr>
+              <w:t xml:space="preserve"> and </w:t>
+            </w:r>
+            <w:r>
+              <w:rPr>
+                <w:rFonts w:ascii="DejaVu Sans Mono" w:hAnsi="DejaVu Sans Mono"/>
+                <w:sz w:val="20"/>
+              </w:rPr>
+              <w:t>function=avg</w:t>
+            </w:r>
+            <w:r>
+              <w:rPr>
+                <w:sz w:val="20"/>
+              </w:rPr>
+              <w:t xml:space="preserve"> product. The paper does not reinterpret </w:t>
+            </w:r>
+            <w:r>
+              <w:rPr>
+                <w:rFonts w:ascii="DejaVu Sans Mono" w:hAnsi="DejaVu Sans Mono"/>
+                <w:sz w:val="20"/>
+              </w:rPr>
+              <w:t>sample_size</w:t>
+            </w:r>
+            <w:r>
+              <w:rPr>
+                <w:sz w:val="20"/>
+              </w:rPr>
+              <w:t xml:space="preserve"> as a per-bin count or invent exact interval boundaries around returned tuple timestamps.</w:t>
+            </w:r>
+          </w:p>
+        </w:tc>
+      </w:tr>
+      <w:tr>
+        <w:trPr>
+          <w:cantSplit/>
+        </w:trPr>
+        <w:tc>
+          <w:tcPr>
+            <w:tcW w:type="dxa" w:w="2232"/>
+            <w:vAlign w:val="center"/>
+            <w:tcBorders>
+              <w:top w:val="single" w:sz="4" w:color="D9D9D9"/>
+              <w:left w:val="single" w:sz="4" w:color="D9D9D9"/>
+              <w:bottom w:val="single" w:sz="4" w:color="D9D9D9"/>
+              <w:right w:val="single" w:sz="4" w:color="D9D9D9"/>
+            </w:tcBorders>
+            <w:tcMar>
+              <w:top w:w="90" w:type="dxa"/>
+              <w:left w:w="90" w:type="dxa"/>
+              <w:bottom w:w="90" w:type="dxa"/>
+              <w:right w:w="90" w:type="dxa"/>
+            </w:tcMar>
+            <w:shd w:fill="F7F7F7"/>
+          </w:tcPr>
+          <w:p>
+            <w:pPr>
+              <w:spacing w:after="40" w:line="247" w:lineRule="auto"/>
+            </w:pPr>
+            <w:r>
+              <w:rPr>
+                <w:b/>
+                <w:sz w:val="20"/>
+              </w:rPr>
+              <w:t>Source time / acquisition time</w:t>
+            </w:r>
+          </w:p>
+        </w:tc>
+        <w:tc>
+          <w:tcPr>
+            <w:tcW w:type="dxa" w:w="3312"/>
+            <w:vAlign w:val="center"/>
+            <w:tcBorders>
+              <w:top w:val="single" w:sz="4" w:color="D9D9D9"/>
+              <w:left w:val="single" w:sz="4" w:color="D9D9D9"/>
+              <w:bottom w:val="single" w:sz="4" w:color="D9D9D9"/>
+              <w:right w:val="single" w:sz="4" w:color="D9D9D9"/>
+            </w:tcBorders>
+            <w:tcMar>
+              <w:top w:w="90" w:type="dxa"/>
+              <w:left w:w="90" w:type="dxa"/>
+              <w:bottom w:w="90" w:type="dxa"/>
+              <w:right w:w="90" w:type="dxa"/>
+            </w:tcMar>
+            <w:shd w:fill="F7F7F7"/>
+          </w:tcPr>
+          <w:p>
+            <w:pPr>
+              <w:spacing w:after="40" w:line="247" w:lineRule="auto"/>
+            </w:pPr>
+            <w:r>
+              <w:rPr>
+                <w:sz w:val="20"/>
+              </w:rPr>
+              <w:t>These are study operational terms grounded in the source timestamps and provenance requirements rather than external standard terms (MERLIN Project 2026k).</w:t>
+            </w:r>
+          </w:p>
+        </w:tc>
+        <w:tc>
+          <w:tcPr>
+            <w:tcW w:type="dxa" w:w="4248"/>
+            <w:vAlign w:val="center"/>
+            <w:tcBorders>
+              <w:top w:val="single" w:sz="4" w:color="D9D9D9"/>
+              <w:left w:val="single" w:sz="4" w:color="D9D9D9"/>
+              <w:bottom w:val="single" w:sz="4" w:color="D9D9D9"/>
+              <w:right w:val="single" w:sz="4" w:color="D9D9D9"/>
+            </w:tcBorders>
+            <w:tcMar>
+              <w:top w:w="90" w:type="dxa"/>
+              <w:left w:w="90" w:type="dxa"/>
+              <w:bottom w:w="90" w:type="dxa"/>
+              <w:right w:w="90" w:type="dxa"/>
+            </w:tcMar>
+            <w:shd w:fill="F7F7F7"/>
+          </w:tcPr>
+          <w:p>
+            <w:pPr>
+              <w:spacing w:after="40" w:line="247" w:lineRule="auto"/>
+            </w:pPr>
+            <w:r>
+              <w:rPr>
+                <w:b/>
+                <w:sz w:val="20"/>
+              </w:rPr>
+              <w:t>Source time</w:t>
+            </w:r>
+            <w:r>
+              <w:rPr>
+                <w:sz w:val="20"/>
+              </w:rPr>
+              <w:t xml:space="preserve"> is the timestamp the source associates with a reading or aggregate. </w:t>
+            </w:r>
+            <w:r>
+              <w:rPr>
+                <w:b/>
+                <w:sz w:val="20"/>
+              </w:rPr>
+              <w:t>Acquisition time</w:t>
+            </w:r>
+            <w:r>
+              <w:rPr>
+                <w:sz w:val="20"/>
+              </w:rPr>
+              <w:t xml:space="preserve"> is when this experiment obtained the response and is integration provenance, not an observation time.</w:t>
+            </w:r>
+          </w:p>
+        </w:tc>
+      </w:tr>
+      <w:tr>
+        <w:trPr>
+          <w:cantSplit/>
+        </w:trPr>
+        <w:tc>
+          <w:tcPr>
+            <w:tcW w:type="dxa" w:w="2232"/>
+            <w:vAlign w:val="center"/>
+            <w:tcBorders>
+              <w:top w:val="single" w:sz="4" w:color="D9D9D9"/>
+              <w:left w:val="single" w:sz="4" w:color="D9D9D9"/>
+              <w:bottom w:val="single" w:sz="4" w:color="D9D9D9"/>
+              <w:right w:val="single" w:sz="4" w:color="D9D9D9"/>
+            </w:tcBorders>
+            <w:tcMar>
+              <w:top w:w="90" w:type="dxa"/>
+              <w:left w:w="90" w:type="dxa"/>
+              <w:bottom w:w="90" w:type="dxa"/>
+              <w:right w:w="90" w:type="dxa"/>
+            </w:tcMar>
+            <w:shd w:fill="FFFFFF"/>
+          </w:tcPr>
+          <w:p>
+            <w:pPr>
+              <w:spacing w:after="40" w:line="247" w:lineRule="auto"/>
+            </w:pPr>
+            <w:r>
+              <w:rPr>
+                <w:b/>
+                <w:sz w:val="20"/>
+              </w:rPr>
+              <w:t>Semantic preservation</w:t>
+            </w:r>
+          </w:p>
+        </w:tc>
+        <w:tc>
+          <w:tcPr>
+            <w:tcW w:type="dxa" w:w="3312"/>
+            <w:vAlign w:val="center"/>
+            <w:tcBorders>
+              <w:top w:val="single" w:sz="4" w:color="D9D9D9"/>
+              <w:left w:val="single" w:sz="4" w:color="D9D9D9"/>
+              <w:bottom w:val="single" w:sz="4" w:color="D9D9D9"/>
+              <w:right w:val="single" w:sz="4" w:color="D9D9D9"/>
+            </w:tcBorders>
+            <w:tcMar>
+              <w:top w:w="90" w:type="dxa"/>
+              <w:left w:w="90" w:type="dxa"/>
+              <w:bottom w:w="90" w:type="dxa"/>
+              <w:right w:w="90" w:type="dxa"/>
+            </w:tcMar>
+            <w:shd w:fill="FFFFFF"/>
+          </w:tcPr>
+          <w:p>
+            <w:pPr>
+              <w:spacing w:after="40" w:line="247" w:lineRule="auto"/>
+            </w:pPr>
+            <w:r>
+              <w:rPr>
+                <w:sz w:val="20"/>
+              </w:rPr>
+              <w:t>This is the study's operational criterion, informed by the role/time distinctions of CSAPI and the mapping method (Open Geospatial Consortium 2025a; 2025b; MERLIN Project 2026l).</w:t>
+            </w:r>
+          </w:p>
+        </w:tc>
+        <w:tc>
+          <w:tcPr>
+            <w:tcW w:type="dxa" w:w="4248"/>
+            <w:vAlign w:val="center"/>
+            <w:tcBorders>
+              <w:top w:val="single" w:sz="4" w:color="D9D9D9"/>
+              <w:left w:val="single" w:sz="4" w:color="D9D9D9"/>
+              <w:bottom w:val="single" w:sz="4" w:color="D9D9D9"/>
+              <w:right w:val="single" w:sz="4" w:color="D9D9D9"/>
+            </w:tcBorders>
+            <w:tcMar>
+              <w:top w:w="90" w:type="dxa"/>
+              <w:left w:w="90" w:type="dxa"/>
+              <w:bottom w:w="90" w:type="dxa"/>
+              <w:right w:w="90" w:type="dxa"/>
+            </w:tcMar>
+            <w:shd w:fill="FFFFFF"/>
+          </w:tcPr>
+          <w:p>
+            <w:pPr>
+              <w:spacing w:after="40" w:line="247" w:lineRule="auto"/>
+            </w:pPr>
+            <w:r>
+              <w:rPr>
+                <w:sz w:val="20"/>
+              </w:rPr>
+              <w:t>Source-supported meaning about identity, producer, observed subject, property, unit, value, time, aggregation, provenance and qualified absence is preserved when the integration does not silently change or invent it.</w:t>
+            </w:r>
+          </w:p>
+        </w:tc>
+      </w:tr>
+    </w:tbl>
+    <w:p>
+      <w:pPr>
+        <w:spacing w:after="40" w:before="0" w:line="60" w:lineRule="exact"/>
+      </w:pPr>
+    </w:p>
+    <w:p>
+      <w:pPr>
+        <w:pStyle w:val="Heading1"/>
+      </w:pPr>
+      <w:r>
+        <w:rPr/>
+        <w:t>3 Background and technical baseline</w:t>
       </w:r>
     </w:p>
     <w:p>
@@ -914,7 +2522,7 @@
       </w:pPr>
       <w:r>
         <w:rPr/>
-        <w:t>3 Experimental integration infrastructure</w:t>
+        <w:t>4 Experimental integration infrastructure</w:t>
       </w:r>
     </w:p>
     <w:p>
@@ -2508,7 +4116,7 @@
       </w:r>
       <w:r>
         <w:rPr/>
-        <w:t xml:space="preserve"> a strong alternative because it provides authentication, pagination, validation, and transport hooks. Its convenient common model, however, would add another normalization layer between the wire representation and MERLIN's own interpretation, which is undesirable when the interpretation itself is the object of study. The control-first choice was therefore a standalone application using the ogc-client CSAPI fork, while retaining Explorer and other clients as external inspection or comparison tools rather than experimental foundations.</w:t>
+        <w:t xml:space="preserve"> a strong alternative because it provides authentication, pagination, validation, and transport hooks. Its convenient common model, however, would add another common-model transformation layer between the wire representation and MERLIN's own interpretation, which is undesirable when the interpretation itself is the object of study. The control-first choice was therefore a standalone application using the ogc-client CSAPI fork, while retaining Explorer and other clients as external inspection or comparison tools rather than experimental foundations.</w:t>
       </w:r>
     </w:p>
     <w:p>
@@ -3898,7 +5506,7 @@
       </w:pPr>
       <w:r>
         <w:rPr/>
-        <w:t>4 Research questions and study design</w:t>
+        <w:t>5 Research questions and study design</w:t>
       </w:r>
     </w:p>
     <w:p>
@@ -4039,7 +5647,7 @@
       </w:pPr>
       <w:r>
         <w:rPr/>
-        <w:t>5 Source selection and preliminary observations</w:t>
+        <w:t>6 Source selection and preliminary observations</w:t>
       </w:r>
     </w:p>
     <w:p>
@@ -4078,7 +5686,58 @@
       </w:pPr>
       <w:r>
         <w:rPr/>
-        <w:t>Existing feasibility evidence</w:t>
+        <w:t>Formal Phase 1 source evidence</w:t>
+      </w:r>
+    </w:p>
+    <w:p>
+      <w:pPr/>
+      <w:r>
+        <w:rPr/>
+        <w:t xml:space="preserve">The 24 October feasibility check established that registration 19639 could provide useful current and historical data, but it is no longer the evidence basis for formal mappings. Phase 1 froze a new complete specimen at </w:t>
+      </w:r>
+      <w:r>
+        <w:rPr>
+          <w:rFonts w:ascii="DejaVu Sans Mono" w:hAnsi="DejaVu Sans Mono"/>
+          <w:sz w:val="19"/>
+        </w:rPr>
+        <w:t>2026-10-25T02:43:48Z</w:t>
+      </w:r>
+      <w:r>
+        <w:rPr/>
+        <w:t xml:space="preserve">, including the Device response, response headers, request URLs and one-day temperature and PM2.5 histories with SHA-256 hashes (MERLIN Project 2026k). The source reports 21 current channels, with eleven non-SEN5X channels at </w:t>
+      </w:r>
+      <w:r>
+        <w:rPr>
+          <w:rFonts w:ascii="DejaVu Sans Mono" w:hAnsi="DejaVu Sans Mono"/>
+          <w:sz w:val="19"/>
+        </w:rPr>
+        <w:t>02:40:21Z</w:t>
+      </w:r>
+      <w:r>
+        <w:rPr/>
+        <w:t xml:space="preserve"> and ten SEN5X particulate channels at </w:t>
+      </w:r>
+      <w:r>
+        <w:rPr>
+          <w:rFonts w:ascii="DejaVu Sans Mono" w:hAnsi="DejaVu Sans Mono"/>
+          <w:sz w:val="19"/>
+        </w:rPr>
+        <w:t>02:36:21Z</w:t>
+      </w:r>
+      <w:r>
+        <w:rPr/>
+        <w:t xml:space="preserve">. This two-cohort timing pattern is itself evidence that device-level </w:t>
+      </w:r>
+      <w:r>
+        <w:rPr>
+          <w:rFonts w:ascii="DejaVu Sans Mono" w:hAnsi="DejaVu Sans Mono"/>
+          <w:sz w:val="19"/>
+        </w:rPr>
+        <w:t>last_reading_at</w:t>
+      </w:r>
+      <w:r>
+        <w:rPr/>
+        <w:t xml:space="preserve"> cannot replace channel-specific time.</w:t>
       </w:r>
     </w:p>
     <w:p>
@@ -4090,11 +5749,11 @@
         <w:rPr>
           <w:b/>
         </w:rPr>
-        <w:t>Table 4. Selected observations from the preliminary public capture.</w:t>
+        <w:t>Table 4. Selected observations from the formal frozen specimen.</w:t>
       </w:r>
       <w:r>
         <w:rPr/>
-        <w:t xml:space="preserve"> The preliminary study retrieved public registration 19639 on 24 October 2026 at 5:57:35 p.m. EDT, equivalent to 21:57:35 UTC. Selected measurements and their individual source timestamps are preserved in the evidence record. The table summarizes a subset; it is not a new live measurement or an executed adapter result (MERLIN Project 2026b). Source timestamps are on 24 October 2026 and are shown in UTC to preserve their original time basis.</w:t>
+        <w:t xml:space="preserve"> The table uses the retained 25 October source body rather than the earlier feasibility values. Values and times are source-reported and have not yet passed through the proposed adapter or CSAPI server. System-related telemetry is shown alongside environmental observations to exercise different subject and interpretation questions. None of the rows is a readiness or health assessment (MERLIN Project 2026k).</w:t>
       </w:r>
     </w:p>
     <w:tbl>
@@ -4270,7 +5929,7 @@
               <w:rPr>
                 <w:sz w:val="20"/>
               </w:rPr>
-              <w:t>Temperature</w:t>
+              <w:t>Air temperature</w:t>
             </w:r>
           </w:p>
         </w:tc>
@@ -4300,7 +5959,7 @@
               <w:rPr>
                 <w:sz w:val="20"/>
               </w:rPr>
-              <w:t>19.82 ºC</w:t>
+              <w:t>19.59 ºC</w:t>
             </w:r>
           </w:p>
         </w:tc>
@@ -4330,7 +5989,7 @@
               <w:rPr>
                 <w:sz w:val="20"/>
               </w:rPr>
-              <w:t>21:55:12</w:t>
+              <w:t>02:40:21</w:t>
             </w:r>
           </w:p>
         </w:tc>
@@ -4360,7 +6019,257 @@
               <w:rPr>
                 <w:sz w:val="20"/>
               </w:rPr>
-              <w:t>Are quantity, unit, subject, and time preserved?</w:t>
+              <w:t>Are property, unit, environmental subject and time preserved?</w:t>
+            </w:r>
+          </w:p>
+        </w:tc>
+      </w:tr>
+      <w:tr>
+        <w:trPr>
+          <w:cantSplit/>
+        </w:trPr>
+        <w:tc>
+          <w:tcPr>
+            <w:tcW w:type="dxa" w:w="1728"/>
+            <w:vAlign w:val="center"/>
+            <w:tcBorders>
+              <w:top w:val="single" w:sz="4" w:color="D9D9D9"/>
+              <w:left w:val="single" w:sz="4" w:color="D9D9D9"/>
+              <w:bottom w:val="single" w:sz="4" w:color="D9D9D9"/>
+              <w:right w:val="single" w:sz="4" w:color="D9D9D9"/>
+            </w:tcBorders>
+            <w:tcMar>
+              <w:top w:w="90" w:type="dxa"/>
+              <w:left w:w="90" w:type="dxa"/>
+              <w:bottom w:w="90" w:type="dxa"/>
+              <w:right w:w="90" w:type="dxa"/>
+            </w:tcMar>
+            <w:shd w:fill="F7F7F7"/>
+          </w:tcPr>
+          <w:p>
+            <w:pPr>
+              <w:spacing w:after="40" w:line="247" w:lineRule="auto"/>
+            </w:pPr>
+            <w:r>
+              <w:rPr>
+                <w:sz w:val="20"/>
+              </w:rPr>
+              <w:t>Relative humidity</w:t>
+            </w:r>
+          </w:p>
+        </w:tc>
+        <w:tc>
+          <w:tcPr>
+            <w:tcW w:type="dxa" w:w="1872"/>
+            <w:vAlign w:val="center"/>
+            <w:tcBorders>
+              <w:top w:val="single" w:sz="4" w:color="D9D9D9"/>
+              <w:left w:val="single" w:sz="4" w:color="D9D9D9"/>
+              <w:bottom w:val="single" w:sz="4" w:color="D9D9D9"/>
+              <w:right w:val="single" w:sz="4" w:color="D9D9D9"/>
+            </w:tcBorders>
+            <w:tcMar>
+              <w:top w:w="90" w:type="dxa"/>
+              <w:left w:w="90" w:type="dxa"/>
+              <w:bottom w:w="90" w:type="dxa"/>
+              <w:right w:w="90" w:type="dxa"/>
+            </w:tcMar>
+            <w:shd w:fill="F7F7F7"/>
+          </w:tcPr>
+          <w:p>
+            <w:pPr>
+              <w:spacing w:after="40" w:line="247" w:lineRule="auto"/>
+            </w:pPr>
+            <w:r>
+              <w:rPr>
+                <w:sz w:val="20"/>
+              </w:rPr>
+              <w:t>65.54 %</w:t>
+            </w:r>
+          </w:p>
+        </w:tc>
+        <w:tc>
+          <w:tcPr>
+            <w:tcW w:type="dxa" w:w="1656"/>
+            <w:vAlign w:val="center"/>
+            <w:tcBorders>
+              <w:top w:val="single" w:sz="4" w:color="D9D9D9"/>
+              <w:left w:val="single" w:sz="4" w:color="D9D9D9"/>
+              <w:bottom w:val="single" w:sz="4" w:color="D9D9D9"/>
+              <w:right w:val="single" w:sz="4" w:color="D9D9D9"/>
+            </w:tcBorders>
+            <w:tcMar>
+              <w:top w:w="90" w:type="dxa"/>
+              <w:left w:w="90" w:type="dxa"/>
+              <w:bottom w:w="90" w:type="dxa"/>
+              <w:right w:w="90" w:type="dxa"/>
+            </w:tcMar>
+            <w:shd w:fill="F7F7F7"/>
+          </w:tcPr>
+          <w:p>
+            <w:pPr>
+              <w:spacing w:after="40" w:line="247" w:lineRule="auto"/>
+            </w:pPr>
+            <w:r>
+              <w:rPr>
+                <w:sz w:val="20"/>
+              </w:rPr>
+              <w:t>02:40:21</w:t>
+            </w:r>
+          </w:p>
+        </w:tc>
+        <w:tc>
+          <w:tcPr>
+            <w:tcW w:type="dxa" w:w="4536"/>
+            <w:vAlign w:val="center"/>
+            <w:tcBorders>
+              <w:top w:val="single" w:sz="4" w:color="D9D9D9"/>
+              <w:left w:val="single" w:sz="4" w:color="D9D9D9"/>
+              <w:bottom w:val="single" w:sz="4" w:color="D9D9D9"/>
+              <w:right w:val="single" w:sz="4" w:color="D9D9D9"/>
+            </w:tcBorders>
+            <w:tcMar>
+              <w:top w:w="90" w:type="dxa"/>
+              <w:left w:w="90" w:type="dxa"/>
+              <w:bottom w:w="90" w:type="dxa"/>
+              <w:right w:w="90" w:type="dxa"/>
+            </w:tcMar>
+            <w:shd w:fill="F7F7F7"/>
+          </w:tcPr>
+          <w:p>
+            <w:pPr>
+              <w:spacing w:after="40" w:line="247" w:lineRule="auto"/>
+            </w:pPr>
+            <w:r>
+              <w:rPr>
+                <w:sz w:val="20"/>
+              </w:rPr>
+              <w:t>Can a second SHT31 output remain distinct from component identity?</w:t>
+            </w:r>
+          </w:p>
+        </w:tc>
+      </w:tr>
+      <w:tr>
+        <w:trPr>
+          <w:cantSplit/>
+        </w:trPr>
+        <w:tc>
+          <w:tcPr>
+            <w:tcW w:type="dxa" w:w="1728"/>
+            <w:vAlign w:val="center"/>
+            <w:tcBorders>
+              <w:top w:val="single" w:sz="4" w:color="D9D9D9"/>
+              <w:left w:val="single" w:sz="4" w:color="D9D9D9"/>
+              <w:bottom w:val="single" w:sz="4" w:color="D9D9D9"/>
+              <w:right w:val="single" w:sz="4" w:color="D9D9D9"/>
+            </w:tcBorders>
+            <w:tcMar>
+              <w:top w:w="90" w:type="dxa"/>
+              <w:left w:w="90" w:type="dxa"/>
+              <w:bottom w:w="90" w:type="dxa"/>
+              <w:right w:w="90" w:type="dxa"/>
+            </w:tcMar>
+            <w:shd w:fill="FFFFFF"/>
+          </w:tcPr>
+          <w:p>
+            <w:pPr>
+              <w:spacing w:after="40" w:line="247" w:lineRule="auto"/>
+            </w:pPr>
+            <w:r>
+              <w:rPr>
+                <w:sz w:val="20"/>
+              </w:rPr>
+              <w:t>PM2.5</w:t>
+            </w:r>
+          </w:p>
+        </w:tc>
+        <w:tc>
+          <w:tcPr>
+            <w:tcW w:type="dxa" w:w="1872"/>
+            <w:vAlign w:val="center"/>
+            <w:tcBorders>
+              <w:top w:val="single" w:sz="4" w:color="D9D9D9"/>
+              <w:left w:val="single" w:sz="4" w:color="D9D9D9"/>
+              <w:bottom w:val="single" w:sz="4" w:color="D9D9D9"/>
+              <w:right w:val="single" w:sz="4" w:color="D9D9D9"/>
+            </w:tcBorders>
+            <w:tcMar>
+              <w:top w:w="90" w:type="dxa"/>
+              <w:left w:w="90" w:type="dxa"/>
+              <w:bottom w:w="90" w:type="dxa"/>
+              <w:right w:w="90" w:type="dxa"/>
+            </w:tcMar>
+            <w:shd w:fill="FFFFFF"/>
+          </w:tcPr>
+          <w:p>
+            <w:pPr>
+              <w:spacing w:after="40" w:line="247" w:lineRule="auto"/>
+            </w:pPr>
+            <w:r>
+              <w:rPr>
+                <w:sz w:val="20"/>
+              </w:rPr>
+              <w:t>9.3 ug/m3</w:t>
+            </w:r>
+          </w:p>
+        </w:tc>
+        <w:tc>
+          <w:tcPr>
+            <w:tcW w:type="dxa" w:w="1656"/>
+            <w:vAlign w:val="center"/>
+            <w:tcBorders>
+              <w:top w:val="single" w:sz="4" w:color="D9D9D9"/>
+              <w:left w:val="single" w:sz="4" w:color="D9D9D9"/>
+              <w:bottom w:val="single" w:sz="4" w:color="D9D9D9"/>
+              <w:right w:val="single" w:sz="4" w:color="D9D9D9"/>
+            </w:tcBorders>
+            <w:tcMar>
+              <w:top w:w="90" w:type="dxa"/>
+              <w:left w:w="90" w:type="dxa"/>
+              <w:bottom w:w="90" w:type="dxa"/>
+              <w:right w:w="90" w:type="dxa"/>
+            </w:tcMar>
+            <w:shd w:fill="FFFFFF"/>
+          </w:tcPr>
+          <w:p>
+            <w:pPr>
+              <w:spacing w:after="40" w:line="247" w:lineRule="auto"/>
+            </w:pPr>
+            <w:r>
+              <w:rPr>
+                <w:sz w:val="20"/>
+              </w:rPr>
+              <w:t>02:36:21</w:t>
+            </w:r>
+          </w:p>
+        </w:tc>
+        <w:tc>
+          <w:tcPr>
+            <w:tcW w:type="dxa" w:w="4536"/>
+            <w:vAlign w:val="center"/>
+            <w:tcBorders>
+              <w:top w:val="single" w:sz="4" w:color="D9D9D9"/>
+              <w:left w:val="single" w:sz="4" w:color="D9D9D9"/>
+              <w:bottom w:val="single" w:sz="4" w:color="D9D9D9"/>
+              <w:right w:val="single" w:sz="4" w:color="D9D9D9"/>
+            </w:tcBorders>
+            <w:tcMar>
+              <w:top w:w="90" w:type="dxa"/>
+              <w:left w:w="90" w:type="dxa"/>
+              <w:bottom w:w="90" w:type="dxa"/>
+              <w:right w:w="90" w:type="dxa"/>
+            </w:tcMar>
+            <w:shd w:fill="FFFFFF"/>
+          </w:tcPr>
+          <w:p>
+            <w:pPr>
+              <w:spacing w:after="40" w:line="247" w:lineRule="auto"/>
+            </w:pPr>
+            <w:r>
+              <w:rPr>
+                <w:sz w:val="20"/>
+              </w:rPr>
+              <w:t>Does the older particulate-channel time remain visible?</w:t>
             </w:r>
           </w:p>
         </w:tc>
@@ -4455,7 +6364,7 @@
               <w:rPr>
                 <w:sz w:val="20"/>
               </w:rPr>
-              <w:t>21:55:12</w:t>
+              <w:t>02:40:21</w:t>
             </w:r>
           </w:p>
         </w:tc>
@@ -4485,7 +6394,7 @@
               <w:rPr>
                 <w:sz w:val="20"/>
               </w:rPr>
-              <w:t>Is percentage kept separate from runtime or supply topology?</w:t>
+              <w:t>Is parent-System status kept separate from battery identity and supply topology?</w:t>
             </w:r>
           </w:p>
         </w:tc>
@@ -4520,7 +6429,7 @@
               <w:rPr>
                 <w:sz w:val="20"/>
               </w:rPr>
-              <w:t>PM2.5</w:t>
+              <w:t>Wi-Fi RSSI</w:t>
             </w:r>
           </w:p>
         </w:tc>
@@ -4550,7 +6459,7 @@
               <w:rPr>
                 <w:sz w:val="20"/>
               </w:rPr>
-              <w:t>10.6 ug/m3</w:t>
+              <w:t>−45 dBm</w:t>
             </w:r>
           </w:p>
         </w:tc>
@@ -4580,7 +6489,7 @@
               <w:rPr>
                 <w:sz w:val="20"/>
               </w:rPr>
-              <w:t>21:46:09</w:t>
+              <w:t>02:40:21</w:t>
             </w:r>
           </w:p>
         </w:tc>
@@ -4610,7 +6519,7 @@
               <w:rPr>
                 <w:sz w:val="20"/>
               </w:rPr>
-              <w:t>Does the older channel time remain visible?</w:t>
+              <w:t>Can received-signal power remain telemetry without becoming interface/link status?</w:t>
             </w:r>
           </w:p>
         </w:tc>
@@ -4645,7 +6554,7 @@
               <w:rPr>
                 <w:sz w:val="20"/>
               </w:rPr>
-              <w:t>Wi-Fi RSSI</w:t>
+              <w:t>SD-card indication</w:t>
             </w:r>
           </w:p>
         </w:tc>
@@ -4675,7 +6584,7 @@
               <w:rPr>
                 <w:sz w:val="20"/>
               </w:rPr>
-              <w:t>−45 dBm</w:t>
+              <w:t>1</w:t>
             </w:r>
           </w:p>
         </w:tc>
@@ -4705,7 +6614,7 @@
               <w:rPr>
                 <w:sz w:val="20"/>
               </w:rPr>
-              <w:t>21:55:12</w:t>
+              <w:t>02:40:21</w:t>
             </w:r>
           </w:p>
         </w:tc>
@@ -4735,132 +6644,7 @@
               <w:rPr>
                 <w:sz w:val="20"/>
               </w:rPr>
-              <w:t>Is a radio measurement distinguished from end-to-end availability?</w:t>
-            </w:r>
-          </w:p>
-        </w:tc>
-      </w:tr>
-      <w:tr>
-        <w:trPr>
-          <w:cantSplit/>
-        </w:trPr>
-        <w:tc>
-          <w:tcPr>
-            <w:tcW w:type="dxa" w:w="1728"/>
-            <w:vAlign w:val="center"/>
-            <w:tcBorders>
-              <w:top w:val="single" w:sz="4" w:color="D9D9D9"/>
-              <w:left w:val="single" w:sz="4" w:color="D9D9D9"/>
-              <w:bottom w:val="single" w:sz="4" w:color="D9D9D9"/>
-              <w:right w:val="single" w:sz="4" w:color="D9D9D9"/>
-            </w:tcBorders>
-            <w:tcMar>
-              <w:top w:w="90" w:type="dxa"/>
-              <w:left w:w="90" w:type="dxa"/>
-              <w:bottom w:w="90" w:type="dxa"/>
-              <w:right w:w="90" w:type="dxa"/>
-            </w:tcMar>
-            <w:shd w:fill="FFFFFF"/>
-          </w:tcPr>
-          <w:p>
-            <w:pPr>
-              <w:spacing w:after="40" w:line="247" w:lineRule="auto"/>
-            </w:pPr>
-            <w:r>
-              <w:rPr>
-                <w:sz w:val="20"/>
-              </w:rPr>
-              <w:t>SD-card indicator</w:t>
-            </w:r>
-          </w:p>
-        </w:tc>
-        <w:tc>
-          <w:tcPr>
-            <w:tcW w:type="dxa" w:w="1872"/>
-            <w:vAlign w:val="center"/>
-            <w:tcBorders>
-              <w:top w:val="single" w:sz="4" w:color="D9D9D9"/>
-              <w:left w:val="single" w:sz="4" w:color="D9D9D9"/>
-              <w:bottom w:val="single" w:sz="4" w:color="D9D9D9"/>
-              <w:right w:val="single" w:sz="4" w:color="D9D9D9"/>
-            </w:tcBorders>
-            <w:tcMar>
-              <w:top w:w="90" w:type="dxa"/>
-              <w:left w:w="90" w:type="dxa"/>
-              <w:bottom w:w="90" w:type="dxa"/>
-              <w:right w:w="90" w:type="dxa"/>
-            </w:tcMar>
-            <w:shd w:fill="FFFFFF"/>
-          </w:tcPr>
-          <w:p>
-            <w:pPr>
-              <w:spacing w:after="40" w:line="247" w:lineRule="auto"/>
-            </w:pPr>
-            <w:r>
-              <w:rPr>
-                <w:sz w:val="20"/>
-              </w:rPr>
-              <w:t>1</w:t>
-            </w:r>
-          </w:p>
-        </w:tc>
-        <w:tc>
-          <w:tcPr>
-            <w:tcW w:type="dxa" w:w="1656"/>
-            <w:vAlign w:val="center"/>
-            <w:tcBorders>
-              <w:top w:val="single" w:sz="4" w:color="D9D9D9"/>
-              <w:left w:val="single" w:sz="4" w:color="D9D9D9"/>
-              <w:bottom w:val="single" w:sz="4" w:color="D9D9D9"/>
-              <w:right w:val="single" w:sz="4" w:color="D9D9D9"/>
-            </w:tcBorders>
-            <w:tcMar>
-              <w:top w:w="90" w:type="dxa"/>
-              <w:left w:w="90" w:type="dxa"/>
-              <w:bottom w:w="90" w:type="dxa"/>
-              <w:right w:w="90" w:type="dxa"/>
-            </w:tcMar>
-            <w:shd w:fill="FFFFFF"/>
-          </w:tcPr>
-          <w:p>
-            <w:pPr>
-              <w:spacing w:after="40" w:line="247" w:lineRule="auto"/>
-            </w:pPr>
-            <w:r>
-              <w:rPr>
-                <w:sz w:val="20"/>
-              </w:rPr>
-              <w:t>21:55:12</w:t>
-            </w:r>
-          </w:p>
-        </w:tc>
-        <w:tc>
-          <w:tcPr>
-            <w:tcW w:type="dxa" w:w="4536"/>
-            <w:vAlign w:val="center"/>
-            <w:tcBorders>
-              <w:top w:val="single" w:sz="4" w:color="D9D9D9"/>
-              <w:left w:val="single" w:sz="4" w:color="D9D9D9"/>
-              <w:bottom w:val="single" w:sz="4" w:color="D9D9D9"/>
-              <w:right w:val="single" w:sz="4" w:color="D9D9D9"/>
-            </w:tcBorders>
-            <w:tcMar>
-              <w:top w:w="90" w:type="dxa"/>
-              <w:left w:w="90" w:type="dxa"/>
-              <w:bottom w:w="90" w:type="dxa"/>
-              <w:right w:w="90" w:type="dxa"/>
-            </w:tcMar>
-            <w:shd w:fill="FFFFFF"/>
-          </w:tcPr>
-          <w:p>
-            <w:pPr>
-              <w:spacing w:after="40" w:line="247" w:lineRule="auto"/>
-            </w:pPr>
-            <w:r>
-              <w:rPr>
-                <w:sz w:val="20"/>
-              </w:rPr>
-              <w:t>Is the source's coded meaning retained?</w:t>
+              <w:t>Is the source categorical meaning retained without becoming Boolean health?</w:t>
             </w:r>
           </w:p>
         </w:tc>
@@ -4875,7 +6659,62 @@
       <w:pPr/>
       <w:r>
         <w:rPr/>
-        <w:t>The historical temperature request returned 24 groups with one-hour average aggregation and a response-wide sample size of 1,439. The returned timestamps are not all exact hour boundaries. The original exact retrieval time for this request was not retained. These limits remain part of the evidence; this paper does not reconstruct an acquisition time or invent averaging intervals (MERLIN Project 2026b, record “smart-citizen-history-19639-temperature”).</w:t>
+        <w:t xml:space="preserve">The formal one-day temperature history contains 24 one-hour average tuples and reports </w:t>
+      </w:r>
+      <w:r>
+        <w:rPr>
+          <w:rFonts w:ascii="DejaVu Sans Mono" w:hAnsi="DejaVu Sans Mono"/>
+          <w:sz w:val="19"/>
+        </w:rPr>
+        <w:t>sample_size=1439</w:t>
+      </w:r>
+      <w:r>
+        <w:rPr/>
+        <w:t xml:space="preserve">; the corresponding PM2.5 history also contains 24 tuples but reports </w:t>
+      </w:r>
+      <w:r>
+        <w:rPr>
+          <w:rFonts w:ascii="DejaVu Sans Mono" w:hAnsi="DejaVu Sans Mono"/>
+          <w:sz w:val="19"/>
+        </w:rPr>
+        <w:t>sample_size=288</w:t>
+      </w:r>
+      <w:r>
+        <w:rPr/>
+        <w:t xml:space="preserve"> (MERLIN Project 2026k). Smart Citizen documents </w:t>
+      </w:r>
+      <w:r>
+        <w:rPr>
+          <w:rFonts w:ascii="DejaVu Sans Mono" w:hAnsi="DejaVu Sans Mono"/>
+          <w:sz w:val="19"/>
+        </w:rPr>
+        <w:t>sample_size</w:t>
+      </w:r>
+      <w:r>
+        <w:rPr/>
+        <w:t xml:space="preserve"> as the readings examined to build the response, while </w:t>
+      </w:r>
+      <w:r>
+        <w:rPr>
+          <w:rFonts w:ascii="DejaVu Sans Mono" w:hAnsi="DejaVu Sans Mono"/>
+          <w:sz w:val="19"/>
+        </w:rPr>
+        <w:t>rollup=1h</w:t>
+      </w:r>
+      <w:r>
+        <w:rPr/>
+        <w:t xml:space="preserve"> and </w:t>
+      </w:r>
+      <w:r>
+        <w:rPr>
+          <w:rFonts w:ascii="DejaVu Sans Mono" w:hAnsi="DejaVu Sans Mono"/>
+          <w:sz w:val="19"/>
+        </w:rPr>
+        <w:t>function=avg</w:t>
+      </w:r>
+      <w:r>
+        <w:rPr/>
+        <w:t xml:space="preserve"> define the grouping request (Smart Citizen n.d.-d). Returned timestamps are not exact hour boundaries and differ between the two series, so the study preserves each tuple time exactly rather than constructing nominal intervals. These histories are source-platform derived products and are mapped separately from current source-reported results.</w:t>
       </w:r>
     </w:p>
     <w:p>
@@ -4887,11 +6726,22 @@
         <w:rPr>
           <w:b/>
         </w:rPr>
-        <w:t>Listing 1. Selected native temperature fields.</w:t>
+        <w:t>Listing 1. Selected formal temperature fields.</w:t>
       </w:r>
       <w:r>
         <w:rPr/>
-        <w:t xml:space="preserve"> These members are reproduced from one channel in the captured response. Other members are omitted. The excerpt is not a complete API response or a formal source schema (MERLIN Project 2026b, record “smart-citizen-current-19639”).</w:t>
+        <w:t xml:space="preserve"> These members are reproduced from </w:t>
+      </w:r>
+      <w:r>
+        <w:rPr>
+          <w:rFonts w:ascii="DejaVu Sans Mono" w:hAnsi="DejaVu Sans Mono"/>
+          <w:sz w:val="19"/>
+        </w:rPr>
+        <w:t>/data/sensors/18</w:t>
+      </w:r>
+      <w:r>
+        <w:rPr/>
+        <w:t xml:space="preserve"> in the frozen Device response. Other members are omitted, and the excerpt is not a source schema or complete response. The listing is retained as a companion JSON file and verified against the frozen body. It replaces the earlier feasibility excerpt as the formal mapping specimen (MERLIN Project 2026k).</w:t>
       </w:r>
     </w:p>
     <w:p>
@@ -4945,7 +6795,7 @@
         <w:keepNext/>
       </w:pPr>
       <w:r>
-        <w:t xml:space="preserve">  "value": 19.82,</w:t>
+        <w:t xml:space="preserve">  "value": 19.59,</w:t>
       </w:r>
     </w:p>
     <w:p>
@@ -4954,7 +6804,7 @@
         <w:keepNext/>
       </w:pPr>
       <w:r>
-        <w:t xml:space="preserve">  "last_reading_at": "2026-10-24T21:55:12Z"</w:t>
+        <w:t xml:space="preserve">  "last_reading_at": "2026-10-25T02:40:21Z"</w:t>
       </w:r>
     </w:p>
     <w:p>
@@ -4971,7 +6821,113 @@
       <w:pPr/>
       <w:r>
         <w:rPr/>
-        <w:t>The source meaning of a field will not be inferred from this example alone. The value, unit definition, channel description, timestamp documentation, and observation context must be considered together. Definitions and actual samples can reveal different problems: documentation may describe a field that a public response filters, while a sample may expose a value whose broader meaning is underspecified.</w:t>
+        <w:t xml:space="preserve">The native source also exposed semantic traps that matter to the experiment. Smart Citizen documents </w:t>
+      </w:r>
+      <w:r>
+        <w:rPr>
+          <w:rFonts w:ascii="DejaVu Sans Mono" w:hAnsi="DejaVu Sans Mono"/>
+          <w:sz w:val="19"/>
+        </w:rPr>
+        <w:t>notify.low_battery</w:t>
+      </w:r>
+      <w:r>
+        <w:rPr/>
+        <w:t xml:space="preserve"> and </w:t>
+      </w:r>
+      <w:r>
+        <w:rPr>
+          <w:rFonts w:ascii="DejaVu Sans Mono" w:hAnsi="DejaVu Sans Mono"/>
+          <w:sz w:val="19"/>
+        </w:rPr>
+        <w:t>notify.stopped_publishing</w:t>
+      </w:r>
+      <w:r>
+        <w:rPr/>
+        <w:t xml:space="preserve"> as notification settings, so a false value is not evidence of a healthy battery or healthy publishing state (Smart Citizen n.d.-d; MERLIN Project 2026k). Likewise, </w:t>
+      </w:r>
+      <w:r>
+        <w:rPr>
+          <w:rFonts w:ascii="DejaVu Sans Mono" w:hAnsi="DejaVu Sans Mono"/>
+          <w:sz w:val="19"/>
+        </w:rPr>
+        <w:t>prev_value</w:t>
+      </w:r>
+      <w:r>
+        <w:rPr/>
+        <w:t xml:space="preserve"> has no independent timestamp in the current Device representation and is not used to manufacture a timed trend. These examples show why a familiar label cannot substitute for source semantics.</w:t>
+      </w:r>
+    </w:p>
+    <w:p>
+      <w:pPr/>
+      <w:r>
+        <w:rPr/>
+        <w:t xml:space="preserve">The inspected Smart Citizen API source adds a further processing qualification. At revision </w:t>
+      </w:r>
+      <w:r>
+        <w:rPr>
+          <w:rFonts w:ascii="DejaVu Sans Mono" w:hAnsi="DejaVu Sans Mono"/>
+          <w:sz w:val="19"/>
+        </w:rPr>
+        <w:t>25a524cb...</w:t>
+      </w:r>
+      <w:r>
+        <w:rPr/>
+        <w:t xml:space="preserve">, </w:t>
+      </w:r>
+      <w:r>
+        <w:rPr>
+          <w:rFonts w:ascii="DejaVu Sans Mono" w:hAnsi="DejaVu Sans Mono"/>
+          <w:sz w:val="19"/>
+        </w:rPr>
+        <w:t>RawStorer</w:t>
+      </w:r>
+      <w:r>
+        <w:rPr/>
+        <w:t xml:space="preserve"> calls </w:t>
+      </w:r>
+      <w:r>
+        <w:rPr>
+          <w:rFonts w:ascii="DejaVu Sans Mono" w:hAnsi="DejaVu Sans Mono"/>
+          <w:sz w:val="19"/>
+        </w:rPr>
+        <w:t>normalized_value</w:t>
+      </w:r>
+      <w:r>
+        <w:rPr/>
+        <w:t xml:space="preserve"> before storing the </w:t>
+      </w:r>
+      <w:r>
+        <w:rPr>
+          <w:rFonts w:ascii="DejaVu Sans Mono" w:hAnsi="DejaVu Sans Mono"/>
+          <w:sz w:val="19"/>
+        </w:rPr>
+        <w:t>&lt;sensor_id&gt;_raw</w:t>
+      </w:r>
+      <w:r>
+        <w:rPr/>
+        <w:t xml:space="preserve"> entry and then stores the output of a method named </w:t>
+      </w:r>
+      <w:r>
+        <w:rPr>
+          <w:rFonts w:ascii="DejaVu Sans Mono" w:hAnsi="DejaVu Sans Mono"/>
+          <w:sz w:val="19"/>
+        </w:rPr>
+        <w:t>calibrated_value</w:t>
+      </w:r>
+      <w:r>
+        <w:rPr/>
+        <w:t xml:space="preserve"> under the sensor ID that the public Device response exposes as </w:t>
+      </w:r>
+      <w:r>
+        <w:rPr>
+          <w:rFonts w:ascii="DejaVu Sans Mono" w:hAnsi="DejaVu Sans Mono"/>
+          <w:sz w:val="19"/>
+        </w:rPr>
+        <w:t>value</w:t>
+      </w:r>
+      <w:r>
+        <w:rPr/>
+        <w:t xml:space="preserve"> (Smart Citizen 2026). The study therefore calls the public values source-platform reported/processed results rather than untouched raw sensor output, and the method name does not establish calibration in the VIM sense without calibration standards, uncertainty relationships or traceability evidence (Joint Committee for Guides in Metrology 2012). The exact production revision remains unverified, so repository source explains the inspected implementation path without proving byte-for-byte production behavior.</w:t>
       </w:r>
     </w:p>
     <w:p>
@@ -4980,7 +6936,7 @@
       </w:pPr>
       <w:r>
         <w:rPr/>
-        <w:t>6 Proposed dataset and mapping method</w:t>
+        <w:t>7 Proposed dataset and mapping method</w:t>
       </w:r>
     </w:p>
     <w:p>
@@ -4996,14 +6952,14 @@
       <w:pPr/>
       <w:r>
         <w:rPr/>
-        <w:t>The first dataset will include source registration and model metadata, channel inventory, definitions, units, individual timestamps, current readings, and bounded history. It will cover varied supported meanings: environmental temperature and humidity, particulate mass and particle-number concentration, light or pressure, noise level, battery percentage, radio signal strength, and storage indication. Selecting these different cases is intended to exercise semantic distinctions rather than maximize record count.</w:t>
+        <w:t>The formal first dataset now includes source registration and model metadata, a complete 21-channel inventory, definitions, units, individual timestamps, current readings and bounded temperature/PM2.5 history (MERLIN Project 2026k). The representative Phase 3 mapping set covers registration/model identity, temperature, PM2.5, humidity, pressure, A-weighted sound level, battery percentage, RSSI, SD-card indication and the two one-hour aggregate products (MERLIN Project 2026l). Other inventoried channels remain deliberate deferred cases rather than silently unmapped omissions. The selection exercises semantic distinctions rather than maximizing record count.</w:t>
       </w:r>
     </w:p>
     <w:p>
       <w:pPr/>
       <w:r>
         <w:rPr/>
-        <w:t>Each formal acquisition will retain the endpoint and query, acquisition time in UTC, HTTP outcome, available source-version information, original-response fingerprint, and review/transformation revision. Published excerpts will identify their omissions and relationship to the captured body. A fingerprint alone is not an archive. The earlier evidence record preserves excerpts and available fingerprints rather than every complete response, and formal experiment captures will not be retroactively attributed to those feasibility checks (MERLIN Project 2026b).</w:t>
+        <w:t>The formal acquisition retains the endpoint/query, UTC acquisition time, HTTP outcome, response headers, complete response bodies and SHA-256 fingerprints; a later acquisition should additionally freeze the API root/version information when available (MERLIN Project 2026k). Published excerpts identify their relationship to those retained bodies, and the raw capture remains separate from application fixtures. The earlier 24 October evidence record remains a feasibility record and is not retroactively relabeled as the formal specimen (MERLIN Project 2026b). This preserves the difference between feasibility evidence, source evidence and later mapped representations.</w:t>
       </w:r>
     </w:p>
     <w:p>
@@ -5934,6 +7890,562 @@
       </w:pPr>
       <w:r>
         <w:rPr/>
+        <w:t>Phase 1–3 review checkpoint</w:t>
+      </w:r>
+    </w:p>
+    <w:p>
+      <w:pPr/>
+      <w:r>
+        <w:rPr/>
+        <w:t>The mapping review was deliberately reopened before Phase 4 so that source-characterization and semantic defects could be corrected before code or server behavior made them implicit. The review retained the core identity, environmental-observation, battery and SD-card conclusions, corrected RSSI's earlier overconfident status classification, and brought the two aggregate-history products into the mapping ledger with explicit processing provenance (MERLIN Project 2026l). It also corrected the source-processing description and the 11+10 timing cohort count, while preserving unresolved result-time and sampling-subject questions rather than inventing answers. The work pauses at this checkpoint for owner review before any CSAPI resource graph is authored.</w:t>
+      </w:r>
+    </w:p>
+    <w:tbl>
+      <w:tblPr>
+        <w:tblW w:type="auto" w:w="0"/>
+        <w:jc w:val="center"/>
+        <w:tblLayout w:type="fixed"/>
+        <w:tblLook w:firstColumn="1" w:firstRow="1" w:lastColumn="0" w:lastRow="0" w:noHBand="0" w:noVBand="1" w:val="04A0"/>
+      </w:tblPr>
+      <w:tblGrid>
+        <w:gridCol w:w="2880"/>
+        <w:gridCol w:w="6912"/>
+      </w:tblGrid>
+      <w:tr>
+        <w:trPr>
+          <w:cantSplit/>
+          <w:tblHeader/>
+        </w:trPr>
+        <w:tc>
+          <w:tcPr>
+            <w:tcW w:type="dxa" w:w="2880"/>
+            <w:vAlign w:val="center"/>
+            <w:tcBorders>
+              <w:top w:val="single" w:sz="4" w:color="D9D9D9"/>
+              <w:left w:val="single" w:sz="4" w:color="D9D9D9"/>
+              <w:bottom w:val="single" w:sz="4" w:color="D9D9D9"/>
+              <w:right w:val="single" w:sz="4" w:color="D9D9D9"/>
+            </w:tcBorders>
+            <w:tcMar>
+              <w:top w:w="90" w:type="dxa"/>
+              <w:left w:w="90" w:type="dxa"/>
+              <w:bottom w:w="90" w:type="dxa"/>
+              <w:right w:w="90" w:type="dxa"/>
+            </w:tcMar>
+            <w:shd w:fill="E8E8E8"/>
+          </w:tcPr>
+          <w:p>
+            <w:pPr>
+              <w:spacing w:after="40" w:line="247" w:lineRule="auto"/>
+            </w:pPr>
+            <w:r>
+              <w:rPr>
+                <w:b/>
+                <w:sz w:val="20"/>
+              </w:rPr>
+              <w:t>Phase 1–3 item</w:t>
+            </w:r>
+          </w:p>
+        </w:tc>
+        <w:tc>
+          <w:tcPr>
+            <w:tcW w:type="dxa" w:w="6912"/>
+            <w:vAlign w:val="center"/>
+            <w:tcBorders>
+              <w:top w:val="single" w:sz="4" w:color="D9D9D9"/>
+              <w:left w:val="single" w:sz="4" w:color="D9D9D9"/>
+              <w:bottom w:val="single" w:sz="4" w:color="D9D9D9"/>
+              <w:right w:val="single" w:sz="4" w:color="D9D9D9"/>
+            </w:tcBorders>
+            <w:tcMar>
+              <w:top w:w="90" w:type="dxa"/>
+              <w:left w:w="90" w:type="dxa"/>
+              <w:bottom w:w="90" w:type="dxa"/>
+              <w:right w:w="90" w:type="dxa"/>
+            </w:tcMar>
+            <w:shd w:fill="E8E8E8"/>
+          </w:tcPr>
+          <w:p>
+            <w:pPr>
+              <w:spacing w:after="40" w:line="247" w:lineRule="auto"/>
+            </w:pPr>
+            <w:r>
+              <w:rPr>
+                <w:b/>
+                <w:sz w:val="20"/>
+              </w:rPr>
+              <w:t>Reviewed standing</w:t>
+            </w:r>
+          </w:p>
+        </w:tc>
+      </w:tr>
+      <w:tr>
+        <w:trPr>
+          <w:cantSplit/>
+        </w:trPr>
+        <w:tc>
+          <w:tcPr>
+            <w:tcW w:type="dxa" w:w="2880"/>
+            <w:vAlign w:val="center"/>
+            <w:tcBorders>
+              <w:top w:val="single" w:sz="4" w:color="D9D9D9"/>
+              <w:left w:val="single" w:sz="4" w:color="D9D9D9"/>
+              <w:bottom w:val="single" w:sz="4" w:color="D9D9D9"/>
+              <w:right w:val="single" w:sz="4" w:color="D9D9D9"/>
+            </w:tcBorders>
+            <w:tcMar>
+              <w:top w:w="90" w:type="dxa"/>
+              <w:left w:w="90" w:type="dxa"/>
+              <w:bottom w:w="90" w:type="dxa"/>
+              <w:right w:w="90" w:type="dxa"/>
+            </w:tcMar>
+            <w:shd w:fill="FFFFFF"/>
+          </w:tcPr>
+          <w:p>
+            <w:pPr>
+              <w:spacing w:after="40" w:line="247" w:lineRule="auto"/>
+            </w:pPr>
+            <w:r>
+              <w:rPr>
+                <w:sz w:val="20"/>
+              </w:rPr>
+              <w:t>Formal specimen</w:t>
+            </w:r>
+          </w:p>
+        </w:tc>
+        <w:tc>
+          <w:tcPr>
+            <w:tcW w:type="dxa" w:w="6912"/>
+            <w:vAlign w:val="center"/>
+            <w:tcBorders>
+              <w:top w:val="single" w:sz="4" w:color="D9D9D9"/>
+              <w:left w:val="single" w:sz="4" w:color="D9D9D9"/>
+              <w:bottom w:val="single" w:sz="4" w:color="D9D9D9"/>
+              <w:right w:val="single" w:sz="4" w:color="D9D9D9"/>
+            </w:tcBorders>
+            <w:tcMar>
+              <w:top w:w="90" w:type="dxa"/>
+              <w:left w:w="90" w:type="dxa"/>
+              <w:bottom w:w="90" w:type="dxa"/>
+              <w:right w:w="90" w:type="dxa"/>
+            </w:tcMar>
+            <w:shd w:fill="FFFFFF"/>
+          </w:tcPr>
+          <w:p>
+            <w:pPr>
+              <w:spacing w:after="40" w:line="247" w:lineRule="auto"/>
+            </w:pPr>
+            <w:r>
+              <w:rPr>
+                <w:sz w:val="20"/>
+              </w:rPr>
+              <w:t>Frozen registration 19639 Device response plus temperature and PM2.5 histories with requests, headers and hashes</w:t>
+            </w:r>
+          </w:p>
+        </w:tc>
+      </w:tr>
+      <w:tr>
+        <w:trPr>
+          <w:cantSplit/>
+        </w:trPr>
+        <w:tc>
+          <w:tcPr>
+            <w:tcW w:type="dxa" w:w="2880"/>
+            <w:vAlign w:val="center"/>
+            <w:tcBorders>
+              <w:top w:val="single" w:sz="4" w:color="D9D9D9"/>
+              <w:left w:val="single" w:sz="4" w:color="D9D9D9"/>
+              <w:bottom w:val="single" w:sz="4" w:color="D9D9D9"/>
+              <w:right w:val="single" w:sz="4" w:color="D9D9D9"/>
+            </w:tcBorders>
+            <w:tcMar>
+              <w:top w:w="90" w:type="dxa"/>
+              <w:left w:w="90" w:type="dxa"/>
+              <w:bottom w:w="90" w:type="dxa"/>
+              <w:right w:w="90" w:type="dxa"/>
+            </w:tcMar>
+            <w:shd w:fill="F7F7F7"/>
+          </w:tcPr>
+          <w:p>
+            <w:pPr>
+              <w:spacing w:after="40" w:line="247" w:lineRule="auto"/>
+            </w:pPr>
+            <w:r>
+              <w:rPr>
+                <w:sz w:val="20"/>
+              </w:rPr>
+              <w:t>Native characterization</w:t>
+            </w:r>
+          </w:p>
+        </w:tc>
+        <w:tc>
+          <w:tcPr>
+            <w:tcW w:type="dxa" w:w="6912"/>
+            <w:vAlign w:val="center"/>
+            <w:tcBorders>
+              <w:top w:val="single" w:sz="4" w:color="D9D9D9"/>
+              <w:left w:val="single" w:sz="4" w:color="D9D9D9"/>
+              <w:bottom w:val="single" w:sz="4" w:color="D9D9D9"/>
+              <w:right w:val="single" w:sz="4" w:color="D9D9D9"/>
+            </w:tcBorders>
+            <w:tcMar>
+              <w:top w:w="90" w:type="dxa"/>
+              <w:left w:w="90" w:type="dxa"/>
+              <w:bottom w:w="90" w:type="dxa"/>
+              <w:right w:w="90" w:type="dxa"/>
+            </w:tcMar>
+            <w:shd w:fill="F7F7F7"/>
+          </w:tcPr>
+          <w:p>
+            <w:pPr>
+              <w:spacing w:after="40" w:line="247" w:lineRule="auto"/>
+            </w:pPr>
+            <w:r>
+              <w:rPr>
+                <w:sz w:val="20"/>
+              </w:rPr>
+              <w:t>21 channels; 11 at 02:40:21Z and 10 SEN5X channels at 02:36:21Z; notification, previous-value, location and processing limitations explicit</w:t>
+            </w:r>
+          </w:p>
+        </w:tc>
+      </w:tr>
+      <w:tr>
+        <w:trPr>
+          <w:cantSplit/>
+        </w:trPr>
+        <w:tc>
+          <w:tcPr>
+            <w:tcW w:type="dxa" w:w="2880"/>
+            <w:vAlign w:val="center"/>
+            <w:tcBorders>
+              <w:top w:val="single" w:sz="4" w:color="D9D9D9"/>
+              <w:left w:val="single" w:sz="4" w:color="D9D9D9"/>
+              <w:bottom w:val="single" w:sz="4" w:color="D9D9D9"/>
+              <w:right w:val="single" w:sz="4" w:color="D9D9D9"/>
+            </w:tcBorders>
+            <w:tcMar>
+              <w:top w:w="90" w:type="dxa"/>
+              <w:left w:w="90" w:type="dxa"/>
+              <w:bottom w:w="90" w:type="dxa"/>
+              <w:right w:w="90" w:type="dxa"/>
+            </w:tcMar>
+            <w:shd w:fill="FFFFFF"/>
+          </w:tcPr>
+          <w:p>
+            <w:pPr>
+              <w:spacing w:after="40" w:line="247" w:lineRule="auto"/>
+            </w:pPr>
+            <w:r>
+              <w:rPr>
+                <w:sz w:val="20"/>
+              </w:rPr>
+              <w:t>Identity/model</w:t>
+            </w:r>
+          </w:p>
+        </w:tc>
+        <w:tc>
+          <w:tcPr>
+            <w:tcW w:type="dxa" w:w="6912"/>
+            <w:vAlign w:val="center"/>
+            <w:tcBorders>
+              <w:top w:val="single" w:sz="4" w:color="D9D9D9"/>
+              <w:left w:val="single" w:sz="4" w:color="D9D9D9"/>
+              <w:bottom w:val="single" w:sz="4" w:color="D9D9D9"/>
+              <w:right w:val="single" w:sz="4" w:color="D9D9D9"/>
+            </w:tcBorders>
+            <w:tcMar>
+              <w:top w:w="90" w:type="dxa"/>
+              <w:left w:w="90" w:type="dxa"/>
+              <w:bottom w:w="90" w:type="dxa"/>
+              <w:right w:w="90" w:type="dxa"/>
+            </w:tcMar>
+            <w:shd w:fill="FFFFFF"/>
+          </w:tcPr>
+          <w:p>
+            <w:pPr>
+              <w:spacing w:after="40" w:line="247" w:lineRule="auto"/>
+            </w:pPr>
+            <w:r>
+              <w:rPr>
+                <w:sz w:val="20"/>
+              </w:rPr>
+              <w:t>System instance remains distinct from platform registration and reusable SCK2.3 model description</w:t>
+            </w:r>
+          </w:p>
+        </w:tc>
+      </w:tr>
+      <w:tr>
+        <w:trPr>
+          <w:cantSplit/>
+        </w:trPr>
+        <w:tc>
+          <w:tcPr>
+            <w:tcW w:type="dxa" w:w="2880"/>
+            <w:vAlign w:val="center"/>
+            <w:tcBorders>
+              <w:top w:val="single" w:sz="4" w:color="D9D9D9"/>
+              <w:left w:val="single" w:sz="4" w:color="D9D9D9"/>
+              <w:bottom w:val="single" w:sz="4" w:color="D9D9D9"/>
+              <w:right w:val="single" w:sz="4" w:color="D9D9D9"/>
+            </w:tcBorders>
+            <w:tcMar>
+              <w:top w:w="90" w:type="dxa"/>
+              <w:left w:w="90" w:type="dxa"/>
+              <w:bottom w:w="90" w:type="dxa"/>
+              <w:right w:w="90" w:type="dxa"/>
+            </w:tcMar>
+            <w:shd w:fill="F7F7F7"/>
+          </w:tcPr>
+          <w:p>
+            <w:pPr>
+              <w:spacing w:after="40" w:line="247" w:lineRule="auto"/>
+            </w:pPr>
+            <w:r>
+              <w:rPr>
+                <w:sz w:val="20"/>
+              </w:rPr>
+              <w:t>Environmental current results</w:t>
+            </w:r>
+          </w:p>
+        </w:tc>
+        <w:tc>
+          <w:tcPr>
+            <w:tcW w:type="dxa" w:w="6912"/>
+            <w:vAlign w:val="center"/>
+            <w:tcBorders>
+              <w:top w:val="single" w:sz="4" w:color="D9D9D9"/>
+              <w:left w:val="single" w:sz="4" w:color="D9D9D9"/>
+              <w:bottom w:val="single" w:sz="4" w:color="D9D9D9"/>
+              <w:right w:val="single" w:sz="4" w:color="D9D9D9"/>
+            </w:tcBorders>
+            <w:tcMar>
+              <w:top w:w="90" w:type="dxa"/>
+              <w:left w:w="90" w:type="dxa"/>
+              <w:bottom w:w="90" w:type="dxa"/>
+              <w:right w:w="90" w:type="dxa"/>
+            </w:tcMar>
+            <w:shd w:fill="F7F7F7"/>
+          </w:tcPr>
+          <w:p>
+            <w:pPr>
+              <w:spacing w:after="40" w:line="247" w:lineRule="auto"/>
+            </w:pPr>
+            <w:r>
+              <w:rPr>
+                <w:sz w:val="20"/>
+              </w:rPr>
+              <w:t>Temperature, PM2.5, humidity, pressure and A-weighted sound level mapped as environmental observations with unresolved sampling feature/resultTime</w:t>
+            </w:r>
+          </w:p>
+        </w:tc>
+      </w:tr>
+      <w:tr>
+        <w:trPr>
+          <w:cantSplit/>
+        </w:trPr>
+        <w:tc>
+          <w:tcPr>
+            <w:tcW w:type="dxa" w:w="2880"/>
+            <w:vAlign w:val="center"/>
+            <w:tcBorders>
+              <w:top w:val="single" w:sz="4" w:color="D9D9D9"/>
+              <w:left w:val="single" w:sz="4" w:color="D9D9D9"/>
+              <w:bottom w:val="single" w:sz="4" w:color="D9D9D9"/>
+              <w:right w:val="single" w:sz="4" w:color="D9D9D9"/>
+            </w:tcBorders>
+            <w:tcMar>
+              <w:top w:w="90" w:type="dxa"/>
+              <w:left w:w="90" w:type="dxa"/>
+              <w:bottom w:w="90" w:type="dxa"/>
+              <w:right w:w="90" w:type="dxa"/>
+            </w:tcMar>
+            <w:shd w:fill="FFFFFF"/>
+          </w:tcPr>
+          <w:p>
+            <w:pPr>
+              <w:spacing w:after="40" w:line="247" w:lineRule="auto"/>
+            </w:pPr>
+            <w:r>
+              <w:rPr>
+                <w:sz w:val="20"/>
+              </w:rPr>
+              <w:t>Parent-System status</w:t>
+            </w:r>
+          </w:p>
+        </w:tc>
+        <w:tc>
+          <w:tcPr>
+            <w:tcW w:type="dxa" w:w="6912"/>
+            <w:vAlign w:val="center"/>
+            <w:tcBorders>
+              <w:top w:val="single" w:sz="4" w:color="D9D9D9"/>
+              <w:left w:val="single" w:sz="4" w:color="D9D9D9"/>
+              <w:bottom w:val="single" w:sz="4" w:color="D9D9D9"/>
+              <w:right w:val="single" w:sz="4" w:color="D9D9D9"/>
+            </w:tcBorders>
+            <w:tcMar>
+              <w:top w:w="90" w:type="dxa"/>
+              <w:left w:w="90" w:type="dxa"/>
+              <w:bottom w:w="90" w:type="dxa"/>
+              <w:right w:w="90" w:type="dxa"/>
+            </w:tcMar>
+            <w:shd w:fill="FFFFFF"/>
+          </w:tcPr>
+          <w:p>
+            <w:pPr>
+              <w:spacing w:after="40" w:line="247" w:lineRule="auto"/>
+            </w:pPr>
+            <w:r>
+              <w:rPr>
+                <w:sz w:val="20"/>
+              </w:rPr>
+              <w:t>Battery percentage and SD-card code mapped without inventing battery topology, readiness or Boolean health</w:t>
+            </w:r>
+          </w:p>
+        </w:tc>
+      </w:tr>
+      <w:tr>
+        <w:trPr>
+          <w:cantSplit/>
+        </w:trPr>
+        <w:tc>
+          <w:tcPr>
+            <w:tcW w:type="dxa" w:w="2880"/>
+            <w:vAlign w:val="center"/>
+            <w:tcBorders>
+              <w:top w:val="single" w:sz="4" w:color="D9D9D9"/>
+              <w:left w:val="single" w:sz="4" w:color="D9D9D9"/>
+              <w:bottom w:val="single" w:sz="4" w:color="D9D9D9"/>
+              <w:right w:val="single" w:sz="4" w:color="D9D9D9"/>
+            </w:tcBorders>
+            <w:tcMar>
+              <w:top w:w="90" w:type="dxa"/>
+              <w:left w:w="90" w:type="dxa"/>
+              <w:bottom w:w="90" w:type="dxa"/>
+              <w:right w:w="90" w:type="dxa"/>
+            </w:tcMar>
+            <w:shd w:fill="F7F7F7"/>
+          </w:tcPr>
+          <w:p>
+            <w:pPr>
+              <w:spacing w:after="40" w:line="247" w:lineRule="auto"/>
+            </w:pPr>
+            <w:r>
+              <w:rPr>
+                <w:sz w:val="20"/>
+              </w:rPr>
+              <w:t>RSSI</w:t>
+            </w:r>
+          </w:p>
+        </w:tc>
+        <w:tc>
+          <w:tcPr>
+            <w:tcW w:type="dxa" w:w="6912"/>
+            <w:vAlign w:val="center"/>
+            <w:tcBorders>
+              <w:top w:val="single" w:sz="4" w:color="D9D9D9"/>
+              <w:left w:val="single" w:sz="4" w:color="D9D9D9"/>
+              <w:bottom w:val="single" w:sz="4" w:color="D9D9D9"/>
+              <w:right w:val="single" w:sz="4" w:color="D9D9D9"/>
+            </w:tcBorders>
+            <w:tcMar>
+              <w:top w:w="90" w:type="dxa"/>
+              <w:left w:w="90" w:type="dxa"/>
+              <w:bottom w:w="90" w:type="dxa"/>
+              <w:right w:w="90" w:type="dxa"/>
+            </w:tcMar>
+            <w:shd w:fill="F7F7F7"/>
+          </w:tcPr>
+          <w:p>
+            <w:pPr>
+              <w:spacing w:after="40" w:line="247" w:lineRule="auto"/>
+            </w:pPr>
+            <w:r>
+              <w:rPr>
+                <w:sz w:val="20"/>
+              </w:rPr>
+              <w:t>Quantity preserved; observed subject and optional DataStream type remain unresolved instead of forcing System status</w:t>
+            </w:r>
+          </w:p>
+        </w:tc>
+      </w:tr>
+      <w:tr>
+        <w:trPr>
+          <w:cantSplit/>
+        </w:trPr>
+        <w:tc>
+          <w:tcPr>
+            <w:tcW w:type="dxa" w:w="2880"/>
+            <w:vAlign w:val="center"/>
+            <w:tcBorders>
+              <w:top w:val="single" w:sz="4" w:color="D9D9D9"/>
+              <w:left w:val="single" w:sz="4" w:color="D9D9D9"/>
+              <w:bottom w:val="single" w:sz="4" w:color="D9D9D9"/>
+              <w:right w:val="single" w:sz="4" w:color="D9D9D9"/>
+            </w:tcBorders>
+            <w:tcMar>
+              <w:top w:w="90" w:type="dxa"/>
+              <w:left w:w="90" w:type="dxa"/>
+              <w:bottom w:w="90" w:type="dxa"/>
+              <w:right w:w="90" w:type="dxa"/>
+            </w:tcMar>
+            <w:shd w:fill="FFFFFF"/>
+          </w:tcPr>
+          <w:p>
+            <w:pPr>
+              <w:spacing w:after="40" w:line="247" w:lineRule="auto"/>
+            </w:pPr>
+            <w:r>
+              <w:rPr>
+                <w:sz w:val="20"/>
+              </w:rPr>
+              <w:t>Aggregate history</w:t>
+            </w:r>
+          </w:p>
+        </w:tc>
+        <w:tc>
+          <w:tcPr>
+            <w:tcW w:type="dxa" w:w="6912"/>
+            <w:vAlign w:val="center"/>
+            <w:tcBorders>
+              <w:top w:val="single" w:sz="4" w:color="D9D9D9"/>
+              <w:left w:val="single" w:sz="4" w:color="D9D9D9"/>
+              <w:bottom w:val="single" w:sz="4" w:color="D9D9D9"/>
+              <w:right w:val="single" w:sz="4" w:color="D9D9D9"/>
+            </w:tcBorders>
+            <w:tcMar>
+              <w:top w:w="90" w:type="dxa"/>
+              <w:left w:w="90" w:type="dxa"/>
+              <w:bottom w:w="90" w:type="dxa"/>
+              <w:right w:w="90" w:type="dxa"/>
+            </w:tcMar>
+            <w:shd w:fill="FFFFFF"/>
+          </w:tcPr>
+          <w:p>
+            <w:pPr>
+              <w:spacing w:after="40" w:line="247" w:lineRule="auto"/>
+            </w:pPr>
+            <w:r>
+              <w:rPr>
+                <w:sz w:val="20"/>
+              </w:rPr>
+              <w:t>One-hour averages treated as source-platform processing products; processing System/Procedure and exact times remain Phase 4 design questions</w:t>
+            </w:r>
+          </w:p>
+        </w:tc>
+      </w:tr>
+    </w:tbl>
+    <w:p>
+      <w:pPr>
+        <w:spacing w:after="40" w:before="0" w:line="60" w:lineRule="exact"/>
+      </w:pPr>
+    </w:p>
+    <w:p>
+      <w:pPr>
+        <w:pStyle w:val="Heading2"/>
+      </w:pPr>
+      <w:r>
+        <w:rPr/>
         <w:t>Illustrative encoding</w:t>
       </w:r>
     </w:p>
@@ -6112,14 +8624,47 @@
       </w:r>
       <w:r>
         <w:rPr/>
-        <w:t xml:space="preserve"> links the captured temperature channel to the proposed output declaration in Listing 2. The source supplies channel identifier 55, the value 19.82, a Celsius unit reference, an air-temperature definition reference, and the channel's source timestamp (MERLIN Project 2026b, record “smart-citizen-current-19639”). In the underlying model, this is an observation of an environmental property produced by a sensing system, with a result that remains distinct from the system description. MPSS R11 requires the producer, observed subject, and temporal context to remain distinguishable, so the observation cannot become a measurement of the kit merely because the kit reported it (MERLIN Project 2026a, sec. 5.8, R11). R10 also keeps a declared output distinct from the availability of recorded data (MERLIN Project 2026a, sec. 5.8, R10).</w:t>
+        <w:t xml:space="preserve"> now uses the formal frozen temperature channel rather than the preliminary feasibility value. The source supplies sensor catalogue ID 55, value 19.59 ºC, unit definition </w:t>
+      </w:r>
+      <w:r>
+        <w:rPr>
+          <w:rFonts w:ascii="DejaVu Sans Mono" w:hAnsi="DejaVu Sans Mono"/>
+          <w:sz w:val="19"/>
+        </w:rPr>
+        <w:t>https://qudt.org/vocab/unit/DEG_C</w:t>
+      </w:r>
+      <w:r>
+        <w:rPr/>
+        <w:t xml:space="preserve">, air-temperature definition </w:t>
+      </w:r>
+      <w:r>
+        <w:rPr>
+          <w:rFonts w:ascii="DejaVu Sans Mono" w:hAnsi="DejaVu Sans Mono"/>
+          <w:sz w:val="19"/>
+        </w:rPr>
+        <w:t>http://www.eionet.europa.eu/gemet/concept/281</w:t>
+      </w:r>
+      <w:r>
+        <w:rPr/>
+        <w:t xml:space="preserve">, and channel source time </w:t>
+      </w:r>
+      <w:r>
+        <w:rPr>
+          <w:rFonts w:ascii="DejaVu Sans Mono" w:hAnsi="DejaVu Sans Mono"/>
+          <w:sz w:val="19"/>
+        </w:rPr>
+        <w:t>2026-10-25T02:40:21Z</w:t>
+      </w:r>
+      <w:r>
+        <w:rPr/>
+        <w:t xml:space="preserve"> (MERLIN Project 2026k; 2026l). In the underlying model this is an environmental Observation result produced by the sensing System, with the observed subject distinct from that producer. MPSS R10 and R11 therefore keep output/DataStream correspondence, producer, observed subject and temporal context distinguishable.</w:t>
       </w:r>
     </w:p>
     <w:p>
       <w:pPr/>
       <w:r>
         <w:rPr/>
-        <w:t xml:space="preserve">The observation-concept lineage runs through CSAPI to W3C SOSA/SSN: CSAPI explicitly identifies that semantic foundation, while documenting its own adaptations and allowing representations other than RDF (Open Geospatial Consortium 2025a, annex C.1). The individual contributing concepts are </w:t>
+        <w:t xml:space="preserve">The observation-concept lineage runs through CSAPI to SOSA/SSN. </w:t>
       </w:r>
       <w:r>
         <w:rPr>
@@ -6163,7 +8708,7 @@
       </w:r>
       <w:r>
         <w:rPr/>
-        <w:t xml:space="preserve">, and </w:t>
+        <w:t xml:space="preserve"> and </w:t>
       </w:r>
       <w:r>
         <w:rPr>
@@ -6174,91 +8719,25 @@
       </w:r>
       <w:r>
         <w:rPr/>
-        <w:t xml:space="preserve">, which distinguish producer, observation activity, observed property, subject, and outcome (World Wide Web Consortium 2017, secs. 4.3.2, 4.6.2, 4.7.2). CSAPI supplies the DataStream and Observation resources and their associations; its observation </w:t>
+        <w:t xml:space="preserve"> distinguish the producer, observation, property, subject and outcome, while CSAPI supplies the DataStream and Observation resource mechanisms (World Wide Web Consortium 2017; Open Geospatial Consortium 2025a; 2025b). GEMET concept 281 and QUDT </w:t>
       </w:r>
       <w:r>
         <w:rPr>
           <w:rFonts w:ascii="DejaVu Sans Mono" w:hAnsi="DejaVu Sans Mono"/>
           <w:sz w:val="19"/>
         </w:rPr>
-        <w:t>result</w:t>
+        <w:t>DEG_C</w:t>
       </w:r>
       <w:r>
         <w:rPr/>
-        <w:t xml:space="preserve"> corresponds to </w:t>
-      </w:r>
-      <w:r>
-        <w:rPr>
-          <w:rFonts w:ascii="DejaVu Sans Mono" w:hAnsi="DejaVu Sans Mono"/>
-          <w:sz w:val="19"/>
-        </w:rPr>
-        <w:t>sosa:hasResult</w:t>
-      </w:r>
-      <w:r>
-        <w:rPr/>
-        <w:t xml:space="preserve">, and </w:t>
-      </w:r>
-      <w:r>
-        <w:rPr>
-          <w:rFonts w:ascii="DejaVu Sans Mono" w:hAnsi="DejaVu Sans Mono"/>
-          <w:sz w:val="19"/>
-        </w:rPr>
-        <w:t>samplingFeature</w:t>
-      </w:r>
-      <w:r>
-        <w:rPr/>
-        <w:t xml:space="preserve"> corresponds to </w:t>
-      </w:r>
-      <w:r>
-        <w:rPr>
-          <w:rFonts w:ascii="DejaVu Sans Mono" w:hAnsi="DejaVu Sans Mono"/>
-          <w:sz w:val="19"/>
-        </w:rPr>
-        <w:t>sosa:hasFeatureOfInterest</w:t>
-      </w:r>
-      <w:r>
-        <w:rPr/>
-        <w:t xml:space="preserve"> (Open Geospatial Consortium 2025b, secs. 9.2, 9.7). This is an identified conceptual contribution through the standard, rather than an assertion that every SOSA/SSN term or constraint is adopted by the experiment.</w:t>
+        <w:t xml:space="preserve"> are source-carried property/unit vocabularies rather than evidence that those vocabularies historically donated every relevant DIM concept (European Environment Agency 2021; QUDT.org n.d.). The local output name remains an experiment-authored choice.</w:t>
       </w:r>
     </w:p>
     <w:p>
       <w:pPr/>
       <w:r>
         <w:rPr/>
-        <w:t xml:space="preserve">Two further source contributions explain the property and unit: GEMET concept 281 identifies air temperature, and QUDT </w:t>
-      </w:r>
-      <w:r>
-        <w:rPr>
-          <w:rFonts w:ascii="DejaVu Sans Mono" w:hAnsi="DejaVu Sans Mono"/>
-          <w:sz w:val="19"/>
-        </w:rPr>
-        <w:t>unit:DEG_C</w:t>
-      </w:r>
-      <w:r>
-        <w:rPr/>
-        <w:t xml:space="preserve"> identifies degree Celsius (European Environment Agency 2021; QUDT.org n.d.). These are the vocabulary references carried by the native specimen; retaining them does not establish that they were historical donors to every part of the DIM. SWE's Quantity, semantic </w:t>
-      </w:r>
-      <w:r>
-        <w:rPr>
-          <w:rFonts w:ascii="DejaVu Sans Mono" w:hAnsi="DejaVu Sans Mono"/>
-          <w:sz w:val="19"/>
-        </w:rPr>
-        <w:t>definition</w:t>
-      </w:r>
-      <w:r>
-        <w:rPr/>
-        <w:t xml:space="preserve">, and unit-reference mechanisms provide the typed representation, while SensorML's </w:t>
-      </w:r>
-      <w:r>
-        <w:rPr>
-          <w:rFonts w:ascii="DejaVu Sans Mono" w:hAnsi="DejaVu Sans Mono"/>
-          <w:sz w:val="19"/>
-        </w:rPr>
-        <w:t>outputs</w:t>
-      </w:r>
-      <w:r>
-        <w:rPr/>
-        <w:t xml:space="preserve"> member declares the output (Open Geospatial Consortium 2025c, secs. 8.2, 9.1; 2025d, secs. 7.3, 8.2, 9.1). The local name </w:t>
+        <w:t xml:space="preserve">The proposed SensorML output uses a SWE Quantity named </w:t>
       </w:r>
       <w:r>
         <w:rPr>
@@ -6269,7 +8748,36 @@
       </w:r>
       <w:r>
         <w:rPr/>
-        <w:t xml:space="preserve"> and display label remain authored choices, while the final producer identity, sampling subject, observation-time interpretation, and executed CSAPI publication remain to be resolved and tested.</w:t>
+        <w:t xml:space="preserve"> with the source property and unit URIs. Its CSAPI DataStream is type </w:t>
+      </w:r>
+      <w:r>
+        <w:rPr>
+          <w:rFonts w:ascii="DejaVu Sans Mono" w:hAnsi="DejaVu Sans Mono"/>
+          <w:sz w:val="19"/>
+        </w:rPr>
+        <w:t>observation</w:t>
+      </w:r>
+      <w:r>
+        <w:rPr/>
+        <w:t xml:space="preserve">; linked scalar Observations are expected to yield server-derived </w:t>
+      </w:r>
+      <w:r>
+        <w:rPr>
+          <w:rFonts w:ascii="DejaVu Sans Mono" w:hAnsi="DejaVu Sans Mono"/>
+          <w:sz w:val="19"/>
+        </w:rPr>
+        <w:t>resultType=measure</w:t>
+      </w:r>
+      <w:r>
+        <w:rPr/>
+        <w:t>, rather than the adapter authoring that summary field directly (Open Geospatial Consortium 2025b, sec. 9.2). The channel timestamp is retained as the source-recorded observation time and a candidate phenomenonTime, but the source supplies no separate resultTime. No SamplingFeature is created merely to satisfy the target graph.</w:t>
+      </w:r>
+    </w:p>
+    <w:p>
+      <w:pPr/>
+      <w:r>
+        <w:rPr/>
+        <w:t>Presentation may show the source-reported temperature, unit, property meaning, producer and channel time while stating that the environmental sampling subject is not independently identified. It must not call 19.59 ºC “device temperature,” replace the channel time with the Device's latest time, or use acquisition time as an observation time. These are semantic-preservation requirements, not layout preferences.</w:t>
       </w:r>
     </w:p>
     <w:p>
@@ -6296,54 +8804,221 @@
       </w:r>
       <w:r>
         <w:rPr/>
-        <w:t xml:space="preserve"> concerns the source-reported remaining battery level of 99 percent, not a demonstrated physical power arrangement (MERLIN Project 2026b, record “smart-citizen-current-19639”). The underlying model distinguishes a reported property from an identified power-source entity and from a relationship describing which equipment it supplies. MPSS R17 preserves the quantity, subject, measurement point, time, and reading-versus-estimate meaning, while R11 preserves producer-versus-subject context (MERLIN Project 2026a, secs. 5.8, 5.10). Its Sensor, Observation, ObservableProperty, FeatureOfInterest, and Result distinctions follow the same SOSA/SSN lineage explained for </w:t>
+        <w:t xml:space="preserve"> uses the formal 99 percent result at </w:t>
       </w:r>
       <w:r>
         <w:rPr>
           <w:rFonts w:ascii="DejaVu Sans Mono" w:hAnsi="DejaVu Sans Mono"/>
           <w:sz w:val="19"/>
         </w:rPr>
-        <w:t>SC-TEMP-01</w:t>
+        <w:t>2026-10-25T02:40:21Z</w:t>
       </w:r>
       <w:r>
         <w:rPr/>
-        <w:t xml:space="preserve"> (World Wide Web Consortium 2017, secs. 4.3.2, 4.6.2, 4.7.2; Open Geospatial Consortium 2025a, annex C.1). A percent-scaled SWE Quantity within a CSAPI stream/observation representation is a proposed carrier, but the exact property definition and observation contract still require a completed mapping record (Open Geospatial Consortium 2025b, secs. 9.2, 9.6–9.7; 2025d, secs. 8.2.8, 9.1.9).</w:t>
+        <w:t xml:space="preserve"> and Smart Citizen Measurement 7, whose definition is the SCK remaining battery level in percentage (MERLIN Project 2026k; 2026l). Under the paper's telemetry definition, this is remotely transmitted parent-System power/status telemetry, not evidence of a separately identified battery. MPSS R17 preserves the changing value and observed subject, while R16 is not instantiated because no battery identity, Power Interface or source-to-consumer relationship is supplied. A status DataStream is therefore defensible because the property is explicitly about the parent SCK itself (Open Geospatial Consortium 2025b, sec. 9.2; Scholl and Suloway 2023).</w:t>
       </w:r>
     </w:p>
     <w:p>
       <w:pPr/>
       <w:r>
         <w:rPr/>
-        <w:t>RFC 7326 contributes distinct power-source, metering, and aggregation relationship concepts; its Power Source Relationship concerns the energy-supply interconnection (Parello et al. 2014, secs. 6.6, 8.1–8.3). In this mapping, those concepts constrain interpretation by explaining why a battery percentage does not itself establish a supply edge. R16's OGC relationship binding is authored by MERLIN, so any later topology mapping must identify the reused RFC meaning and assess the binding's adaptations separately (MERLIN Project 2026a, sec. 5.10, R16). The present percentage mapping does not instantiate any of these three relationship concepts, and the paper will report that absence explicitly.</w:t>
-      </w:r>
-    </w:p>
-    <w:p>
-      <w:pPr/>
-      <w:r>
-        <w:rPr/>
-        <w:t xml:space="preserve">RFC 7577 supplies separate battery-monitoring concepts, including </w:t>
+        <w:t xml:space="preserve">RFC 7326 contributes power-source and metering concepts that constrain against inventing supply topology, and RFC 7577 defines battery objects such as actual charge and actual voltage whose units and meanings are not equivalent to a percentage (Parello et al. 2014; Quittek et al. 2015). The proposed SWE Quantity uses local name </w:t>
       </w:r>
       <w:r>
         <w:rPr>
           <w:rFonts w:ascii="DejaVu Sans Mono" w:hAnsi="DejaVu Sans Mono"/>
           <w:sz w:val="19"/>
         </w:rPr>
-        <w:t>batteryActualCharge</w:t>
+        <w:t>batteryLevel</w:t>
       </w:r>
       <w:r>
         <w:rPr/>
-        <w:t xml:space="preserve"> in milliampere hours and </w:t>
+        <w:t xml:space="preserve">, source unit code </w:t>
       </w:r>
       <w:r>
         <w:rPr>
           <w:rFonts w:ascii="DejaVu Sans Mono" w:hAnsi="DejaVu Sans Mono"/>
           <w:sz w:val="19"/>
         </w:rPr>
-        <w:t>batteryActualVoltage</w:t>
+        <w:t>%</w:t>
       </w:r>
       <w:r>
         <w:rPr/>
-        <w:t xml:space="preserve"> in millivolts (Quittek et al. 2015, sec. 4). Neither quantity is established by a percentage alone, so this mapping has no demonstrated equivalence to either individual MIB object. The RFC is used here to test and reject unsupported substitutions, rather than to claim a directly reused battery-field definition. The proposed display therefore retains the supplier's percentage and its evidence limits without adding charge in milliampere hours, voltage, runtime, battery identity, or charging state.</w:t>
+        <w:t xml:space="preserve">, and the resolvable source concept </w:t>
+      </w:r>
+      <w:r>
+        <w:rPr>
+          <w:rFonts w:ascii="DejaVu Sans Mono" w:hAnsi="DejaVu Sans Mono"/>
+          <w:sz w:val="19"/>
+        </w:rPr>
+        <w:t>https://api.smartcitizen.me/v0/measurements/7</w:t>
+      </w:r>
+      <w:r>
+        <w:rPr/>
+        <w:t xml:space="preserve"> as an experiment-authored semantic definition. Linked scalar Observations are expected to yield server-derived </w:t>
+      </w:r>
+      <w:r>
+        <w:rPr>
+          <w:rFonts w:ascii="DejaVu Sans Mono" w:hAnsi="DejaVu Sans Mono"/>
+          <w:sz w:val="19"/>
+        </w:rPr>
+        <w:t>resultType=measure</w:t>
+      </w:r>
+      <w:r>
+        <w:rPr/>
+        <w:t>. The source still supplies no separate resultTime.</w:t>
+      </w:r>
+    </w:p>
+    <w:p>
+      <w:pPr/>
+      <w:r>
+        <w:rPr/>
+        <w:t>The display may say “source-reported SCK remaining battery level: 99%” and show its source time. It must not add charge in mAh, voltage, remaining runtime, charging state, a separate battery identity, a supply edge or readiness judgment. This preserved absence is part of the result rather than a missing-value defect.</w:t>
+      </w:r>
+    </w:p>
+    <w:p>
+      <w:pPr>
+        <w:pStyle w:val="Heading2"/>
+      </w:pPr>
+      <w:r>
+        <w:rPr/>
+        <w:t>RSSI classification correction</w:t>
+      </w:r>
+    </w:p>
+    <w:p>
+      <w:pPr/>
+      <w:r>
+        <w:rPr/>
+        <w:t xml:space="preserve">The Phase 3 review changed the earlier proposed classification of </w:t>
+      </w:r>
+      <w:r>
+        <w:rPr>
+          <w:rFonts w:ascii="DejaVu Sans Mono" w:hAnsi="DejaVu Sans Mono"/>
+          <w:sz w:val="19"/>
+        </w:rPr>
+        <w:t>SC-RSSI-01</w:t>
+      </w:r>
+      <w:r>
+        <w:rPr/>
+        <w:t xml:space="preserve">. Smart Citizen defines RSSI as power present in a received radio signal, but the frozen source does not independently identify whether the observed subject is the parent System, an embedded Wi-Fi subsystem/interface, or the received signal/link context (Smart Citizen n.d.-d; MERLIN Project 2026l). OGC reserves DataStream type </w:t>
+      </w:r>
+      <w:r>
+        <w:rPr>
+          <w:rFonts w:ascii="DejaVu Sans Mono" w:hAnsi="DejaVu Sans Mono"/>
+          <w:sz w:val="19"/>
+        </w:rPr>
+        <w:t>status</w:t>
+      </w:r>
+      <w:r>
+        <w:rPr/>
+        <w:t xml:space="preserve"> for observations of the parent System or its subsystems and </w:t>
+      </w:r>
+      <w:r>
+        <w:rPr>
+          <w:rFonts w:ascii="DejaVu Sans Mono" w:hAnsi="DejaVu Sans Mono"/>
+          <w:sz w:val="19"/>
+        </w:rPr>
+        <w:t>observation</w:t>
+      </w:r>
+      <w:r>
+        <w:rPr/>
+        <w:t xml:space="preserve"> for other features of interest, so equipment context alone does not settle the type (Open Geospatial Consortium 2025b, sec. 9.2). The Phase 3 design therefore leaves the optional DataStream </w:t>
+      </w:r>
+      <w:r>
+        <w:rPr>
+          <w:rFonts w:ascii="DejaVu Sans Mono" w:hAnsi="DejaVu Sans Mono"/>
+          <w:sz w:val="19"/>
+        </w:rPr>
+        <w:t>type</w:t>
+      </w:r>
+      <w:r>
+        <w:rPr/>
+        <w:t xml:space="preserve"> unset until Phase 4 resolves the subject.</w:t>
+      </w:r>
+    </w:p>
+    <w:p>
+      <w:pPr/>
+      <w:r>
+        <w:rPr/>
+        <w:t xml:space="preserve">The value remains a SWE Quantity with source-concept definition </w:t>
+      </w:r>
+      <w:r>
+        <w:rPr>
+          <w:rFonts w:ascii="DejaVu Sans Mono" w:hAnsi="DejaVu Sans Mono"/>
+          <w:sz w:val="19"/>
+        </w:rPr>
+        <w:t>https://api.smartcitizen.me/v0/measurements/78</w:t>
+      </w:r>
+      <w:r>
+        <w:rPr/>
+        <w:t xml:space="preserve">. The native unit lexeme </w:t>
+      </w:r>
+      <w:r>
+        <w:rPr>
+          <w:rFonts w:ascii="DejaVu Sans Mono" w:hAnsi="DejaVu Sans Mono"/>
+          <w:sz w:val="19"/>
+        </w:rPr>
+        <w:t>dBm</w:t>
+      </w:r>
+      <w:r>
+        <w:rPr/>
+        <w:t xml:space="preserve"> is preserved; QUDT </w:t>
+      </w:r>
+      <w:r>
+        <w:rPr>
+          <w:rFonts w:ascii="DejaVu Sans Mono" w:hAnsi="DejaVu Sans Mono"/>
+          <w:sz w:val="19"/>
+        </w:rPr>
+        <w:t>DeciB-MilliW</w:t>
+      </w:r>
+      <w:r>
+        <w:rPr/>
+        <w:t xml:space="preserve"> is a possible experiment-authored unit normalization because it represents a decibel level referenced to one milliwatt, but Smart Citizen did not supply that URI (QUDT.org 2026). MPSS R13 continues to constrain the interpretation: RSSI is not interface operational status, enabled state, reachability or a directed network link. Presentation therefore reports source RSSI without inventing “Wi-Fi health,” “link up” or signal-quality thresholds.</w:t>
+      </w:r>
+    </w:p>
+    <w:p>
+      <w:pPr>
+        <w:pStyle w:val="Heading2"/>
+      </w:pPr>
+      <w:r>
+        <w:rPr/>
+        <w:t>Aggregate-history mappings</w:t>
+      </w:r>
+    </w:p>
+    <w:p>
+      <w:pPr/>
+      <w:r>
+        <w:rPr/>
+        <w:t xml:space="preserve">The one-hour average temperature and PM2.5 series are now explicit Phase 3 mappings rather than deferred examples. Smart Citizen documents the rollup and grouping function, and the inspected implementation shows source-platform aggregation through Kairos; the derived averages therefore have processing provenance that must not be attributed to the physical SCK (Smart Citizen n.d.-d; 2026; MERLIN Project 2026l). OGC permits a process System with </w:t>
+      </w:r>
+      <w:r>
+        <w:rPr>
+          <w:rFonts w:ascii="DejaVu Sans Mono" w:hAnsi="DejaVu Sans Mono"/>
+          <w:sz w:val="19"/>
+        </w:rPr>
+        <w:t>assetType=Process</w:t>
+      </w:r>
+      <w:r>
+        <w:rPr/>
+        <w:t xml:space="preserve">, an associated Procedure, and a derived Property that references a </w:t>
+      </w:r>
+      <w:r>
+        <w:rPr>
+          <w:rFonts w:ascii="DejaVu Sans Mono" w:hAnsi="DejaVu Sans Mono"/>
+          <w:sz w:val="19"/>
+        </w:rPr>
+        <w:t>baseProperty</w:t>
+      </w:r>
+      <w:r>
+        <w:rPr/>
+        <w:t xml:space="preserve"> and optionally a statistic (Open Geospatial Consortium 2025a, secs. 9, 15). The Phase 3 design uses those mechanisms conceptually while leaving exact UIDs and server-supported request structures for Phase 4.</w:t>
+      </w:r>
+    </w:p>
+    <w:p>
+      <w:pPr/>
+      <w:r>
+        <w:rPr/>
+        <w:t>The temperature response reports 1,439 readings examined and the PM2.5 response 288, even though both return 24 one-hour aggregate tuples. Those response-wide counts remain query/processing provenance and are not copied into each aggregate as per-bin sample counts. Returned tuple timestamps are preserved exactly, and no nominal one-hour phenomenon interval or separate resultTime is invented from the request spelling. If the target server cannot preserve the processing distinction without distortion, omitting the aggregate products from the first load is preferable to presenting them as direct physical-kit output.</w:t>
       </w:r>
     </w:p>
     <w:p>
@@ -7261,7 +9936,7 @@
       </w:pPr>
       <w:r>
         <w:rPr/>
-        <w:t>7 Integration and evaluation protocol</w:t>
+        <w:t>8 Integration and evaluation protocol</w:t>
       </w:r>
     </w:p>
     <w:p>
@@ -7277,14 +9952,14 @@
       <w:pPr/>
       <w:r>
         <w:rPr/>
-        <w:t>Before execution, the team will reassess registration 19639 for sufficiently recent data and document any reason for choosing a different public registration. Polling, caching, and retry behavior will follow the source's documented and observed behavior. Repeated retrieval of the same old observation will not make it new. The adapter will preserve acquisition time separately from source time and will document its duplicate-handling policy.</w:t>
+        <w:t>The formal Phase 1 specimen is already frozen and remains the deterministic mapping/replay baseline. Before a later live adapter run, the team will reassess registration 19639 for sufficiently recent data and document any reason for choosing a different live source while retaining the frozen specimen for comparison. Polling, caching and retry behavior will follow documented and observed source behavior, and repeated retrieval of an old observation will not make it new. The adapter will preserve acquisition time separately from source time and document duplicate handling.</w:t>
       </w:r>
     </w:p>
     <w:p>
       <w:pPr/>
       <w:r>
         <w:rPr/>
-        <w:t>The selected CSAPI service will be checked for the required resource creation and retrieval capabilities. Only the chosen supported interfaces will be used, and the actual endpoint and version will be recorded in the execution record. A source sample will then be followed through capture, normalized representation, service response, and client display. Server acceptance establishes one part of that chain; it does not establish full semantic correctness (Open Geospatial Consortium 2025a; 2025b).</w:t>
+        <w:t>The selected CSAPI service will be checked for the required resource creation and retrieval capabilities. Only the chosen supported interfaces will be used, and the actual endpoint and version will be recorded in the execution record. A source sample will then be followed through capture, mapped representation, service response, and client display. Server acceptance establishes one part of that chain; it does not establish full semantic correctness (Open Geospatial Consortium 2025a; 2025b).</w:t>
       </w:r>
     </w:p>
     <w:p>
@@ -7872,7 +10547,7 @@
       </w:pPr>
       <w:r>
         <w:rPr/>
-        <w:t>8 Interface comparison and figure protocol</w:t>
+        <w:t>9 Interface comparison and figure protocol</w:t>
       </w:r>
     </w:p>
     <w:p>
@@ -7945,7 +10620,7 @@
       </w:r>
       <w:r>
         <w:rPr/>
-        <w:t xml:space="preserve"> The first-party onboarding documentation presents this screen immediately after instructing a user to visit a newly publishing Kit and scroll down for basic exploration (Smart Citizen n.d.-e). The historical example shows kit page 14410, a device-level header with a 44 percent battery indication and last-data-received time, a horizontal strip of current light, noise, air-temperature, humidity, pressure, and particulate measurements, and a selected PM2.5 detail with property explanation, date controls, and a time-series graph. The visible data are dated 14 July 2021 and are not observations from registration 19639 or evidence that the current production interface is pixel-identical. The source pixels are reproduced unchanged from Smart Citizen's documentation and their provenance and published rights notices are retained with the study figures (MERLIN Project 2026j).</w:t>
+        <w:t xml:space="preserve"> The first-party onboarding documentation presents this screen immediately after instructing a user to visit a newly publishing Kit and scroll down for basic exploration (Smart Citizen n.d.-e). The historical example shows kit page 14410, a device-level header with a 44 percent battery indication and last-data-received time, a horizontal strip of current light, noise, air-temperature, humidity, pressure, and particulate measurements, and a selected PM2.5 detail with property explanation, date controls, and a time-series graph. The visible data are dated 14 July 2021 and are not observations from registration 19639 or evidence that the current production interface is pixel-identical. The source pixels are reproduced unchanged from Smart Citizen's documentation and their source provenance and separate published rights notices are retained with the study figures (MERLIN Project 2026j).</w:t>
       </w:r>
     </w:p>
     <w:p>
@@ -9839,34 +12514,28 @@
       </w:pPr>
       <w:r>
         <w:rPr/>
-        <w:t>9 Results to be reported</w:t>
+        <w:t>10 Results to be reported</w:t>
       </w:r>
     </w:p>
     <w:p>
       <w:pPr/>
       <w:r>
-        <w:rPr>
-          <w:b/>
-        </w:rPr>
-        <w:t>The proposed adapter, CSAPI loading, live integration, and comparative evaluation have not been executed as part of this study.</w:t>
-      </w:r>
-      <w:r>
         <w:rPr/>
-        <w:t xml:space="preserve"> No experimental success rate, task-time improvement, or user outcome is reported in version 0.6. The public access observations in section 5 and the historical vendor UI evidence in section 8 establish feasibility and presentation context; neither is a matched experimental result.</w:t>
+        <w:t>Phases 1–3 now provide reportable source and mapping results, but the end-to-end integration remains incomplete. The experiment has frozen a complete formal Device specimen and two bounded histories, characterized all 21 current channels and their identity/time semantics, and reviewed nine current-state plus two aggregate-history mappings (MERLIN Project 2026k; 2026l). It has also recorded corrections discovered by review, including the source-processing provenance wording, notification-setting false friend, 11+10 timing cohorts and RSSI DataStream-type overreach. No adapter success rate, CSAPI interoperability claim, connected Glaux result, task-time improvement or user outcome is reported.</w:t>
       </w:r>
     </w:p>
     <w:p>
       <w:pPr/>
       <w:r>
         <w:rPr/>
-        <w:t>The results section will be completed in three parts. First, acquisition and integration results will identify the actual versions, selected records, publication/retrieval outcomes, and failures. Second, semantic and coverage results will account for every selected assertion and relevant relationship, with source limitations distinguished from implementation defects. Third, presentation results will connect the matched figures to the predefined operator questions and document where profile-aware organization helped, made no difference, or introduced a problem.</w:t>
+        <w:t>The reviewed mappings demonstrate several negative results that are themselves meaningful. A Smart Citizen registration UUID is not established as a manufacturer serial; a shared Sensor catalogue parent is not an installed-component serial; battery percentage does not establish battery identity or supply topology; RSSI does not establish interface/link status; and SD-card code 0 cannot be simplified to a Boolean health state. The aggregate histories also show that semantic preservation includes processing provenance, because the source platform produced the one-hour averages and their response-wide sample counts. These findings narrow what a correct Phase 4 resource graph may claim.</w:t>
       </w:r>
     </w:p>
     <w:p>
       <w:pPr/>
       <w:r>
         <w:rPr/>
-        <w:t>The expected reporting structure does not presume a favorable outcome. An accurate generic presentation may answer a task as well as the profile-aware condition. A proposed binding may prove unnecessary or insufficient. Those findings would inform the model and PBI rather than invalidate the experiment's purpose.</w:t>
+        <w:t>The remaining results will be produced in later phases. First, Phase 4 must turn the reviewed mappings into a resource graph and executable identity/subject/time decisions; later phases will record adapter outputs, server create/retrieve behavior, Glaux traversal and the matched generic/profile-aware presentation. Each later result will remain tied to the frozen specimen or a separately identified live acquisition rather than silently replacing the evidence baseline. The reporting structure continues to permit an accurate generic presentation or an unfavorable profile result.</w:t>
       </w:r>
     </w:p>
     <w:p>
@@ -9875,21 +12544,21 @@
       </w:pPr>
       <w:r>
         <w:rPr/>
-        <w:t>10 Discussion and limitations</w:t>
+        <w:t>11 Discussion and limitations</w:t>
       </w:r>
     </w:p>
     <w:p>
       <w:pPr/>
       <w:r>
         <w:rPr/>
-        <w:t>The immediate public-data case is strongest for measurements, descriptions, source context, and integration provenance. It is weaker for unit-specific physical composition, operating configuration, deployment history, power topology, and maintenance. More readings can enrich temporal evidence without filling those missing relationships. Documentary model enrichment must not be presented as observation of a particular installation (MERLIN Project 2026a; 2026b; Smart Citizen n.d.-c).</w:t>
+        <w:t>The immediate public-data case is strongest for reported quantities, source-platform descriptions, source context, telemetry and integration provenance. It remains weaker for unit-specific physical composition, operating configuration, deployment history, power topology and maintenance, and more readings cannot fill those missing relationships by themselves. Documentary model enrichment must not be presented as observation of the particular installation, while source-platform processing must not be presented as direct physical-sensor output (MERLIN Project 2026a; 2026k; 2026l). The terminology baseline helps keep those boundaries explicit.</w:t>
       </w:r>
     </w:p>
     <w:p>
       <w:pPr/>
       <w:r>
         <w:rPr/>
-        <w:t>The selected source may change its fields, permissions, or availability. The research captures are limited in scope, and not every original response body was archived. Timestamp semantics and historical location applicability require verification. The example cannot establish general performance across all sensor families, operational conditions, or users. A later independent producer can test transfer, while an owned kit can address physical evidence gaps; these are different extensions.</w:t>
+        <w:t>The formal Phase 1 capture archives the complete Device body plus the two selected history bodies, but it is still only one bounded specimen and did not freeze every possible endpoint or production-version indicator. The selected source may change its fields, permissions, processing code or availability, and the inspected Smart Citizen source revision is not independently proven to be the exact production revision (Smart Citizen 2026). Timestamp semantics, aggregate interval boundaries and historical location applicability retain explicit uncertainties. A later independent producer can test transfer, while an owned kit can address physical evidence gaps; these are different extensions.</w:t>
       </w:r>
     </w:p>
     <w:p>
@@ -9905,7 +12574,7 @@
       </w:pPr>
       <w:r>
         <w:rPr/>
-        <w:t>11 Reproducibility and document maintenance</w:t>
+        <w:t>12 Reproducibility and document maintenance</w:t>
       </w:r>
     </w:p>
     <w:p>
@@ -9933,7 +12602,7 @@
       <w:pPr/>
       <w:r>
         <w:rPr/>
-        <w:t>The existing fourteen imported project artifacts retain their versions and bytes. This paper is a new research artifact. Its mapping choices and findings will be reconciled into the appropriate PBI, wireframe, profile, and DIM records when supported; publication of a research draft does not silently amend those baselines. The next paper revision should add the initial mapping record and actual execution evidence, including the first trace through the selected CSAPI service.</w:t>
+        <w:t>The existing fourteen imported project artifacts retain their versions and bytes. This paper is a new research artifact. Its mapping choices and findings will be reconciled into the appropriate PBI, wireframe, profile, and DIM records when supported; publication of a research draft does not silently amend those baselines. The next paper revision should add the Phase 4 resource graph and, only after its review gate, actual execution evidence from the first adapter/CSAPI trace.</w:t>
       </w:r>
     </w:p>
     <w:p>
@@ -9942,14 +12611,21 @@
       </w:pPr>
       <w:r>
         <w:rPr/>
-        <w:t>12 Conclusion</w:t>
+        <w:t>13 Conclusion</w:t>
       </w:r>
     </w:p>
     <w:p>
       <w:pPr/>
       <w:r>
         <w:rPr/>
-        <w:t>This protocol establishes a way to test whether a standards-grounded description of a sensing system remains useful after integration. The first case will combine public Smart Citizen readings with source definitions, documented model information, and explicit integration provenance. Its value will be assessed through traceable meaning, stated domain coverage, and observable operator tasks. The paper is prepared to accumulate both successful mappings and counterexamples as the experiment proceeds.</w:t>
+        <w:t>This study has moved from a proposed source assessment to a reviewed Phase 1–3 evidence baseline. A formal Smart Citizen specimen is frozen, its native identities, channel times, status/configuration distinctions and processing limitations are characterized, and the representative mapping set now includes both current results and source-platform aggregate products. The review also demonstrated why shared terminology matters: telemetry is not static metadata, provenance includes processing and integration history, and a code label containing “calibrated” does not establish formal calibration. These corrections occurred before target resource design, where they can constrain implementation rather than be discovered after it.</w:t>
+      </w:r>
+    </w:p>
+    <w:p>
+      <w:pPr/>
+      <w:r>
+        <w:rPr/>
+        <w:t>The next question is no longer whether a real source can be acquired or whether a plausible mapping can be sketched. It is whether the reviewed meanings can be represented as a defensible CSAPI resource graph without inventing identity, subject, time or provenance. That is the Phase 4 question, and this paper intentionally pauses before it for owner review. Later integration and presentation results will be evaluated against this reviewed baseline rather than against assumptions reconstructed after the fact.</w:t>
       </w:r>
     </w:p>
     <w:p>
@@ -10041,17 +12717,17 @@
       </w:pPr>
       <w:r>
         <w:rPr/>
-        <w:t xml:space="preserve">MERLIN Project. 2026a. </w:t>
+        <w:t xml:space="preserve">Joint Committee for Guides in Metrology. 2012. </w:t>
       </w:r>
       <w:r>
         <w:rPr>
           <w:i/>
         </w:rPr>
-        <w:t>Managed Physical Sensing Systems and Deployments: Profile Scope, Content Outline and Integrated Binding Draft</w:t>
+        <w:t>International Vocabulary of Metrology—Basic and General Concepts and Associated Terms (VIM)</w:t>
       </w:r>
       <w:r>
         <w:rPr/>
-        <w:t>. Version 0.3.5. October 17. Project working draft. https://github.com/OS4CSAPI/glaux-client/blob/1a24fdff71ef801d9b326d2b42a63743db737a8e/Docs/Design/MPSS/MERLIN_Managed_Physical_Sensing_Systems_Profile_Integrated_Binding_Draft_v0.3.5_17OCT2026.docx.</w:t>
+        <w:t>. 3rd ed., 2008 version with minor corrections. JCGM 200:2012. https://doi.org/10.59161/JCGM200-2012.</w:t>
       </w:r>
     </w:p>
     <w:p>
@@ -10060,7 +12736,17 @@
       </w:pPr>
       <w:r>
         <w:rPr/>
-        <w:t>MERLIN Project. 2026b. “Open Sensor Candidate Access Observations.” October 24. Research evidence record, schema version 1. https://github.com/OS4CSAPI/glaux-client/blob/1a24fdff71ef801d9b326d2b42a63743db737a8e/Docs/Research/Evidence/OPEN_SENSOR_ACCESS_2026-10-24.json.</w:t>
+        <w:t xml:space="preserve">MERLIN Project. 2026a. </w:t>
+      </w:r>
+      <w:r>
+        <w:rPr>
+          <w:i/>
+        </w:rPr>
+        <w:t>Managed Physical Sensing Systems and Deployments: Profile Scope, Content Outline and Integrated Binding Draft</w:t>
+      </w:r>
+      <w:r>
+        <w:rPr/>
+        <w:t>. Version 0.3.5. October 17. Project working draft. https://github.com/OS4CSAPI/glaux-client/blob/1a24fdff71ef801d9b326d2b42a63743db737a8e/Docs/Design/MPSS/MERLIN_Managed_Physical_Sensing_Systems_Profile_Integrated_Binding_Draft_v0.3.5_17OCT2026.docx.</w:t>
       </w:r>
     </w:p>
     <w:p>
@@ -10069,7 +12755,7 @@
       </w:pPr>
       <w:r>
         <w:rPr/>
-        <w:t>MERLIN Project. 2026c. “Open Sensor Candidates for MERLIN DIM and MPSS Experiments.” October 24. Research report. https://github.com/OS4CSAPI/glaux-client/blob/1a24fdff71ef801d9b326d2b42a63743db737a8e/Docs/Research/Reports/OPEN_SENSOR_CANDIDATES_2026-10-24.md.</w:t>
+        <w:t>MERLIN Project. 2026b. “Open Sensor Candidate Access Observations.” October 24. Research evidence record, schema version 1. https://github.com/OS4CSAPI/glaux-client/blob/1a24fdff71ef801d9b326d2b42a63743db737a8e/Docs/Research/Evidence/OPEN_SENSOR_ACCESS_2026-10-24.json.</w:t>
       </w:r>
     </w:p>
     <w:p>
@@ -10078,7 +12764,7 @@
       </w:pPr>
       <w:r>
         <w:rPr/>
-        <w:t>MERLIN Project. 2026d. “Resource Details Wireframe Template.” October 24. Design and implementation record. https://github.com/OS4CSAPI/glaux-client/blob/1a24fdff71ef801d9b326d2b42a63743db737a8e/Docs/Design/RESOURCE_DETAILS_TEMPLATE.md.</w:t>
+        <w:t>MERLIN Project. 2026c. “Open Sensor Candidates for MERLIN DIM and MPSS Experiments.” October 24. Research report. https://github.com/OS4CSAPI/glaux-client/blob/1a24fdff71ef801d9b326d2b42a63743db737a8e/Docs/Research/Reports/OPEN_SENSOR_CANDIDATES_2026-10-24.md.</w:t>
       </w:r>
     </w:p>
     <w:p>
@@ -10087,7 +12773,7 @@
       </w:pPr>
       <w:r>
         <w:rPr/>
-        <w:t>MERLIN Project. 2026e. “Smart Citizen Experiment Plan.” October 24. Proposed experiment plan. https://github.com/OS4CSAPI/glaux-client/blob/1a24fdff71ef801d9b326d2b42a63743db737a8e/Docs/Plans/SMART_CITIZEN_EXPERIMENT_PLAN.md.</w:t>
+        <w:t>MERLIN Project. 2026d. “Resource Details Wireframe Template.” October 24. Design and implementation record. https://github.com/OS4CSAPI/glaux-client/blob/1a24fdff71ef801d9b326d2b42a63743db737a8e/Docs/Design/RESOURCE_DETAILS_TEMPLATE.md.</w:t>
       </w:r>
     </w:p>
     <w:p>
@@ -10096,7 +12782,7 @@
       </w:pPr>
       <w:r>
         <w:rPr/>
-        <w:t>MERLIN Project. 2026f. “52°North connected-systems-pygeoapi Experimental Server Baseline.” October 24. Research evidence record. https://github.com/OS4CSAPI/glaux-client/blob/work/details-view-20261023/Docs/Research/Evidence/PYGEOAPI_SERVER_BASELINE_2026-10-24.md.</w:t>
+        <w:t>MERLIN Project. 2026e. “Smart Citizen Experiment Plan.” October 24. Proposed experiment plan. https://github.com/OS4CSAPI/glaux-client/blob/1a24fdff71ef801d9b326d2b42a63743db737a8e/Docs/Plans/SMART_CITIZEN_EXPERIMENT_PLAN.md.</w:t>
       </w:r>
     </w:p>
     <w:p>
@@ -10105,7 +12791,7 @@
       </w:pPr>
       <w:r>
         <w:rPr/>
-        <w:t>MERLIN Project. 2026g. “Glaux Client Selection and Experimental Architecture Baseline.” October 24. Research evidence record. https://github.com/OS4CSAPI/glaux-client/blob/work/details-view-20261023/Docs/Research/Evidence/GLAUX_CLIENT_BASELINE_2026-10-24.md.</w:t>
+        <w:t>MERLIN Project. 2026f. “52°North connected-systems-pygeoapi Experimental Server Baseline.” October 24. Research evidence record. https://github.com/OS4CSAPI/glaux-client/blob/work/details-view-20261023/Docs/Research/Evidence/PYGEOAPI_SERVER_BASELINE_2026-10-24.md.</w:t>
       </w:r>
     </w:p>
     <w:p>
@@ -10114,7 +12800,7 @@
       </w:pPr>
       <w:r>
         <w:rPr/>
-        <w:t>MERLIN Project. 2026h. “Dependency Provenance and Reproducibility.” October 23. Project dependency record. https://github.com/OS4CSAPI/glaux-client/blob/work/details-view-20261023/Docs/DEPENDENCIES.md.</w:t>
+        <w:t>MERLIN Project. 2026g. “Glaux Client Selection and Experimental Architecture Baseline.” October 24. Research evidence record. https://github.com/OS4CSAPI/glaux-client/blob/work/details-view-20261023/Docs/Research/Evidence/GLAUX_CLIENT_BASELINE_2026-10-24.md.</w:t>
       </w:r>
     </w:p>
     <w:p>
@@ -10123,7 +12809,7 @@
       </w:pPr>
       <w:r>
         <w:rPr/>
-        <w:t>MERLIN Project. 2026i. “Cloudflare Deployment Continuation.” October 24. Deployment record. https://github.com/OS4CSAPI/glaux-client/blob/work/details-view-20261023/Docs/Plans/CLOUDFLARE_DEPLOYMENT.md.</w:t>
+        <w:t>MERLIN Project. 2026h. “Dependency Provenance and Reproducibility.” October 23. Project dependency record. https://github.com/OS4CSAPI/glaux-client/blob/work/details-view-20261023/Docs/DEPENDENCIES.md.</w:t>
       </w:r>
     </w:p>
     <w:p>
@@ -10132,7 +12818,7 @@
       </w:pPr>
       <w:r>
         <w:rPr/>
-        <w:t>MERLIN Project. 2026j. “Smart Citizen Vendor Presentation Baseline.” October 24. Research evidence record. https://github.com/OS4CSAPI/glaux-client/blob/work/details-view-20261023/Docs/Research/Evidence/SMART_CITIZEN_VENDOR_UI_BASELINE_2026-10-24.md.</w:t>
+        <w:t>MERLIN Project. 2026i. “Cloudflare Deployment Continuation.” October 24. Deployment record. https://github.com/OS4CSAPI/glaux-client/blob/work/details-view-20261023/Docs/Plans/CLOUDFLARE_DEPLOYMENT.md.</w:t>
       </w:r>
     </w:p>
     <w:p>
@@ -10141,17 +12827,7 @@
       </w:pPr>
       <w:r>
         <w:rPr/>
-        <w:t xml:space="preserve">Open Geospatial Consortium. 2025a. </w:t>
-      </w:r>
-      <w:r>
-        <w:rPr>
-          <w:i/>
-        </w:rPr>
-        <w:t>OGC API—Connected Systems—Part 1: Feature Resources</w:t>
-      </w:r>
-      <w:r>
-        <w:rPr/>
-        <w:t>. Version 1.0. OGC 23-001. Edited by Alexandre Robin. July 16. https://docs.ogc.org/is/23-001/23-001.html.</w:t>
+        <w:t>MERLIN Project. 2026j. “Smart Citizen Vendor Presentation Baseline.” October 24. Research evidence record. https://github.com/OS4CSAPI/glaux-client/blob/work/details-view-20261023/Docs/Research/Evidence/SMART_CITIZEN_VENDOR_UI_BASELINE_2026-10-24.md.</w:t>
       </w:r>
     </w:p>
     <w:p>
@@ -10160,17 +12836,7 @@
       </w:pPr>
       <w:r>
         <w:rPr/>
-        <w:t xml:space="preserve">Open Geospatial Consortium. 2025b. </w:t>
-      </w:r>
-      <w:r>
-        <w:rPr>
-          <w:i/>
-        </w:rPr>
-        <w:t>OGC API—Connected Systems—Part 2: Dynamic Data</w:t>
-      </w:r>
-      <w:r>
-        <w:rPr/>
-        <w:t>. Version 1.0. OGC 23-002. Edited by Alexandre Robin. July 16. https://docs.ogc.org/is/23-002/23-002.html.</w:t>
+        <w:t>MERLIN Project. 2026k. “Smart Citizen Source Specimen and Native Inventory.” October 25. Experiment workbook record. https://github.com/OS4CSAPI/glaux-client/blob/work/details-view-20261023/Docs/Research/Studies/Smart_Citizen/Workbook/01_SOURCE_SPECIMEN_AND_INVENTORY.md.</w:t>
       </w:r>
     </w:p>
     <w:p>
@@ -10179,17 +12845,7 @@
       </w:pPr>
       <w:r>
         <w:rPr/>
-        <w:t xml:space="preserve">Open Geospatial Consortium. 2025c. </w:t>
-      </w:r>
-      <w:r>
-        <w:rPr>
-          <w:i/>
-        </w:rPr>
-        <w:t>OGC SensorML Encoding Standard</w:t>
-      </w:r>
-      <w:r>
-        <w:rPr/>
-        <w:t>. Version 3.0. OGC 23-000. Edited by Alexandre Robin. July 16. https://docs.ogc.org/is/23-000/23-000.html.</w:t>
+        <w:t>MERLIN Project. 2026l. “Smart Citizen Mapping Ledger.” October 25. Experiment workbook record. https://github.com/OS4CSAPI/glaux-client/blob/work/details-view-20261023/Docs/Research/Studies/Smart_Citizen/Workbook/02_MAPPING_LEDGER.md.</w:t>
       </w:r>
     </w:p>
     <w:p>
@@ -10198,17 +12854,17 @@
       </w:pPr>
       <w:r>
         <w:rPr/>
-        <w:t xml:space="preserve">Open Geospatial Consortium. 2025d. </w:t>
+        <w:t xml:space="preserve">Open Geospatial Consortium. 2025a. </w:t>
       </w:r>
       <w:r>
         <w:rPr>
           <w:i/>
         </w:rPr>
-        <w:t>OGC SWE Common Data Model Encoding Standard</w:t>
+        <w:t>OGC API—Connected Systems—Part 1: Feature Resources</w:t>
       </w:r>
       <w:r>
         <w:rPr/>
-        <w:t>. Version 3.0.0. OGC 24-014. Edited by Alexandre Robin. July 16. https://docs.ogc.org/is/24-014/24-014.html.</w:t>
+        <w:t>. Version 1.0. OGC 23-001. Edited by Alexandre Robin. July 16. https://docs.ogc.org/is/23-001/23-001.html.</w:t>
       </w:r>
     </w:p>
     <w:p>
@@ -10217,7 +12873,17 @@
       </w:pPr>
       <w:r>
         <w:rPr/>
-        <w:t>Open Geospatial Consortium. n.d.-a. “Index of /sensorML/3.0/json.” Official SensorML 3.0 JSON schema repository. Accessed October 24, 2026. https://schemas.opengis.net/sensorML/3.0/json/.</w:t>
+        <w:t xml:space="preserve">Open Geospatial Consortium. 2025b. </w:t>
+      </w:r>
+      <w:r>
+        <w:rPr>
+          <w:i/>
+        </w:rPr>
+        <w:t>OGC API—Connected Systems—Part 2: Dynamic Data</w:t>
+      </w:r>
+      <w:r>
+        <w:rPr/>
+        <w:t>. Version 1.0. OGC 23-002. Edited by Alexandre Robin. July 16. https://docs.ogc.org/is/23-002/23-002.html.</w:t>
       </w:r>
     </w:p>
     <w:p>
@@ -10226,7 +12892,17 @@
       </w:pPr>
       <w:r>
         <w:rPr/>
-        <w:t>Open Geospatial Consortium. n.d.-b. “Index of /sweCommon/3.0/json.” Official SWE Common 3.0 JSON schema repository. Accessed October 24, 2026. https://schemas.opengis.net/sweCommon/3.0/json/.</w:t>
+        <w:t xml:space="preserve">Open Geospatial Consortium. 2025c. </w:t>
+      </w:r>
+      <w:r>
+        <w:rPr>
+          <w:i/>
+        </w:rPr>
+        <w:t>OGC SensorML Encoding Standard</w:t>
+      </w:r>
+      <w:r>
+        <w:rPr/>
+        <w:t>. Version 3.0. OGC 23-000. Edited by Alexandre Robin. July 16. https://docs.ogc.org/is/23-000/23-000.html.</w:t>
       </w:r>
     </w:p>
     <w:p>
@@ -10235,7 +12911,17 @@
       </w:pPr>
       <w:r>
         <w:rPr/>
-        <w:t>OS4CSAPI. 2026. “ogc-client-CSAPI_2.” GitHub repository, phase-10 revision 4ca1d7db9b1ccdf545adbef42ef941139fe11977. Accessed October 24, 2026. https://github.com/OS4CSAPI/ogc-client-CSAPI_2/tree/4ca1d7db9b1ccdf545adbef42ef941139fe11977.</w:t>
+        <w:t xml:space="preserve">Open Geospatial Consortium. 2025d. </w:t>
+      </w:r>
+      <w:r>
+        <w:rPr>
+          <w:i/>
+        </w:rPr>
+        <w:t>OGC SWE Common Data Model Encoding Standard</w:t>
+      </w:r>
+      <w:r>
+        <w:rPr/>
+        <w:t>. Version 3.0.0. OGC 24-014. Edited by Alexandre Robin. July 16. https://docs.ogc.org/is/24-014/24-014.html.</w:t>
       </w:r>
     </w:p>
     <w:p>
@@ -10244,17 +12930,7 @@
       </w:pPr>
       <w:r>
         <w:rPr/>
-        <w:t xml:space="preserve">Parello, John, Benoit Claise, Brad Schoening, and Juergen Quittek. 2014. </w:t>
-      </w:r>
-      <w:r>
-        <w:rPr>
-          <w:i/>
-        </w:rPr>
-        <w:t>Energy Management Framework</w:t>
-      </w:r>
-      <w:r>
-        <w:rPr/>
-        <w:t>. RFC 7326. Informational. September. https://doi.org/10.17487/RFC7326.</w:t>
+        <w:t>Open Geospatial Consortium. n.d.-a. “Index of /sensorML/3.0/json.” Official SensorML 3.0 JSON schema repository. Accessed October 24, 2026. https://schemas.opengis.net/sensorML/3.0/json/.</w:t>
       </w:r>
     </w:p>
     <w:p>
@@ -10263,17 +12939,7 @@
       </w:pPr>
       <w:r>
         <w:rPr/>
-        <w:t xml:space="preserve">pygeoapi Development Team. 2026. </w:t>
-      </w:r>
-      <w:r>
-        <w:rPr>
-          <w:i/>
-        </w:rPr>
-        <w:t>pygeoapi 0.25.dev0 Documentation</w:t>
-      </w:r>
-      <w:r>
-        <w:rPr/>
-        <w:t>. October 22. https://docs.pygeoapi.io/en/latest/.</w:t>
+        <w:t>Open Geospatial Consortium. n.d.-b. “Index of /sweCommon/3.0/json.” Official SWE Common 3.0 JSON schema repository. Accessed October 24, 2026. https://schemas.opengis.net/sweCommon/3.0/json/.</w:t>
       </w:r>
     </w:p>
     <w:p>
@@ -10282,17 +12948,7 @@
       </w:pPr>
       <w:r>
         <w:rPr/>
-        <w:t xml:space="preserve">QUDT.org. n.d. “Degree Celsius.” </w:t>
-      </w:r>
-      <w:r>
-        <w:rPr>
-          <w:i/>
-        </w:rPr>
-        <w:t>QUDT Units Vocabulary</w:t>
-      </w:r>
-      <w:r>
-        <w:rPr/>
-        <w:t>, version 3.5.3. Unit DEG_C. Accessed October 24, 2026. https://qudt.org/vocab/unit/DEG_C.</w:t>
+        <w:t>OS4CSAPI. 2026. “ogc-client-CSAPI_2.” GitHub repository, phase-10 revision 4ca1d7db9b1ccdf545adbef42ef941139fe11977. Accessed October 24, 2026. https://github.com/OS4CSAPI/ogc-client-CSAPI_2/tree/4ca1d7db9b1ccdf545adbef42ef941139fe11977.</w:t>
       </w:r>
     </w:p>
     <w:p>
@@ -10301,17 +12957,17 @@
       </w:pPr>
       <w:r>
         <w:rPr/>
-        <w:t xml:space="preserve">Quittek, Juergen, Rolf Winter, and Thomas Dietz. 2015. </w:t>
+        <w:t xml:space="preserve">Parello, John, Benoit Claise, Brad Schoening, and Juergen Quittek. 2014. </w:t>
       </w:r>
       <w:r>
         <w:rPr>
           <w:i/>
         </w:rPr>
-        <w:t>Definition of Managed Objects for Battery Monitoring</w:t>
+        <w:t>Energy Management Framework</w:t>
       </w:r>
       <w:r>
         <w:rPr/>
-        <w:t>. RFC 7577. Standards Track. July. https://doi.org/10.17487/RFC7577.</w:t>
+        <w:t>. RFC 7326. Informational. September. https://doi.org/10.17487/RFC7326.</w:t>
       </w:r>
     </w:p>
     <w:p>
@@ -10320,7 +12976,17 @@
       </w:pPr>
       <w:r>
         <w:rPr/>
-        <w:t>Seeed Studio. n.d. “Smart Citizen Kit 2.3—Open Source Environmental Monitoring Kit.” SKU 114993536. Accessed October 24, 2026. https://www.seeedstudio.com/Smart-Citizen2-3-p-6327.html.</w:t>
+        <w:t xml:space="preserve">pygeoapi Development Team. 2026. </w:t>
+      </w:r>
+      <w:r>
+        <w:rPr>
+          <w:i/>
+        </w:rPr>
+        <w:t>pygeoapi 0.25.dev0 Documentation</w:t>
+      </w:r>
+      <w:r>
+        <w:rPr/>
+        <w:t>. October 22. https://docs.pygeoapi.io/en/latest/.</w:t>
       </w:r>
     </w:p>
     <w:p>
@@ -10329,17 +12995,17 @@
       </w:pPr>
       <w:r>
         <w:rPr/>
-        <w:t xml:space="preserve">Smart Citizen. n.d.-a. “Data Platform.” </w:t>
+        <w:t xml:space="preserve">QUDT.org. n.d. “Degree Celsius.” </w:t>
       </w:r>
       <w:r>
         <w:rPr>
           <w:i/>
         </w:rPr>
-        <w:t>Smart Citizen Docs</w:t>
+        <w:t>QUDT Units Vocabulary</w:t>
       </w:r>
       <w:r>
         <w:rPr/>
-        <w:t>. Accessed October 24, 2026. https://docs.smartcitizen.me/data/data-platform/.</w:t>
+        <w:t>, version 3.5.3. Unit DEG_C. Accessed October 24, 2026. https://qudt.org/vocab/unit/DEG_C.</w:t>
       </w:r>
     </w:p>
     <w:p>
@@ -10348,17 +13014,17 @@
       </w:pPr>
       <w:r>
         <w:rPr/>
-        <w:t xml:space="preserve">Smart Citizen. n.d.-b. “Open Source.” </w:t>
+        <w:t xml:space="preserve">QUDT.org. 2026. </w:t>
       </w:r>
       <w:r>
         <w:rPr>
           <w:i/>
         </w:rPr>
-        <w:t>Smart Citizen Docs</w:t>
+        <w:t>QUDT Units Vocabulary</w:t>
       </w:r>
       <w:r>
         <w:rPr/>
-        <w:t>. Accessed October 24, 2026. https://docs.smartcitizen.me/about/open-source/.</w:t>
+        <w:t>. Version 3.5.3. Accessed October 25, 2026. https://www.qudt.org/doc/DOC_VOCAB-UNITS.html.</w:t>
       </w:r>
     </w:p>
     <w:p>
@@ -10367,17 +13033,17 @@
       </w:pPr>
       <w:r>
         <w:rPr/>
-        <w:t xml:space="preserve">Smart Citizen. n.d.-c. “Smart Citizen Kit.” </w:t>
+        <w:t xml:space="preserve">Quittek, Juergen, Rolf Winter, and Thomas Dietz. 2015. </w:t>
       </w:r>
       <w:r>
         <w:rPr>
           <w:i/>
         </w:rPr>
-        <w:t>Smart Citizen Docs</w:t>
+        <w:t>Definition of Managed Objects for Battery Monitoring</w:t>
       </w:r>
       <w:r>
         <w:rPr/>
-        <w:t>. Accessed October 24, 2026. https://docs.smartcitizen.me/hardware/kit/.</w:t>
+        <w:t>. RFC 7577. Standards Track. July. https://doi.org/10.17487/RFC7577.</w:t>
       </w:r>
     </w:p>
     <w:p>
@@ -10386,7 +13052,17 @@
       </w:pPr>
       <w:r>
         <w:rPr/>
-        <w:t>Smart Citizen. n.d.-d. “SmartCitizen API Reference.” Accessed October 24, 2026. https://developer.smartcitizen.me/.</w:t>
+        <w:t xml:space="preserve">Scholl, Matthew, and Theresa Suloway. 2023. </w:t>
+      </w:r>
+      <w:r>
+        <w:rPr>
+          <w:i/>
+        </w:rPr>
+        <w:t>Introduction to Cybersecurity for Commercial Satellite Operations</w:t>
+      </w:r>
+      <w:r>
+        <w:rPr/>
+        <w:t>. NIST Interagency/Internal Report 8270. July. National Institute of Standards and Technology. https://doi.org/10.6028/NIST.IR.8270.</w:t>
       </w:r>
     </w:p>
     <w:p>
@@ -10395,17 +13071,7 @@
       </w:pPr>
       <w:r>
         <w:rPr/>
-        <w:t xml:space="preserve">Smart Citizen. n.d.-e. “Onboarding Your Kit.” </w:t>
-      </w:r>
-      <w:r>
-        <w:rPr>
-          <w:i/>
-        </w:rPr>
-        <w:t>Smart Citizen Docs</w:t>
-      </w:r>
-      <w:r>
-        <w:rPr/>
-        <w:t>. Accessed October 24, 2026. https://docs.smartcitizen.me/guides/getting-started/onboarding-your-kit/.</w:t>
+        <w:t>Seeed Studio. n.d. “Smart Citizen Kit 2.3—Open Source Environmental Monitoring Kit.” SKU 114993536. Accessed October 24, 2026. https://www.seeedstudio.com/Smart-Citizen2-3-p-6327.html.</w:t>
       </w:r>
     </w:p>
     <w:p>
@@ -10414,17 +13080,7 @@
       </w:pPr>
       <w:r>
         <w:rPr/>
-        <w:t xml:space="preserve">Smart Citizen. n.d.-f. “Data Tools.” </w:t>
-      </w:r>
-      <w:r>
-        <w:rPr>
-          <w:i/>
-        </w:rPr>
-        <w:t>Smart Citizen Docs</w:t>
-      </w:r>
-      <w:r>
-        <w:rPr/>
-        <w:t>. Accessed October 24, 2026. https://docs.smartcitizen.me/data/data-tools/.</w:t>
+        <w:t>Smart Citizen. 2026. “smartcitizen-api.” GitHub repository, revision 25a524cbfb036f8950c247b847d8884a4e776297. Accessed October 25, 2026. https://github.com/fablabbcn/smartcitizen-api/tree/25a524cbfb036f8950c247b847d8884a4e776297.</w:t>
       </w:r>
     </w:p>
     <w:p>
@@ -10433,6 +13089,110 @@
       </w:pPr>
       <w:r>
         <w:rPr/>
+        <w:t xml:space="preserve">Smart Citizen. n.d.-a. “Data Platform.” </w:t>
+      </w:r>
+      <w:r>
+        <w:rPr>
+          <w:i/>
+        </w:rPr>
+        <w:t>Smart Citizen Docs</w:t>
+      </w:r>
+      <w:r>
+        <w:rPr/>
+        <w:t>. Accessed October 24, 2026. https://docs.smartcitizen.me/data/data-platform/.</w:t>
+      </w:r>
+    </w:p>
+    <w:p>
+      <w:pPr>
+        <w:pStyle w:val="PaperReference"/>
+      </w:pPr>
+      <w:r>
+        <w:rPr/>
+        <w:t xml:space="preserve">Smart Citizen. n.d.-b. “Open Source.” </w:t>
+      </w:r>
+      <w:r>
+        <w:rPr>
+          <w:i/>
+        </w:rPr>
+        <w:t>Smart Citizen Docs</w:t>
+      </w:r>
+      <w:r>
+        <w:rPr/>
+        <w:t>. Accessed October 24, 2026. https://docs.smartcitizen.me/about/open-source/.</w:t>
+      </w:r>
+    </w:p>
+    <w:p>
+      <w:pPr>
+        <w:pStyle w:val="PaperReference"/>
+      </w:pPr>
+      <w:r>
+        <w:rPr/>
+        <w:t xml:space="preserve">Smart Citizen. n.d.-c. “Smart Citizen Kit.” </w:t>
+      </w:r>
+      <w:r>
+        <w:rPr>
+          <w:i/>
+        </w:rPr>
+        <w:t>Smart Citizen Docs</w:t>
+      </w:r>
+      <w:r>
+        <w:rPr/>
+        <w:t>. Accessed October 24, 2026. https://docs.smartcitizen.me/hardware/kit/.</w:t>
+      </w:r>
+    </w:p>
+    <w:p>
+      <w:pPr>
+        <w:pStyle w:val="PaperReference"/>
+      </w:pPr>
+      <w:r>
+        <w:rPr/>
+        <w:t>Smart Citizen. n.d.-d. “SmartCitizen API Reference.” Accessed October 24, 2026. https://developer.smartcitizen.me/.</w:t>
+      </w:r>
+    </w:p>
+    <w:p>
+      <w:pPr>
+        <w:pStyle w:val="PaperReference"/>
+      </w:pPr>
+      <w:r>
+        <w:rPr/>
+        <w:t xml:space="preserve">Smart Citizen. n.d.-e. “Onboarding Your Kit.” </w:t>
+      </w:r>
+      <w:r>
+        <w:rPr>
+          <w:i/>
+        </w:rPr>
+        <w:t>Smart Citizen Docs</w:t>
+      </w:r>
+      <w:r>
+        <w:rPr/>
+        <w:t>. Accessed October 24, 2026. https://docs.smartcitizen.me/guides/getting-started/onboarding-your-kit/.</w:t>
+      </w:r>
+    </w:p>
+    <w:p>
+      <w:pPr>
+        <w:pStyle w:val="PaperReference"/>
+      </w:pPr>
+      <w:r>
+        <w:rPr/>
+        <w:t xml:space="preserve">Smart Citizen. n.d.-f. “Data Tools.” </w:t>
+      </w:r>
+      <w:r>
+        <w:rPr>
+          <w:i/>
+        </w:rPr>
+        <w:t>Smart Citizen Docs</w:t>
+      </w:r>
+      <w:r>
+        <w:rPr/>
+        <w:t>. Accessed October 24, 2026. https://docs.smartcitizen.me/data/data-tools/.</w:t>
+      </w:r>
+    </w:p>
+    <w:p>
+      <w:pPr>
+        <w:pStyle w:val="PaperReference"/>
+      </w:pPr>
+      <w:r>
+        <w:rPr/>
         <w:t xml:space="preserve">University of Chicago Press. n.d. “Author-Date: Sample Citations.” </w:t>
       </w:r>
       <w:r>
@@ -10444,6 +13204,25 @@
       <w:r>
         <w:rPr/>
         <w:t>. Accessed October 24, 2026. https://www.chicagomanualofstyle.org/tools_citationguide/citation-guide-2.html.</w:t>
+      </w:r>
+    </w:p>
+    <w:p>
+      <w:pPr>
+        <w:pStyle w:val="PaperReference"/>
+      </w:pPr>
+      <w:r>
+        <w:rPr/>
+        <w:t xml:space="preserve">World Wide Web Consortium. 2013. </w:t>
+      </w:r>
+      <w:r>
+        <w:rPr>
+          <w:i/>
+        </w:rPr>
+        <w:t>PROV-DM: The PROV Data Model</w:t>
+      </w:r>
+      <w:r>
+        <w:rPr/>
+        <w:t>. W3C Recommendation, April 30. https://www.w3.org/TR/prov-dm/.</w:t>
       </w:r>
     </w:p>
     <w:p>
@@ -10490,7 +13269,7 @@
         <w:color w:val="000000"/>
         <w:sz w:val="18"/>
       </w:rPr>
-      <w:t xml:space="preserve">Research draft 0.6   24 October 2026 EDT   </w:t>
+      <w:t xml:space="preserve">Research draft 0.7   25 October 2026 EDT   </w:t>
     </w:r>
     <w:fldSimple w:instr="PAGE"/>
   </w:p>

</xml_diff>

<commit_message>
docs: rebuild Smart Citizen paper v0.8
</commit_message>
<xml_diff>
--- a/Docs/Research/Studies/Smart_Citizen/SMART_CITIZEN_EXPERIMENT_PAPER.docx
+++ b/Docs/Research/Studies/Smart_Citizen/SMART_CITIZEN_EXPERIMENT_PAPER.docx
@@ -32,7 +32,7 @@
       <w:pPr/>
       <w:r>
         <w:rPr/>
-        <w:t>Working paper version 0.7 | 25 October 2026 | Study protocol with reviewed Phase 1–3 evidence</w:t>
+        <w:t>Working paper version 0.8 | 25 October 2026 | Study protocol with reviewed Phase 1–4 evidence</w:t>
       </w:r>
     </w:p>
     <w:p>
@@ -48,18 +48,15 @@
       <w:pPr/>
       <w:r>
         <w:rPr/>
-        <w:t>Integrating a sensing system requires preserving the meaning of its information as well as transporting its measurements. An operator may need to distinguish a product model from an installed unit, a producing system from the subject it observes, a source-reported status from an interpretation of that status, and a direct reading from a platform-derived product. This paper defines and begins a Smart Citizen experiment using public source data, an authored adapter, an OGC API — Connected Systems service, and the Glaux client to evaluate the MERLIN domain information model and Managed Physical Sensing Systems profile. Each consequential mapping is required to identify its native assertion, underlying domain concept, donor concepts, MPSS binding, standard carrier, authored transformation, presentation implication, and review outcome.</w:t>
+        <w:t>Integrating a sensing system requires preserving the meaning of its information as well as transporting its measurements. An operator may need to distinguish a product model from an installed unit, a producing system from the subject it observes, a source-reported status from an interpretation of that status, and a direct reading from a platform-derived product. This paper defines and advances a Smart Citizen experiment using public source data, an authored adapter, an Open Geospatial Consortium (OGC) API — Connected Systems (CSAPI) service, and the Glaux client to evaluate the MERLIN domain information model (DIM) and Managed Physical Sensing Systems (MPSS) profile. Each consequential mapping is required to identify its native assertion, underlying domain concept, donor concepts, profile binding, standard carrier, authored transformation, presentation implication, and review outcome.</w:t>
       </w:r>
     </w:p>
     <w:p>
       <w:pPr/>
       <w:r>
         <w:rPr/>
-        <w:t>Phases 1–3 have now frozen a reproducible public specimen, characterized its native identities, channels, times and source semantics, and reviewed nine current-state plus two aggregate-history mappings. This revision also establishes sourced definitions for terms whose casual use could otherwise obscure the experiment, including telemetry, provenance, measurement, calibration, Observation, DataStream, phenomenon time and result time. The adapter, CSAPI publication and round trip, connected Glaux traversal, and matched generic/profile-aware interface comparison remain unexecuted, so no interoperability or operator-benefit result is claimed. The expected contribution remains a reproducible account of which meanings survive integration, which require explicit enrichment, which are transformed by source-platform processing, and which remain unsupported.</w:t>
-      </w:r>
-    </w:p>
-    <w:p>
-      <w:pPr/>
+        <w:t xml:space="preserve">Phases 1–4 have now frozen a reproducible public specimen, characterized its native identities and source semantics, reviewed nine current-state plus two aggregate-history mappings, and designed the connected CSAPI resource graph without writing to the target server. The Phase 4 design separates the physical Smart Citizen Kit from source-platform aggregation, preserves unsupported relationships as explicit absences, and defines deterministic study identities and qualified time projections for executable observations (MERLIN Project 2026m). This revision also adds a maintained acronyms-and-abbreviations section alongside sourced technical definitions so readers do not have to infer specialized shorthand such as received signal strength indication (RSSI). The adapter, CSAPI publication and round trip, connected Glaux traversal, and matched generic/profile-aware interface comparison remain unexecuted, so no interoperability or operator-benefit result is claimed. </w:t>
+      </w:r>
       <w:r>
         <w:rPr>
           <w:b/>
@@ -84,7 +81,7 @@
       <w:pPr/>
       <w:r>
         <w:rPr/>
-        <w:t>The MERLIN Resource Details effort began with the problem of presenting information from heterogeneous sensing systems in a consistent, useful view. TRSS and McQ OmniSense II remain motivating cases. The subsequent domain-model work expanded the inquiry from individual manufacturer screens to the physical sensing system in employment: its identity, equipment, functions, deployment, configuration, communications, power, and lifecycle. The retained MPSS draft organizes these concerns through eight information subjects and twenty relationship identifiers, R01–R20 (MERLIN Project 2026a, secs. 4–5).</w:t>
+        <w:t>The MERLIN Resource Details effort began with the problem of presenting information from heterogeneous sensing systems in a consistent, useful view. TRSS and McQ OmniSense II remain motivating cases; TRSS is retained as the source-system name used by the project rather than expanded here without authoritative support. The subsequent domain-model work expanded the inquiry from individual manufacturer screens to the physical sensing system in employment: its identity, equipment, functions, deployment, configuration, communications, power, and lifecycle. The retained Managed Physical Sensing Systems (MPSS) draft organizes these concerns through eight information subjects and twenty relationship identifiers, R01–R20 (MERLIN Project 2026a, secs. 4–5).</w:t>
       </w:r>
     </w:p>
     <w:p>
@@ -166,14 +163,14 @@
       <w:pPr/>
       <w:r>
         <w:rPr/>
-        <w:t>The Data Board provides logging, Wi-Fi, memory-card access, USB, and a battery connector. The Urban Board carries sensing components and connects a separate particulate-matter module (Smart Citizen n.d.-c, “What is the Smart Citizen Kit?”). For this study, those component roles make physical equipment, sensing functions, communications, and power concrete subjects to examine through the DIM and MPSS. Their presence in model documentation does not establish a verified component inventory for an individual installation.</w:t>
+        <w:t>The Data Board provides logging, Wi-Fi, memory-card access, Universal Serial Bus (USB), and a battery connector. The Urban Board carries sensing components and connects a separate particulate-matter module (Smart Citizen n.d.-c, “What is the Smart Citizen Kit?”). For this study, those component roles make physical equipment, sensing functions, communications, and power concrete subjects to examine through the domain information model (DIM) and MPSS. Their presence in model documentation does not establish a verified component inventory for an individual installation.</w:t>
       </w:r>
     </w:p>
     <w:p>
       <w:pPr/>
       <w:r>
         <w:rPr/>
-        <w:t>The selected specimen is public Smart Citizen registration 19639. A formal capture made on 25 October 2026 at 02:43:48 UTC retained the complete Device response, response headers, and bounded temperature and PM2.5 histories with request URLs and SHA-256 hashes; it supersedes the earlier 24 October feasibility values as the evidence basis for formal mappings (MERLIN Project 2026k). The source reports hardware “SmartCitizen Kit 2.3,” type “SCK,” version “2.3,” and slug “sck:2,3,” while its channel catalogue includes environmental observations and system-related telemetry such as battery level, RSSI and SD-card indication. The registration and reported model identify the selected data specimen, but enduring physical identity and installed configuration remain separate evidence questions.</w:t>
+        <w:t>The selected specimen is public Smart Citizen registration 19639. A formal capture made on 25 October 2026 at 02:43:48 Coordinated Universal Time (UTC) retained the complete Device response, response headers, and bounded temperature and PM2.5 histories with request Uniform Resource Locators (URLs) and Secure Hash Algorithm 256-bit (SHA-256) hashes; it supersedes the earlier 24 October feasibility values as the evidence basis for formal mappings (MERLIN Project 2026k). The source reports hardware “SmartCitizen Kit 2.3,” type “SCK,” version “2.3,” and slug “sck:2,3,” while its channel catalogue includes environmental observations and system-related telemetry such as battery level, received signal strength indication (RSSI), and SD-card indication. The registration and reported model identify the selected data specimen, but enduring physical identity and installed configuration remain separate evidence questions.</w:t>
       </w:r>
     </w:p>
     <w:p>
@@ -845,21 +842,2894 @@
       </w:pPr>
       <w:r>
         <w:rPr/>
-        <w:t>2 Terms and definitions</w:t>
+        <w:t>2 Acronyms and abbreviations</w:t>
       </w:r>
     </w:p>
     <w:p>
       <w:pPr/>
       <w:r>
         <w:rPr/>
-        <w:t>The study uses several technical terms that carry narrower meanings than their everyday equivalents. The definitions below are taken from the cited standards or source documentation where an authoritative definition exists, while study-specific terms are explicitly identified as operational definitions rather than external standards. Later uses in the paper are intended to remain consistent with these meanings, and ambiguous source labels are not allowed to override them.</w:t>
+        <w:t>The paper expands uncommon acronyms on first substantive use where practical, but this section provides one place to recover the meaning without searching backward through the text. It includes project shorthand, standards organizations, technical formats, and a few measurement abbreviations that recur in the experiment. Product/model identifiers such as SHT31, SEN5X, and MPL3115A2 are model names rather than acronyms and are therefore not expanded as if they were abbreviations. Where a source uses a particular expansion, the paper preserves that source wording instead of substituting a more familiar variant.</w:t>
+      </w:r>
+    </w:p>
+    <w:tbl>
+      <w:tblPr>
+        <w:tblW w:type="auto" w:w="0"/>
+        <w:jc w:val="center"/>
+        <w:tblLayout w:type="fixed"/>
+        <w:tblLook w:firstColumn="1" w:firstRow="1" w:lastColumn="0" w:lastRow="0" w:noHBand="0" w:noVBand="1" w:val="04A0"/>
+      </w:tblPr>
+      <w:tblGrid>
+        <w:gridCol w:w="2880"/>
+        <w:gridCol w:w="6912"/>
+      </w:tblGrid>
+      <w:tr>
+        <w:trPr>
+          <w:cantSplit/>
+          <w:tblHeader/>
+        </w:trPr>
+        <w:tc>
+          <w:tcPr>
+            <w:tcW w:type="dxa" w:w="2880"/>
+            <w:vAlign w:val="center"/>
+            <w:tcBorders>
+              <w:top w:val="single" w:sz="4" w:color="D9D9D9"/>
+              <w:left w:val="single" w:sz="4" w:color="D9D9D9"/>
+              <w:bottom w:val="single" w:sz="4" w:color="D9D9D9"/>
+              <w:right w:val="single" w:sz="4" w:color="D9D9D9"/>
+            </w:tcBorders>
+            <w:tcMar>
+              <w:top w:w="90" w:type="dxa"/>
+              <w:left w:w="90" w:type="dxa"/>
+              <w:bottom w:w="90" w:type="dxa"/>
+              <w:right w:w="90" w:type="dxa"/>
+            </w:tcMar>
+            <w:shd w:fill="E8E8E8"/>
+          </w:tcPr>
+          <w:p>
+            <w:pPr>
+              <w:spacing w:after="40" w:line="247" w:lineRule="auto"/>
+            </w:pPr>
+            <w:r>
+              <w:rPr>
+                <w:b/>
+                <w:sz w:val="20"/>
+              </w:rPr>
+              <w:t>Acronym / shorthand</w:t>
+            </w:r>
+          </w:p>
+        </w:tc>
+        <w:tc>
+          <w:tcPr>
+            <w:tcW w:type="dxa" w:w="6912"/>
+            <w:vAlign w:val="center"/>
+            <w:tcBorders>
+              <w:top w:val="single" w:sz="4" w:color="D9D9D9"/>
+              <w:left w:val="single" w:sz="4" w:color="D9D9D9"/>
+              <w:bottom w:val="single" w:sz="4" w:color="D9D9D9"/>
+              <w:right w:val="single" w:sz="4" w:color="D9D9D9"/>
+            </w:tcBorders>
+            <w:tcMar>
+              <w:top w:w="90" w:type="dxa"/>
+              <w:left w:w="90" w:type="dxa"/>
+              <w:bottom w:w="90" w:type="dxa"/>
+              <w:right w:w="90" w:type="dxa"/>
+            </w:tcMar>
+            <w:shd w:fill="E8E8E8"/>
+          </w:tcPr>
+          <w:p>
+            <w:pPr>
+              <w:spacing w:after="40" w:line="247" w:lineRule="auto"/>
+            </w:pPr>
+            <w:r>
+              <w:rPr>
+                <w:b/>
+                <w:sz w:val="20"/>
+              </w:rPr>
+              <w:t>Expansion or meaning in this paper</w:t>
+            </w:r>
+          </w:p>
+        </w:tc>
+      </w:tr>
+      <w:tr>
+        <w:trPr>
+          <w:cantSplit/>
+        </w:trPr>
+        <w:tc>
+          <w:tcPr>
+            <w:tcW w:type="dxa" w:w="2880"/>
+            <w:vAlign w:val="center"/>
+            <w:tcBorders>
+              <w:top w:val="single" w:sz="4" w:color="D9D9D9"/>
+              <w:left w:val="single" w:sz="4" w:color="D9D9D9"/>
+              <w:bottom w:val="single" w:sz="4" w:color="D9D9D9"/>
+              <w:right w:val="single" w:sz="4" w:color="D9D9D9"/>
+            </w:tcBorders>
+            <w:tcMar>
+              <w:top w:w="90" w:type="dxa"/>
+              <w:left w:w="90" w:type="dxa"/>
+              <w:bottom w:w="90" w:type="dxa"/>
+              <w:right w:w="90" w:type="dxa"/>
+            </w:tcMar>
+            <w:shd w:fill="FFFFFF"/>
+          </w:tcPr>
+          <w:p>
+            <w:pPr>
+              <w:spacing w:after="40" w:line="247" w:lineRule="auto"/>
+            </w:pPr>
+            <w:r>
+              <w:rPr>
+                <w:b/>
+                <w:sz w:val="20"/>
+              </w:rPr>
+              <w:t>API</w:t>
+            </w:r>
+          </w:p>
+        </w:tc>
+        <w:tc>
+          <w:tcPr>
+            <w:tcW w:type="dxa" w:w="6912"/>
+            <w:vAlign w:val="center"/>
+            <w:tcBorders>
+              <w:top w:val="single" w:sz="4" w:color="D9D9D9"/>
+              <w:left w:val="single" w:sz="4" w:color="D9D9D9"/>
+              <w:bottom w:val="single" w:sz="4" w:color="D9D9D9"/>
+              <w:right w:val="single" w:sz="4" w:color="D9D9D9"/>
+            </w:tcBorders>
+            <w:tcMar>
+              <w:top w:w="90" w:type="dxa"/>
+              <w:left w:w="90" w:type="dxa"/>
+              <w:bottom w:w="90" w:type="dxa"/>
+              <w:right w:w="90" w:type="dxa"/>
+            </w:tcMar>
+            <w:shd w:fill="FFFFFF"/>
+          </w:tcPr>
+          <w:p>
+            <w:pPr>
+              <w:spacing w:after="40" w:line="247" w:lineRule="auto"/>
+            </w:pPr>
+            <w:r>
+              <w:rPr>
+                <w:sz w:val="20"/>
+              </w:rPr>
+              <w:t>Application Programming Interface</w:t>
+            </w:r>
+          </w:p>
+        </w:tc>
+      </w:tr>
+      <w:tr>
+        <w:trPr>
+          <w:cantSplit/>
+        </w:trPr>
+        <w:tc>
+          <w:tcPr>
+            <w:tcW w:type="dxa" w:w="2880"/>
+            <w:vAlign w:val="center"/>
+            <w:tcBorders>
+              <w:top w:val="single" w:sz="4" w:color="D9D9D9"/>
+              <w:left w:val="single" w:sz="4" w:color="D9D9D9"/>
+              <w:bottom w:val="single" w:sz="4" w:color="D9D9D9"/>
+              <w:right w:val="single" w:sz="4" w:color="D9D9D9"/>
+            </w:tcBorders>
+            <w:tcMar>
+              <w:top w:w="90" w:type="dxa"/>
+              <w:left w:w="90" w:type="dxa"/>
+              <w:bottom w:w="90" w:type="dxa"/>
+              <w:right w:w="90" w:type="dxa"/>
+            </w:tcMar>
+            <w:shd w:fill="F7F7F7"/>
+          </w:tcPr>
+          <w:p>
+            <w:pPr>
+              <w:spacing w:after="40" w:line="247" w:lineRule="auto"/>
+            </w:pPr>
+            <w:r>
+              <w:rPr>
+                <w:b/>
+                <w:sz w:val="20"/>
+              </w:rPr>
+              <w:t>CSAPI</w:t>
+            </w:r>
+          </w:p>
+        </w:tc>
+        <w:tc>
+          <w:tcPr>
+            <w:tcW w:type="dxa" w:w="6912"/>
+            <w:vAlign w:val="center"/>
+            <w:tcBorders>
+              <w:top w:val="single" w:sz="4" w:color="D9D9D9"/>
+              <w:left w:val="single" w:sz="4" w:color="D9D9D9"/>
+              <w:bottom w:val="single" w:sz="4" w:color="D9D9D9"/>
+              <w:right w:val="single" w:sz="4" w:color="D9D9D9"/>
+            </w:tcBorders>
+            <w:tcMar>
+              <w:top w:w="90" w:type="dxa"/>
+              <w:left w:w="90" w:type="dxa"/>
+              <w:bottom w:w="90" w:type="dxa"/>
+              <w:right w:w="90" w:type="dxa"/>
+            </w:tcMar>
+            <w:shd w:fill="F7F7F7"/>
+          </w:tcPr>
+          <w:p>
+            <w:pPr>
+              <w:spacing w:after="40" w:line="247" w:lineRule="auto"/>
+            </w:pPr>
+            <w:r>
+              <w:rPr>
+                <w:sz w:val="20"/>
+              </w:rPr>
+              <w:t>OGC API — Connected Systems; project shorthand used for the Connected Systems API</w:t>
+            </w:r>
+          </w:p>
+        </w:tc>
+      </w:tr>
+      <w:tr>
+        <w:trPr>
+          <w:cantSplit/>
+        </w:trPr>
+        <w:tc>
+          <w:tcPr>
+            <w:tcW w:type="dxa" w:w="2880"/>
+            <w:vAlign w:val="center"/>
+            <w:tcBorders>
+              <w:top w:val="single" w:sz="4" w:color="D9D9D9"/>
+              <w:left w:val="single" w:sz="4" w:color="D9D9D9"/>
+              <w:bottom w:val="single" w:sz="4" w:color="D9D9D9"/>
+              <w:right w:val="single" w:sz="4" w:color="D9D9D9"/>
+            </w:tcBorders>
+            <w:tcMar>
+              <w:top w:w="90" w:type="dxa"/>
+              <w:left w:w="90" w:type="dxa"/>
+              <w:bottom w:w="90" w:type="dxa"/>
+              <w:right w:w="90" w:type="dxa"/>
+            </w:tcMar>
+            <w:shd w:fill="FFFFFF"/>
+          </w:tcPr>
+          <w:p>
+            <w:pPr>
+              <w:spacing w:after="40" w:line="247" w:lineRule="auto"/>
+            </w:pPr>
+            <w:r>
+              <w:rPr>
+                <w:b/>
+                <w:sz w:val="20"/>
+              </w:rPr>
+              <w:t>CSS</w:t>
+            </w:r>
+          </w:p>
+        </w:tc>
+        <w:tc>
+          <w:tcPr>
+            <w:tcW w:type="dxa" w:w="6912"/>
+            <w:vAlign w:val="center"/>
+            <w:tcBorders>
+              <w:top w:val="single" w:sz="4" w:color="D9D9D9"/>
+              <w:left w:val="single" w:sz="4" w:color="D9D9D9"/>
+              <w:bottom w:val="single" w:sz="4" w:color="D9D9D9"/>
+              <w:right w:val="single" w:sz="4" w:color="D9D9D9"/>
+            </w:tcBorders>
+            <w:tcMar>
+              <w:top w:w="90" w:type="dxa"/>
+              <w:left w:w="90" w:type="dxa"/>
+              <w:bottom w:w="90" w:type="dxa"/>
+              <w:right w:w="90" w:type="dxa"/>
+            </w:tcMar>
+            <w:shd w:fill="FFFFFF"/>
+          </w:tcPr>
+          <w:p>
+            <w:pPr>
+              <w:spacing w:after="40" w:line="247" w:lineRule="auto"/>
+            </w:pPr>
+            <w:r>
+              <w:rPr>
+                <w:sz w:val="20"/>
+              </w:rPr>
+              <w:t>Cascading Style Sheets</w:t>
+            </w:r>
+          </w:p>
+        </w:tc>
+      </w:tr>
+      <w:tr>
+        <w:trPr>
+          <w:cantSplit/>
+        </w:trPr>
+        <w:tc>
+          <w:tcPr>
+            <w:tcW w:type="dxa" w:w="2880"/>
+            <w:vAlign w:val="center"/>
+            <w:tcBorders>
+              <w:top w:val="single" w:sz="4" w:color="D9D9D9"/>
+              <w:left w:val="single" w:sz="4" w:color="D9D9D9"/>
+              <w:bottom w:val="single" w:sz="4" w:color="D9D9D9"/>
+              <w:right w:val="single" w:sz="4" w:color="D9D9D9"/>
+            </w:tcBorders>
+            <w:tcMar>
+              <w:top w:w="90" w:type="dxa"/>
+              <w:left w:w="90" w:type="dxa"/>
+              <w:bottom w:w="90" w:type="dxa"/>
+              <w:right w:w="90" w:type="dxa"/>
+            </w:tcMar>
+            <w:shd w:fill="F7F7F7"/>
+          </w:tcPr>
+          <w:p>
+            <w:pPr>
+              <w:spacing w:after="40" w:line="247" w:lineRule="auto"/>
+            </w:pPr>
+            <w:r>
+              <w:rPr>
+                <w:b/>
+                <w:sz w:val="20"/>
+              </w:rPr>
+              <w:t>CSV</w:t>
+            </w:r>
+          </w:p>
+        </w:tc>
+        <w:tc>
+          <w:tcPr>
+            <w:tcW w:type="dxa" w:w="6912"/>
+            <w:vAlign w:val="center"/>
+            <w:tcBorders>
+              <w:top w:val="single" w:sz="4" w:color="D9D9D9"/>
+              <w:left w:val="single" w:sz="4" w:color="D9D9D9"/>
+              <w:bottom w:val="single" w:sz="4" w:color="D9D9D9"/>
+              <w:right w:val="single" w:sz="4" w:color="D9D9D9"/>
+            </w:tcBorders>
+            <w:tcMar>
+              <w:top w:w="90" w:type="dxa"/>
+              <w:left w:w="90" w:type="dxa"/>
+              <w:bottom w:w="90" w:type="dxa"/>
+              <w:right w:w="90" w:type="dxa"/>
+            </w:tcMar>
+            <w:shd w:fill="F7F7F7"/>
+          </w:tcPr>
+          <w:p>
+            <w:pPr>
+              <w:spacing w:after="40" w:line="247" w:lineRule="auto"/>
+            </w:pPr>
+            <w:r>
+              <w:rPr>
+                <w:sz w:val="20"/>
+              </w:rPr>
+              <w:t>Comma-Separated Values</w:t>
+            </w:r>
+          </w:p>
+        </w:tc>
+      </w:tr>
+      <w:tr>
+        <w:trPr>
+          <w:cantSplit/>
+        </w:trPr>
+        <w:tc>
+          <w:tcPr>
+            <w:tcW w:type="dxa" w:w="2880"/>
+            <w:vAlign w:val="center"/>
+            <w:tcBorders>
+              <w:top w:val="single" w:sz="4" w:color="D9D9D9"/>
+              <w:left w:val="single" w:sz="4" w:color="D9D9D9"/>
+              <w:bottom w:val="single" w:sz="4" w:color="D9D9D9"/>
+              <w:right w:val="single" w:sz="4" w:color="D9D9D9"/>
+            </w:tcBorders>
+            <w:tcMar>
+              <w:top w:w="90" w:type="dxa"/>
+              <w:left w:w="90" w:type="dxa"/>
+              <w:bottom w:w="90" w:type="dxa"/>
+              <w:right w:w="90" w:type="dxa"/>
+            </w:tcMar>
+            <w:shd w:fill="FFFFFF"/>
+          </w:tcPr>
+          <w:p>
+            <w:pPr>
+              <w:spacing w:after="40" w:line="247" w:lineRule="auto"/>
+            </w:pPr>
+            <w:r>
+              <w:rPr>
+                <w:b/>
+                <w:sz w:val="20"/>
+              </w:rPr>
+              <w:t>DGIWG</w:t>
+            </w:r>
+          </w:p>
+        </w:tc>
+        <w:tc>
+          <w:tcPr>
+            <w:tcW w:type="dxa" w:w="6912"/>
+            <w:vAlign w:val="center"/>
+            <w:tcBorders>
+              <w:top w:val="single" w:sz="4" w:color="D9D9D9"/>
+              <w:left w:val="single" w:sz="4" w:color="D9D9D9"/>
+              <w:bottom w:val="single" w:sz="4" w:color="D9D9D9"/>
+              <w:right w:val="single" w:sz="4" w:color="D9D9D9"/>
+            </w:tcBorders>
+            <w:tcMar>
+              <w:top w:w="90" w:type="dxa"/>
+              <w:left w:w="90" w:type="dxa"/>
+              <w:bottom w:w="90" w:type="dxa"/>
+              <w:right w:w="90" w:type="dxa"/>
+            </w:tcMar>
+            <w:shd w:fill="FFFFFF"/>
+          </w:tcPr>
+          <w:p>
+            <w:pPr>
+              <w:spacing w:after="40" w:line="247" w:lineRule="auto"/>
+            </w:pPr>
+            <w:r>
+              <w:rPr>
+                <w:sz w:val="20"/>
+              </w:rPr>
+              <w:t>Defence Geospatial Information Working Group</w:t>
+            </w:r>
+          </w:p>
+        </w:tc>
+      </w:tr>
+      <w:tr>
+        <w:trPr>
+          <w:cantSplit/>
+        </w:trPr>
+        <w:tc>
+          <w:tcPr>
+            <w:tcW w:type="dxa" w:w="2880"/>
+            <w:vAlign w:val="center"/>
+            <w:tcBorders>
+              <w:top w:val="single" w:sz="4" w:color="D9D9D9"/>
+              <w:left w:val="single" w:sz="4" w:color="D9D9D9"/>
+              <w:bottom w:val="single" w:sz="4" w:color="D9D9D9"/>
+              <w:right w:val="single" w:sz="4" w:color="D9D9D9"/>
+            </w:tcBorders>
+            <w:tcMar>
+              <w:top w:w="90" w:type="dxa"/>
+              <w:left w:w="90" w:type="dxa"/>
+              <w:bottom w:w="90" w:type="dxa"/>
+              <w:right w:w="90" w:type="dxa"/>
+            </w:tcMar>
+            <w:shd w:fill="F7F7F7"/>
+          </w:tcPr>
+          <w:p>
+            <w:pPr>
+              <w:spacing w:after="40" w:line="247" w:lineRule="auto"/>
+            </w:pPr>
+            <w:r>
+              <w:rPr>
+                <w:b/>
+                <w:sz w:val="20"/>
+              </w:rPr>
+              <w:t>DIM</w:t>
+            </w:r>
+          </w:p>
+        </w:tc>
+        <w:tc>
+          <w:tcPr>
+            <w:tcW w:type="dxa" w:w="6912"/>
+            <w:vAlign w:val="center"/>
+            <w:tcBorders>
+              <w:top w:val="single" w:sz="4" w:color="D9D9D9"/>
+              <w:left w:val="single" w:sz="4" w:color="D9D9D9"/>
+              <w:bottom w:val="single" w:sz="4" w:color="D9D9D9"/>
+              <w:right w:val="single" w:sz="4" w:color="D9D9D9"/>
+            </w:tcBorders>
+            <w:tcMar>
+              <w:top w:w="90" w:type="dxa"/>
+              <w:left w:w="90" w:type="dxa"/>
+              <w:bottom w:w="90" w:type="dxa"/>
+              <w:right w:w="90" w:type="dxa"/>
+            </w:tcMar>
+            <w:shd w:fill="F7F7F7"/>
+          </w:tcPr>
+          <w:p>
+            <w:pPr>
+              <w:spacing w:after="40" w:line="247" w:lineRule="auto"/>
+            </w:pPr>
+            <w:r>
+              <w:rPr>
+                <w:sz w:val="20"/>
+              </w:rPr>
+              <w:t>Domain Information Model</w:t>
+            </w:r>
+          </w:p>
+        </w:tc>
+      </w:tr>
+      <w:tr>
+        <w:trPr>
+          <w:cantSplit/>
+        </w:trPr>
+        <w:tc>
+          <w:tcPr>
+            <w:tcW w:type="dxa" w:w="2880"/>
+            <w:vAlign w:val="center"/>
+            <w:tcBorders>
+              <w:top w:val="single" w:sz="4" w:color="D9D9D9"/>
+              <w:left w:val="single" w:sz="4" w:color="D9D9D9"/>
+              <w:bottom w:val="single" w:sz="4" w:color="D9D9D9"/>
+              <w:right w:val="single" w:sz="4" w:color="D9D9D9"/>
+            </w:tcBorders>
+            <w:tcMar>
+              <w:top w:w="90" w:type="dxa"/>
+              <w:left w:w="90" w:type="dxa"/>
+              <w:bottom w:w="90" w:type="dxa"/>
+              <w:right w:w="90" w:type="dxa"/>
+            </w:tcMar>
+            <w:shd w:fill="FFFFFF"/>
+          </w:tcPr>
+          <w:p>
+            <w:pPr>
+              <w:spacing w:after="40" w:line="247" w:lineRule="auto"/>
+            </w:pPr>
+            <w:r>
+              <w:rPr>
+                <w:b/>
+                <w:sz w:val="20"/>
+              </w:rPr>
+              <w:t>GEMET</w:t>
+            </w:r>
+          </w:p>
+        </w:tc>
+        <w:tc>
+          <w:tcPr>
+            <w:tcW w:type="dxa" w:w="6912"/>
+            <w:vAlign w:val="center"/>
+            <w:tcBorders>
+              <w:top w:val="single" w:sz="4" w:color="D9D9D9"/>
+              <w:left w:val="single" w:sz="4" w:color="D9D9D9"/>
+              <w:bottom w:val="single" w:sz="4" w:color="D9D9D9"/>
+              <w:right w:val="single" w:sz="4" w:color="D9D9D9"/>
+            </w:tcBorders>
+            <w:tcMar>
+              <w:top w:w="90" w:type="dxa"/>
+              <w:left w:w="90" w:type="dxa"/>
+              <w:bottom w:w="90" w:type="dxa"/>
+              <w:right w:w="90" w:type="dxa"/>
+            </w:tcMar>
+            <w:shd w:fill="FFFFFF"/>
+          </w:tcPr>
+          <w:p>
+            <w:pPr>
+              <w:spacing w:after="40" w:line="247" w:lineRule="auto"/>
+            </w:pPr>
+            <w:r>
+              <w:rPr>
+                <w:sz w:val="20"/>
+              </w:rPr>
+              <w:t>General Multilingual Environmental Thesaurus</w:t>
+            </w:r>
+          </w:p>
+        </w:tc>
+      </w:tr>
+      <w:tr>
+        <w:trPr>
+          <w:cantSplit/>
+        </w:trPr>
+        <w:tc>
+          <w:tcPr>
+            <w:tcW w:type="dxa" w:w="2880"/>
+            <w:vAlign w:val="center"/>
+            <w:tcBorders>
+              <w:top w:val="single" w:sz="4" w:color="D9D9D9"/>
+              <w:left w:val="single" w:sz="4" w:color="D9D9D9"/>
+              <w:bottom w:val="single" w:sz="4" w:color="D9D9D9"/>
+              <w:right w:val="single" w:sz="4" w:color="D9D9D9"/>
+            </w:tcBorders>
+            <w:tcMar>
+              <w:top w:w="90" w:type="dxa"/>
+              <w:left w:w="90" w:type="dxa"/>
+              <w:bottom w:w="90" w:type="dxa"/>
+              <w:right w:w="90" w:type="dxa"/>
+            </w:tcMar>
+            <w:shd w:fill="F7F7F7"/>
+          </w:tcPr>
+          <w:p>
+            <w:pPr>
+              <w:spacing w:after="40" w:line="247" w:lineRule="auto"/>
+            </w:pPr>
+            <w:r>
+              <w:rPr>
+                <w:b/>
+                <w:sz w:val="20"/>
+              </w:rPr>
+              <w:t>HTTP</w:t>
+            </w:r>
+          </w:p>
+        </w:tc>
+        <w:tc>
+          <w:tcPr>
+            <w:tcW w:type="dxa" w:w="6912"/>
+            <w:vAlign w:val="center"/>
+            <w:tcBorders>
+              <w:top w:val="single" w:sz="4" w:color="D9D9D9"/>
+              <w:left w:val="single" w:sz="4" w:color="D9D9D9"/>
+              <w:bottom w:val="single" w:sz="4" w:color="D9D9D9"/>
+              <w:right w:val="single" w:sz="4" w:color="D9D9D9"/>
+            </w:tcBorders>
+            <w:tcMar>
+              <w:top w:w="90" w:type="dxa"/>
+              <w:left w:w="90" w:type="dxa"/>
+              <w:bottom w:w="90" w:type="dxa"/>
+              <w:right w:w="90" w:type="dxa"/>
+            </w:tcMar>
+            <w:shd w:fill="F7F7F7"/>
+          </w:tcPr>
+          <w:p>
+            <w:pPr>
+              <w:spacing w:after="40" w:line="247" w:lineRule="auto"/>
+            </w:pPr>
+            <w:r>
+              <w:rPr>
+                <w:sz w:val="20"/>
+              </w:rPr>
+              <w:t>Hypertext Transfer Protocol</w:t>
+            </w:r>
+          </w:p>
+        </w:tc>
+      </w:tr>
+      <w:tr>
+        <w:trPr>
+          <w:cantSplit/>
+        </w:trPr>
+        <w:tc>
+          <w:tcPr>
+            <w:tcW w:type="dxa" w:w="2880"/>
+            <w:vAlign w:val="center"/>
+            <w:tcBorders>
+              <w:top w:val="single" w:sz="4" w:color="D9D9D9"/>
+              <w:left w:val="single" w:sz="4" w:color="D9D9D9"/>
+              <w:bottom w:val="single" w:sz="4" w:color="D9D9D9"/>
+              <w:right w:val="single" w:sz="4" w:color="D9D9D9"/>
+            </w:tcBorders>
+            <w:tcMar>
+              <w:top w:w="90" w:type="dxa"/>
+              <w:left w:w="90" w:type="dxa"/>
+              <w:bottom w:w="90" w:type="dxa"/>
+              <w:right w:w="90" w:type="dxa"/>
+            </w:tcMar>
+            <w:shd w:fill="FFFFFF"/>
+          </w:tcPr>
+          <w:p>
+            <w:pPr>
+              <w:spacing w:after="40" w:line="247" w:lineRule="auto"/>
+            </w:pPr>
+            <w:r>
+              <w:rPr>
+                <w:b/>
+                <w:sz w:val="20"/>
+              </w:rPr>
+              <w:t>ID</w:t>
+            </w:r>
+          </w:p>
+        </w:tc>
+        <w:tc>
+          <w:tcPr>
+            <w:tcW w:type="dxa" w:w="6912"/>
+            <w:vAlign w:val="center"/>
+            <w:tcBorders>
+              <w:top w:val="single" w:sz="4" w:color="D9D9D9"/>
+              <w:left w:val="single" w:sz="4" w:color="D9D9D9"/>
+              <w:bottom w:val="single" w:sz="4" w:color="D9D9D9"/>
+              <w:right w:val="single" w:sz="4" w:color="D9D9D9"/>
+            </w:tcBorders>
+            <w:tcMar>
+              <w:top w:w="90" w:type="dxa"/>
+              <w:left w:w="90" w:type="dxa"/>
+              <w:bottom w:w="90" w:type="dxa"/>
+              <w:right w:w="90" w:type="dxa"/>
+            </w:tcMar>
+            <w:shd w:fill="FFFFFF"/>
+          </w:tcPr>
+          <w:p>
+            <w:pPr>
+              <w:spacing w:after="40" w:line="247" w:lineRule="auto"/>
+            </w:pPr>
+            <w:r>
+              <w:rPr>
+                <w:sz w:val="20"/>
+              </w:rPr>
+              <w:t>Identifier</w:t>
+            </w:r>
+          </w:p>
+        </w:tc>
+      </w:tr>
+      <w:tr>
+        <w:trPr>
+          <w:cantSplit/>
+        </w:trPr>
+        <w:tc>
+          <w:tcPr>
+            <w:tcW w:type="dxa" w:w="2880"/>
+            <w:vAlign w:val="center"/>
+            <w:tcBorders>
+              <w:top w:val="single" w:sz="4" w:color="D9D9D9"/>
+              <w:left w:val="single" w:sz="4" w:color="D9D9D9"/>
+              <w:bottom w:val="single" w:sz="4" w:color="D9D9D9"/>
+              <w:right w:val="single" w:sz="4" w:color="D9D9D9"/>
+            </w:tcBorders>
+            <w:tcMar>
+              <w:top w:w="90" w:type="dxa"/>
+              <w:left w:w="90" w:type="dxa"/>
+              <w:bottom w:w="90" w:type="dxa"/>
+              <w:right w:w="90" w:type="dxa"/>
+            </w:tcMar>
+            <w:shd w:fill="F7F7F7"/>
+          </w:tcPr>
+          <w:p>
+            <w:pPr>
+              <w:spacing w:after="40" w:line="247" w:lineRule="auto"/>
+            </w:pPr>
+            <w:r>
+              <w:rPr>
+                <w:b/>
+                <w:sz w:val="20"/>
+              </w:rPr>
+              <w:t>JCGM</w:t>
+            </w:r>
+          </w:p>
+        </w:tc>
+        <w:tc>
+          <w:tcPr>
+            <w:tcW w:type="dxa" w:w="6912"/>
+            <w:vAlign w:val="center"/>
+            <w:tcBorders>
+              <w:top w:val="single" w:sz="4" w:color="D9D9D9"/>
+              <w:left w:val="single" w:sz="4" w:color="D9D9D9"/>
+              <w:bottom w:val="single" w:sz="4" w:color="D9D9D9"/>
+              <w:right w:val="single" w:sz="4" w:color="D9D9D9"/>
+            </w:tcBorders>
+            <w:tcMar>
+              <w:top w:w="90" w:type="dxa"/>
+              <w:left w:w="90" w:type="dxa"/>
+              <w:bottom w:w="90" w:type="dxa"/>
+              <w:right w:w="90" w:type="dxa"/>
+            </w:tcMar>
+            <w:shd w:fill="F7F7F7"/>
+          </w:tcPr>
+          <w:p>
+            <w:pPr>
+              <w:spacing w:after="40" w:line="247" w:lineRule="auto"/>
+            </w:pPr>
+            <w:r>
+              <w:rPr>
+                <w:sz w:val="20"/>
+              </w:rPr>
+              <w:t>Joint Committee for Guides in Metrology</w:t>
+            </w:r>
+          </w:p>
+        </w:tc>
+      </w:tr>
+      <w:tr>
+        <w:trPr>
+          <w:cantSplit/>
+        </w:trPr>
+        <w:tc>
+          <w:tcPr>
+            <w:tcW w:type="dxa" w:w="2880"/>
+            <w:vAlign w:val="center"/>
+            <w:tcBorders>
+              <w:top w:val="single" w:sz="4" w:color="D9D9D9"/>
+              <w:left w:val="single" w:sz="4" w:color="D9D9D9"/>
+              <w:bottom w:val="single" w:sz="4" w:color="D9D9D9"/>
+              <w:right w:val="single" w:sz="4" w:color="D9D9D9"/>
+            </w:tcBorders>
+            <w:tcMar>
+              <w:top w:w="90" w:type="dxa"/>
+              <w:left w:w="90" w:type="dxa"/>
+              <w:bottom w:w="90" w:type="dxa"/>
+              <w:right w:w="90" w:type="dxa"/>
+            </w:tcMar>
+            <w:shd w:fill="FFFFFF"/>
+          </w:tcPr>
+          <w:p>
+            <w:pPr>
+              <w:spacing w:after="40" w:line="247" w:lineRule="auto"/>
+            </w:pPr>
+            <w:r>
+              <w:rPr>
+                <w:b/>
+                <w:sz w:val="20"/>
+              </w:rPr>
+              <w:t>JSON</w:t>
+            </w:r>
+          </w:p>
+        </w:tc>
+        <w:tc>
+          <w:tcPr>
+            <w:tcW w:type="dxa" w:w="6912"/>
+            <w:vAlign w:val="center"/>
+            <w:tcBorders>
+              <w:top w:val="single" w:sz="4" w:color="D9D9D9"/>
+              <w:left w:val="single" w:sz="4" w:color="D9D9D9"/>
+              <w:bottom w:val="single" w:sz="4" w:color="D9D9D9"/>
+              <w:right w:val="single" w:sz="4" w:color="D9D9D9"/>
+            </w:tcBorders>
+            <w:tcMar>
+              <w:top w:w="90" w:type="dxa"/>
+              <w:left w:w="90" w:type="dxa"/>
+              <w:bottom w:w="90" w:type="dxa"/>
+              <w:right w:w="90" w:type="dxa"/>
+            </w:tcMar>
+            <w:shd w:fill="FFFFFF"/>
+          </w:tcPr>
+          <w:p>
+            <w:pPr>
+              <w:spacing w:after="40" w:line="247" w:lineRule="auto"/>
+            </w:pPr>
+            <w:r>
+              <w:rPr>
+                <w:sz w:val="20"/>
+              </w:rPr>
+              <w:t>JavaScript Object Notation</w:t>
+            </w:r>
+          </w:p>
+        </w:tc>
+      </w:tr>
+      <w:tr>
+        <w:trPr>
+          <w:cantSplit/>
+        </w:trPr>
+        <w:tc>
+          <w:tcPr>
+            <w:tcW w:type="dxa" w:w="2880"/>
+            <w:vAlign w:val="center"/>
+            <w:tcBorders>
+              <w:top w:val="single" w:sz="4" w:color="D9D9D9"/>
+              <w:left w:val="single" w:sz="4" w:color="D9D9D9"/>
+              <w:bottom w:val="single" w:sz="4" w:color="D9D9D9"/>
+              <w:right w:val="single" w:sz="4" w:color="D9D9D9"/>
+            </w:tcBorders>
+            <w:tcMar>
+              <w:top w:w="90" w:type="dxa"/>
+              <w:left w:w="90" w:type="dxa"/>
+              <w:bottom w:w="90" w:type="dxa"/>
+              <w:right w:w="90" w:type="dxa"/>
+            </w:tcMar>
+            <w:shd w:fill="F7F7F7"/>
+          </w:tcPr>
+          <w:p>
+            <w:pPr>
+              <w:spacing w:after="40" w:line="247" w:lineRule="auto"/>
+            </w:pPr>
+            <w:r>
+              <w:rPr>
+                <w:b/>
+                <w:sz w:val="20"/>
+              </w:rPr>
+              <w:t>MERLIN</w:t>
+            </w:r>
+          </w:p>
+        </w:tc>
+        <w:tc>
+          <w:tcPr>
+            <w:tcW w:type="dxa" w:w="6912"/>
+            <w:vAlign w:val="center"/>
+            <w:tcBorders>
+              <w:top w:val="single" w:sz="4" w:color="D9D9D9"/>
+              <w:left w:val="single" w:sz="4" w:color="D9D9D9"/>
+              <w:bottom w:val="single" w:sz="4" w:color="D9D9D9"/>
+              <w:right w:val="single" w:sz="4" w:color="D9D9D9"/>
+            </w:tcBorders>
+            <w:tcMar>
+              <w:top w:w="90" w:type="dxa"/>
+              <w:left w:w="90" w:type="dxa"/>
+              <w:bottom w:w="90" w:type="dxa"/>
+              <w:right w:w="90" w:type="dxa"/>
+            </w:tcMar>
+            <w:shd w:fill="F7F7F7"/>
+          </w:tcPr>
+          <w:p>
+            <w:pPr>
+              <w:spacing w:after="40" w:line="247" w:lineRule="auto"/>
+            </w:pPr>
+            <w:r>
+              <w:rPr>
+                <w:sz w:val="20"/>
+              </w:rPr>
+              <w:t>Project name used by this study; the paper does not assert an expansion</w:t>
+            </w:r>
+          </w:p>
+        </w:tc>
+      </w:tr>
+      <w:tr>
+        <w:trPr>
+          <w:cantSplit/>
+        </w:trPr>
+        <w:tc>
+          <w:tcPr>
+            <w:tcW w:type="dxa" w:w="2880"/>
+            <w:vAlign w:val="center"/>
+            <w:tcBorders>
+              <w:top w:val="single" w:sz="4" w:color="D9D9D9"/>
+              <w:left w:val="single" w:sz="4" w:color="D9D9D9"/>
+              <w:bottom w:val="single" w:sz="4" w:color="D9D9D9"/>
+              <w:right w:val="single" w:sz="4" w:color="D9D9D9"/>
+            </w:tcBorders>
+            <w:tcMar>
+              <w:top w:w="90" w:type="dxa"/>
+              <w:left w:w="90" w:type="dxa"/>
+              <w:bottom w:w="90" w:type="dxa"/>
+              <w:right w:w="90" w:type="dxa"/>
+            </w:tcMar>
+            <w:shd w:fill="FFFFFF"/>
+          </w:tcPr>
+          <w:p>
+            <w:pPr>
+              <w:spacing w:after="40" w:line="247" w:lineRule="auto"/>
+            </w:pPr>
+            <w:r>
+              <w:rPr>
+                <w:b/>
+                <w:sz w:val="20"/>
+              </w:rPr>
+              <w:t>MPSS</w:t>
+            </w:r>
+          </w:p>
+        </w:tc>
+        <w:tc>
+          <w:tcPr>
+            <w:tcW w:type="dxa" w:w="6912"/>
+            <w:vAlign w:val="center"/>
+            <w:tcBorders>
+              <w:top w:val="single" w:sz="4" w:color="D9D9D9"/>
+              <w:left w:val="single" w:sz="4" w:color="D9D9D9"/>
+              <w:bottom w:val="single" w:sz="4" w:color="D9D9D9"/>
+              <w:right w:val="single" w:sz="4" w:color="D9D9D9"/>
+            </w:tcBorders>
+            <w:tcMar>
+              <w:top w:w="90" w:type="dxa"/>
+              <w:left w:w="90" w:type="dxa"/>
+              <w:bottom w:w="90" w:type="dxa"/>
+              <w:right w:w="90" w:type="dxa"/>
+            </w:tcMar>
+            <w:shd w:fill="FFFFFF"/>
+          </w:tcPr>
+          <w:p>
+            <w:pPr>
+              <w:spacing w:after="40" w:line="247" w:lineRule="auto"/>
+            </w:pPr>
+            <w:r>
+              <w:rPr>
+                <w:sz w:val="20"/>
+              </w:rPr>
+              <w:t>Managed Physical Sensing Systems</w:t>
+            </w:r>
+          </w:p>
+        </w:tc>
+      </w:tr>
+      <w:tr>
+        <w:trPr>
+          <w:cantSplit/>
+        </w:trPr>
+        <w:tc>
+          <w:tcPr>
+            <w:tcW w:type="dxa" w:w="2880"/>
+            <w:vAlign w:val="center"/>
+            <w:tcBorders>
+              <w:top w:val="single" w:sz="4" w:color="D9D9D9"/>
+              <w:left w:val="single" w:sz="4" w:color="D9D9D9"/>
+              <w:bottom w:val="single" w:sz="4" w:color="D9D9D9"/>
+              <w:right w:val="single" w:sz="4" w:color="D9D9D9"/>
+            </w:tcBorders>
+            <w:tcMar>
+              <w:top w:w="90" w:type="dxa"/>
+              <w:left w:w="90" w:type="dxa"/>
+              <w:bottom w:w="90" w:type="dxa"/>
+              <w:right w:w="90" w:type="dxa"/>
+            </w:tcMar>
+            <w:shd w:fill="F7F7F7"/>
+          </w:tcPr>
+          <w:p>
+            <w:pPr>
+              <w:spacing w:after="40" w:line="247" w:lineRule="auto"/>
+            </w:pPr>
+            <w:r>
+              <w:rPr>
+                <w:b/>
+                <w:sz w:val="20"/>
+              </w:rPr>
+              <w:t>NIST</w:t>
+            </w:r>
+          </w:p>
+        </w:tc>
+        <w:tc>
+          <w:tcPr>
+            <w:tcW w:type="dxa" w:w="6912"/>
+            <w:vAlign w:val="center"/>
+            <w:tcBorders>
+              <w:top w:val="single" w:sz="4" w:color="D9D9D9"/>
+              <w:left w:val="single" w:sz="4" w:color="D9D9D9"/>
+              <w:bottom w:val="single" w:sz="4" w:color="D9D9D9"/>
+              <w:right w:val="single" w:sz="4" w:color="D9D9D9"/>
+            </w:tcBorders>
+            <w:tcMar>
+              <w:top w:w="90" w:type="dxa"/>
+              <w:left w:w="90" w:type="dxa"/>
+              <w:bottom w:w="90" w:type="dxa"/>
+              <w:right w:w="90" w:type="dxa"/>
+            </w:tcMar>
+            <w:shd w:fill="F7F7F7"/>
+          </w:tcPr>
+          <w:p>
+            <w:pPr>
+              <w:spacing w:after="40" w:line="247" w:lineRule="auto"/>
+            </w:pPr>
+            <w:r>
+              <w:rPr>
+                <w:sz w:val="20"/>
+              </w:rPr>
+              <w:t>National Institute of Standards and Technology</w:t>
+            </w:r>
+          </w:p>
+        </w:tc>
+      </w:tr>
+      <w:tr>
+        <w:trPr>
+          <w:cantSplit/>
+        </w:trPr>
+        <w:tc>
+          <w:tcPr>
+            <w:tcW w:type="dxa" w:w="2880"/>
+            <w:vAlign w:val="center"/>
+            <w:tcBorders>
+              <w:top w:val="single" w:sz="4" w:color="D9D9D9"/>
+              <w:left w:val="single" w:sz="4" w:color="D9D9D9"/>
+              <w:bottom w:val="single" w:sz="4" w:color="D9D9D9"/>
+              <w:right w:val="single" w:sz="4" w:color="D9D9D9"/>
+            </w:tcBorders>
+            <w:tcMar>
+              <w:top w:w="90" w:type="dxa"/>
+              <w:left w:w="90" w:type="dxa"/>
+              <w:bottom w:w="90" w:type="dxa"/>
+              <w:right w:w="90" w:type="dxa"/>
+            </w:tcMar>
+            <w:shd w:fill="FFFFFF"/>
+          </w:tcPr>
+          <w:p>
+            <w:pPr>
+              <w:spacing w:after="40" w:line="247" w:lineRule="auto"/>
+            </w:pPr>
+            <w:r>
+              <w:rPr>
+                <w:b/>
+                <w:sz w:val="20"/>
+              </w:rPr>
+              <w:t>OGC</w:t>
+            </w:r>
+          </w:p>
+        </w:tc>
+        <w:tc>
+          <w:tcPr>
+            <w:tcW w:type="dxa" w:w="6912"/>
+            <w:vAlign w:val="center"/>
+            <w:tcBorders>
+              <w:top w:val="single" w:sz="4" w:color="D9D9D9"/>
+              <w:left w:val="single" w:sz="4" w:color="D9D9D9"/>
+              <w:bottom w:val="single" w:sz="4" w:color="D9D9D9"/>
+              <w:right w:val="single" w:sz="4" w:color="D9D9D9"/>
+            </w:tcBorders>
+            <w:tcMar>
+              <w:top w:w="90" w:type="dxa"/>
+              <w:left w:w="90" w:type="dxa"/>
+              <w:bottom w:w="90" w:type="dxa"/>
+              <w:right w:w="90" w:type="dxa"/>
+            </w:tcMar>
+            <w:shd w:fill="FFFFFF"/>
+          </w:tcPr>
+          <w:p>
+            <w:pPr>
+              <w:spacing w:after="40" w:line="247" w:lineRule="auto"/>
+            </w:pPr>
+            <w:r>
+              <w:rPr>
+                <w:sz w:val="20"/>
+              </w:rPr>
+              <w:t>Open Geospatial Consortium</w:t>
+            </w:r>
+          </w:p>
+        </w:tc>
+      </w:tr>
+      <w:tr>
+        <w:trPr>
+          <w:cantSplit/>
+        </w:trPr>
+        <w:tc>
+          <w:tcPr>
+            <w:tcW w:type="dxa" w:w="2880"/>
+            <w:vAlign w:val="center"/>
+            <w:tcBorders>
+              <w:top w:val="single" w:sz="4" w:color="D9D9D9"/>
+              <w:left w:val="single" w:sz="4" w:color="D9D9D9"/>
+              <w:bottom w:val="single" w:sz="4" w:color="D9D9D9"/>
+              <w:right w:val="single" w:sz="4" w:color="D9D9D9"/>
+            </w:tcBorders>
+            <w:tcMar>
+              <w:top w:w="90" w:type="dxa"/>
+              <w:left w:w="90" w:type="dxa"/>
+              <w:bottom w:w="90" w:type="dxa"/>
+              <w:right w:w="90" w:type="dxa"/>
+            </w:tcMar>
+            <w:shd w:fill="F7F7F7"/>
+          </w:tcPr>
+          <w:p>
+            <w:pPr>
+              <w:spacing w:after="40" w:line="247" w:lineRule="auto"/>
+            </w:pPr>
+            <w:r>
+              <w:rPr>
+                <w:b/>
+                <w:sz w:val="20"/>
+              </w:rPr>
+              <w:t>OS4CSAPI</w:t>
+            </w:r>
+          </w:p>
+        </w:tc>
+        <w:tc>
+          <w:tcPr>
+            <w:tcW w:type="dxa" w:w="6912"/>
+            <w:vAlign w:val="center"/>
+            <w:tcBorders>
+              <w:top w:val="single" w:sz="4" w:color="D9D9D9"/>
+              <w:left w:val="single" w:sz="4" w:color="D9D9D9"/>
+              <w:bottom w:val="single" w:sz="4" w:color="D9D9D9"/>
+              <w:right w:val="single" w:sz="4" w:color="D9D9D9"/>
+            </w:tcBorders>
+            <w:tcMar>
+              <w:top w:w="90" w:type="dxa"/>
+              <w:left w:w="90" w:type="dxa"/>
+              <w:bottom w:w="90" w:type="dxa"/>
+              <w:right w:w="90" w:type="dxa"/>
+            </w:tcMar>
+            <w:shd w:fill="F7F7F7"/>
+          </w:tcPr>
+          <w:p>
+            <w:pPr>
+              <w:spacing w:after="40" w:line="247" w:lineRule="auto"/>
+            </w:pPr>
+            <w:r>
+              <w:rPr>
+                <w:sz w:val="20"/>
+              </w:rPr>
+              <w:t>Repository/organization identifier used by the project; the paper does not assert an expansion</w:t>
+            </w:r>
+          </w:p>
+        </w:tc>
+      </w:tr>
+      <w:tr>
+        <w:trPr>
+          <w:cantSplit/>
+        </w:trPr>
+        <w:tc>
+          <w:tcPr>
+            <w:tcW w:type="dxa" w:w="2880"/>
+            <w:vAlign w:val="center"/>
+            <w:tcBorders>
+              <w:top w:val="single" w:sz="4" w:color="D9D9D9"/>
+              <w:left w:val="single" w:sz="4" w:color="D9D9D9"/>
+              <w:bottom w:val="single" w:sz="4" w:color="D9D9D9"/>
+              <w:right w:val="single" w:sz="4" w:color="D9D9D9"/>
+            </w:tcBorders>
+            <w:tcMar>
+              <w:top w:w="90" w:type="dxa"/>
+              <w:left w:w="90" w:type="dxa"/>
+              <w:bottom w:w="90" w:type="dxa"/>
+              <w:right w:w="90" w:type="dxa"/>
+            </w:tcMar>
+            <w:shd w:fill="FFFFFF"/>
+          </w:tcPr>
+          <w:p>
+            <w:pPr>
+              <w:spacing w:after="40" w:line="247" w:lineRule="auto"/>
+            </w:pPr>
+            <w:r>
+              <w:rPr>
+                <w:b/>
+                <w:sz w:val="20"/>
+              </w:rPr>
+              <w:t>PBI</w:t>
+            </w:r>
+          </w:p>
+        </w:tc>
+        <w:tc>
+          <w:tcPr>
+            <w:tcW w:type="dxa" w:w="6912"/>
+            <w:vAlign w:val="center"/>
+            <w:tcBorders>
+              <w:top w:val="single" w:sz="4" w:color="D9D9D9"/>
+              <w:left w:val="single" w:sz="4" w:color="D9D9D9"/>
+              <w:bottom w:val="single" w:sz="4" w:color="D9D9D9"/>
+              <w:right w:val="single" w:sz="4" w:color="D9D9D9"/>
+            </w:tcBorders>
+            <w:tcMar>
+              <w:top w:w="90" w:type="dxa"/>
+              <w:left w:w="90" w:type="dxa"/>
+              <w:bottom w:w="90" w:type="dxa"/>
+              <w:right w:w="90" w:type="dxa"/>
+            </w:tcMar>
+            <w:shd w:fill="FFFFFF"/>
+          </w:tcPr>
+          <w:p>
+            <w:pPr>
+              <w:spacing w:after="40" w:line="247" w:lineRule="auto"/>
+            </w:pPr>
+            <w:r>
+              <w:rPr>
+                <w:sz w:val="20"/>
+              </w:rPr>
+              <w:t>Product Backlog Item</w:t>
+            </w:r>
+          </w:p>
+        </w:tc>
+      </w:tr>
+      <w:tr>
+        <w:trPr>
+          <w:cantSplit/>
+        </w:trPr>
+        <w:tc>
+          <w:tcPr>
+            <w:tcW w:type="dxa" w:w="2880"/>
+            <w:vAlign w:val="center"/>
+            <w:tcBorders>
+              <w:top w:val="single" w:sz="4" w:color="D9D9D9"/>
+              <w:left w:val="single" w:sz="4" w:color="D9D9D9"/>
+              <w:bottom w:val="single" w:sz="4" w:color="D9D9D9"/>
+              <w:right w:val="single" w:sz="4" w:color="D9D9D9"/>
+            </w:tcBorders>
+            <w:tcMar>
+              <w:top w:w="90" w:type="dxa"/>
+              <w:left w:w="90" w:type="dxa"/>
+              <w:bottom w:w="90" w:type="dxa"/>
+              <w:right w:w="90" w:type="dxa"/>
+            </w:tcMar>
+            <w:shd w:fill="F7F7F7"/>
+          </w:tcPr>
+          <w:p>
+            <w:pPr>
+              <w:spacing w:after="40" w:line="247" w:lineRule="auto"/>
+            </w:pPr>
+            <w:r>
+              <w:rPr>
+                <w:b/>
+                <w:sz w:val="20"/>
+              </w:rPr>
+              <w:t>PM2.5</w:t>
+            </w:r>
+          </w:p>
+        </w:tc>
+        <w:tc>
+          <w:tcPr>
+            <w:tcW w:type="dxa" w:w="6912"/>
+            <w:vAlign w:val="center"/>
+            <w:tcBorders>
+              <w:top w:val="single" w:sz="4" w:color="D9D9D9"/>
+              <w:left w:val="single" w:sz="4" w:color="D9D9D9"/>
+              <w:bottom w:val="single" w:sz="4" w:color="D9D9D9"/>
+              <w:right w:val="single" w:sz="4" w:color="D9D9D9"/>
+            </w:tcBorders>
+            <w:tcMar>
+              <w:top w:w="90" w:type="dxa"/>
+              <w:left w:w="90" w:type="dxa"/>
+              <w:bottom w:w="90" w:type="dxa"/>
+              <w:right w:w="90" w:type="dxa"/>
+            </w:tcMar>
+            <w:shd w:fill="F7F7F7"/>
+          </w:tcPr>
+          <w:p>
+            <w:pPr>
+              <w:spacing w:after="40" w:line="247" w:lineRule="auto"/>
+            </w:pPr>
+            <w:r>
+              <w:rPr>
+                <w:sz w:val="20"/>
+              </w:rPr>
+              <w:t>Particulate matter in the source category below 2.5 micrometres in size; common environmental shorthand rather than an acronym</w:t>
+            </w:r>
+          </w:p>
+        </w:tc>
+      </w:tr>
+      <w:tr>
+        <w:trPr>
+          <w:cantSplit/>
+        </w:trPr>
+        <w:tc>
+          <w:tcPr>
+            <w:tcW w:type="dxa" w:w="2880"/>
+            <w:vAlign w:val="center"/>
+            <w:tcBorders>
+              <w:top w:val="single" w:sz="4" w:color="D9D9D9"/>
+              <w:left w:val="single" w:sz="4" w:color="D9D9D9"/>
+              <w:bottom w:val="single" w:sz="4" w:color="D9D9D9"/>
+              <w:right w:val="single" w:sz="4" w:color="D9D9D9"/>
+            </w:tcBorders>
+            <w:tcMar>
+              <w:top w:w="90" w:type="dxa"/>
+              <w:left w:w="90" w:type="dxa"/>
+              <w:bottom w:w="90" w:type="dxa"/>
+              <w:right w:w="90" w:type="dxa"/>
+            </w:tcMar>
+            <w:shd w:fill="FFFFFF"/>
+          </w:tcPr>
+          <w:p>
+            <w:pPr>
+              <w:spacing w:after="40" w:line="247" w:lineRule="auto"/>
+            </w:pPr>
+            <w:r>
+              <w:rPr>
+                <w:b/>
+                <w:sz w:val="20"/>
+              </w:rPr>
+              <w:t>PROV</w:t>
+            </w:r>
+          </w:p>
+        </w:tc>
+        <w:tc>
+          <w:tcPr>
+            <w:tcW w:type="dxa" w:w="6912"/>
+            <w:vAlign w:val="center"/>
+            <w:tcBorders>
+              <w:top w:val="single" w:sz="4" w:color="D9D9D9"/>
+              <w:left w:val="single" w:sz="4" w:color="D9D9D9"/>
+              <w:bottom w:val="single" w:sz="4" w:color="D9D9D9"/>
+              <w:right w:val="single" w:sz="4" w:color="D9D9D9"/>
+            </w:tcBorders>
+            <w:tcMar>
+              <w:top w:w="90" w:type="dxa"/>
+              <w:left w:w="90" w:type="dxa"/>
+              <w:bottom w:w="90" w:type="dxa"/>
+              <w:right w:w="90" w:type="dxa"/>
+            </w:tcMar>
+            <w:shd w:fill="FFFFFF"/>
+          </w:tcPr>
+          <w:p>
+            <w:pPr>
+              <w:spacing w:after="40" w:line="247" w:lineRule="auto"/>
+            </w:pPr>
+            <w:r>
+              <w:rPr>
+                <w:sz w:val="20"/>
+              </w:rPr>
+              <w:t>W3C provenance family/model shorthand</w:t>
+            </w:r>
+          </w:p>
+        </w:tc>
+      </w:tr>
+      <w:tr>
+        <w:trPr>
+          <w:cantSplit/>
+        </w:trPr>
+        <w:tc>
+          <w:tcPr>
+            <w:tcW w:type="dxa" w:w="2880"/>
+            <w:vAlign w:val="center"/>
+            <w:tcBorders>
+              <w:top w:val="single" w:sz="4" w:color="D9D9D9"/>
+              <w:left w:val="single" w:sz="4" w:color="D9D9D9"/>
+              <w:bottom w:val="single" w:sz="4" w:color="D9D9D9"/>
+              <w:right w:val="single" w:sz="4" w:color="D9D9D9"/>
+            </w:tcBorders>
+            <w:tcMar>
+              <w:top w:w="90" w:type="dxa"/>
+              <w:left w:w="90" w:type="dxa"/>
+              <w:bottom w:w="90" w:type="dxa"/>
+              <w:right w:w="90" w:type="dxa"/>
+            </w:tcMar>
+            <w:shd w:fill="F7F7F7"/>
+          </w:tcPr>
+          <w:p>
+            <w:pPr>
+              <w:spacing w:after="40" w:line="247" w:lineRule="auto"/>
+            </w:pPr>
+            <w:r>
+              <w:rPr>
+                <w:b/>
+                <w:sz w:val="20"/>
+              </w:rPr>
+              <w:t>QUDT</w:t>
+            </w:r>
+          </w:p>
+        </w:tc>
+        <w:tc>
+          <w:tcPr>
+            <w:tcW w:type="dxa" w:w="6912"/>
+            <w:vAlign w:val="center"/>
+            <w:tcBorders>
+              <w:top w:val="single" w:sz="4" w:color="D9D9D9"/>
+              <w:left w:val="single" w:sz="4" w:color="D9D9D9"/>
+              <w:bottom w:val="single" w:sz="4" w:color="D9D9D9"/>
+              <w:right w:val="single" w:sz="4" w:color="D9D9D9"/>
+            </w:tcBorders>
+            <w:tcMar>
+              <w:top w:w="90" w:type="dxa"/>
+              <w:left w:w="90" w:type="dxa"/>
+              <w:bottom w:w="90" w:type="dxa"/>
+              <w:right w:w="90" w:type="dxa"/>
+            </w:tcMar>
+            <w:shd w:fill="F7F7F7"/>
+          </w:tcPr>
+          <w:p>
+            <w:pPr>
+              <w:spacing w:after="40" w:line="247" w:lineRule="auto"/>
+            </w:pPr>
+            <w:r>
+              <w:rPr>
+                <w:sz w:val="20"/>
+              </w:rPr>
+              <w:t>Quantities, Units, Dimensions and Types</w:t>
+            </w:r>
+          </w:p>
+        </w:tc>
+      </w:tr>
+      <w:tr>
+        <w:trPr>
+          <w:cantSplit/>
+        </w:trPr>
+        <w:tc>
+          <w:tcPr>
+            <w:tcW w:type="dxa" w:w="2880"/>
+            <w:vAlign w:val="center"/>
+            <w:tcBorders>
+              <w:top w:val="single" w:sz="4" w:color="D9D9D9"/>
+              <w:left w:val="single" w:sz="4" w:color="D9D9D9"/>
+              <w:bottom w:val="single" w:sz="4" w:color="D9D9D9"/>
+              <w:right w:val="single" w:sz="4" w:color="D9D9D9"/>
+            </w:tcBorders>
+            <w:tcMar>
+              <w:top w:w="90" w:type="dxa"/>
+              <w:left w:w="90" w:type="dxa"/>
+              <w:bottom w:w="90" w:type="dxa"/>
+              <w:right w:w="90" w:type="dxa"/>
+            </w:tcMar>
+            <w:shd w:fill="FFFFFF"/>
+          </w:tcPr>
+          <w:p>
+            <w:pPr>
+              <w:spacing w:after="40" w:line="247" w:lineRule="auto"/>
+            </w:pPr>
+            <w:r>
+              <w:rPr>
+                <w:b/>
+                <w:sz w:val="20"/>
+              </w:rPr>
+              <w:t>RFC</w:t>
+            </w:r>
+          </w:p>
+        </w:tc>
+        <w:tc>
+          <w:tcPr>
+            <w:tcW w:type="dxa" w:w="6912"/>
+            <w:vAlign w:val="center"/>
+            <w:tcBorders>
+              <w:top w:val="single" w:sz="4" w:color="D9D9D9"/>
+              <w:left w:val="single" w:sz="4" w:color="D9D9D9"/>
+              <w:bottom w:val="single" w:sz="4" w:color="D9D9D9"/>
+              <w:right w:val="single" w:sz="4" w:color="D9D9D9"/>
+            </w:tcBorders>
+            <w:tcMar>
+              <w:top w:w="90" w:type="dxa"/>
+              <w:left w:w="90" w:type="dxa"/>
+              <w:bottom w:w="90" w:type="dxa"/>
+              <w:right w:w="90" w:type="dxa"/>
+            </w:tcMar>
+            <w:shd w:fill="FFFFFF"/>
+          </w:tcPr>
+          <w:p>
+            <w:pPr>
+              <w:spacing w:after="40" w:line="247" w:lineRule="auto"/>
+            </w:pPr>
+            <w:r>
+              <w:rPr>
+                <w:sz w:val="20"/>
+              </w:rPr>
+              <w:t>Request for Comments</w:t>
+            </w:r>
+          </w:p>
+        </w:tc>
+      </w:tr>
+      <w:tr>
+        <w:trPr>
+          <w:cantSplit/>
+        </w:trPr>
+        <w:tc>
+          <w:tcPr>
+            <w:tcW w:type="dxa" w:w="2880"/>
+            <w:vAlign w:val="center"/>
+            <w:tcBorders>
+              <w:top w:val="single" w:sz="4" w:color="D9D9D9"/>
+              <w:left w:val="single" w:sz="4" w:color="D9D9D9"/>
+              <w:bottom w:val="single" w:sz="4" w:color="D9D9D9"/>
+              <w:right w:val="single" w:sz="4" w:color="D9D9D9"/>
+            </w:tcBorders>
+            <w:tcMar>
+              <w:top w:w="90" w:type="dxa"/>
+              <w:left w:w="90" w:type="dxa"/>
+              <w:bottom w:w="90" w:type="dxa"/>
+              <w:right w:w="90" w:type="dxa"/>
+            </w:tcMar>
+            <w:shd w:fill="F7F7F7"/>
+          </w:tcPr>
+          <w:p>
+            <w:pPr>
+              <w:spacing w:after="40" w:line="247" w:lineRule="auto"/>
+            </w:pPr>
+            <w:r>
+              <w:rPr>
+                <w:b/>
+                <w:sz w:val="20"/>
+              </w:rPr>
+              <w:t>RSSI</w:t>
+            </w:r>
+          </w:p>
+        </w:tc>
+        <w:tc>
+          <w:tcPr>
+            <w:tcW w:type="dxa" w:w="6912"/>
+            <w:vAlign w:val="center"/>
+            <w:tcBorders>
+              <w:top w:val="single" w:sz="4" w:color="D9D9D9"/>
+              <w:left w:val="single" w:sz="4" w:color="D9D9D9"/>
+              <w:bottom w:val="single" w:sz="4" w:color="D9D9D9"/>
+              <w:right w:val="single" w:sz="4" w:color="D9D9D9"/>
+            </w:tcBorders>
+            <w:tcMar>
+              <w:top w:w="90" w:type="dxa"/>
+              <w:left w:w="90" w:type="dxa"/>
+              <w:bottom w:w="90" w:type="dxa"/>
+              <w:right w:w="90" w:type="dxa"/>
+            </w:tcMar>
+            <w:shd w:fill="F7F7F7"/>
+          </w:tcPr>
+          <w:p>
+            <w:pPr>
+              <w:spacing w:after="40" w:line="247" w:lineRule="auto"/>
+            </w:pPr>
+            <w:r>
+              <w:rPr>
+                <w:sz w:val="20"/>
+              </w:rPr>
+              <w:t>Received signal strength indication; Smart Citizen defines it as a measurement of power present in a received radio signal (Smart Citizen n.d.-d)</w:t>
+            </w:r>
+          </w:p>
+        </w:tc>
+      </w:tr>
+      <w:tr>
+        <w:trPr>
+          <w:cantSplit/>
+        </w:trPr>
+        <w:tc>
+          <w:tcPr>
+            <w:tcW w:type="dxa" w:w="2880"/>
+            <w:vAlign w:val="center"/>
+            <w:tcBorders>
+              <w:top w:val="single" w:sz="4" w:color="D9D9D9"/>
+              <w:left w:val="single" w:sz="4" w:color="D9D9D9"/>
+              <w:bottom w:val="single" w:sz="4" w:color="D9D9D9"/>
+              <w:right w:val="single" w:sz="4" w:color="D9D9D9"/>
+            </w:tcBorders>
+            <w:tcMar>
+              <w:top w:w="90" w:type="dxa"/>
+              <w:left w:w="90" w:type="dxa"/>
+              <w:bottom w:w="90" w:type="dxa"/>
+              <w:right w:w="90" w:type="dxa"/>
+            </w:tcMar>
+            <w:shd w:fill="FFFFFF"/>
+          </w:tcPr>
+          <w:p>
+            <w:pPr>
+              <w:spacing w:after="40" w:line="247" w:lineRule="auto"/>
+            </w:pPr>
+            <w:r>
+              <w:rPr>
+                <w:b/>
+                <w:sz w:val="20"/>
+              </w:rPr>
+              <w:t>SCK</w:t>
+            </w:r>
+          </w:p>
+        </w:tc>
+        <w:tc>
+          <w:tcPr>
+            <w:tcW w:type="dxa" w:w="6912"/>
+            <w:vAlign w:val="center"/>
+            <w:tcBorders>
+              <w:top w:val="single" w:sz="4" w:color="D9D9D9"/>
+              <w:left w:val="single" w:sz="4" w:color="D9D9D9"/>
+              <w:bottom w:val="single" w:sz="4" w:color="D9D9D9"/>
+              <w:right w:val="single" w:sz="4" w:color="D9D9D9"/>
+            </w:tcBorders>
+            <w:tcMar>
+              <w:top w:w="90" w:type="dxa"/>
+              <w:left w:w="90" w:type="dxa"/>
+              <w:bottom w:w="90" w:type="dxa"/>
+              <w:right w:w="90" w:type="dxa"/>
+            </w:tcMar>
+            <w:shd w:fill="FFFFFF"/>
+          </w:tcPr>
+          <w:p>
+            <w:pPr>
+              <w:spacing w:after="40" w:line="247" w:lineRule="auto"/>
+            </w:pPr>
+            <w:r>
+              <w:rPr>
+                <w:sz w:val="20"/>
+              </w:rPr>
+              <w:t>Smart Citizen Kit</w:t>
+            </w:r>
+          </w:p>
+        </w:tc>
+      </w:tr>
+      <w:tr>
+        <w:trPr>
+          <w:cantSplit/>
+        </w:trPr>
+        <w:tc>
+          <w:tcPr>
+            <w:tcW w:type="dxa" w:w="2880"/>
+            <w:vAlign w:val="center"/>
+            <w:tcBorders>
+              <w:top w:val="single" w:sz="4" w:color="D9D9D9"/>
+              <w:left w:val="single" w:sz="4" w:color="D9D9D9"/>
+              <w:bottom w:val="single" w:sz="4" w:color="D9D9D9"/>
+              <w:right w:val="single" w:sz="4" w:color="D9D9D9"/>
+            </w:tcBorders>
+            <w:tcMar>
+              <w:top w:w="90" w:type="dxa"/>
+              <w:left w:w="90" w:type="dxa"/>
+              <w:bottom w:w="90" w:type="dxa"/>
+              <w:right w:w="90" w:type="dxa"/>
+            </w:tcMar>
+            <w:shd w:fill="F7F7F7"/>
+          </w:tcPr>
+          <w:p>
+            <w:pPr>
+              <w:spacing w:after="40" w:line="247" w:lineRule="auto"/>
+            </w:pPr>
+            <w:r>
+              <w:rPr>
+                <w:b/>
+                <w:sz w:val="20"/>
+              </w:rPr>
+              <w:t>SDK</w:t>
+            </w:r>
+          </w:p>
+        </w:tc>
+        <w:tc>
+          <w:tcPr>
+            <w:tcW w:type="dxa" w:w="6912"/>
+            <w:vAlign w:val="center"/>
+            <w:tcBorders>
+              <w:top w:val="single" w:sz="4" w:color="D9D9D9"/>
+              <w:left w:val="single" w:sz="4" w:color="D9D9D9"/>
+              <w:bottom w:val="single" w:sz="4" w:color="D9D9D9"/>
+              <w:right w:val="single" w:sz="4" w:color="D9D9D9"/>
+            </w:tcBorders>
+            <w:tcMar>
+              <w:top w:w="90" w:type="dxa"/>
+              <w:left w:w="90" w:type="dxa"/>
+              <w:bottom w:w="90" w:type="dxa"/>
+              <w:right w:w="90" w:type="dxa"/>
+            </w:tcMar>
+            <w:shd w:fill="F7F7F7"/>
+          </w:tcPr>
+          <w:p>
+            <w:pPr>
+              <w:spacing w:after="40" w:line="247" w:lineRule="auto"/>
+            </w:pPr>
+            <w:r>
+              <w:rPr>
+                <w:sz w:val="20"/>
+              </w:rPr>
+              <w:t>Software Development Kit</w:t>
+            </w:r>
+          </w:p>
+        </w:tc>
+      </w:tr>
+      <w:tr>
+        <w:trPr>
+          <w:cantSplit/>
+        </w:trPr>
+        <w:tc>
+          <w:tcPr>
+            <w:tcW w:type="dxa" w:w="2880"/>
+            <w:vAlign w:val="center"/>
+            <w:tcBorders>
+              <w:top w:val="single" w:sz="4" w:color="D9D9D9"/>
+              <w:left w:val="single" w:sz="4" w:color="D9D9D9"/>
+              <w:bottom w:val="single" w:sz="4" w:color="D9D9D9"/>
+              <w:right w:val="single" w:sz="4" w:color="D9D9D9"/>
+            </w:tcBorders>
+            <w:tcMar>
+              <w:top w:w="90" w:type="dxa"/>
+              <w:left w:w="90" w:type="dxa"/>
+              <w:bottom w:w="90" w:type="dxa"/>
+              <w:right w:w="90" w:type="dxa"/>
+            </w:tcMar>
+            <w:shd w:fill="FFFFFF"/>
+          </w:tcPr>
+          <w:p>
+            <w:pPr>
+              <w:spacing w:after="40" w:line="247" w:lineRule="auto"/>
+            </w:pPr>
+            <w:r>
+              <w:rPr>
+                <w:b/>
+                <w:sz w:val="20"/>
+              </w:rPr>
+              <w:t>SHA-256</w:t>
+            </w:r>
+          </w:p>
+        </w:tc>
+        <w:tc>
+          <w:tcPr>
+            <w:tcW w:type="dxa" w:w="6912"/>
+            <w:vAlign w:val="center"/>
+            <w:tcBorders>
+              <w:top w:val="single" w:sz="4" w:color="D9D9D9"/>
+              <w:left w:val="single" w:sz="4" w:color="D9D9D9"/>
+              <w:bottom w:val="single" w:sz="4" w:color="D9D9D9"/>
+              <w:right w:val="single" w:sz="4" w:color="D9D9D9"/>
+            </w:tcBorders>
+            <w:tcMar>
+              <w:top w:w="90" w:type="dxa"/>
+              <w:left w:w="90" w:type="dxa"/>
+              <w:bottom w:w="90" w:type="dxa"/>
+              <w:right w:w="90" w:type="dxa"/>
+            </w:tcMar>
+            <w:shd w:fill="FFFFFF"/>
+          </w:tcPr>
+          <w:p>
+            <w:pPr>
+              <w:spacing w:after="40" w:line="247" w:lineRule="auto"/>
+            </w:pPr>
+            <w:r>
+              <w:rPr>
+                <w:sz w:val="20"/>
+              </w:rPr>
+              <w:t>Secure Hash Algorithm 256-bit</w:t>
+            </w:r>
+          </w:p>
+        </w:tc>
+      </w:tr>
+      <w:tr>
+        <w:trPr>
+          <w:cantSplit/>
+        </w:trPr>
+        <w:tc>
+          <w:tcPr>
+            <w:tcW w:type="dxa" w:w="2880"/>
+            <w:vAlign w:val="center"/>
+            <w:tcBorders>
+              <w:top w:val="single" w:sz="4" w:color="D9D9D9"/>
+              <w:left w:val="single" w:sz="4" w:color="D9D9D9"/>
+              <w:bottom w:val="single" w:sz="4" w:color="D9D9D9"/>
+              <w:right w:val="single" w:sz="4" w:color="D9D9D9"/>
+            </w:tcBorders>
+            <w:tcMar>
+              <w:top w:w="90" w:type="dxa"/>
+              <w:left w:w="90" w:type="dxa"/>
+              <w:bottom w:w="90" w:type="dxa"/>
+              <w:right w:w="90" w:type="dxa"/>
+            </w:tcMar>
+            <w:shd w:fill="F7F7F7"/>
+          </w:tcPr>
+          <w:p>
+            <w:pPr>
+              <w:spacing w:after="40" w:line="247" w:lineRule="auto"/>
+            </w:pPr>
+            <w:r>
+              <w:rPr>
+                <w:b/>
+                <w:sz w:val="20"/>
+              </w:rPr>
+              <w:t>SensorML</w:t>
+            </w:r>
+          </w:p>
+        </w:tc>
+        <w:tc>
+          <w:tcPr>
+            <w:tcW w:type="dxa" w:w="6912"/>
+            <w:vAlign w:val="center"/>
+            <w:tcBorders>
+              <w:top w:val="single" w:sz="4" w:color="D9D9D9"/>
+              <w:left w:val="single" w:sz="4" w:color="D9D9D9"/>
+              <w:bottom w:val="single" w:sz="4" w:color="D9D9D9"/>
+              <w:right w:val="single" w:sz="4" w:color="D9D9D9"/>
+            </w:tcBorders>
+            <w:tcMar>
+              <w:top w:w="90" w:type="dxa"/>
+              <w:left w:w="90" w:type="dxa"/>
+              <w:bottom w:w="90" w:type="dxa"/>
+              <w:right w:w="90" w:type="dxa"/>
+            </w:tcMar>
+            <w:shd w:fill="F7F7F7"/>
+          </w:tcPr>
+          <w:p>
+            <w:pPr>
+              <w:spacing w:after="40" w:line="247" w:lineRule="auto"/>
+            </w:pPr>
+            <w:r>
+              <w:rPr>
+                <w:sz w:val="20"/>
+              </w:rPr>
+              <w:t>Sensor Model Language</w:t>
+            </w:r>
+          </w:p>
+        </w:tc>
+      </w:tr>
+      <w:tr>
+        <w:trPr>
+          <w:cantSplit/>
+        </w:trPr>
+        <w:tc>
+          <w:tcPr>
+            <w:tcW w:type="dxa" w:w="2880"/>
+            <w:vAlign w:val="center"/>
+            <w:tcBorders>
+              <w:top w:val="single" w:sz="4" w:color="D9D9D9"/>
+              <w:left w:val="single" w:sz="4" w:color="D9D9D9"/>
+              <w:bottom w:val="single" w:sz="4" w:color="D9D9D9"/>
+              <w:right w:val="single" w:sz="4" w:color="D9D9D9"/>
+            </w:tcBorders>
+            <w:tcMar>
+              <w:top w:w="90" w:type="dxa"/>
+              <w:left w:w="90" w:type="dxa"/>
+              <w:bottom w:w="90" w:type="dxa"/>
+              <w:right w:w="90" w:type="dxa"/>
+            </w:tcMar>
+            <w:shd w:fill="FFFFFF"/>
+          </w:tcPr>
+          <w:p>
+            <w:pPr>
+              <w:spacing w:after="40" w:line="247" w:lineRule="auto"/>
+            </w:pPr>
+            <w:r>
+              <w:rPr>
+                <w:b/>
+                <w:sz w:val="20"/>
+              </w:rPr>
+              <w:t>SOSA</w:t>
+            </w:r>
+          </w:p>
+        </w:tc>
+        <w:tc>
+          <w:tcPr>
+            <w:tcW w:type="dxa" w:w="6912"/>
+            <w:vAlign w:val="center"/>
+            <w:tcBorders>
+              <w:top w:val="single" w:sz="4" w:color="D9D9D9"/>
+              <w:left w:val="single" w:sz="4" w:color="D9D9D9"/>
+              <w:bottom w:val="single" w:sz="4" w:color="D9D9D9"/>
+              <w:right w:val="single" w:sz="4" w:color="D9D9D9"/>
+            </w:tcBorders>
+            <w:tcMar>
+              <w:top w:w="90" w:type="dxa"/>
+              <w:left w:w="90" w:type="dxa"/>
+              <w:bottom w:w="90" w:type="dxa"/>
+              <w:right w:w="90" w:type="dxa"/>
+            </w:tcMar>
+            <w:shd w:fill="FFFFFF"/>
+          </w:tcPr>
+          <w:p>
+            <w:pPr>
+              <w:spacing w:after="40" w:line="247" w:lineRule="auto"/>
+            </w:pPr>
+            <w:r>
+              <w:rPr>
+                <w:sz w:val="20"/>
+              </w:rPr>
+              <w:t>Sensor, Observation, Sample, and Actuator</w:t>
+            </w:r>
+          </w:p>
+        </w:tc>
+      </w:tr>
+      <w:tr>
+        <w:trPr>
+          <w:cantSplit/>
+        </w:trPr>
+        <w:tc>
+          <w:tcPr>
+            <w:tcW w:type="dxa" w:w="2880"/>
+            <w:vAlign w:val="center"/>
+            <w:tcBorders>
+              <w:top w:val="single" w:sz="4" w:color="D9D9D9"/>
+              <w:left w:val="single" w:sz="4" w:color="D9D9D9"/>
+              <w:bottom w:val="single" w:sz="4" w:color="D9D9D9"/>
+              <w:right w:val="single" w:sz="4" w:color="D9D9D9"/>
+            </w:tcBorders>
+            <w:tcMar>
+              <w:top w:w="90" w:type="dxa"/>
+              <w:left w:w="90" w:type="dxa"/>
+              <w:bottom w:w="90" w:type="dxa"/>
+              <w:right w:w="90" w:type="dxa"/>
+            </w:tcMar>
+            <w:shd w:fill="F7F7F7"/>
+          </w:tcPr>
+          <w:p>
+            <w:pPr>
+              <w:spacing w:after="40" w:line="247" w:lineRule="auto"/>
+            </w:pPr>
+            <w:r>
+              <w:rPr>
+                <w:b/>
+                <w:sz w:val="20"/>
+              </w:rPr>
+              <w:t>SSN</w:t>
+            </w:r>
+          </w:p>
+        </w:tc>
+        <w:tc>
+          <w:tcPr>
+            <w:tcW w:type="dxa" w:w="6912"/>
+            <w:vAlign w:val="center"/>
+            <w:tcBorders>
+              <w:top w:val="single" w:sz="4" w:color="D9D9D9"/>
+              <w:left w:val="single" w:sz="4" w:color="D9D9D9"/>
+              <w:bottom w:val="single" w:sz="4" w:color="D9D9D9"/>
+              <w:right w:val="single" w:sz="4" w:color="D9D9D9"/>
+            </w:tcBorders>
+            <w:tcMar>
+              <w:top w:w="90" w:type="dxa"/>
+              <w:left w:w="90" w:type="dxa"/>
+              <w:bottom w:w="90" w:type="dxa"/>
+              <w:right w:w="90" w:type="dxa"/>
+            </w:tcMar>
+            <w:shd w:fill="F7F7F7"/>
+          </w:tcPr>
+          <w:p>
+            <w:pPr>
+              <w:spacing w:after="40" w:line="247" w:lineRule="auto"/>
+            </w:pPr>
+            <w:r>
+              <w:rPr>
+                <w:sz w:val="20"/>
+              </w:rPr>
+              <w:t>Semantic Sensor Network</w:t>
+            </w:r>
+          </w:p>
+        </w:tc>
+      </w:tr>
+      <w:tr>
+        <w:trPr>
+          <w:cantSplit/>
+        </w:trPr>
+        <w:tc>
+          <w:tcPr>
+            <w:tcW w:type="dxa" w:w="2880"/>
+            <w:vAlign w:val="center"/>
+            <w:tcBorders>
+              <w:top w:val="single" w:sz="4" w:color="D9D9D9"/>
+              <w:left w:val="single" w:sz="4" w:color="D9D9D9"/>
+              <w:bottom w:val="single" w:sz="4" w:color="D9D9D9"/>
+              <w:right w:val="single" w:sz="4" w:color="D9D9D9"/>
+            </w:tcBorders>
+            <w:tcMar>
+              <w:top w:w="90" w:type="dxa"/>
+              <w:left w:w="90" w:type="dxa"/>
+              <w:bottom w:w="90" w:type="dxa"/>
+              <w:right w:w="90" w:type="dxa"/>
+            </w:tcMar>
+            <w:shd w:fill="FFFFFF"/>
+          </w:tcPr>
+          <w:p>
+            <w:pPr>
+              <w:spacing w:after="40" w:line="247" w:lineRule="auto"/>
+            </w:pPr>
+            <w:r>
+              <w:rPr>
+                <w:b/>
+                <w:sz w:val="20"/>
+              </w:rPr>
+              <w:t>SWE</w:t>
+            </w:r>
+          </w:p>
+        </w:tc>
+        <w:tc>
+          <w:tcPr>
+            <w:tcW w:type="dxa" w:w="6912"/>
+            <w:vAlign w:val="center"/>
+            <w:tcBorders>
+              <w:top w:val="single" w:sz="4" w:color="D9D9D9"/>
+              <w:left w:val="single" w:sz="4" w:color="D9D9D9"/>
+              <w:bottom w:val="single" w:sz="4" w:color="D9D9D9"/>
+              <w:right w:val="single" w:sz="4" w:color="D9D9D9"/>
+            </w:tcBorders>
+            <w:tcMar>
+              <w:top w:w="90" w:type="dxa"/>
+              <w:left w:w="90" w:type="dxa"/>
+              <w:bottom w:w="90" w:type="dxa"/>
+              <w:right w:w="90" w:type="dxa"/>
+            </w:tcMar>
+            <w:shd w:fill="FFFFFF"/>
+          </w:tcPr>
+          <w:p>
+            <w:pPr>
+              <w:spacing w:after="40" w:line="247" w:lineRule="auto"/>
+            </w:pPr>
+            <w:r>
+              <w:rPr>
+                <w:sz w:val="20"/>
+              </w:rPr>
+              <w:t>Sensor Web Enablement</w:t>
+            </w:r>
+          </w:p>
+        </w:tc>
+      </w:tr>
+      <w:tr>
+        <w:trPr>
+          <w:cantSplit/>
+        </w:trPr>
+        <w:tc>
+          <w:tcPr>
+            <w:tcW w:type="dxa" w:w="2880"/>
+            <w:vAlign w:val="center"/>
+            <w:tcBorders>
+              <w:top w:val="single" w:sz="4" w:color="D9D9D9"/>
+              <w:left w:val="single" w:sz="4" w:color="D9D9D9"/>
+              <w:bottom w:val="single" w:sz="4" w:color="D9D9D9"/>
+              <w:right w:val="single" w:sz="4" w:color="D9D9D9"/>
+            </w:tcBorders>
+            <w:tcMar>
+              <w:top w:w="90" w:type="dxa"/>
+              <w:left w:w="90" w:type="dxa"/>
+              <w:bottom w:w="90" w:type="dxa"/>
+              <w:right w:w="90" w:type="dxa"/>
+            </w:tcMar>
+            <w:shd w:fill="F7F7F7"/>
+          </w:tcPr>
+          <w:p>
+            <w:pPr>
+              <w:spacing w:after="40" w:line="247" w:lineRule="auto"/>
+            </w:pPr>
+            <w:r>
+              <w:rPr>
+                <w:b/>
+                <w:sz w:val="20"/>
+              </w:rPr>
+              <w:t>TRSS</w:t>
+            </w:r>
+          </w:p>
+        </w:tc>
+        <w:tc>
+          <w:tcPr>
+            <w:tcW w:type="dxa" w:w="6912"/>
+            <w:vAlign w:val="center"/>
+            <w:tcBorders>
+              <w:top w:val="single" w:sz="4" w:color="D9D9D9"/>
+              <w:left w:val="single" w:sz="4" w:color="D9D9D9"/>
+              <w:bottom w:val="single" w:sz="4" w:color="D9D9D9"/>
+              <w:right w:val="single" w:sz="4" w:color="D9D9D9"/>
+            </w:tcBorders>
+            <w:tcMar>
+              <w:top w:w="90" w:type="dxa"/>
+              <w:left w:w="90" w:type="dxa"/>
+              <w:bottom w:w="90" w:type="dxa"/>
+              <w:right w:w="90" w:type="dxa"/>
+            </w:tcMar>
+            <w:shd w:fill="F7F7F7"/>
+          </w:tcPr>
+          <w:p>
+            <w:pPr>
+              <w:spacing w:after="40" w:line="247" w:lineRule="auto"/>
+            </w:pPr>
+            <w:r>
+              <w:rPr>
+                <w:sz w:val="20"/>
+              </w:rPr>
+              <w:t>Source-system name used by the project; the paper does not assert an expansion</w:t>
+            </w:r>
+          </w:p>
+        </w:tc>
+      </w:tr>
+      <w:tr>
+        <w:trPr>
+          <w:cantSplit/>
+        </w:trPr>
+        <w:tc>
+          <w:tcPr>
+            <w:tcW w:type="dxa" w:w="2880"/>
+            <w:vAlign w:val="center"/>
+            <w:tcBorders>
+              <w:top w:val="single" w:sz="4" w:color="D9D9D9"/>
+              <w:left w:val="single" w:sz="4" w:color="D9D9D9"/>
+              <w:bottom w:val="single" w:sz="4" w:color="D9D9D9"/>
+              <w:right w:val="single" w:sz="4" w:color="D9D9D9"/>
+            </w:tcBorders>
+            <w:tcMar>
+              <w:top w:w="90" w:type="dxa"/>
+              <w:left w:w="90" w:type="dxa"/>
+              <w:bottom w:w="90" w:type="dxa"/>
+              <w:right w:w="90" w:type="dxa"/>
+            </w:tcMar>
+            <w:shd w:fill="FFFFFF"/>
+          </w:tcPr>
+          <w:p>
+            <w:pPr>
+              <w:spacing w:after="40" w:line="247" w:lineRule="auto"/>
+            </w:pPr>
+            <w:r>
+              <w:rPr>
+                <w:b/>
+                <w:sz w:val="20"/>
+              </w:rPr>
+              <w:t>UI</w:t>
+            </w:r>
+          </w:p>
+        </w:tc>
+        <w:tc>
+          <w:tcPr>
+            <w:tcW w:type="dxa" w:w="6912"/>
+            <w:vAlign w:val="center"/>
+            <w:tcBorders>
+              <w:top w:val="single" w:sz="4" w:color="D9D9D9"/>
+              <w:left w:val="single" w:sz="4" w:color="D9D9D9"/>
+              <w:bottom w:val="single" w:sz="4" w:color="D9D9D9"/>
+              <w:right w:val="single" w:sz="4" w:color="D9D9D9"/>
+            </w:tcBorders>
+            <w:tcMar>
+              <w:top w:w="90" w:type="dxa"/>
+              <w:left w:w="90" w:type="dxa"/>
+              <w:bottom w:w="90" w:type="dxa"/>
+              <w:right w:w="90" w:type="dxa"/>
+            </w:tcMar>
+            <w:shd w:fill="FFFFFF"/>
+          </w:tcPr>
+          <w:p>
+            <w:pPr>
+              <w:spacing w:after="40" w:line="247" w:lineRule="auto"/>
+            </w:pPr>
+            <w:r>
+              <w:rPr>
+                <w:sz w:val="20"/>
+              </w:rPr>
+              <w:t>User Interface</w:t>
+            </w:r>
+          </w:p>
+        </w:tc>
+      </w:tr>
+      <w:tr>
+        <w:trPr>
+          <w:cantSplit/>
+        </w:trPr>
+        <w:tc>
+          <w:tcPr>
+            <w:tcW w:type="dxa" w:w="2880"/>
+            <w:vAlign w:val="center"/>
+            <w:tcBorders>
+              <w:top w:val="single" w:sz="4" w:color="D9D9D9"/>
+              <w:left w:val="single" w:sz="4" w:color="D9D9D9"/>
+              <w:bottom w:val="single" w:sz="4" w:color="D9D9D9"/>
+              <w:right w:val="single" w:sz="4" w:color="D9D9D9"/>
+            </w:tcBorders>
+            <w:tcMar>
+              <w:top w:w="90" w:type="dxa"/>
+              <w:left w:w="90" w:type="dxa"/>
+              <w:bottom w:w="90" w:type="dxa"/>
+              <w:right w:w="90" w:type="dxa"/>
+            </w:tcMar>
+            <w:shd w:fill="F7F7F7"/>
+          </w:tcPr>
+          <w:p>
+            <w:pPr>
+              <w:spacing w:after="40" w:line="247" w:lineRule="auto"/>
+            </w:pPr>
+            <w:r>
+              <w:rPr>
+                <w:b/>
+                <w:sz w:val="20"/>
+              </w:rPr>
+              <w:t>UID</w:t>
+            </w:r>
+          </w:p>
+        </w:tc>
+        <w:tc>
+          <w:tcPr>
+            <w:tcW w:type="dxa" w:w="6912"/>
+            <w:vAlign w:val="center"/>
+            <w:tcBorders>
+              <w:top w:val="single" w:sz="4" w:color="D9D9D9"/>
+              <w:left w:val="single" w:sz="4" w:color="D9D9D9"/>
+              <w:bottom w:val="single" w:sz="4" w:color="D9D9D9"/>
+              <w:right w:val="single" w:sz="4" w:color="D9D9D9"/>
+            </w:tcBorders>
+            <w:tcMar>
+              <w:top w:w="90" w:type="dxa"/>
+              <w:left w:w="90" w:type="dxa"/>
+              <w:bottom w:w="90" w:type="dxa"/>
+              <w:right w:w="90" w:type="dxa"/>
+            </w:tcMar>
+            <w:shd w:fill="F7F7F7"/>
+          </w:tcPr>
+          <w:p>
+            <w:pPr>
+              <w:spacing w:after="40" w:line="247" w:lineRule="auto"/>
+            </w:pPr>
+            <w:r>
+              <w:rPr>
+                <w:sz w:val="20"/>
+              </w:rPr>
+              <w:t>Unique Identifier</w:t>
+            </w:r>
+          </w:p>
+        </w:tc>
+      </w:tr>
+      <w:tr>
+        <w:trPr>
+          <w:cantSplit/>
+        </w:trPr>
+        <w:tc>
+          <w:tcPr>
+            <w:tcW w:type="dxa" w:w="2880"/>
+            <w:vAlign w:val="center"/>
+            <w:tcBorders>
+              <w:top w:val="single" w:sz="4" w:color="D9D9D9"/>
+              <w:left w:val="single" w:sz="4" w:color="D9D9D9"/>
+              <w:bottom w:val="single" w:sz="4" w:color="D9D9D9"/>
+              <w:right w:val="single" w:sz="4" w:color="D9D9D9"/>
+            </w:tcBorders>
+            <w:tcMar>
+              <w:top w:w="90" w:type="dxa"/>
+              <w:left w:w="90" w:type="dxa"/>
+              <w:bottom w:w="90" w:type="dxa"/>
+              <w:right w:w="90" w:type="dxa"/>
+            </w:tcMar>
+            <w:shd w:fill="FFFFFF"/>
+          </w:tcPr>
+          <w:p>
+            <w:pPr>
+              <w:spacing w:after="40" w:line="247" w:lineRule="auto"/>
+            </w:pPr>
+            <w:r>
+              <w:rPr>
+                <w:b/>
+                <w:sz w:val="20"/>
+              </w:rPr>
+              <w:t>URI</w:t>
+            </w:r>
+          </w:p>
+        </w:tc>
+        <w:tc>
+          <w:tcPr>
+            <w:tcW w:type="dxa" w:w="6912"/>
+            <w:vAlign w:val="center"/>
+            <w:tcBorders>
+              <w:top w:val="single" w:sz="4" w:color="D9D9D9"/>
+              <w:left w:val="single" w:sz="4" w:color="D9D9D9"/>
+              <w:bottom w:val="single" w:sz="4" w:color="D9D9D9"/>
+              <w:right w:val="single" w:sz="4" w:color="D9D9D9"/>
+            </w:tcBorders>
+            <w:tcMar>
+              <w:top w:w="90" w:type="dxa"/>
+              <w:left w:w="90" w:type="dxa"/>
+              <w:bottom w:w="90" w:type="dxa"/>
+              <w:right w:w="90" w:type="dxa"/>
+            </w:tcMar>
+            <w:shd w:fill="FFFFFF"/>
+          </w:tcPr>
+          <w:p>
+            <w:pPr>
+              <w:spacing w:after="40" w:line="247" w:lineRule="auto"/>
+            </w:pPr>
+            <w:r>
+              <w:rPr>
+                <w:sz w:val="20"/>
+              </w:rPr>
+              <w:t>Uniform Resource Identifier</w:t>
+            </w:r>
+          </w:p>
+        </w:tc>
+      </w:tr>
+      <w:tr>
+        <w:trPr>
+          <w:cantSplit/>
+        </w:trPr>
+        <w:tc>
+          <w:tcPr>
+            <w:tcW w:type="dxa" w:w="2880"/>
+            <w:vAlign w:val="center"/>
+            <w:tcBorders>
+              <w:top w:val="single" w:sz="4" w:color="D9D9D9"/>
+              <w:left w:val="single" w:sz="4" w:color="D9D9D9"/>
+              <w:bottom w:val="single" w:sz="4" w:color="D9D9D9"/>
+              <w:right w:val="single" w:sz="4" w:color="D9D9D9"/>
+            </w:tcBorders>
+            <w:tcMar>
+              <w:top w:w="90" w:type="dxa"/>
+              <w:left w:w="90" w:type="dxa"/>
+              <w:bottom w:w="90" w:type="dxa"/>
+              <w:right w:w="90" w:type="dxa"/>
+            </w:tcMar>
+            <w:shd w:fill="F7F7F7"/>
+          </w:tcPr>
+          <w:p>
+            <w:pPr>
+              <w:spacing w:after="40" w:line="247" w:lineRule="auto"/>
+            </w:pPr>
+            <w:r>
+              <w:rPr>
+                <w:b/>
+                <w:sz w:val="20"/>
+              </w:rPr>
+              <w:t>URL</w:t>
+            </w:r>
+          </w:p>
+        </w:tc>
+        <w:tc>
+          <w:tcPr>
+            <w:tcW w:type="dxa" w:w="6912"/>
+            <w:vAlign w:val="center"/>
+            <w:tcBorders>
+              <w:top w:val="single" w:sz="4" w:color="D9D9D9"/>
+              <w:left w:val="single" w:sz="4" w:color="D9D9D9"/>
+              <w:bottom w:val="single" w:sz="4" w:color="D9D9D9"/>
+              <w:right w:val="single" w:sz="4" w:color="D9D9D9"/>
+            </w:tcBorders>
+            <w:tcMar>
+              <w:top w:w="90" w:type="dxa"/>
+              <w:left w:w="90" w:type="dxa"/>
+              <w:bottom w:w="90" w:type="dxa"/>
+              <w:right w:w="90" w:type="dxa"/>
+            </w:tcMar>
+            <w:shd w:fill="F7F7F7"/>
+          </w:tcPr>
+          <w:p>
+            <w:pPr>
+              <w:spacing w:after="40" w:line="247" w:lineRule="auto"/>
+            </w:pPr>
+            <w:r>
+              <w:rPr>
+                <w:sz w:val="20"/>
+              </w:rPr>
+              <w:t>Uniform Resource Locator</w:t>
+            </w:r>
+          </w:p>
+        </w:tc>
+      </w:tr>
+      <w:tr>
+        <w:trPr>
+          <w:cantSplit/>
+        </w:trPr>
+        <w:tc>
+          <w:tcPr>
+            <w:tcW w:type="dxa" w:w="2880"/>
+            <w:vAlign w:val="center"/>
+            <w:tcBorders>
+              <w:top w:val="single" w:sz="4" w:color="D9D9D9"/>
+              <w:left w:val="single" w:sz="4" w:color="D9D9D9"/>
+              <w:bottom w:val="single" w:sz="4" w:color="D9D9D9"/>
+              <w:right w:val="single" w:sz="4" w:color="D9D9D9"/>
+            </w:tcBorders>
+            <w:tcMar>
+              <w:top w:w="90" w:type="dxa"/>
+              <w:left w:w="90" w:type="dxa"/>
+              <w:bottom w:w="90" w:type="dxa"/>
+              <w:right w:w="90" w:type="dxa"/>
+            </w:tcMar>
+            <w:shd w:fill="FFFFFF"/>
+          </w:tcPr>
+          <w:p>
+            <w:pPr>
+              <w:spacing w:after="40" w:line="247" w:lineRule="auto"/>
+            </w:pPr>
+            <w:r>
+              <w:rPr>
+                <w:b/>
+                <w:sz w:val="20"/>
+              </w:rPr>
+              <w:t>USB</w:t>
+            </w:r>
+          </w:p>
+        </w:tc>
+        <w:tc>
+          <w:tcPr>
+            <w:tcW w:type="dxa" w:w="6912"/>
+            <w:vAlign w:val="center"/>
+            <w:tcBorders>
+              <w:top w:val="single" w:sz="4" w:color="D9D9D9"/>
+              <w:left w:val="single" w:sz="4" w:color="D9D9D9"/>
+              <w:bottom w:val="single" w:sz="4" w:color="D9D9D9"/>
+              <w:right w:val="single" w:sz="4" w:color="D9D9D9"/>
+            </w:tcBorders>
+            <w:tcMar>
+              <w:top w:w="90" w:type="dxa"/>
+              <w:left w:w="90" w:type="dxa"/>
+              <w:bottom w:w="90" w:type="dxa"/>
+              <w:right w:w="90" w:type="dxa"/>
+            </w:tcMar>
+            <w:shd w:fill="FFFFFF"/>
+          </w:tcPr>
+          <w:p>
+            <w:pPr>
+              <w:spacing w:after="40" w:line="247" w:lineRule="auto"/>
+            </w:pPr>
+            <w:r>
+              <w:rPr>
+                <w:sz w:val="20"/>
+              </w:rPr>
+              <w:t>Universal Serial Bus</w:t>
+            </w:r>
+          </w:p>
+        </w:tc>
+      </w:tr>
+      <w:tr>
+        <w:trPr>
+          <w:cantSplit/>
+        </w:trPr>
+        <w:tc>
+          <w:tcPr>
+            <w:tcW w:type="dxa" w:w="2880"/>
+            <w:vAlign w:val="center"/>
+            <w:tcBorders>
+              <w:top w:val="single" w:sz="4" w:color="D9D9D9"/>
+              <w:left w:val="single" w:sz="4" w:color="D9D9D9"/>
+              <w:bottom w:val="single" w:sz="4" w:color="D9D9D9"/>
+              <w:right w:val="single" w:sz="4" w:color="D9D9D9"/>
+            </w:tcBorders>
+            <w:tcMar>
+              <w:top w:w="90" w:type="dxa"/>
+              <w:left w:w="90" w:type="dxa"/>
+              <w:bottom w:w="90" w:type="dxa"/>
+              <w:right w:w="90" w:type="dxa"/>
+            </w:tcMar>
+            <w:shd w:fill="F7F7F7"/>
+          </w:tcPr>
+          <w:p>
+            <w:pPr>
+              <w:spacing w:after="40" w:line="247" w:lineRule="auto"/>
+            </w:pPr>
+            <w:r>
+              <w:rPr>
+                <w:b/>
+                <w:sz w:val="20"/>
+              </w:rPr>
+              <w:t>UTC</w:t>
+            </w:r>
+          </w:p>
+        </w:tc>
+        <w:tc>
+          <w:tcPr>
+            <w:tcW w:type="dxa" w:w="6912"/>
+            <w:vAlign w:val="center"/>
+            <w:tcBorders>
+              <w:top w:val="single" w:sz="4" w:color="D9D9D9"/>
+              <w:left w:val="single" w:sz="4" w:color="D9D9D9"/>
+              <w:bottom w:val="single" w:sz="4" w:color="D9D9D9"/>
+              <w:right w:val="single" w:sz="4" w:color="D9D9D9"/>
+            </w:tcBorders>
+            <w:tcMar>
+              <w:top w:w="90" w:type="dxa"/>
+              <w:left w:w="90" w:type="dxa"/>
+              <w:bottom w:w="90" w:type="dxa"/>
+              <w:right w:w="90" w:type="dxa"/>
+            </w:tcMar>
+            <w:shd w:fill="F7F7F7"/>
+          </w:tcPr>
+          <w:p>
+            <w:pPr>
+              <w:spacing w:after="40" w:line="247" w:lineRule="auto"/>
+            </w:pPr>
+            <w:r>
+              <w:rPr>
+                <w:sz w:val="20"/>
+              </w:rPr>
+              <w:t>Coordinated Universal Time</w:t>
+            </w:r>
+          </w:p>
+        </w:tc>
+      </w:tr>
+      <w:tr>
+        <w:trPr>
+          <w:cantSplit/>
+        </w:trPr>
+        <w:tc>
+          <w:tcPr>
+            <w:tcW w:type="dxa" w:w="2880"/>
+            <w:vAlign w:val="center"/>
+            <w:tcBorders>
+              <w:top w:val="single" w:sz="4" w:color="D9D9D9"/>
+              <w:left w:val="single" w:sz="4" w:color="D9D9D9"/>
+              <w:bottom w:val="single" w:sz="4" w:color="D9D9D9"/>
+              <w:right w:val="single" w:sz="4" w:color="D9D9D9"/>
+            </w:tcBorders>
+            <w:tcMar>
+              <w:top w:w="90" w:type="dxa"/>
+              <w:left w:w="90" w:type="dxa"/>
+              <w:bottom w:w="90" w:type="dxa"/>
+              <w:right w:w="90" w:type="dxa"/>
+            </w:tcMar>
+            <w:shd w:fill="FFFFFF"/>
+          </w:tcPr>
+          <w:p>
+            <w:pPr>
+              <w:spacing w:after="40" w:line="247" w:lineRule="auto"/>
+            </w:pPr>
+            <w:r>
+              <w:rPr>
+                <w:b/>
+                <w:sz w:val="20"/>
+              </w:rPr>
+              <w:t>UV</w:t>
+            </w:r>
+          </w:p>
+        </w:tc>
+        <w:tc>
+          <w:tcPr>
+            <w:tcW w:type="dxa" w:w="6912"/>
+            <w:vAlign w:val="center"/>
+            <w:tcBorders>
+              <w:top w:val="single" w:sz="4" w:color="D9D9D9"/>
+              <w:left w:val="single" w:sz="4" w:color="D9D9D9"/>
+              <w:bottom w:val="single" w:sz="4" w:color="D9D9D9"/>
+              <w:right w:val="single" w:sz="4" w:color="D9D9D9"/>
+            </w:tcBorders>
+            <w:tcMar>
+              <w:top w:w="90" w:type="dxa"/>
+              <w:left w:w="90" w:type="dxa"/>
+              <w:bottom w:w="90" w:type="dxa"/>
+              <w:right w:w="90" w:type="dxa"/>
+            </w:tcMar>
+            <w:shd w:fill="FFFFFF"/>
+          </w:tcPr>
+          <w:p>
+            <w:pPr>
+              <w:spacing w:after="40" w:line="247" w:lineRule="auto"/>
+            </w:pPr>
+            <w:r>
+              <w:rPr>
+                <w:sz w:val="20"/>
+              </w:rPr>
+              <w:t>Ultraviolet</w:t>
+            </w:r>
+          </w:p>
+        </w:tc>
+      </w:tr>
+      <w:tr>
+        <w:trPr>
+          <w:cantSplit/>
+        </w:trPr>
+        <w:tc>
+          <w:tcPr>
+            <w:tcW w:type="dxa" w:w="2880"/>
+            <w:vAlign w:val="center"/>
+            <w:tcBorders>
+              <w:top w:val="single" w:sz="4" w:color="D9D9D9"/>
+              <w:left w:val="single" w:sz="4" w:color="D9D9D9"/>
+              <w:bottom w:val="single" w:sz="4" w:color="D9D9D9"/>
+              <w:right w:val="single" w:sz="4" w:color="D9D9D9"/>
+            </w:tcBorders>
+            <w:tcMar>
+              <w:top w:w="90" w:type="dxa"/>
+              <w:left w:w="90" w:type="dxa"/>
+              <w:bottom w:w="90" w:type="dxa"/>
+              <w:right w:w="90" w:type="dxa"/>
+            </w:tcMar>
+            <w:shd w:fill="F7F7F7"/>
+          </w:tcPr>
+          <w:p>
+            <w:pPr>
+              <w:spacing w:after="40" w:line="247" w:lineRule="auto"/>
+            </w:pPr>
+            <w:r>
+              <w:rPr>
+                <w:b/>
+                <w:sz w:val="20"/>
+              </w:rPr>
+              <w:t>UUID</w:t>
+            </w:r>
+          </w:p>
+        </w:tc>
+        <w:tc>
+          <w:tcPr>
+            <w:tcW w:type="dxa" w:w="6912"/>
+            <w:vAlign w:val="center"/>
+            <w:tcBorders>
+              <w:top w:val="single" w:sz="4" w:color="D9D9D9"/>
+              <w:left w:val="single" w:sz="4" w:color="D9D9D9"/>
+              <w:bottom w:val="single" w:sz="4" w:color="D9D9D9"/>
+              <w:right w:val="single" w:sz="4" w:color="D9D9D9"/>
+            </w:tcBorders>
+            <w:tcMar>
+              <w:top w:w="90" w:type="dxa"/>
+              <w:left w:w="90" w:type="dxa"/>
+              <w:bottom w:w="90" w:type="dxa"/>
+              <w:right w:w="90" w:type="dxa"/>
+            </w:tcMar>
+            <w:shd w:fill="F7F7F7"/>
+          </w:tcPr>
+          <w:p>
+            <w:pPr>
+              <w:spacing w:after="40" w:line="247" w:lineRule="auto"/>
+            </w:pPr>
+            <w:r>
+              <w:rPr>
+                <w:sz w:val="20"/>
+              </w:rPr>
+              <w:t>Universally Unique IDentifier; UUID version 5 is the name-based form used for deterministic Phase 4 study identities (Davis et al. 2024)</w:t>
+            </w:r>
+          </w:p>
+        </w:tc>
+      </w:tr>
+      <w:tr>
+        <w:trPr>
+          <w:cantSplit/>
+        </w:trPr>
+        <w:tc>
+          <w:tcPr>
+            <w:tcW w:type="dxa" w:w="2880"/>
+            <w:vAlign w:val="center"/>
+            <w:tcBorders>
+              <w:top w:val="single" w:sz="4" w:color="D9D9D9"/>
+              <w:left w:val="single" w:sz="4" w:color="D9D9D9"/>
+              <w:bottom w:val="single" w:sz="4" w:color="D9D9D9"/>
+              <w:right w:val="single" w:sz="4" w:color="D9D9D9"/>
+            </w:tcBorders>
+            <w:tcMar>
+              <w:top w:w="90" w:type="dxa"/>
+              <w:left w:w="90" w:type="dxa"/>
+              <w:bottom w:w="90" w:type="dxa"/>
+              <w:right w:w="90" w:type="dxa"/>
+            </w:tcMar>
+            <w:shd w:fill="FFFFFF"/>
+          </w:tcPr>
+          <w:p>
+            <w:pPr>
+              <w:spacing w:after="40" w:line="247" w:lineRule="auto"/>
+            </w:pPr>
+            <w:r>
+              <w:rPr>
+                <w:b/>
+                <w:sz w:val="20"/>
+              </w:rPr>
+              <w:t>VIM</w:t>
+            </w:r>
+          </w:p>
+        </w:tc>
+        <w:tc>
+          <w:tcPr>
+            <w:tcW w:type="dxa" w:w="6912"/>
+            <w:vAlign w:val="center"/>
+            <w:tcBorders>
+              <w:top w:val="single" w:sz="4" w:color="D9D9D9"/>
+              <w:left w:val="single" w:sz="4" w:color="D9D9D9"/>
+              <w:bottom w:val="single" w:sz="4" w:color="D9D9D9"/>
+              <w:right w:val="single" w:sz="4" w:color="D9D9D9"/>
+            </w:tcBorders>
+            <w:tcMar>
+              <w:top w:w="90" w:type="dxa"/>
+              <w:left w:w="90" w:type="dxa"/>
+              <w:bottom w:w="90" w:type="dxa"/>
+              <w:right w:w="90" w:type="dxa"/>
+            </w:tcMar>
+            <w:shd w:fill="FFFFFF"/>
+          </w:tcPr>
+          <w:p>
+            <w:pPr>
+              <w:spacing w:after="40" w:line="247" w:lineRule="auto"/>
+            </w:pPr>
+            <w:r>
+              <w:rPr>
+                <w:sz w:val="20"/>
+              </w:rPr>
+              <w:t>International Vocabulary of Metrology</w:t>
+            </w:r>
+          </w:p>
+        </w:tc>
+      </w:tr>
+      <w:tr>
+        <w:trPr>
+          <w:cantSplit/>
+        </w:trPr>
+        <w:tc>
+          <w:tcPr>
+            <w:tcW w:type="dxa" w:w="2880"/>
+            <w:vAlign w:val="center"/>
+            <w:tcBorders>
+              <w:top w:val="single" w:sz="4" w:color="D9D9D9"/>
+              <w:left w:val="single" w:sz="4" w:color="D9D9D9"/>
+              <w:bottom w:val="single" w:sz="4" w:color="D9D9D9"/>
+              <w:right w:val="single" w:sz="4" w:color="D9D9D9"/>
+            </w:tcBorders>
+            <w:tcMar>
+              <w:top w:w="90" w:type="dxa"/>
+              <w:left w:w="90" w:type="dxa"/>
+              <w:bottom w:w="90" w:type="dxa"/>
+              <w:right w:w="90" w:type="dxa"/>
+            </w:tcMar>
+            <w:shd w:fill="F7F7F7"/>
+          </w:tcPr>
+          <w:p>
+            <w:pPr>
+              <w:spacing w:after="40" w:line="247" w:lineRule="auto"/>
+            </w:pPr>
+            <w:r>
+              <w:rPr>
+                <w:b/>
+                <w:sz w:val="20"/>
+              </w:rPr>
+              <w:t>W3C</w:t>
+            </w:r>
+          </w:p>
+        </w:tc>
+        <w:tc>
+          <w:tcPr>
+            <w:tcW w:type="dxa" w:w="6912"/>
+            <w:vAlign w:val="center"/>
+            <w:tcBorders>
+              <w:top w:val="single" w:sz="4" w:color="D9D9D9"/>
+              <w:left w:val="single" w:sz="4" w:color="D9D9D9"/>
+              <w:bottom w:val="single" w:sz="4" w:color="D9D9D9"/>
+              <w:right w:val="single" w:sz="4" w:color="D9D9D9"/>
+            </w:tcBorders>
+            <w:tcMar>
+              <w:top w:w="90" w:type="dxa"/>
+              <w:left w:w="90" w:type="dxa"/>
+              <w:bottom w:w="90" w:type="dxa"/>
+              <w:right w:w="90" w:type="dxa"/>
+            </w:tcMar>
+            <w:shd w:fill="F7F7F7"/>
+          </w:tcPr>
+          <w:p>
+            <w:pPr>
+              <w:spacing w:after="40" w:line="247" w:lineRule="auto"/>
+            </w:pPr>
+            <w:r>
+              <w:rPr>
+                <w:sz w:val="20"/>
+              </w:rPr>
+              <w:t>World Wide Web Consortium</w:t>
+            </w:r>
+          </w:p>
+        </w:tc>
+      </w:tr>
+      <w:tr>
+        <w:trPr>
+          <w:cantSplit/>
+        </w:trPr>
+        <w:tc>
+          <w:tcPr>
+            <w:tcW w:type="dxa" w:w="2880"/>
+            <w:vAlign w:val="center"/>
+            <w:tcBorders>
+              <w:top w:val="single" w:sz="4" w:color="D9D9D9"/>
+              <w:left w:val="single" w:sz="4" w:color="D9D9D9"/>
+              <w:bottom w:val="single" w:sz="4" w:color="D9D9D9"/>
+              <w:right w:val="single" w:sz="4" w:color="D9D9D9"/>
+            </w:tcBorders>
+            <w:tcMar>
+              <w:top w:w="90" w:type="dxa"/>
+              <w:left w:w="90" w:type="dxa"/>
+              <w:bottom w:w="90" w:type="dxa"/>
+              <w:right w:w="90" w:type="dxa"/>
+            </w:tcMar>
+            <w:shd w:fill="FFFFFF"/>
+          </w:tcPr>
+          <w:p>
+            <w:pPr>
+              <w:spacing w:after="40" w:line="247" w:lineRule="auto"/>
+            </w:pPr>
+            <w:r>
+              <w:rPr>
+                <w:b/>
+                <w:sz w:val="20"/>
+              </w:rPr>
+              <w:t>dBA</w:t>
+            </w:r>
+          </w:p>
+        </w:tc>
+        <w:tc>
+          <w:tcPr>
+            <w:tcW w:type="dxa" w:w="6912"/>
+            <w:vAlign w:val="center"/>
+            <w:tcBorders>
+              <w:top w:val="single" w:sz="4" w:color="D9D9D9"/>
+              <w:left w:val="single" w:sz="4" w:color="D9D9D9"/>
+              <w:bottom w:val="single" w:sz="4" w:color="D9D9D9"/>
+              <w:right w:val="single" w:sz="4" w:color="D9D9D9"/>
+            </w:tcBorders>
+            <w:tcMar>
+              <w:top w:w="90" w:type="dxa"/>
+              <w:left w:w="90" w:type="dxa"/>
+              <w:bottom w:w="90" w:type="dxa"/>
+              <w:right w:w="90" w:type="dxa"/>
+            </w:tcMar>
+            <w:shd w:fill="FFFFFF"/>
+          </w:tcPr>
+          <w:p>
+            <w:pPr>
+              <w:spacing w:after="40" w:line="247" w:lineRule="auto"/>
+            </w:pPr>
+            <w:r>
+              <w:rPr>
+                <w:sz w:val="20"/>
+              </w:rPr>
+              <w:t>A-weighted decibel</w:t>
+            </w:r>
+          </w:p>
+        </w:tc>
+      </w:tr>
+      <w:tr>
+        <w:trPr>
+          <w:cantSplit/>
+        </w:trPr>
+        <w:tc>
+          <w:tcPr>
+            <w:tcW w:type="dxa" w:w="2880"/>
+            <w:vAlign w:val="center"/>
+            <w:tcBorders>
+              <w:top w:val="single" w:sz="4" w:color="D9D9D9"/>
+              <w:left w:val="single" w:sz="4" w:color="D9D9D9"/>
+              <w:bottom w:val="single" w:sz="4" w:color="D9D9D9"/>
+              <w:right w:val="single" w:sz="4" w:color="D9D9D9"/>
+            </w:tcBorders>
+            <w:tcMar>
+              <w:top w:w="90" w:type="dxa"/>
+              <w:left w:w="90" w:type="dxa"/>
+              <w:bottom w:w="90" w:type="dxa"/>
+              <w:right w:w="90" w:type="dxa"/>
+            </w:tcMar>
+            <w:shd w:fill="F7F7F7"/>
+          </w:tcPr>
+          <w:p>
+            <w:pPr>
+              <w:spacing w:after="40" w:line="247" w:lineRule="auto"/>
+            </w:pPr>
+            <w:r>
+              <w:rPr>
+                <w:b/>
+                <w:sz w:val="20"/>
+              </w:rPr>
+              <w:t>dBm</w:t>
+            </w:r>
+          </w:p>
+        </w:tc>
+        <w:tc>
+          <w:tcPr>
+            <w:tcW w:type="dxa" w:w="6912"/>
+            <w:vAlign w:val="center"/>
+            <w:tcBorders>
+              <w:top w:val="single" w:sz="4" w:color="D9D9D9"/>
+              <w:left w:val="single" w:sz="4" w:color="D9D9D9"/>
+              <w:bottom w:val="single" w:sz="4" w:color="D9D9D9"/>
+              <w:right w:val="single" w:sz="4" w:color="D9D9D9"/>
+            </w:tcBorders>
+            <w:tcMar>
+              <w:top w:w="90" w:type="dxa"/>
+              <w:left w:w="90" w:type="dxa"/>
+              <w:bottom w:w="90" w:type="dxa"/>
+              <w:right w:w="90" w:type="dxa"/>
+            </w:tcMar>
+            <w:shd w:fill="F7F7F7"/>
+          </w:tcPr>
+          <w:p>
+            <w:pPr>
+              <w:spacing w:after="40" w:line="247" w:lineRule="auto"/>
+            </w:pPr>
+            <w:r>
+              <w:rPr>
+                <w:sz w:val="20"/>
+              </w:rPr>
+              <w:t>Decibel referenced to one milliwatt</w:t>
+            </w:r>
+          </w:p>
+        </w:tc>
+      </w:tr>
+    </w:tbl>
+    <w:p>
+      <w:pPr>
+        <w:spacing w:after="40" w:before="0" w:line="60" w:lineRule="exact"/>
+      </w:pPr>
+    </w:p>
+    <w:p>
+      <w:pPr>
+        <w:pStyle w:val="Heading1"/>
+      </w:pPr>
+      <w:r>
+        <w:rPr/>
+        <w:t>3 Terms and definitions</w:t>
       </w:r>
     </w:p>
     <w:p>
       <w:pPr/>
       <w:r>
         <w:rPr/>
-        <w:t xml:space="preserve">The distinction between a sourced definition and the study's application is important. For example, W3C PROV defines provenance generally, while this study applies that concept to source, processing and integration provenance; NIST defines telemetry around remote measurement transmission, while the paper does not call static model metadata telemetry. Likewise, a source-code method named </w:t>
+        <w:t>The study uses several technical terms that carry narrower meanings than their everyday equivalents. The definitions below are taken from the cited standards or source documentation where an authoritative definition exists, while study-specific terms are explicitly identified as operational definitions rather than external standards. Later uses in the paper are intended to remain consistent with these meanings, and ambiguous source labels are not allowed to override them.</w:t>
+      </w:r>
+    </w:p>
+    <w:p>
+      <w:pPr/>
+      <w:r>
+        <w:rPr/>
+        <w:t xml:space="preserve">The distinction between a sourced definition and the study's application is important. For example, the World Wide Web Consortium (W3C) PROV data model defines provenance generally, while this study applies that concept to source, processing and integration provenance; the National Institute of Standards and Technology (NIST) defines telemetry around remote measurement transmission, while the paper does not call static model metadata telemetry. Likewise, a source-code method named </w:t>
       </w:r>
       <w:r>
         <w:rPr>
@@ -1270,7 +4140,7 @@
               <w:rPr>
                 <w:sz w:val="20"/>
               </w:rPr>
-              <w:t>VIM 3 defines measurement as the process of experimentally obtaining one or more quantity values reasonably attributable to a quantity (Joint Committee for Guides in Metrology 2012, sec. 2.1).</w:t>
+              <w:t>The International Vocabulary of Metrology (VIM) defines measurement as the process of experimentally obtaining one or more quantity values reasonably attributable to a quantity (Joint Committee for Guides in Metrology 2012, sec. 2.1).</w:t>
             </w:r>
           </w:p>
         </w:tc>
@@ -1845,7 +4715,7 @@
               <w:rPr>
                 <w:sz w:val="20"/>
               </w:rPr>
-              <w:t xml:space="preserve">DataStream type is selected only after the observed subject is supported. RSSI therefore remains untyped at the Phase 3 design stage rather than being forced into </w:t>
+              <w:t xml:space="preserve">DataStream type is selected only after the observed subject is supported. Received signal strength indication (RSSI) therefore remains untyped in the reviewed Phase 4 graph rather than being forced into </w:t>
             </w:r>
             <w:r>
               <w:rPr>
@@ -1954,7 +4824,7 @@
               <w:rPr>
                 <w:sz w:val="20"/>
               </w:rPr>
-              <w:t>Smart Citizen's channel timestamp is preserved as source time and is a candidate phenomenonTime. Experiment acquisition time is not substituted for an unavailable source resultTime.</w:t>
+              <w:t>Phase 4 uses a documented coincident-time projection for current readings and a qualified source-response result-time proxy for on-demand aggregate products; acquisition time remains separate integration provenance (MERLIN Project 2026m).</w:t>
             </w:r>
           </w:p>
         </w:tc>
@@ -2453,7 +5323,7 @@
       </w:pPr>
       <w:r>
         <w:rPr/>
-        <w:t>3 Background and technical baseline</w:t>
+        <w:t>4 Background and technical baseline</w:t>
       </w:r>
     </w:p>
     <w:p>
@@ -2476,21 +5346,21 @@
       <w:pPr/>
       <w:r>
         <w:rPr/>
-        <w:t>OGC API Connected Systems Part 1 supplies feature-resource mechanisms for systems, procedures, deployments, and related subjects. Part 2 addresses dynamic resources, including datastreams, observation schemas, observations, and control-related resources. These are approved standards in the inspected version 1.0 editions; a specific server must still be checked for the classes and operations it actually implements (Open Geospatial Consortium 2025a, secs. 7–15; 2025b, secs. 9–12).</w:t>
+        <w:t>Open Geospatial Consortium (OGC) API — Connected Systems Part 1 supplies feature-resource mechanisms for systems, procedures, deployments, and related subjects. Part 2 addresses dynamic resources, including datastreams, observation schemas, observations, and control-related resources. These are approved standards in the inspected version 1.0 editions; a specific server must still be checked for the classes and operations it actually implements (Open Geospatial Consortium 2025a, secs. 7–15; 2025b, secs. 9–12).</w:t>
       </w:r>
     </w:p>
     <w:p>
       <w:pPr/>
       <w:r>
         <w:rPr/>
-        <w:t>SensorML 3.0 provides rich descriptions of processes and physical systems, including outputs, configurations, and related descriptive content. SWE Common 3.0 provides typed components, semantic definitions, units, structured values, and encoding mechanisms. Their official JSON schemas provide machine-readable structural constraints. These standards supply representation mechanisms; a structurally valid document can still identify the wrong subject or misinterpret a source field (Open Geospatial Consortium 2025c, secs. 8–9; 2025d, secs. 7–10; n.d.-a; n.d.-b).</w:t>
+        <w:t>Sensor Model Language (SensorML) 3.0 provides rich descriptions of processes and physical systems, including outputs, configurations, and related descriptive content. Sensor Web Enablement (SWE) Common 3.0 provides typed components, semantic definitions, units, structured values, and encoding mechanisms. Their official JavaScript Object Notation (JSON) schemas provide machine-readable structural constraints. These standards supply representation mechanisms; a structurally valid document can still identify the wrong subject or misinterpret a source field (Open Geospatial Consortium 2025c, secs. 8–9; 2025d, secs. 7–10; n.d.-a; n.d.-b).</w:t>
       </w:r>
     </w:p>
     <w:p>
       <w:pPr/>
       <w:r>
         <w:rPr/>
-        <w:t>The retained project baseline is MPSS v0.3.5, dated 17 October 2026. The first presentation comparison will use the recovered 560 × 440 CSS-pixel Resource Details frame. That frame is an existing review baseline with provisional layout choices; it is not evidence that the proposed Smart Citizen interface already exists or that the final PBI is complete (MERLIN Project 2026a; 2026d).</w:t>
+        <w:t>The retained project baseline is MPSS v0.3.5, dated 17 October 2026. The first presentation comparison will use the recovered 560 × 440 Cascading Style Sheets (CSS) pixel Resource Details frame. That frame is an existing review baseline with provisional layout choices; it is not evidence that the proposed Smart Citizen interface already exists or that the final PBI is complete (MERLIN Project 2026a; 2026d).</w:t>
       </w:r>
     </w:p>
     <w:p>
@@ -2506,7 +5376,7 @@
       <w:pPr/>
       <w:r>
         <w:rPr/>
-        <w:t>Power illustrates why mapping requires more than matching labels. RFC 7326 distinguishes power-source, metering, and aggregation relationships. RFC 7577 defines battery-monitoring objects. MERLIN's selected OGC bindings remain project-authored uses of those donor meanings; neither RFC establishes a MERLIN screen layout or an automatic equivalence with a supplier's battery percentage (Parello et al. 2014, secs. 6.6, 8; Quittek et al. 2015, sec. 4; MERLIN Project 2026a, sec. 5.10).</w:t>
+        <w:t>Power illustrates why mapping requires more than matching labels. Request for Comments (RFC) 7326 distinguishes power-source, metering, and aggregation relationships. RFC 7577 defines battery-monitoring objects. MERLIN's selected OGC bindings remain project-authored uses of those donor meanings; neither RFC establishes a MERLIN screen layout or an automatic equivalence with a supplier's battery percentage (Parello et al. 2014, secs. 6.6, 8; Quittek et al. 2015, sec. 4; MERLIN Project 2026a, sec. 5.10).</w:t>
       </w:r>
     </w:p>
     <w:p>
@@ -2522,7 +5392,7 @@
       </w:pPr>
       <w:r>
         <w:rPr/>
-        <w:t>4 Experimental integration infrastructure</w:t>
+        <w:t>5 Experimental integration infrastructure</w:t>
       </w:r>
     </w:p>
     <w:p>
@@ -2531,7 +5401,7 @@
       </w:pPr>
       <w:r>
         <w:rPr/>
-        <w:t>3.1 Experimental CSAPI server</w:t>
+        <w:t>Experimental CSAPI server</w:t>
       </w:r>
     </w:p>
     <w:p>
@@ -2547,7 +5417,7 @@
       <w:pPr/>
       <w:r>
         <w:rPr/>
-        <w:t>pygeoapi is an open-source Python server implementation of the OGC API family, designed around an HTTP API, configuration, core API behavior, and pluggable data, process, and formatter components (pygeoapi Development Team 2026, “How pygeoapi works”). 52°North developed its Connected Systems implementation on that foundation and describes the repository as a proof of concept of OGC API – Connected Systems based on pygeoapi (52°North Spatial Information Research GmbH n.d.-a). 52°North reports that an initial Connected Systems API design and prototype were developed in KI:STE in synergy with MINKE and EMODnet Ingestion III, followed by continued pygeoapi-community work around the prototype (52°North Spatial Information Research GmbH 2023; n.d.-b). This lineage explains where the server implementation came from without implying that pygeoapi itself natively supplies every Connected Systems behavior used by the prototype.</w:t>
+        <w:t>pygeoapi is an open-source Python server implementation of the OGC API family, designed around a Hypertext Transfer Protocol (HTTP) API, configuration, core API behavior, and pluggable data, process, and formatter components (pygeoapi Development Team 2026, “How pygeoapi works”). 52°North developed its Connected Systems implementation on that foundation and describes the repository as a proof of concept of OGC API – Connected Systems based on pygeoapi (52°North Spatial Information Research GmbH n.d.-a). 52°North reports that the initial Connected Systems API design and prototype were developed through several research projects and were followed by continued pygeoapi-community work around the prototype (52°North Spatial Information Research GmbH 2023; n.d.-b). This lineage explains where the server implementation came from without implying that pygeoapi itself natively supplies every Connected Systems behavior used by the prototype.</w:t>
       </w:r>
     </w:p>
     <w:p>
@@ -2587,7 +5457,7 @@
       </w:r>
       <w:r>
         <w:rPr/>
-        <w:t xml:space="preserve"> and includes native geospatial dependencies such as GDAL, PROJ, GEOS, NumPy, and Shapely. The upstream repository provides examples for multiple backends and a simulator for inserting example data, so its source tree represents several deployment possibilities rather than one fixed storage architecture. The exact backend used by the OS4CSAPI instance therefore has to come from our deployment evidence, not from inference based on the upstream dependency list.</w:t>
+        <w:t xml:space="preserve"> and includes the native geospatial dependencies required by the implementation. The upstream repository provides examples for multiple backends and a simulator for inserting example data, so its source tree represents several deployment possibilities rather than one fixed storage architecture. The exact backend used by the OS4CSAPI instance therefore has to come from our deployment evidence, not from inference based on the upstream dependency list.</w:t>
       </w:r>
     </w:p>
     <w:p>
@@ -2636,7 +5506,7 @@
       </w:r>
       <w:r>
         <w:rPr/>
-        <w:t>. Those adaptations consisted of a public-URL correction, an asynchronous full-scan/bootstrap-ID patch, and retained ARM64/native-dependency adaptations. Project inventory recorded the endpoint as unauthenticated for the test environment, but that access posture will be reverified before the Smart Citizen run.</w:t>
+        <w:t>. Those adaptations consisted of a public-URL correction, an asynchronous full-scan/bootstrap-ID patch, and retained 64-bit processor-architecture/native-dependency adaptations. Project inventory recorded the endpoint as unauthenticated for the test environment, but that access posture will be reverified before the Smart Citizen run.</w:t>
       </w:r>
     </w:p>
     <w:p>
@@ -3577,7 +6447,7 @@
               <w:rPr>
                 <w:sz w:val="20"/>
               </w:rPr>
-              <w:t>Public-URL fix; async full-scan/bootstrap-ID patch; ARM64/native-dependency adaptations</w:t>
+              <w:t>Public-URL fix; async full-scan/bootstrap-ID patch; 64-bit processor-architecture/native-dependency adaptations</w:t>
             </w:r>
           </w:p>
         </w:tc>
@@ -3989,7 +6859,7 @@
       </w:pPr>
       <w:r>
         <w:rPr/>
-        <w:t>3.2 Experimental Glaux client</w:t>
+        <w:t>Experimental Glaux client</w:t>
       </w:r>
     </w:p>
     <w:p>
@@ -4123,7 +6993,7 @@
       <w:pPr/>
       <w:r>
         <w:rPr/>
-        <w:t>This choice is task-specific rather than a claim that the selected library is the best general CSAPI SDK. The key experimental advantage is that request behavior and original responses remain under application control, allowing the study to distinguish what the server returned from what the parser extracted and what the profile interpreter concluded (MERLIN Project 2026g). The client also preserves unknown or unsupported content for Standard View rather than requiring the profile to explain every supplied field. A future library replacement should therefore be judged by whether it preserves this observable boundary, not by API similarity alone.</w:t>
+        <w:t>This choice is task-specific rather than a claim that the selected library is the best general CSAPI software development kit (SDK). The key experimental advantage is that request behavior and original responses remain under application control, allowing the study to distinguish what the server returned from what the parser extracted and what the profile interpreter concluded (MERLIN Project 2026g). The client also preserves unknown or unsupported content for Standard View rather than requiring the profile to explain every supplied field. A future library replacement should therefore be judged by whether it preserves this observable boundary, not by API similarity alone.</w:t>
       </w:r>
     </w:p>
     <w:p>
@@ -5506,7 +8376,7 @@
       </w:pPr>
       <w:r>
         <w:rPr/>
-        <w:t>5 Research questions and study design</w:t>
+        <w:t>6 Research questions and study design</w:t>
       </w:r>
     </w:p>
     <w:p>
@@ -5647,7 +8517,7 @@
       </w:pPr>
       <w:r>
         <w:rPr/>
-        <w:t>6 Source selection and preliminary observations</w:t>
+        <w:t>7 Source selection and preliminary observations</w:t>
       </w:r>
     </w:p>
     <w:p>
@@ -6936,7 +9806,7 @@
       </w:pPr>
       <w:r>
         <w:rPr/>
-        <w:t>7 Proposed dataset and mapping method</w:t>
+        <w:t>8 Proposed dataset and mapping method</w:t>
       </w:r>
     </w:p>
     <w:p>
@@ -7897,7 +10767,7 @@
       <w:pPr/>
       <w:r>
         <w:rPr/>
-        <w:t>The mapping review was deliberately reopened before Phase 4 so that source-characterization and semantic defects could be corrected before code or server behavior made them implicit. The review retained the core identity, environmental-observation, battery and SD-card conclusions, corrected RSSI's earlier overconfident status classification, and brought the two aggregate-history products into the mapping ledger with explicit processing provenance (MERLIN Project 2026l). It also corrected the source-processing description and the 11+10 timing cohort count, while preserving unresolved result-time and sampling-subject questions rather than inventing answers. The work pauses at this checkpoint for owner review before any CSAPI resource graph is authored.</w:t>
+        <w:t>The mapping review was deliberately reopened before Phase 4 so that source-characterization and semantic defects could be corrected before code or server behavior made them implicit; that Phase 1–3 gate is now a completed historical checkpoint. The review retained the core identity, environmental-observation, battery and SD-card conclusions, corrected RSSI's earlier overconfident status classification, and brought the two aggregate-history products into the mapping ledger with explicit processing provenance (MERLIN Project 2026l). It also corrected the source-processing description and the 11+10 timing cohort count, while preserving unresolved result-time and sampling-subject questions rather than inventing answers. The owner subsequently accepted those findings and authorized the Phase 4 resource-graph design recorded below.</w:t>
       </w:r>
     </w:p>
     <w:tbl>
@@ -8334,7 +11204,7 @@
               <w:rPr>
                 <w:sz w:val="20"/>
               </w:rPr>
-              <w:t>RSSI</w:t>
+              <w:t>Received signal strength indication (RSSI)</w:t>
             </w:r>
           </w:p>
         </w:tc>
@@ -8429,7 +11299,7 @@
               <w:rPr>
                 <w:sz w:val="20"/>
               </w:rPr>
-              <w:t>One-hour averages treated as source-platform processing products; processing System/Procedure and exact times remain Phase 4 design questions</w:t>
+              <w:t>One-hour averages treated as source-platform processing products; Phase 4 supplies the processing System/Procedure and qualified time policy without inventing interval bounds</w:t>
             </w:r>
           </w:p>
         </w:tc>
@@ -8882,7 +11752,7 @@
       </w:pPr>
       <w:r>
         <w:rPr/>
-        <w:t>RSSI classification correction</w:t>
+        <w:t>Received signal strength indication (RSSI) classification correction</w:t>
       </w:r>
     </w:p>
     <w:p>
@@ -8900,7 +11770,7 @@
       </w:r>
       <w:r>
         <w:rPr/>
-        <w:t xml:space="preserve">. Smart Citizen defines RSSI as power present in a received radio signal, but the frozen source does not independently identify whether the observed subject is the parent System, an embedded Wi-Fi subsystem/interface, or the received signal/link context (Smart Citizen n.d.-d; MERLIN Project 2026l). OGC reserves DataStream type </w:t>
+        <w:t xml:space="preserve">. Smart Citizen's source vocabulary expands RSSI as “received signal strength indication” and defines it as power present in a received radio signal, but the frozen source does not independently identify whether the observed subject is the parent System, an embedded Wi-Fi subsystem/interface, or the received signal/link context (Smart Citizen n.d.-d; MERLIN Project 2026l). OGC reserves DataStream type </w:t>
       </w:r>
       <w:r>
         <w:rPr>
@@ -8922,7 +11792,7 @@
       </w:r>
       <w:r>
         <w:rPr/>
-        <w:t xml:space="preserve"> for other features of interest, so equipment context alone does not settle the type (Open Geospatial Consortium 2025b, sec. 9.2). The Phase 3 design therefore leaves the optional DataStream </w:t>
+        <w:t xml:space="preserve"> for other features of interest, so equipment context alone does not settle the type (Open Geospatial Consortium 2025b, sec. 9.2). The reviewed Phase 4 design keeps the optional DataStream </w:t>
       </w:r>
       <w:r>
         <w:rPr>
@@ -8933,7 +11803,7 @@
       </w:r>
       <w:r>
         <w:rPr/>
-        <w:t xml:space="preserve"> unset until Phase 4 resolves the subject.</w:t>
+        <w:t xml:space="preserve"> unset because the source still does not establish that subject.</w:t>
       </w:r>
     </w:p>
     <w:p>
@@ -9011,14 +11881,25 @@
       </w:r>
       <w:r>
         <w:rPr/>
-        <w:t xml:space="preserve"> and optionally a statistic (Open Geospatial Consortium 2025a, secs. 9, 15). The Phase 3 design uses those mechanisms conceptually while leaving exact UIDs and server-supported request structures for Phase 4.</w:t>
+        <w:t xml:space="preserve"> and optionally a statistic (Open Geospatial Consortium 2025a, secs. 9, 15). Phase 4 now instantiates that distinction conceptually as a separate source-platform processing System and reusable aggregation Procedure while leaving actual target-server execution for later phases.</w:t>
       </w:r>
     </w:p>
     <w:p>
       <w:pPr/>
       <w:r>
         <w:rPr/>
-        <w:t>The temperature response reports 1,439 readings examined and the PM2.5 response 288, even though both return 24 one-hour aggregate tuples. Those response-wide counts remain query/processing provenance and are not copied into each aggregate as per-bin sample counts. Returned tuple timestamps are preserved exactly, and no nominal one-hour phenomenon interval or separate resultTime is invented from the request spelling. If the target server cannot preserve the processing distinction without distortion, omitting the aggregate products from the first load is preferable to presenting them as direct physical-kit output.</w:t>
+        <w:t xml:space="preserve">The temperature response reports 1,439 readings examined and the PM2.5 response 288, even though both return 24 one-hour aggregate tuples. Those response-wide counts remain query/processing provenance and are not copied into each aggregate as per-bin sample counts. Returned tuple timestamps are preserved exactly, and no nominal one-hour phenomenon interval is invented from the request spelling. Phase 4 uses the frozen history response date as an explicitly qualified source-response proxy for </w:t>
+      </w:r>
+      <w:r>
+        <w:rPr>
+          <w:rFonts w:ascii="DejaVu Sans Mono" w:hAnsi="DejaVu Sans Mono"/>
+          <w:sz w:val="19"/>
+        </w:rPr>
+        <w:t>resultTime</w:t>
+      </w:r>
+      <w:r>
+        <w:rPr/>
+        <w:t>, rather than pretending it is the internal computation-completion time (MERLIN Project 2026m). If the target server cannot preserve the processing distinction without distortion, omitting the aggregate products from the first load is preferable to presenting them as direct physical-kit output.</w:t>
       </w:r>
     </w:p>
     <w:p>
@@ -9027,7 +11908,14 @@
       </w:pPr>
       <w:r>
         <w:rPr/>
-        <w:t>Expected domain coverage</w:t>
+        <w:t>Phase 4 reviewed Connected Systems resource graph</w:t>
+      </w:r>
+    </w:p>
+    <w:p>
+      <w:pPr/>
+      <w:r>
+        <w:rPr/>
+        <w:t>Phase 4 converts the reviewed meanings into a concrete, reviewable Connected Systems resource graph without making any server writes (MERLIN Project 2026m). The deterministic first-load design contains two Systems, two Procedures, ten DataStreams with ten observation schemas, and fifty-six Observations: eight frozen current results plus twenty-four temperature and twenty-four PM2.5 aggregate results. The physical Smart Citizen case and the source-platform aggregation process are separate producing Systems, so a one-hour average is not silently attributed to the physical kit. Every created resource is traceable to a Phase 3 mapping, while unsupported topology is represented by deliberate absence rather than by placeholder resources.</w:t>
       </w:r>
     </w:p>
     <w:p>
@@ -9039,7 +11927,886 @@
         <w:rPr>
           <w:b/>
         </w:rPr>
-        <w:t>Table 6. Expected coverage and remaining evidence needs.</w:t>
+        <w:t>Table 7. Phase 4 resource graph and negative design decisions.</w:t>
+      </w:r>
+      <w:r>
+        <w:rPr/>
+        <w:t xml:space="preserve"> The table summarizes the design that would be implemented by the adapter after this review gate. Study-owned System and Procedure identities use deterministic Universally Unique IDentifier version 5 (UUIDv5) URNs derived from documented project name strings; those identifiers identify MERLIN study representations rather than manufacturer-issued physical assets (Davis et al. 2024; MERLIN Project 2026m). The target graph deliberately omits resource types for which the source does not supply defensible identity or relationship evidence. These choices are design results, not executed server results.</w:t>
+      </w:r>
+    </w:p>
+    <w:tbl>
+      <w:tblPr>
+        <w:tblW w:type="auto" w:w="0"/>
+        <w:jc w:val="center"/>
+        <w:tblLayout w:type="fixed"/>
+        <w:tblLook w:firstColumn="1" w:firstRow="1" w:lastColumn="0" w:lastRow="0" w:noHBand="0" w:noVBand="1" w:val="04A0"/>
+      </w:tblPr>
+      <w:tblGrid>
+        <w:gridCol w:w="2880"/>
+        <w:gridCol w:w="6912"/>
+      </w:tblGrid>
+      <w:tr>
+        <w:trPr>
+          <w:cantSplit/>
+          <w:tblHeader/>
+        </w:trPr>
+        <w:tc>
+          <w:tcPr>
+            <w:tcW w:type="dxa" w:w="2880"/>
+            <w:vAlign w:val="center"/>
+            <w:tcBorders>
+              <w:top w:val="single" w:sz="4" w:color="D9D9D9"/>
+              <w:left w:val="single" w:sz="4" w:color="D9D9D9"/>
+              <w:bottom w:val="single" w:sz="4" w:color="D9D9D9"/>
+              <w:right w:val="single" w:sz="4" w:color="D9D9D9"/>
+            </w:tcBorders>
+            <w:tcMar>
+              <w:top w:w="90" w:type="dxa"/>
+              <w:left w:w="90" w:type="dxa"/>
+              <w:bottom w:w="90" w:type="dxa"/>
+              <w:right w:w="90" w:type="dxa"/>
+            </w:tcMar>
+            <w:shd w:fill="E8E8E8"/>
+          </w:tcPr>
+          <w:p>
+            <w:pPr>
+              <w:spacing w:after="40" w:line="247" w:lineRule="auto"/>
+            </w:pPr>
+            <w:r>
+              <w:rPr>
+                <w:b/>
+                <w:sz w:val="20"/>
+              </w:rPr>
+              <w:t>Design element</w:t>
+            </w:r>
+          </w:p>
+        </w:tc>
+        <w:tc>
+          <w:tcPr>
+            <w:tcW w:type="dxa" w:w="6912"/>
+            <w:vAlign w:val="center"/>
+            <w:tcBorders>
+              <w:top w:val="single" w:sz="4" w:color="D9D9D9"/>
+              <w:left w:val="single" w:sz="4" w:color="D9D9D9"/>
+              <w:bottom w:val="single" w:sz="4" w:color="D9D9D9"/>
+              <w:right w:val="single" w:sz="4" w:color="D9D9D9"/>
+            </w:tcBorders>
+            <w:tcMar>
+              <w:top w:w="90" w:type="dxa"/>
+              <w:left w:w="90" w:type="dxa"/>
+              <w:bottom w:w="90" w:type="dxa"/>
+              <w:right w:w="90" w:type="dxa"/>
+            </w:tcMar>
+            <w:shd w:fill="E8E8E8"/>
+          </w:tcPr>
+          <w:p>
+            <w:pPr>
+              <w:spacing w:after="40" w:line="247" w:lineRule="auto"/>
+            </w:pPr>
+            <w:r>
+              <w:rPr>
+                <w:b/>
+                <w:sz w:val="20"/>
+              </w:rPr>
+              <w:t>Phase 4 decision</w:t>
+            </w:r>
+          </w:p>
+        </w:tc>
+      </w:tr>
+      <w:tr>
+        <w:trPr>
+          <w:cantSplit/>
+        </w:trPr>
+        <w:tc>
+          <w:tcPr>
+            <w:tcW w:type="dxa" w:w="2880"/>
+            <w:vAlign w:val="center"/>
+            <w:tcBorders>
+              <w:top w:val="single" w:sz="4" w:color="D9D9D9"/>
+              <w:left w:val="single" w:sz="4" w:color="D9D9D9"/>
+              <w:bottom w:val="single" w:sz="4" w:color="D9D9D9"/>
+              <w:right w:val="single" w:sz="4" w:color="D9D9D9"/>
+            </w:tcBorders>
+            <w:tcMar>
+              <w:top w:w="90" w:type="dxa"/>
+              <w:left w:w="90" w:type="dxa"/>
+              <w:bottom w:w="90" w:type="dxa"/>
+              <w:right w:w="90" w:type="dxa"/>
+            </w:tcMar>
+            <w:shd w:fill="FFFFFF"/>
+          </w:tcPr>
+          <w:p>
+            <w:pPr>
+              <w:spacing w:after="40" w:line="247" w:lineRule="auto"/>
+            </w:pPr>
+            <w:r>
+              <w:rPr>
+                <w:sz w:val="20"/>
+              </w:rPr>
+              <w:t>Physical sensing case</w:t>
+            </w:r>
+          </w:p>
+        </w:tc>
+        <w:tc>
+          <w:tcPr>
+            <w:tcW w:type="dxa" w:w="6912"/>
+            <w:vAlign w:val="center"/>
+            <w:tcBorders>
+              <w:top w:val="single" w:sz="4" w:color="D9D9D9"/>
+              <w:left w:val="single" w:sz="4" w:color="D9D9D9"/>
+              <w:bottom w:val="single" w:sz="4" w:color="D9D9D9"/>
+              <w:right w:val="single" w:sz="4" w:color="D9D9D9"/>
+            </w:tcBorders>
+            <w:tcMar>
+              <w:top w:w="90" w:type="dxa"/>
+              <w:left w:w="90" w:type="dxa"/>
+              <w:bottom w:w="90" w:type="dxa"/>
+              <w:right w:w="90" w:type="dxa"/>
+            </w:tcMar>
+            <w:shd w:fill="FFFFFF"/>
+          </w:tcPr>
+          <w:p>
+            <w:pPr>
+              <w:spacing w:after="40" w:line="247" w:lineRule="auto"/>
+            </w:pPr>
+            <w:r>
+              <w:rPr>
+                <w:sz w:val="20"/>
+              </w:rPr>
+              <w:t>One CSAPI System representing the sensing-system instance known through registration 19639; Smart Citizen ID/UUID remain source identifiers</w:t>
+            </w:r>
+          </w:p>
+        </w:tc>
+      </w:tr>
+      <w:tr>
+        <w:trPr>
+          <w:cantSplit/>
+        </w:trPr>
+        <w:tc>
+          <w:tcPr>
+            <w:tcW w:type="dxa" w:w="2880"/>
+            <w:vAlign w:val="center"/>
+            <w:tcBorders>
+              <w:top w:val="single" w:sz="4" w:color="D9D9D9"/>
+              <w:left w:val="single" w:sz="4" w:color="D9D9D9"/>
+              <w:bottom w:val="single" w:sz="4" w:color="D9D9D9"/>
+              <w:right w:val="single" w:sz="4" w:color="D9D9D9"/>
+            </w:tcBorders>
+            <w:tcMar>
+              <w:top w:w="90" w:type="dxa"/>
+              <w:left w:w="90" w:type="dxa"/>
+              <w:bottom w:w="90" w:type="dxa"/>
+              <w:right w:w="90" w:type="dxa"/>
+            </w:tcMar>
+            <w:shd w:fill="F7F7F7"/>
+          </w:tcPr>
+          <w:p>
+            <w:pPr>
+              <w:spacing w:after="40" w:line="247" w:lineRule="auto"/>
+            </w:pPr>
+            <w:r>
+              <w:rPr>
+                <w:sz w:val="20"/>
+              </w:rPr>
+              <w:t>Reusable product description</w:t>
+            </w:r>
+          </w:p>
+        </w:tc>
+        <w:tc>
+          <w:tcPr>
+            <w:tcW w:type="dxa" w:w="6912"/>
+            <w:vAlign w:val="center"/>
+            <w:tcBorders>
+              <w:top w:val="single" w:sz="4" w:color="D9D9D9"/>
+              <w:left w:val="single" w:sz="4" w:color="D9D9D9"/>
+              <w:bottom w:val="single" w:sz="4" w:color="D9D9D9"/>
+              <w:right w:val="single" w:sz="4" w:color="D9D9D9"/>
+            </w:tcBorders>
+            <w:tcMar>
+              <w:top w:w="90" w:type="dxa"/>
+              <w:left w:w="90" w:type="dxa"/>
+              <w:bottom w:w="90" w:type="dxa"/>
+              <w:right w:w="90" w:type="dxa"/>
+            </w:tcMar>
+            <w:shd w:fill="F7F7F7"/>
+          </w:tcPr>
+          <w:p>
+            <w:pPr>
+              <w:spacing w:after="40" w:line="247" w:lineRule="auto"/>
+            </w:pPr>
+            <w:r>
+              <w:rPr>
+                <w:sz w:val="20"/>
+              </w:rPr>
+              <w:t xml:space="preserve">One Procedure for the SCK2.3 model/datasheet; linked through System kind / SensorML </w:t>
+            </w:r>
+            <w:r>
+              <w:rPr>
+                <w:rFonts w:ascii="DejaVu Sans Mono" w:hAnsi="DejaVu Sans Mono"/>
+                <w:sz w:val="20"/>
+              </w:rPr>
+              <w:t>typeOf</w:t>
+            </w:r>
+          </w:p>
+        </w:tc>
+      </w:tr>
+      <w:tr>
+        <w:trPr>
+          <w:cantSplit/>
+        </w:trPr>
+        <w:tc>
+          <w:tcPr>
+            <w:tcW w:type="dxa" w:w="2880"/>
+            <w:vAlign w:val="center"/>
+            <w:tcBorders>
+              <w:top w:val="single" w:sz="4" w:color="D9D9D9"/>
+              <w:left w:val="single" w:sz="4" w:color="D9D9D9"/>
+              <w:bottom w:val="single" w:sz="4" w:color="D9D9D9"/>
+              <w:right w:val="single" w:sz="4" w:color="D9D9D9"/>
+            </w:tcBorders>
+            <w:tcMar>
+              <w:top w:w="90" w:type="dxa"/>
+              <w:left w:w="90" w:type="dxa"/>
+              <w:bottom w:w="90" w:type="dxa"/>
+              <w:right w:w="90" w:type="dxa"/>
+            </w:tcMar>
+            <w:shd w:fill="FFFFFF"/>
+          </w:tcPr>
+          <w:p>
+            <w:pPr>
+              <w:spacing w:after="40" w:line="247" w:lineRule="auto"/>
+            </w:pPr>
+            <w:r>
+              <w:rPr>
+                <w:sz w:val="20"/>
+              </w:rPr>
+              <w:t>Current outputs</w:t>
+            </w:r>
+          </w:p>
+        </w:tc>
+        <w:tc>
+          <w:tcPr>
+            <w:tcW w:type="dxa" w:w="6912"/>
+            <w:vAlign w:val="center"/>
+            <w:tcBorders>
+              <w:top w:val="single" w:sz="4" w:color="D9D9D9"/>
+              <w:left w:val="single" w:sz="4" w:color="D9D9D9"/>
+              <w:bottom w:val="single" w:sz="4" w:color="D9D9D9"/>
+              <w:right w:val="single" w:sz="4" w:color="D9D9D9"/>
+            </w:tcBorders>
+            <w:tcMar>
+              <w:top w:w="90" w:type="dxa"/>
+              <w:left w:w="90" w:type="dxa"/>
+              <w:bottom w:w="90" w:type="dxa"/>
+              <w:right w:w="90" w:type="dxa"/>
+            </w:tcMar>
+            <w:shd w:fill="FFFFFF"/>
+          </w:tcPr>
+          <w:p>
+            <w:pPr>
+              <w:spacing w:after="40" w:line="247" w:lineRule="auto"/>
+            </w:pPr>
+            <w:r>
+              <w:rPr>
+                <w:sz w:val="20"/>
+              </w:rPr>
+              <w:t>Eight DataStreams/schemas for temperature, PM2.5, humidity, pressure, A-weighted sound level, battery level, RSSI, and SD-card indication</w:t>
+            </w:r>
+          </w:p>
+        </w:tc>
+      </w:tr>
+      <w:tr>
+        <w:trPr>
+          <w:cantSplit/>
+        </w:trPr>
+        <w:tc>
+          <w:tcPr>
+            <w:tcW w:type="dxa" w:w="2880"/>
+            <w:vAlign w:val="center"/>
+            <w:tcBorders>
+              <w:top w:val="single" w:sz="4" w:color="D9D9D9"/>
+              <w:left w:val="single" w:sz="4" w:color="D9D9D9"/>
+              <w:bottom w:val="single" w:sz="4" w:color="D9D9D9"/>
+              <w:right w:val="single" w:sz="4" w:color="D9D9D9"/>
+            </w:tcBorders>
+            <w:tcMar>
+              <w:top w:w="90" w:type="dxa"/>
+              <w:left w:w="90" w:type="dxa"/>
+              <w:bottom w:w="90" w:type="dxa"/>
+              <w:right w:w="90" w:type="dxa"/>
+            </w:tcMar>
+            <w:shd w:fill="F7F7F7"/>
+          </w:tcPr>
+          <w:p>
+            <w:pPr>
+              <w:spacing w:after="40" w:line="247" w:lineRule="auto"/>
+            </w:pPr>
+            <w:r>
+              <w:rPr>
+                <w:sz w:val="20"/>
+              </w:rPr>
+              <w:t>Aggregate processing</w:t>
+            </w:r>
+          </w:p>
+        </w:tc>
+        <w:tc>
+          <w:tcPr>
+            <w:tcW w:type="dxa" w:w="6912"/>
+            <w:vAlign w:val="center"/>
+            <w:tcBorders>
+              <w:top w:val="single" w:sz="4" w:color="D9D9D9"/>
+              <w:left w:val="single" w:sz="4" w:color="D9D9D9"/>
+              <w:bottom w:val="single" w:sz="4" w:color="D9D9D9"/>
+              <w:right w:val="single" w:sz="4" w:color="D9D9D9"/>
+            </w:tcBorders>
+            <w:tcMar>
+              <w:top w:w="90" w:type="dxa"/>
+              <w:left w:w="90" w:type="dxa"/>
+              <w:bottom w:w="90" w:type="dxa"/>
+              <w:right w:w="90" w:type="dxa"/>
+            </w:tcMar>
+            <w:shd w:fill="F7F7F7"/>
+          </w:tcPr>
+          <w:p>
+            <w:pPr>
+              <w:spacing w:after="40" w:line="247" w:lineRule="auto"/>
+            </w:pPr>
+            <w:r>
+              <w:rPr>
+                <w:sz w:val="20"/>
+              </w:rPr>
+              <w:t>Separate process System plus reusable one-hour-average Procedure; two aggregate DataStreams</w:t>
+            </w:r>
+          </w:p>
+        </w:tc>
+      </w:tr>
+      <w:tr>
+        <w:trPr>
+          <w:cantSplit/>
+        </w:trPr>
+        <w:tc>
+          <w:tcPr>
+            <w:tcW w:type="dxa" w:w="2880"/>
+            <w:vAlign w:val="center"/>
+            <w:tcBorders>
+              <w:top w:val="single" w:sz="4" w:color="D9D9D9"/>
+              <w:left w:val="single" w:sz="4" w:color="D9D9D9"/>
+              <w:bottom w:val="single" w:sz="4" w:color="D9D9D9"/>
+              <w:right w:val="single" w:sz="4" w:color="D9D9D9"/>
+            </w:tcBorders>
+            <w:tcMar>
+              <w:top w:w="90" w:type="dxa"/>
+              <w:left w:w="90" w:type="dxa"/>
+              <w:bottom w:w="90" w:type="dxa"/>
+              <w:right w:w="90" w:type="dxa"/>
+            </w:tcMar>
+            <w:shd w:fill="FFFFFF"/>
+          </w:tcPr>
+          <w:p>
+            <w:pPr>
+              <w:spacing w:after="40" w:line="247" w:lineRule="auto"/>
+            </w:pPr>
+            <w:r>
+              <w:rPr>
+                <w:sz w:val="20"/>
+              </w:rPr>
+              <w:t>Current observation time</w:t>
+            </w:r>
+          </w:p>
+        </w:tc>
+        <w:tc>
+          <w:tcPr>
+            <w:tcW w:type="dxa" w:w="6912"/>
+            <w:vAlign w:val="center"/>
+            <w:tcBorders>
+              <w:top w:val="single" w:sz="4" w:color="D9D9D9"/>
+              <w:left w:val="single" w:sz="4" w:color="D9D9D9"/>
+              <w:bottom w:val="single" w:sz="4" w:color="D9D9D9"/>
+              <w:right w:val="single" w:sz="4" w:color="D9D9D9"/>
+            </w:tcBorders>
+            <w:tcMar>
+              <w:top w:w="90" w:type="dxa"/>
+              <w:left w:w="90" w:type="dxa"/>
+              <w:bottom w:w="90" w:type="dxa"/>
+              <w:right w:w="90" w:type="dxa"/>
+            </w:tcMar>
+            <w:shd w:fill="FFFFFF"/>
+          </w:tcPr>
+          <w:p>
+            <w:pPr>
+              <w:spacing w:after="40" w:line="247" w:lineRule="auto"/>
+            </w:pPr>
+            <w:r>
+              <w:rPr>
+                <w:sz w:val="20"/>
+              </w:rPr>
+              <w:t>Channel source time copied to both phenomenonTime and resultTime as a disclosed coincident-time projection</w:t>
+            </w:r>
+          </w:p>
+        </w:tc>
+      </w:tr>
+      <w:tr>
+        <w:trPr>
+          <w:cantSplit/>
+        </w:trPr>
+        <w:tc>
+          <w:tcPr>
+            <w:tcW w:type="dxa" w:w="2880"/>
+            <w:vAlign w:val="center"/>
+            <w:tcBorders>
+              <w:top w:val="single" w:sz="4" w:color="D9D9D9"/>
+              <w:left w:val="single" w:sz="4" w:color="D9D9D9"/>
+              <w:bottom w:val="single" w:sz="4" w:color="D9D9D9"/>
+              <w:right w:val="single" w:sz="4" w:color="D9D9D9"/>
+            </w:tcBorders>
+            <w:tcMar>
+              <w:top w:w="90" w:type="dxa"/>
+              <w:left w:w="90" w:type="dxa"/>
+              <w:bottom w:w="90" w:type="dxa"/>
+              <w:right w:w="90" w:type="dxa"/>
+            </w:tcMar>
+            <w:shd w:fill="F7F7F7"/>
+          </w:tcPr>
+          <w:p>
+            <w:pPr>
+              <w:spacing w:after="40" w:line="247" w:lineRule="auto"/>
+            </w:pPr>
+            <w:r>
+              <w:rPr>
+                <w:sz w:val="20"/>
+              </w:rPr>
+              <w:t>Aggregate observation time</w:t>
+            </w:r>
+          </w:p>
+        </w:tc>
+        <w:tc>
+          <w:tcPr>
+            <w:tcW w:type="dxa" w:w="6912"/>
+            <w:vAlign w:val="center"/>
+            <w:tcBorders>
+              <w:top w:val="single" w:sz="4" w:color="D9D9D9"/>
+              <w:left w:val="single" w:sz="4" w:color="D9D9D9"/>
+              <w:bottom w:val="single" w:sz="4" w:color="D9D9D9"/>
+              <w:right w:val="single" w:sz="4" w:color="D9D9D9"/>
+            </w:tcBorders>
+            <w:tcMar>
+              <w:top w:w="90" w:type="dxa"/>
+              <w:left w:w="90" w:type="dxa"/>
+              <w:bottom w:w="90" w:type="dxa"/>
+              <w:right w:w="90" w:type="dxa"/>
+            </w:tcMar>
+            <w:shd w:fill="F7F7F7"/>
+          </w:tcPr>
+          <w:p>
+            <w:pPr>
+              <w:spacing w:after="40" w:line="247" w:lineRule="auto"/>
+            </w:pPr>
+            <w:r>
+              <w:rPr>
+                <w:sz w:val="20"/>
+              </w:rPr>
+              <w:t>Returned tuple time as phenomenonTime; frozen source HTTP response date as a qualified resultTime proxy</w:t>
+            </w:r>
+          </w:p>
+        </w:tc>
+      </w:tr>
+      <w:tr>
+        <w:trPr>
+          <w:cantSplit/>
+        </w:trPr>
+        <w:tc>
+          <w:tcPr>
+            <w:tcW w:type="dxa" w:w="2880"/>
+            <w:vAlign w:val="center"/>
+            <w:tcBorders>
+              <w:top w:val="single" w:sz="4" w:color="D9D9D9"/>
+              <w:left w:val="single" w:sz="4" w:color="D9D9D9"/>
+              <w:bottom w:val="single" w:sz="4" w:color="D9D9D9"/>
+              <w:right w:val="single" w:sz="4" w:color="D9D9D9"/>
+            </w:tcBorders>
+            <w:tcMar>
+              <w:top w:w="90" w:type="dxa"/>
+              <w:left w:w="90" w:type="dxa"/>
+              <w:bottom w:w="90" w:type="dxa"/>
+              <w:right w:w="90" w:type="dxa"/>
+            </w:tcMar>
+            <w:shd w:fill="FFFFFF"/>
+          </w:tcPr>
+          <w:p>
+            <w:pPr>
+              <w:spacing w:after="40" w:line="247" w:lineRule="auto"/>
+            </w:pPr>
+            <w:r>
+              <w:rPr>
+                <w:sz w:val="20"/>
+              </w:rPr>
+              <w:t>Environmental SamplingFeature</w:t>
+            </w:r>
+          </w:p>
+        </w:tc>
+        <w:tc>
+          <w:tcPr>
+            <w:tcW w:type="dxa" w:w="6912"/>
+            <w:vAlign w:val="center"/>
+            <w:tcBorders>
+              <w:top w:val="single" w:sz="4" w:color="D9D9D9"/>
+              <w:left w:val="single" w:sz="4" w:color="D9D9D9"/>
+              <w:bottom w:val="single" w:sz="4" w:color="D9D9D9"/>
+              <w:right w:val="single" w:sz="4" w:color="D9D9D9"/>
+            </w:tcBorders>
+            <w:tcMar>
+              <w:top w:w="90" w:type="dxa"/>
+              <w:left w:w="90" w:type="dxa"/>
+              <w:bottom w:w="90" w:type="dxa"/>
+              <w:right w:w="90" w:type="dxa"/>
+            </w:tcMar>
+            <w:shd w:fill="FFFFFF"/>
+          </w:tcPr>
+          <w:p>
+            <w:pPr>
+              <w:spacing w:after="40" w:line="247" w:lineRule="auto"/>
+            </w:pPr>
+            <w:r>
+              <w:rPr>
+                <w:sz w:val="20"/>
+              </w:rPr>
+              <w:t>Not created; source does not identify a defensible sample/air-volume feature</w:t>
+            </w:r>
+          </w:p>
+        </w:tc>
+      </w:tr>
+      <w:tr>
+        <w:trPr>
+          <w:cantSplit/>
+        </w:trPr>
+        <w:tc>
+          <w:tcPr>
+            <w:tcW w:type="dxa" w:w="2880"/>
+            <w:vAlign w:val="center"/>
+            <w:tcBorders>
+              <w:top w:val="single" w:sz="4" w:color="D9D9D9"/>
+              <w:left w:val="single" w:sz="4" w:color="D9D9D9"/>
+              <w:bottom w:val="single" w:sz="4" w:color="D9D9D9"/>
+              <w:right w:val="single" w:sz="4" w:color="D9D9D9"/>
+            </w:tcBorders>
+            <w:tcMar>
+              <w:top w:w="90" w:type="dxa"/>
+              <w:left w:w="90" w:type="dxa"/>
+              <w:bottom w:w="90" w:type="dxa"/>
+              <w:right w:w="90" w:type="dxa"/>
+            </w:tcMar>
+            <w:shd w:fill="F7F7F7"/>
+          </w:tcPr>
+          <w:p>
+            <w:pPr>
+              <w:spacing w:after="40" w:line="247" w:lineRule="auto"/>
+            </w:pPr>
+            <w:r>
+              <w:rPr>
+                <w:sz w:val="20"/>
+              </w:rPr>
+              <w:t>Deployment and position</w:t>
+            </w:r>
+          </w:p>
+        </w:tc>
+        <w:tc>
+          <w:tcPr>
+            <w:tcW w:type="dxa" w:w="6912"/>
+            <w:vAlign w:val="center"/>
+            <w:tcBorders>
+              <w:top w:val="single" w:sz="4" w:color="D9D9D9"/>
+              <w:left w:val="single" w:sz="4" w:color="D9D9D9"/>
+              <w:bottom w:val="single" w:sz="4" w:color="D9D9D9"/>
+              <w:right w:val="single" w:sz="4" w:color="D9D9D9"/>
+            </w:tcBorders>
+            <w:tcMar>
+              <w:top w:w="90" w:type="dxa"/>
+              <w:left w:w="90" w:type="dxa"/>
+              <w:bottom w:w="90" w:type="dxa"/>
+              <w:right w:w="90" w:type="dxa"/>
+            </w:tcMar>
+            <w:shd w:fill="F7F7F7"/>
+          </w:tcPr>
+          <w:p>
+            <w:pPr>
+              <w:spacing w:after="40" w:line="247" w:lineRule="auto"/>
+            </w:pPr>
+            <w:r>
+              <w:rPr>
+                <w:sz w:val="20"/>
+              </w:rPr>
+              <w:t>Not created/populated in first load; public location precision and employment meaning are insufficient</w:t>
+            </w:r>
+          </w:p>
+        </w:tc>
+      </w:tr>
+      <w:tr>
+        <w:trPr>
+          <w:cantSplit/>
+        </w:trPr>
+        <w:tc>
+          <w:tcPr>
+            <w:tcW w:type="dxa" w:w="2880"/>
+            <w:vAlign w:val="center"/>
+            <w:tcBorders>
+              <w:top w:val="single" w:sz="4" w:color="D9D9D9"/>
+              <w:left w:val="single" w:sz="4" w:color="D9D9D9"/>
+              <w:bottom w:val="single" w:sz="4" w:color="D9D9D9"/>
+              <w:right w:val="single" w:sz="4" w:color="D9D9D9"/>
+            </w:tcBorders>
+            <w:tcMar>
+              <w:top w:w="90" w:type="dxa"/>
+              <w:left w:w="90" w:type="dxa"/>
+              <w:bottom w:w="90" w:type="dxa"/>
+              <w:right w:w="90" w:type="dxa"/>
+            </w:tcMar>
+            <w:shd w:fill="FFFFFF"/>
+          </w:tcPr>
+          <w:p>
+            <w:pPr>
+              <w:spacing w:after="40" w:line="247" w:lineRule="auto"/>
+            </w:pPr>
+            <w:r>
+              <w:rPr>
+                <w:sz w:val="20"/>
+              </w:rPr>
+              <w:t>Component/battery/Wi-Fi/SD Systems</w:t>
+            </w:r>
+          </w:p>
+        </w:tc>
+        <w:tc>
+          <w:tcPr>
+            <w:tcW w:type="dxa" w:w="6912"/>
+            <w:vAlign w:val="center"/>
+            <w:tcBorders>
+              <w:top w:val="single" w:sz="4" w:color="D9D9D9"/>
+              <w:left w:val="single" w:sz="4" w:color="D9D9D9"/>
+              <w:bottom w:val="single" w:sz="4" w:color="D9D9D9"/>
+              <w:right w:val="single" w:sz="4" w:color="D9D9D9"/>
+            </w:tcBorders>
+            <w:tcMar>
+              <w:top w:w="90" w:type="dxa"/>
+              <w:left w:w="90" w:type="dxa"/>
+              <w:bottom w:w="90" w:type="dxa"/>
+              <w:right w:w="90" w:type="dxa"/>
+            </w:tcMar>
+            <w:shd w:fill="FFFFFF"/>
+          </w:tcPr>
+          <w:p>
+            <w:pPr>
+              <w:spacing w:after="40" w:line="247" w:lineRule="auto"/>
+            </w:pPr>
+            <w:r>
+              <w:rPr>
+                <w:sz w:val="20"/>
+              </w:rPr>
+              <w:t>Not created; catalogue/status fields do not establish independently identified resources</w:t>
+            </w:r>
+          </w:p>
+        </w:tc>
+      </w:tr>
+      <w:tr>
+        <w:trPr>
+          <w:cantSplit/>
+        </w:trPr>
+        <w:tc>
+          <w:tcPr>
+            <w:tcW w:type="dxa" w:w="2880"/>
+            <w:vAlign w:val="center"/>
+            <w:tcBorders>
+              <w:top w:val="single" w:sz="4" w:color="D9D9D9"/>
+              <w:left w:val="single" w:sz="4" w:color="D9D9D9"/>
+              <w:bottom w:val="single" w:sz="4" w:color="D9D9D9"/>
+              <w:right w:val="single" w:sz="4" w:color="D9D9D9"/>
+            </w:tcBorders>
+            <w:tcMar>
+              <w:top w:w="90" w:type="dxa"/>
+              <w:left w:w="90" w:type="dxa"/>
+              <w:bottom w:w="90" w:type="dxa"/>
+              <w:right w:w="90" w:type="dxa"/>
+            </w:tcMar>
+            <w:shd w:fill="F7F7F7"/>
+          </w:tcPr>
+          <w:p>
+            <w:pPr>
+              <w:spacing w:after="40" w:line="247" w:lineRule="auto"/>
+            </w:pPr>
+            <w:r>
+              <w:rPr>
+                <w:sz w:val="20"/>
+              </w:rPr>
+              <w:t>Local derived Property resources</w:t>
+            </w:r>
+          </w:p>
+        </w:tc>
+        <w:tc>
+          <w:tcPr>
+            <w:tcW w:type="dxa" w:w="6912"/>
+            <w:vAlign w:val="center"/>
+            <w:tcBorders>
+              <w:top w:val="single" w:sz="4" w:color="D9D9D9"/>
+              <w:left w:val="single" w:sz="4" w:color="D9D9D9"/>
+              <w:bottom w:val="single" w:sz="4" w:color="D9D9D9"/>
+              <w:right w:val="single" w:sz="4" w:color="D9D9D9"/>
+            </w:tcBorders>
+            <w:tcMar>
+              <w:top w:w="90" w:type="dxa"/>
+              <w:left w:w="90" w:type="dxa"/>
+              <w:bottom w:w="90" w:type="dxa"/>
+              <w:right w:w="90" w:type="dxa"/>
+            </w:tcMar>
+            <w:shd w:fill="F7F7F7"/>
+          </w:tcPr>
+          <w:p>
+            <w:pPr>
+              <w:spacing w:after="40" w:line="247" w:lineRule="auto"/>
+            </w:pPr>
+            <w:r>
+              <w:rPr>
+                <w:sz w:val="20"/>
+              </w:rPr>
+              <w:t>Not required for first load; stable authored property URIs carry meaning while target Property creation remains unreliable</w:t>
+            </w:r>
+          </w:p>
+        </w:tc>
+      </w:tr>
+      <w:tr>
+        <w:trPr>
+          <w:cantSplit/>
+        </w:trPr>
+        <w:tc>
+          <w:tcPr>
+            <w:tcW w:type="dxa" w:w="2880"/>
+            <w:vAlign w:val="center"/>
+            <w:tcBorders>
+              <w:top w:val="single" w:sz="4" w:color="D9D9D9"/>
+              <w:left w:val="single" w:sz="4" w:color="D9D9D9"/>
+              <w:bottom w:val="single" w:sz="4" w:color="D9D9D9"/>
+              <w:right w:val="single" w:sz="4" w:color="D9D9D9"/>
+            </w:tcBorders>
+            <w:tcMar>
+              <w:top w:w="90" w:type="dxa"/>
+              <w:left w:w="90" w:type="dxa"/>
+              <w:bottom w:w="90" w:type="dxa"/>
+              <w:right w:w="90" w:type="dxa"/>
+            </w:tcMar>
+            <w:shd w:fill="FFFFFF"/>
+          </w:tcPr>
+          <w:p>
+            <w:pPr>
+              <w:spacing w:after="40" w:line="247" w:lineRule="auto"/>
+            </w:pPr>
+            <w:r>
+              <w:rPr>
+                <w:sz w:val="20"/>
+              </w:rPr>
+              <w:t>Controls</w:t>
+            </w:r>
+          </w:p>
+        </w:tc>
+        <w:tc>
+          <w:tcPr>
+            <w:tcW w:type="dxa" w:w="6912"/>
+            <w:vAlign w:val="center"/>
+            <w:tcBorders>
+              <w:top w:val="single" w:sz="4" w:color="D9D9D9"/>
+              <w:left w:val="single" w:sz="4" w:color="D9D9D9"/>
+              <w:bottom w:val="single" w:sz="4" w:color="D9D9D9"/>
+              <w:right w:val="single" w:sz="4" w:color="D9D9D9"/>
+            </w:tcBorders>
+            <w:tcMar>
+              <w:top w:w="90" w:type="dxa"/>
+              <w:left w:w="90" w:type="dxa"/>
+              <w:bottom w:w="90" w:type="dxa"/>
+              <w:right w:w="90" w:type="dxa"/>
+            </w:tcMar>
+            <w:shd w:fill="FFFFFF"/>
+          </w:tcPr>
+          <w:p>
+            <w:pPr>
+              <w:spacing w:after="40" w:line="247" w:lineRule="auto"/>
+            </w:pPr>
+            <w:r>
+              <w:rPr>
+                <w:sz w:val="20"/>
+              </w:rPr>
+              <w:t>Not created; no selected command evidence belongs to this read/integration experiment</w:t>
+            </w:r>
+          </w:p>
+        </w:tc>
+      </w:tr>
+    </w:tbl>
+    <w:p>
+      <w:pPr>
+        <w:spacing w:after="40" w:before="0" w:line="60" w:lineRule="exact"/>
+      </w:pPr>
+    </w:p>
+    <w:p>
+      <w:pPr/>
+      <w:r>
+        <w:rPr/>
+        <w:t xml:space="preserve">The time projections are deliberately explicit because the source exposes fewer temporal distinctions than the Connected Systems Observation model requires. For the eight current results, Phase 4 sets both </w:t>
+      </w:r>
+      <w:r>
+        <w:rPr>
+          <w:rFonts w:ascii="DejaVu Sans Mono" w:hAnsi="DejaVu Sans Mono"/>
+          <w:sz w:val="19"/>
+        </w:rPr>
+        <w:t>phenomenonTime</w:t>
+      </w:r>
+      <w:r>
+        <w:rPr/>
+        <w:t xml:space="preserve"> and </w:t>
+      </w:r>
+      <w:r>
+        <w:rPr>
+          <w:rFonts w:ascii="DejaVu Sans Mono" w:hAnsi="DejaVu Sans Mono"/>
+          <w:sz w:val="19"/>
+        </w:rPr>
+        <w:t>resultTime</w:t>
+      </w:r>
+      <w:r>
+        <w:rPr/>
+        <w:t xml:space="preserve"> to the channel's reading timestamp and keeps experiment acquisition time separate as integration provenance. For the on-demand aggregate products, the returned tuple timestamp remains the phenomenon-time anchor while the corresponding frozen HTTP response date is used only as a source-response proxy for result time. Neither rule claims that Smart Citizen originally supplied two independent timestamps, and both must be revisited if stronger source-side time evidence becomes available.</w:t>
+      </w:r>
+    </w:p>
+    <w:p>
+      <w:pPr/>
+      <w:r>
+        <w:rPr/>
+        <w:t xml:space="preserve">Phase 4 also exposes implementation constraints in the exact 52°North target revision </w:t>
+      </w:r>
+      <w:r>
+        <w:rPr>
+          <w:rFonts w:ascii="DejaVu Sans Mono" w:hAnsi="DejaVu Sans Mono"/>
+          <w:sz w:val="19"/>
+        </w:rPr>
+        <w:t>6ad75aa7...</w:t>
+      </w:r>
+      <w:r>
+        <w:rPr/>
+        <w:t>. Its route table lacks POST creation for Property resources despite repository examples/create logic, its observation schema is more permissive than the approved standard about phenomenon time, its documentation treats aggregate “meta-datastreams” as future functionality, and cascade deletion remains incomplete (52°North Spatial Information Research GmbH n.d.-a; MERLIN Project 2026m). The design therefore does not depend on local Property creation or implementation-specific aggregate shortcuts, sends both observation times explicitly, and defines child-first cleanup from Observations to DataStreams to Systems to Procedures. These are bounded target-implementation findings, not a claim of complete standards-conformance assessment.</w:t>
+      </w:r>
+    </w:p>
+    <w:p>
+      <w:pPr>
+        <w:pStyle w:val="Heading2"/>
+      </w:pPr>
+      <w:r>
+        <w:rPr/>
+        <w:t>Expected domain coverage</w:t>
+      </w:r>
+    </w:p>
+    <w:p>
+      <w:pPr>
+        <w:pStyle w:val="PaperCaption"/>
+        <w:keepNext/>
+      </w:pPr>
+      <w:r>
+        <w:rPr>
+          <w:b/>
+        </w:rPr>
+        <w:t>Table 7. Expected coverage and remaining evidence needs.</w:t>
       </w:r>
       <w:r>
         <w:rPr/>
@@ -9936,7 +13703,7 @@
       </w:pPr>
       <w:r>
         <w:rPr/>
-        <w:t>8 Integration and evaluation protocol</w:t>
+        <w:t>9 Integration and evaluation protocol</w:t>
       </w:r>
     </w:p>
     <w:p>
@@ -9959,7 +13726,7 @@
       <w:pPr/>
       <w:r>
         <w:rPr/>
-        <w:t>The selected CSAPI service will be checked for the required resource creation and retrieval capabilities. Only the chosen supported interfaces will be used, and the actual endpoint and version will be recorded in the execution record. A source sample will then be followed through capture, mapped representation, service response, and client display. Server acceptance establishes one part of that chain; it does not establish full semantic correctness (Open Geospatial Consortium 2025a; 2025b).</w:t>
+        <w:t>The selected CSAPI service will be checked against the exact Phase 4 resource graph before publication. Only reviewed resource types and relationships will be emitted, and the actual endpoint, running revision, assigned server identifiers, and cleanup evidence will be recorded in the execution record. A source sample will then be followed through capture, deterministic adapter output, service response, and client display. Server acceptance establishes one part of that chain; it does not establish full semantic correctness (Open Geospatial Consortium 2025a; 2025b).</w:t>
       </w:r>
     </w:p>
     <w:p>
@@ -9980,7 +13747,7 @@
         <w:rPr>
           <w:b/>
         </w:rPr>
-        <w:t>Table 7. Proposed evaluation criteria.</w:t>
+        <w:t>Table 8. Proposed evaluation criteria.</w:t>
       </w:r>
       <w:r>
         <w:rPr/>
@@ -10547,7 +14314,7 @@
       </w:pPr>
       <w:r>
         <w:rPr/>
-        <w:t>9 Interface comparison and figure protocol</w:t>
+        <w:t>10 Interface comparison and figure protocol</w:t>
       </w:r>
     </w:p>
     <w:p>
@@ -10703,7 +14470,7 @@
         <w:rPr>
           <w:b/>
         </w:rPr>
-        <w:t>Table 8. Vendor presentation elements and reconstruction questions.</w:t>
+        <w:t>Table 9. Vendor presentation elements and reconstruction questions.</w:t>
       </w:r>
       <w:r>
         <w:rPr/>
@@ -11427,11 +15194,11 @@
         <w:rPr>
           <w:b/>
         </w:rPr>
-        <w:t>Table 9. Planned figures and evidence status.</w:t>
+        <w:t>Table 10. Planned figures and evidence status.</w:t>
       </w:r>
       <w:r>
         <w:rPr/>
-        <w:t xml:space="preserve"> Figures 1–5 identify the system, server, client, experiment architecture, and conceptual model. Figures 6 and 7 now provide first-party historical Smart Citizen UI evidence selected before the CSAPI/Glaux result exists. Figures 8–10 remain reserved for contemporaneous or executed evidence and will not be filled with simulated substitutes.</w:t>
+        <w:t xml:space="preserve"> Figures 1–5 identify the system, server, client, experiment architecture, and conceptual model. Figures 6 and 7 provide first-party historical Smart Citizen user-interface evidence, while the Phase 4 resource graph is maintained as a reviewed design artifact rather than being misrepresented as executed server evidence. Figures 8–10 remain reserved for contemporaneous or executed evidence and will not be filled with simulated substitutes.</w:t>
       </w:r>
     </w:p>
     <w:tbl>
@@ -12490,7 +16257,7 @@
               <w:rPr>
                 <w:sz w:val="20"/>
               </w:rPr>
-              <w:t>Awaiting server records and mapping results</w:t>
+              <w:t>Phase 4 design exists; actual server relationships and traced display remain awaiting execution</w:t>
             </w:r>
           </w:p>
         </w:tc>
@@ -12514,28 +16281,38 @@
       </w:pPr>
       <w:r>
         <w:rPr/>
-        <w:t>10 Results to be reported</w:t>
+        <w:t>11 Results to be reported</w:t>
       </w:r>
     </w:p>
     <w:p>
       <w:pPr/>
       <w:r>
         <w:rPr/>
-        <w:t>Phases 1–3 now provide reportable source and mapping results, but the end-to-end integration remains incomplete. The experiment has frozen a complete formal Device specimen and two bounded histories, characterized all 21 current channels and their identity/time semantics, and reviewed nine current-state plus two aggregate-history mappings (MERLIN Project 2026k; 2026l). It has also recorded corrections discovered by review, including the source-processing provenance wording, notification-setting false friend, 11+10 timing cohorts and RSSI DataStream-type overreach. No adapter success rate, CSAPI interoperability claim, connected Glaux result, task-time improvement or user outcome is reported.</w:t>
+        <w:t>Phases 1–4 now provide reportable source, mapping, and design results, but the end-to-end integration remains incomplete. The experiment has frozen a complete formal Device specimen and two bounded histories, characterized all 21 current channels, reviewed nine current-state plus two aggregate-history mappings, and designed the first connected CSAPI graph containing two Systems, two Procedures, ten DataStreams/schemas, and fifty-six frozen Observations (MERLIN Project 2026k; 2026l; 2026m). It has also recorded corrections and design constraints discovered by review, including source-processing provenance, notification-setting semantics, the 11+10 timing cohorts, the unresolved RSSI subject, qualified time projections, and explicit negative-resource decisions. No adapter execution, server create/retrieve result, connected Glaux result, task-time improvement, or user outcome is reported.</w:t>
       </w:r>
     </w:p>
     <w:p>
       <w:pPr/>
       <w:r>
         <w:rPr/>
-        <w:t>The reviewed mappings demonstrate several negative results that are themselves meaningful. A Smart Citizen registration UUID is not established as a manufacturer serial; a shared Sensor catalogue parent is not an installed-component serial; battery percentage does not establish battery identity or supply topology; RSSI does not establish interface/link status; and SD-card code 0 cannot be simplified to a Boolean health state. The aggregate histories also show that semantic preservation includes processing provenance, because the source platform produced the one-hour averages and their response-wide sample counts. These findings narrow what a correct Phase 4 resource graph may claim.</w:t>
+        <w:t xml:space="preserve">The Phase 4 graph demonstrates that semantic preservation can require </w:t>
+      </w:r>
+      <w:r>
+        <w:rPr>
+          <w:b/>
+        </w:rPr>
+        <w:t>not</w:t>
+      </w:r>
+      <w:r>
+        <w:rPr/>
+        <w:t xml:space="preserve"> creating apparently convenient resources. A Smart Citizen registration UUID is not established as a manufacturer serial; source catalogue parents do not establish installed-component identity; battery percentage does not establish a battery System or supply topology; received signal strength indication does not establish an interface/link-status resource; and public location metadata does not establish a Deployment. Environmental SamplingFeatures are also omitted because the source does not identify defensible sample features. These absences are evidence-backed design outcomes rather than implementation incompleteness.</w:t>
       </w:r>
     </w:p>
     <w:p>
       <w:pPr/>
       <w:r>
         <w:rPr/>
-        <w:t>The remaining results will be produced in later phases. First, Phase 4 must turn the reviewed mappings into a resource graph and executable identity/subject/time decisions; later phases will record adapter outputs, server create/retrieve behavior, Glaux traversal and the matched generic/profile-aware presentation. Each later result will remain tied to the frozen specimen or a separately identified live acquisition rather than silently replacing the evidence baseline. The reporting structure continues to permit an accurate generic presentation or an unfavorable profile result.</w:t>
+        <w:t>The aggregate histories further show why processing provenance changes the resource graph. The one-hour averages are assigned to a separate process System and aggregation Procedure instead of being credited directly to the physical kit, while stable authored property URIs distinguish those derived products from their base observed properties (MERLIN Project 2026m). Current observations use a disclosed coincident-time projection, and aggregate observations use a source-response result-time proxy, because the source supplies fewer time distinctions than CSAPI requires. The next reportable evidence must come from deterministic adapter output and later server round-trip testing against this reviewed design.</w:t>
       </w:r>
     </w:p>
     <w:p>
@@ -12544,28 +16321,28 @@
       </w:pPr>
       <w:r>
         <w:rPr/>
-        <w:t>11 Discussion and limitations</w:t>
+        <w:t>12 Discussion and limitations</w:t>
       </w:r>
     </w:p>
     <w:p>
       <w:pPr/>
       <w:r>
         <w:rPr/>
-        <w:t>The immediate public-data case is strongest for reported quantities, source-platform descriptions, source context, telemetry and integration provenance. It remains weaker for unit-specific physical composition, operating configuration, deployment history, power topology and maintenance, and more readings cannot fill those missing relationships by themselves. Documentary model enrichment must not be presented as observation of the particular installation, while source-platform processing must not be presented as direct physical-sensor output (MERLIN Project 2026a; 2026k; 2026l). The terminology baseline helps keep those boundaries explicit.</w:t>
+        <w:t>The immediate public-data case is strongest for reported quantities, source-platform descriptions, telemetry, and integration provenance. It remains weaker for unit-specific physical composition, operating configuration, deployment history, power topology, maintenance, and independently identified environmental samples, and more readings cannot fill those relationships by themselves. Phase 4 makes those boundaries concrete by declining to create a Deployment, SamplingFeature, battery, Wi-Fi interface, storage component, or other resource that the evidence cannot identify (MERLIN Project 2026m). Documentary model enrichment must not be presented as observation of the particular installation, while source-platform processing must not be presented as direct physical-sensor output.</w:t>
       </w:r>
     </w:p>
     <w:p>
       <w:pPr/>
       <w:r>
         <w:rPr/>
-        <w:t>The formal Phase 1 capture archives the complete Device body plus the two selected history bodies, but it is still only one bounded specimen and did not freeze every possible endpoint or production-version indicator. The selected source may change its fields, permissions, processing code or availability, and the inspected Smart Citizen source revision is not independently proven to be the exact production revision (Smart Citizen 2026). Timestamp semantics, aggregate interval boundaries and historical location applicability retain explicit uncertainties. A later independent producer can test transfer, while an owned kit can address physical evidence gaps; these are different extensions.</w:t>
+        <w:t>The formal Phase 1 capture archives the complete Device body plus the two selected history bodies, but it is still only one bounded specimen and did not freeze every possible endpoint or production-version indicator. The selected source may change its fields, permissions, processing code or availability, and the inspected Smart Citizen source revision is not independently proven to be the exact production revision (Smart Citizen 2026). The current and aggregate time mappings are therefore explicit projections rather than claims that Smart Citizen supplied all CSAPI-required temporal semantics natively. A later independent producer can test transfer, while an owned kit can address physical evidence gaps; these are different extensions.</w:t>
       </w:r>
     </w:p>
     <w:p>
       <w:pPr/>
       <w:r>
         <w:rPr/>
-        <w:t>No full OGC conformance, whole-profile implementation, or native Smart Citizen support for MPSS is claimed. Structural correctness, service interoperability, and operator benefit require different evidence. The study will also retain the distinction between native source meanings, selected standard mechanisms, MERLIN-authored bindings, and client choices throughout its reporting.</w:t>
+        <w:t>The Phase 4 target-server findings are similarly bounded. The inspected 52°North revision exposes concrete route/schema/delete behaviors that affect this experiment's planned request strategy, but the study has not performed a full OGC conformance test or established that the deployed Oracle instance is byte-for-byte identical to every inspected upstream behavior (52°North Spatial Information Research GmbH n.d.-a; MERLIN Project 2026f; 2026m). Structural correctness, service interoperability, and operator benefit remain separate evidence questions. The study will retain the distinction between native source meanings, approved standard requirements, target implementation behavior, MERLIN-authored bindings, and client choices throughout later phases.</w:t>
       </w:r>
     </w:p>
     <w:p>
@@ -12574,21 +16351,21 @@
       </w:pPr>
       <w:r>
         <w:rPr/>
-        <w:t>12 Reproducibility and document maintenance</w:t>
+        <w:t>13 Reproducibility and document maintenance</w:t>
       </w:r>
     </w:p>
     <w:p>
       <w:pPr/>
       <w:r>
         <w:rPr/>
-        <w:t>The manuscript, figures, code listings, reference metadata, and publication manifest will be maintained together in the repository. Each paper revision will state its version, date, changed evidence, and execution status. The Word edition will be generated from the maintained manuscript and inspected after rendering. Source and output fingerprints will make a stale derived edition detectable.</w:t>
+        <w:t>The manuscript, acronyms-and-abbreviations table, figures, code listings, reference metadata, and publication manifest will be maintained together in the repository. Each paper revision will state its version, date, changed evidence, and execution status. The Word edition will be generated from the maintained manuscript and inspected after rendering. Source and output fingerprints will make a stale derived edition detectable.</w:t>
       </w:r>
     </w:p>
     <w:p>
       <w:pPr/>
       <w:r>
         <w:rPr/>
-        <w:t>Narrative paragraphs, including the abstract and explanatory figure, table, and listing captions, will contain three to five sentences. Headings, metadata, research-question items, table cells, code, and reference entries retain their respective structural formats. The publication check will enforce the paragraph rule, while editorial review will assess whether each paragraph develops a coherent point. Each mapping revision must also maintain the individual donor attributions and the explanation of its model and standard-representation roles.</w:t>
+        <w:t>Narrative paragraphs, including the abstract and explanatory figure, table, and listing captions, will contain three to five sentences. Headings, metadata, research-question items, table cells, code, and reference entries retain their respective structural formats. The publication check will enforce the paragraph rule, while editorial review will assess whether each paragraph develops a coherent point. Each mapping revision must also maintain the individual donor attributions and the explanation of its model and standard-representation roles. New domain-specific acronyms or recurring abbreviations must be expanded on first substantive use where practical and added to the maintained acronym table; the publication verifier checks the required acronym inventory and repeated uppercase shorthand against documented exclusions.</w:t>
       </w:r>
     </w:p>
     <w:p>
@@ -12602,7 +16379,7 @@
       <w:pPr/>
       <w:r>
         <w:rPr/>
-        <w:t>The existing fourteen imported project artifacts retain their versions and bytes. This paper is a new research artifact. Its mapping choices and findings will be reconciled into the appropriate PBI, wireframe, profile, and DIM records when supported; publication of a research draft does not silently amend those baselines. The next paper revision should add the Phase 4 resource graph and, only after its review gate, actual execution evidence from the first adapter/CSAPI trace.</w:t>
+        <w:t>The existing fourteen imported project artifacts retain their versions and bytes. This paper is a new research artifact. Its mapping choices and findings will be reconciled into the appropriate PBI, wireframe, profile, and DIM records when supported; publication of a research draft does not silently amend those baselines. The next paper revision should add actual deterministic adapter evidence after the Phase 5 review gate; executed server relationships and source-to-display traces remain later evidence and must not be backfilled from the Phase 4 design alone.</w:t>
       </w:r>
     </w:p>
     <w:p>
@@ -12611,21 +16388,21 @@
       </w:pPr>
       <w:r>
         <w:rPr/>
-        <w:t>13 Conclusion</w:t>
+        <w:t>14 Conclusion</w:t>
       </w:r>
     </w:p>
     <w:p>
       <w:pPr/>
       <w:r>
         <w:rPr/>
-        <w:t>This study has moved from a proposed source assessment to a reviewed Phase 1–3 evidence baseline. A formal Smart Citizen specimen is frozen, its native identities, channel times, status/configuration distinctions and processing limitations are characterized, and the representative mapping set now includes both current results and source-platform aggregate products. The review also demonstrated why shared terminology matters: telemetry is not static metadata, provenance includes processing and integration history, and a code label containing “calibrated” does not establish formal calibration. These corrections occurred before target resource design, where they can constrain implementation rather than be discovered after it.</w:t>
+        <w:t>This study has moved from source assessment and semantic mapping through a reviewed Phase 4 resource design. A formal Smart Citizen specimen is frozen, its native identities and source semantics are characterized, the representative mappings are reviewed, and a concrete CSAPI graph now states what would be created and what must remain absent. The graph separates the physical sensing case from source-platform aggregate processing, uses deterministic study identities without claiming manufacturer identity, and makes temporal projections explicit rather than hiding source under-specification (MERLIN Project 2026m). The accompanying acronym and definition sections are maintained as part of the evidence discipline so specialized shorthand does not become an implicit barrier to understanding.</w:t>
       </w:r>
     </w:p>
     <w:p>
       <w:pPr/>
       <w:r>
         <w:rPr/>
-        <w:t>The next question is no longer whether a real source can be acquired or whether a plausible mapping can be sketched. It is whether the reviewed meanings can be represented as a defensible CSAPI resource graph without inventing identity, subject, time or provenance. That is the Phase 4 question, and this paper intentionally pauses before it for owner review. Later integration and presentation results will be evaluated against this reviewed baseline rather than against assumptions reconstructed after the fact.</w:t>
+        <w:t>The next question is whether a deterministic adapter can emit exactly this reviewed graph from the frozen specimen without adding unsupported semantics. That is the Phase 5 question, and it remains separate from Phase 6 server publication and later Glaux presentation. No server resource, user-interface result, or interoperability success is claimed merely because the graph is now concrete. Later execution results will be evaluated against this Phase 4 baseline rather than allowing code or target-server behavior to redefine the mapping after the fact.</w:t>
       </w:r>
     </w:p>
     <w:p>
@@ -12689,7 +16466,17 @@
       </w:pPr>
       <w:r>
         <w:rPr/>
-        <w:t>Camptocamp. n.d. “ogc-client.” GitHub repository. Accessed October 24, 2026. https://github.com/camptocamp/ogc-client.</w:t>
+        <w:t xml:space="preserve">Davis, Kyle, Brad Peabody, and Paul Leach. 2024. </w:t>
+      </w:r>
+      <w:r>
+        <w:rPr>
+          <w:i/>
+        </w:rPr>
+        <w:t>Universally Unique IDentifiers (UUIDs)</w:t>
+      </w:r>
+      <w:r>
+        <w:rPr/>
+        <w:t>. RFC 9562. Standards Track. May. https://doi.org/10.17487/RFC9562.</w:t>
       </w:r>
     </w:p>
     <w:p>
@@ -12698,17 +16485,7 @@
       </w:pPr>
       <w:r>
         <w:rPr/>
-        <w:t xml:space="preserve">European Environment Agency. 2021. “Air Temperature.” </w:t>
-      </w:r>
-      <w:r>
-        <w:rPr>
-          <w:i/>
-        </w:rPr>
-        <w:t>GEMET</w:t>
-      </w:r>
-      <w:r>
-        <w:rPr/>
-        <w:t>, version 4.2.3, December 6. Concept 281. Accessed October 24, 2026. https://www.eionet.europa.eu/gemet/en/concept/281.</w:t>
+        <w:t>Camptocamp. n.d. “ogc-client.” GitHub repository. Accessed October 24, 2026. https://github.com/camptocamp/ogc-client.</w:t>
       </w:r>
     </w:p>
     <w:p>
@@ -12717,17 +16494,17 @@
       </w:pPr>
       <w:r>
         <w:rPr/>
-        <w:t xml:space="preserve">Joint Committee for Guides in Metrology. 2012. </w:t>
+        <w:t xml:space="preserve">European Environment Agency. 2021. “Air Temperature.” </w:t>
       </w:r>
       <w:r>
         <w:rPr>
           <w:i/>
         </w:rPr>
-        <w:t>International Vocabulary of Metrology—Basic and General Concepts and Associated Terms (VIM)</w:t>
+        <w:t>GEMET</w:t>
       </w:r>
       <w:r>
         <w:rPr/>
-        <w:t>. 3rd ed., 2008 version with minor corrections. JCGM 200:2012. https://doi.org/10.59161/JCGM200-2012.</w:t>
+        <w:t>, version 4.2.3, December 6. Concept 281. Accessed October 24, 2026. https://www.eionet.europa.eu/gemet/en/concept/281.</w:t>
       </w:r>
     </w:p>
     <w:p>
@@ -12736,17 +16513,17 @@
       </w:pPr>
       <w:r>
         <w:rPr/>
-        <w:t xml:space="preserve">MERLIN Project. 2026a. </w:t>
+        <w:t xml:space="preserve">Joint Committee for Guides in Metrology. 2012. </w:t>
       </w:r>
       <w:r>
         <w:rPr>
           <w:i/>
         </w:rPr>
-        <w:t>Managed Physical Sensing Systems and Deployments: Profile Scope, Content Outline and Integrated Binding Draft</w:t>
+        <w:t>International Vocabulary of Metrology—Basic and General Concepts and Associated Terms (VIM)</w:t>
       </w:r>
       <w:r>
         <w:rPr/>
-        <w:t>. Version 0.3.5. October 17. Project working draft. https://github.com/OS4CSAPI/glaux-client/blob/1a24fdff71ef801d9b326d2b42a63743db737a8e/Docs/Design/MPSS/MERLIN_Managed_Physical_Sensing_Systems_Profile_Integrated_Binding_Draft_v0.3.5_17OCT2026.docx.</w:t>
+        <w:t>. 3rd ed., 2008 version with minor corrections. JCGM 200:2012. https://doi.org/10.59161/JCGM200-2012.</w:t>
       </w:r>
     </w:p>
     <w:p>
@@ -12755,7 +16532,17 @@
       </w:pPr>
       <w:r>
         <w:rPr/>
-        <w:t>MERLIN Project. 2026b. “Open Sensor Candidate Access Observations.” October 24. Research evidence record, schema version 1. https://github.com/OS4CSAPI/glaux-client/blob/1a24fdff71ef801d9b326d2b42a63743db737a8e/Docs/Research/Evidence/OPEN_SENSOR_ACCESS_2026-10-24.json.</w:t>
+        <w:t xml:space="preserve">MERLIN Project. 2026a. </w:t>
+      </w:r>
+      <w:r>
+        <w:rPr>
+          <w:i/>
+        </w:rPr>
+        <w:t>Managed Physical Sensing Systems and Deployments: Profile Scope, Content Outline and Integrated Binding Draft</w:t>
+      </w:r>
+      <w:r>
+        <w:rPr/>
+        <w:t>. Version 0.3.5. October 17. Project working draft. https://github.com/OS4CSAPI/glaux-client/blob/1a24fdff71ef801d9b326d2b42a63743db737a8e/Docs/Design/MPSS/MERLIN_Managed_Physical_Sensing_Systems_Profile_Integrated_Binding_Draft_v0.3.5_17OCT2026.docx.</w:t>
       </w:r>
     </w:p>
     <w:p>
@@ -12764,7 +16551,7 @@
       </w:pPr>
       <w:r>
         <w:rPr/>
-        <w:t>MERLIN Project. 2026c. “Open Sensor Candidates for MERLIN DIM and MPSS Experiments.” October 24. Research report. https://github.com/OS4CSAPI/glaux-client/blob/1a24fdff71ef801d9b326d2b42a63743db737a8e/Docs/Research/Reports/OPEN_SENSOR_CANDIDATES_2026-10-24.md.</w:t>
+        <w:t>MERLIN Project. 2026b. “Open Sensor Candidate Access Observations.” October 24. Research evidence record, schema version 1. https://github.com/OS4CSAPI/glaux-client/blob/1a24fdff71ef801d9b326d2b42a63743db737a8e/Docs/Research/Evidence/OPEN_SENSOR_ACCESS_2026-10-24.json.</w:t>
       </w:r>
     </w:p>
     <w:p>
@@ -12773,7 +16560,7 @@
       </w:pPr>
       <w:r>
         <w:rPr/>
-        <w:t>MERLIN Project. 2026d. “Resource Details Wireframe Template.” October 24. Design and implementation record. https://github.com/OS4CSAPI/glaux-client/blob/1a24fdff71ef801d9b326d2b42a63743db737a8e/Docs/Design/RESOURCE_DETAILS_TEMPLATE.md.</w:t>
+        <w:t>MERLIN Project. 2026c. “Open Sensor Candidates for MERLIN DIM and MPSS Experiments.” October 24. Research report. https://github.com/OS4CSAPI/glaux-client/blob/1a24fdff71ef801d9b326d2b42a63743db737a8e/Docs/Research/Reports/OPEN_SENSOR_CANDIDATES_2026-10-24.md.</w:t>
       </w:r>
     </w:p>
     <w:p>
@@ -12782,7 +16569,7 @@
       </w:pPr>
       <w:r>
         <w:rPr/>
-        <w:t>MERLIN Project. 2026e. “Smart Citizen Experiment Plan.” October 24. Proposed experiment plan. https://github.com/OS4CSAPI/glaux-client/blob/1a24fdff71ef801d9b326d2b42a63743db737a8e/Docs/Plans/SMART_CITIZEN_EXPERIMENT_PLAN.md.</w:t>
+        <w:t>MERLIN Project. 2026d. “Resource Details Wireframe Template.” October 24. Design and implementation record. https://github.com/OS4CSAPI/glaux-client/blob/1a24fdff71ef801d9b326d2b42a63743db737a8e/Docs/Design/RESOURCE_DETAILS_TEMPLATE.md.</w:t>
       </w:r>
     </w:p>
     <w:p>
@@ -12791,7 +16578,7 @@
       </w:pPr>
       <w:r>
         <w:rPr/>
-        <w:t>MERLIN Project. 2026f. “52°North connected-systems-pygeoapi Experimental Server Baseline.” October 24. Research evidence record. https://github.com/OS4CSAPI/glaux-client/blob/work/details-view-20261023/Docs/Research/Evidence/PYGEOAPI_SERVER_BASELINE_2026-10-24.md.</w:t>
+        <w:t>MERLIN Project. 2026e. “Smart Citizen Experiment Plan.” October 24. Proposed experiment plan. https://github.com/OS4CSAPI/glaux-client/blob/1a24fdff71ef801d9b326d2b42a63743db737a8e/Docs/Plans/SMART_CITIZEN_EXPERIMENT_PLAN.md.</w:t>
       </w:r>
     </w:p>
     <w:p>
@@ -12800,7 +16587,7 @@
       </w:pPr>
       <w:r>
         <w:rPr/>
-        <w:t>MERLIN Project. 2026g. “Glaux Client Selection and Experimental Architecture Baseline.” October 24. Research evidence record. https://github.com/OS4CSAPI/glaux-client/blob/work/details-view-20261023/Docs/Research/Evidence/GLAUX_CLIENT_BASELINE_2026-10-24.md.</w:t>
+        <w:t>MERLIN Project. 2026f. “52°North connected-systems-pygeoapi Experimental Server Baseline.” October 24. Research evidence record. https://github.com/OS4CSAPI/glaux-client/blob/work/details-view-20261023/Docs/Research/Evidence/PYGEOAPI_SERVER_BASELINE_2026-10-24.md.</w:t>
       </w:r>
     </w:p>
     <w:p>
@@ -12809,7 +16596,7 @@
       </w:pPr>
       <w:r>
         <w:rPr/>
-        <w:t>MERLIN Project. 2026h. “Dependency Provenance and Reproducibility.” October 23. Project dependency record. https://github.com/OS4CSAPI/glaux-client/blob/work/details-view-20261023/Docs/DEPENDENCIES.md.</w:t>
+        <w:t>MERLIN Project. 2026g. “Glaux Client Selection and Experimental Architecture Baseline.” October 24. Research evidence record. https://github.com/OS4CSAPI/glaux-client/blob/work/details-view-20261023/Docs/Research/Evidence/GLAUX_CLIENT_BASELINE_2026-10-24.md.</w:t>
       </w:r>
     </w:p>
     <w:p>
@@ -12818,7 +16605,7 @@
       </w:pPr>
       <w:r>
         <w:rPr/>
-        <w:t>MERLIN Project. 2026i. “Cloudflare Deployment Continuation.” October 24. Deployment record. https://github.com/OS4CSAPI/glaux-client/blob/work/details-view-20261023/Docs/Plans/CLOUDFLARE_DEPLOYMENT.md.</w:t>
+        <w:t>MERLIN Project. 2026h. “Dependency Provenance and Reproducibility.” October 23. Project dependency record. https://github.com/OS4CSAPI/glaux-client/blob/work/details-view-20261023/Docs/DEPENDENCIES.md.</w:t>
       </w:r>
     </w:p>
     <w:p>
@@ -12827,7 +16614,7 @@
       </w:pPr>
       <w:r>
         <w:rPr/>
-        <w:t>MERLIN Project. 2026j. “Smart Citizen Vendor Presentation Baseline.” October 24. Research evidence record. https://github.com/OS4CSAPI/glaux-client/blob/work/details-view-20261023/Docs/Research/Evidence/SMART_CITIZEN_VENDOR_UI_BASELINE_2026-10-24.md.</w:t>
+        <w:t>MERLIN Project. 2026i. “Cloudflare Deployment Continuation.” October 24. Deployment record. https://github.com/OS4CSAPI/glaux-client/blob/work/details-view-20261023/Docs/Plans/CLOUDFLARE_DEPLOYMENT.md.</w:t>
       </w:r>
     </w:p>
     <w:p>
@@ -12836,7 +16623,7 @@
       </w:pPr>
       <w:r>
         <w:rPr/>
-        <w:t>MERLIN Project. 2026k. “Smart Citizen Source Specimen and Native Inventory.” October 25. Experiment workbook record. https://github.com/OS4CSAPI/glaux-client/blob/work/details-view-20261023/Docs/Research/Studies/Smart_Citizen/Workbook/01_SOURCE_SPECIMEN_AND_INVENTORY.md.</w:t>
+        <w:t>MERLIN Project. 2026j. “Smart Citizen Vendor Presentation Baseline.” October 24. Research evidence record. https://github.com/OS4CSAPI/glaux-client/blob/work/details-view-20261023/Docs/Research/Evidence/SMART_CITIZEN_VENDOR_UI_BASELINE_2026-10-24.md.</w:t>
       </w:r>
     </w:p>
     <w:p>
@@ -12845,7 +16632,25 @@
       </w:pPr>
       <w:r>
         <w:rPr/>
+        <w:t>MERLIN Project. 2026k. “Smart Citizen Source Specimen and Native Inventory.” October 25. Experiment workbook record. https://github.com/OS4CSAPI/glaux-client/blob/work/details-view-20261023/Docs/Research/Studies/Smart_Citizen/Workbook/01_SOURCE_SPECIMEN_AND_INVENTORY.md.</w:t>
+      </w:r>
+    </w:p>
+    <w:p>
+      <w:pPr>
+        <w:pStyle w:val="PaperReference"/>
+      </w:pPr>
+      <w:r>
+        <w:rPr/>
         <w:t>MERLIN Project. 2026l. “Smart Citizen Mapping Ledger.” October 25. Experiment workbook record. https://github.com/OS4CSAPI/glaux-client/blob/work/details-view-20261023/Docs/Research/Studies/Smart_Citizen/Workbook/02_MAPPING_LEDGER.md.</w:t>
+      </w:r>
+    </w:p>
+    <w:p>
+      <w:pPr>
+        <w:pStyle w:val="PaperReference"/>
+      </w:pPr>
+      <w:r>
+        <w:rPr/>
+        <w:t>MERLIN Project. 2026m. “Smart Citizen Proposed CSAPI Resource Graph and Request Design.” October 25. Experiment workbook record. https://github.com/OS4CSAPI/glaux-client/blob/work/details-view-20261023/Docs/Research/Studies/Smart_Citizen/Workbook/03_CSAPI_RESOURCE_GRAPH.md.</w:t>
       </w:r>
     </w:p>
     <w:p>
@@ -13269,7 +17074,7 @@
         <w:color w:val="000000"/>
         <w:sz w:val="18"/>
       </w:rPr>
-      <w:t xml:space="preserve">Research draft 0.7   25 October 2026 EDT   </w:t>
+      <w:t xml:space="preserve">Research draft 0.8   25 October 2026 EDT   </w:t>
     </w:r>
     <w:fldSimple w:instr="PAGE"/>
   </w:p>

</xml_diff>